<commit_message>
Update the status of a publication
</commit_message>
<xml_diff>
--- a/docs/Omid Reza Heidari-CV.docx
+++ b/docs/Omid Reza Heidari-CV.docx
@@ -2599,7 +2599,19 @@
           <w:szCs w:val="20"/>
           <w:lang w:bidi="fa-IR"/>
         </w:rPr>
-        <w:t>Works in preparation</w:t>
+        <w:t>Submitted w</w:t>
+      </w:r>
+      <w:r>
+        <w:rPr>
+          <w:rFonts w:asciiTheme="minorBidi" w:hAnsiTheme="minorBidi"/>
+          <w:b/>
+          <w:bCs/>
+          <w:color w:val="4B4C4E"/>
+          <w:sz w:val="20"/>
+          <w:szCs w:val="20"/>
+          <w:lang w:bidi="fa-IR"/>
+        </w:rPr>
+        <w:t>orks</w:t>
       </w:r>
     </w:p>
     <w:p>
@@ -2700,7 +2712,37 @@
           <w:szCs w:val="20"/>
           <w:lang w:bidi="fa-IR"/>
         </w:rPr>
-        <w:t xml:space="preserve">, </w:t>
+        <w:t>,</w:t>
+      </w:r>
+      <w:r>
+        <w:rPr>
+          <w:rFonts w:asciiTheme="minorBidi" w:hAnsiTheme="minorBidi"/>
+          <w:color w:val="4B4C4E"/>
+          <w:sz w:val="20"/>
+          <w:szCs w:val="20"/>
+          <w:lang w:bidi="fa-IR"/>
+        </w:rPr>
+        <w:t xml:space="preserve"> M Bayat</w:t>
+      </w:r>
+      <w:r>
+        <w:rPr>
+          <w:rFonts w:asciiTheme="minorBidi" w:hAnsiTheme="minorBidi"/>
+          <w:color w:val="4B4C4E"/>
+          <w:sz w:val="20"/>
+          <w:szCs w:val="20"/>
+          <w:lang w:bidi="fa-IR"/>
+        </w:rPr>
+        <w:t>,</w:t>
+      </w:r>
+      <w:r>
+        <w:rPr>
+          <w:rFonts w:asciiTheme="minorBidi" w:hAnsiTheme="minorBidi"/>
+          <w:color w:val="4B4C4E"/>
+          <w:sz w:val="20"/>
+          <w:szCs w:val="20"/>
+          <w:lang w:bidi="fa-IR"/>
+        </w:rPr>
+        <w:t xml:space="preserve"> </w:t>
       </w:r>
       <w:r>
         <w:rPr>
@@ -2728,6 +2770,31 @@
           <w:szCs w:val="20"/>
         </w:rPr>
         <w:t>”</w:t>
+      </w:r>
+    </w:p>
+    <w:p>
+      <w:pPr>
+        <w:rPr>
+          <w:rFonts w:asciiTheme="minorBidi" w:hAnsiTheme="minorBidi"/>
+          <w:b/>
+          <w:bCs/>
+          <w:color w:val="4B4C4E"/>
+          <w:sz w:val="20"/>
+          <w:szCs w:val="20"/>
+          <w:lang w:bidi="fa-IR"/>
+        </w:rPr>
+      </w:pPr>
+      <w:r>
+        <w:rPr>
+          <w:rFonts w:asciiTheme="minorBidi" w:hAnsiTheme="minorBidi"/>
+          <w:b/>
+          <w:bCs/>
+          <w:color w:val="4B4C4E"/>
+          <w:sz w:val="20"/>
+          <w:szCs w:val="20"/>
+          <w:lang w:bidi="fa-IR"/>
+        </w:rPr>
+        <w:t>Works in preparation</w:t>
       </w:r>
     </w:p>
     <w:p>
@@ -4029,21 +4096,6 @@
         <w:rPr>
           <w:rFonts w:asciiTheme="minorBidi" w:hAnsiTheme="minorBidi"/>
           <w:color w:val="4C4D4F"/>
-          <w:sz w:val="2"/>
-          <w:szCs w:val="2"/>
-          <w:lang w:bidi="fa-IR"/>
-        </w:rPr>
-      </w:pPr>
-    </w:p>
-    <w:p>
-      <w:pPr>
-        <w:tabs>
-          <w:tab w:val="left" w:pos="5280"/>
-        </w:tabs>
-        <w:spacing w:line="276" w:lineRule="auto"/>
-        <w:rPr>
-          <w:rFonts w:asciiTheme="minorBidi" w:hAnsiTheme="minorBidi"/>
-          <w:color w:val="4C4D4F"/>
           <w:sz w:val="20"/>
           <w:szCs w:val="20"/>
           <w:lang w:bidi="fa-IR"/>
@@ -4531,7 +4583,7 @@
           <w:szCs w:val="20"/>
           <w:lang w:bidi="fa-IR"/>
         </w:rPr>
-        <w:t>PyTorch, TensorFlow,</w:t>
+        <w:t>PyTorch,</w:t>
       </w:r>
       <w:r>
         <w:rPr>

</xml_diff>

<commit_message>
Remove Resume and fix CV
</commit_message>
<xml_diff>
--- a/docs/Omid Reza Heidari-CV.docx
+++ b/docs/Omid Reza Heidari-CV.docx
@@ -1713,6 +1713,15 @@
           <w:szCs w:val="20"/>
         </w:rPr>
         <w:t>Fourier transform</w:t>
+      </w:r>
+      <w:r>
+        <w:rPr>
+          <w:rFonts w:asciiTheme="minorBidi" w:hAnsiTheme="minorBidi"/>
+          <w:color w:val="4C4D4F"/>
+          <w:sz w:val="20"/>
+          <w:szCs w:val="20"/>
+        </w:rPr>
+        <w:t>,</w:t>
       </w:r>
       <w:r>
         <w:rPr>
@@ -3032,7 +3041,31 @@
           <w:szCs w:val="20"/>
           <w:lang w:bidi="fa-IR"/>
         </w:rPr>
-        <w:t>Research title:</w:t>
+        <w:t xml:space="preserve">Research </w:t>
+      </w:r>
+      <w:r>
+        <w:rPr>
+          <w:rFonts w:asciiTheme="minorBidi" w:hAnsiTheme="minorBidi"/>
+          <w:b/>
+          <w:bCs/>
+          <w:color w:val="4C4D4F"/>
+          <w:sz w:val="20"/>
+          <w:szCs w:val="20"/>
+          <w:lang w:bidi="fa-IR"/>
+        </w:rPr>
+        <w:t>T</w:t>
+      </w:r>
+      <w:r>
+        <w:rPr>
+          <w:rFonts w:asciiTheme="minorBidi" w:hAnsiTheme="minorBidi"/>
+          <w:b/>
+          <w:bCs/>
+          <w:color w:val="4C4D4F"/>
+          <w:sz w:val="20"/>
+          <w:szCs w:val="20"/>
+          <w:lang w:bidi="fa-IR"/>
+        </w:rPr>
+        <w:t>itle:</w:t>
       </w:r>
       <w:r>
         <w:rPr>
@@ -3052,7 +3085,87 @@
           <w:szCs w:val="20"/>
           <w:lang w:bidi="fa-IR"/>
         </w:rPr>
-        <w:t>How to set up a data center</w:t>
+        <w:t xml:space="preserve">How to </w:t>
+      </w:r>
+      <w:r>
+        <w:rPr>
+          <w:rFonts w:asciiTheme="minorBidi" w:hAnsiTheme="minorBidi"/>
+          <w:color w:val="4C4D4F"/>
+          <w:sz w:val="20"/>
+          <w:szCs w:val="20"/>
+          <w:lang w:bidi="fa-IR"/>
+        </w:rPr>
+        <w:t>S</w:t>
+      </w:r>
+      <w:r>
+        <w:rPr>
+          <w:rFonts w:asciiTheme="minorBidi" w:hAnsiTheme="minorBidi"/>
+          <w:color w:val="4C4D4F"/>
+          <w:sz w:val="20"/>
+          <w:szCs w:val="20"/>
+          <w:lang w:bidi="fa-IR"/>
+        </w:rPr>
+        <w:t xml:space="preserve">et </w:t>
+      </w:r>
+      <w:r>
+        <w:rPr>
+          <w:rFonts w:asciiTheme="minorBidi" w:hAnsiTheme="minorBidi"/>
+          <w:color w:val="4C4D4F"/>
+          <w:sz w:val="20"/>
+          <w:szCs w:val="20"/>
+          <w:lang w:bidi="fa-IR"/>
+        </w:rPr>
+        <w:t>U</w:t>
+      </w:r>
+      <w:r>
+        <w:rPr>
+          <w:rFonts w:asciiTheme="minorBidi" w:hAnsiTheme="minorBidi"/>
+          <w:color w:val="4C4D4F"/>
+          <w:sz w:val="20"/>
+          <w:szCs w:val="20"/>
+          <w:lang w:bidi="fa-IR"/>
+        </w:rPr>
+        <w:t xml:space="preserve">p a </w:t>
+      </w:r>
+      <w:r>
+        <w:rPr>
+          <w:rFonts w:asciiTheme="minorBidi" w:hAnsiTheme="minorBidi"/>
+          <w:color w:val="4C4D4F"/>
+          <w:sz w:val="20"/>
+          <w:szCs w:val="20"/>
+          <w:lang w:bidi="fa-IR"/>
+        </w:rPr>
+        <w:t>D</w:t>
+      </w:r>
+      <w:r>
+        <w:rPr>
+          <w:rFonts w:asciiTheme="minorBidi" w:hAnsiTheme="minorBidi"/>
+          <w:color w:val="4C4D4F"/>
+          <w:sz w:val="20"/>
+          <w:szCs w:val="20"/>
+          <w:lang w:bidi="fa-IR"/>
+        </w:rPr>
+        <w:t xml:space="preserve">ata </w:t>
+      </w:r>
+      <w:r>
+        <w:rPr>
+          <w:rFonts w:asciiTheme="minorBidi" w:hAnsiTheme="minorBidi"/>
+          <w:color w:val="4C4D4F"/>
+          <w:sz w:val="20"/>
+          <w:szCs w:val="20"/>
+          <w:lang w:bidi="fa-IR"/>
+        </w:rPr>
+        <w:t>C</w:t>
+      </w:r>
+      <w:r>
+        <w:rPr>
+          <w:rFonts w:asciiTheme="minorBidi" w:hAnsiTheme="minorBidi"/>
+          <w:color w:val="4C4D4F"/>
+          <w:sz w:val="20"/>
+          <w:szCs w:val="20"/>
+          <w:lang w:bidi="fa-IR"/>
+        </w:rPr>
+        <w:t>enter</w:t>
       </w:r>
     </w:p>
     <w:p>

</xml_diff>

<commit_message>
Add two new courses in the online courses section
</commit_message>
<xml_diff>
--- a/docs/Omid Reza Heidari-CV.docx
+++ b/docs/Omid Reza Heidari-CV.docx
@@ -1,6 +1,6 @@
 
 <file path=word/document.xml><?xml version="1.0" encoding="utf-8"?>
-<w:document xmlns:wpc="http://schemas.microsoft.com/office/word/2010/wordprocessingCanvas" xmlns:cx="http://schemas.microsoft.com/office/drawing/2014/chartex" xmlns:cx1="http://schemas.microsoft.com/office/drawing/2015/9/8/chartex" xmlns:cx2="http://schemas.microsoft.com/office/drawing/2015/10/21/chartex" xmlns:cx3="http://schemas.microsoft.com/office/drawing/2016/5/9/chartex" xmlns:cx4="http://schemas.microsoft.com/office/drawing/2016/5/10/chartex" xmlns:cx5="http://schemas.microsoft.com/office/drawing/2016/5/11/chartex" xmlns:cx6="http://schemas.microsoft.com/office/drawing/2016/5/12/chartex" xmlns:cx7="http://schemas.microsoft.com/office/drawing/2016/5/13/chartex" xmlns:cx8="http://schemas.microsoft.com/office/drawing/2016/5/14/chartex" xmlns:mc="http://schemas.openxmlformats.org/markup-compatibility/2006" xmlns:aink="http://schemas.microsoft.com/office/drawing/2016/ink" xmlns:am3d="http://schemas.microsoft.com/office/drawing/2017/model3d" xmlns:o="urn:schemas-microsoft-com:office:office" xmlns:oel="http://schemas.microsoft.com/office/2019/extlst" xmlns:r="http://schemas.openxmlformats.org/officeDocument/2006/relationships" xmlns:m="http://schemas.openxmlformats.org/officeDocument/2006/math" xmlns:v="urn:schemas-microsoft-com:vml" xmlns:wp14="http://schemas.microsoft.com/office/word/2010/wordprocessingDrawing" xmlns:wp="http://schemas.openxmlformats.org/drawingml/2006/wordprocessingDrawing" xmlns:w10="urn:schemas-microsoft-com:office:word" xmlns:w="http://schemas.openxmlformats.org/wordprocessingml/2006/main" xmlns:w14="http://schemas.microsoft.com/office/word/2010/wordml" xmlns:w15="http://schemas.microsoft.com/office/word/2012/wordml" xmlns:w16cex="http://schemas.microsoft.com/office/word/2018/wordml/cex" xmlns:w16cid="http://schemas.microsoft.com/office/word/2016/wordml/cid" xmlns:w16="http://schemas.microsoft.com/office/word/2018/wordml" xmlns:w16sdtdh="http://schemas.microsoft.com/office/word/2020/wordml/sdtdatahash" xmlns:w16se="http://schemas.microsoft.com/office/word/2015/wordml/symex" xmlns:wpg="http://schemas.microsoft.com/office/word/2010/wordprocessingGroup" xmlns:wpi="http://schemas.microsoft.com/office/word/2010/wordprocessingInk" xmlns:wne="http://schemas.microsoft.com/office/word/2006/wordml" xmlns:wps="http://schemas.microsoft.com/office/word/2010/wordprocessingShape" mc:Ignorable="w14 w15 w16se w16cid w16 w16cex w16sdtdh wp14">
+<w:document xmlns:wpc="http://schemas.microsoft.com/office/word/2010/wordprocessingCanvas" xmlns:cx="http://schemas.microsoft.com/office/drawing/2014/chartex" xmlns:cx1="http://schemas.microsoft.com/office/drawing/2015/9/8/chartex" xmlns:cx2="http://schemas.microsoft.com/office/drawing/2015/10/21/chartex" xmlns:cx3="http://schemas.microsoft.com/office/drawing/2016/5/9/chartex" xmlns:cx4="http://schemas.microsoft.com/office/drawing/2016/5/10/chartex" xmlns:cx5="http://schemas.microsoft.com/office/drawing/2016/5/11/chartex" xmlns:cx6="http://schemas.microsoft.com/office/drawing/2016/5/12/chartex" xmlns:cx7="http://schemas.microsoft.com/office/drawing/2016/5/13/chartex" xmlns:cx8="http://schemas.microsoft.com/office/drawing/2016/5/14/chartex" xmlns:mc="http://schemas.openxmlformats.org/markup-compatibility/2006" xmlns:aink="http://schemas.microsoft.com/office/drawing/2016/ink" xmlns:am3d="http://schemas.microsoft.com/office/drawing/2017/model3d" xmlns:o="urn:schemas-microsoft-com:office:office" xmlns:oel="http://schemas.microsoft.com/office/2019/extlst" xmlns:r="http://schemas.openxmlformats.org/officeDocument/2006/relationships" xmlns:m="http://schemas.openxmlformats.org/officeDocument/2006/math" xmlns:v="urn:schemas-microsoft-com:vml" xmlns:wp14="http://schemas.microsoft.com/office/word/2010/wordprocessingDrawing" xmlns:wp="http://schemas.openxmlformats.org/drawingml/2006/wordprocessingDrawing" xmlns:w10="urn:schemas-microsoft-com:office:word" xmlns:w="http://schemas.openxmlformats.org/wordprocessingml/2006/main" xmlns:w14="http://schemas.microsoft.com/office/word/2010/wordml" xmlns:w15="http://schemas.microsoft.com/office/word/2012/wordml" xmlns:w16cex="http://schemas.microsoft.com/office/word/2018/wordml/cex" xmlns:w16cid="http://schemas.microsoft.com/office/word/2016/wordml/cid" xmlns:w16="http://schemas.microsoft.com/office/word/2018/wordml" xmlns:w16du="http://schemas.microsoft.com/office/word/2023/wordml/word16du" xmlns:w16sdtdh="http://schemas.microsoft.com/office/word/2020/wordml/sdtdatahash" xmlns:w16se="http://schemas.microsoft.com/office/word/2015/wordml/symex" xmlns:wpg="http://schemas.microsoft.com/office/word/2010/wordprocessingGroup" xmlns:wpi="http://schemas.microsoft.com/office/word/2010/wordprocessingInk" xmlns:wne="http://schemas.microsoft.com/office/word/2006/wordml" xmlns:wps="http://schemas.microsoft.com/office/word/2010/wordprocessingShape" mc:Ignorable="w14 w15 w16se w16cid w16 w16cex w16sdtdh wp14">
   <w:body>
     <w:p>
       <w:pPr>
@@ -4281,6 +4281,203 @@
           <w:sz w:val="20"/>
           <w:szCs w:val="20"/>
         </w:rPr>
+        <w:t>May 202</w:t>
+      </w:r>
+      <w:r>
+        <w:rPr>
+          <w:rFonts w:asciiTheme="minorBidi" w:hAnsiTheme="minorBidi"/>
+          <w:color w:val="4C4D4F"/>
+          <w:sz w:val="20"/>
+          <w:szCs w:val="20"/>
+        </w:rPr>
+        <w:t>3</w:t>
+      </w:r>
+      <w:r>
+        <w:rPr>
+          <w:rFonts w:asciiTheme="minorBidi" w:hAnsiTheme="minorBidi"/>
+          <w:color w:val="4C4D4F"/>
+          <w:sz w:val="20"/>
+          <w:szCs w:val="20"/>
+        </w:rPr>
+        <w:tab/>
+      </w:r>
+      <w:hyperlink r:id="rId19" w:history="1">
+        <w:r>
+          <w:rPr>
+            <w:rStyle w:val="Hyperlink"/>
+            <w:rFonts w:asciiTheme="minorBidi" w:hAnsiTheme="minorBidi"/>
+            <w:color w:val="2F5496" w:themeColor="accent1" w:themeShade="BF"/>
+            <w:sz w:val="20"/>
+            <w:szCs w:val="20"/>
+            <w:u w:val="none"/>
+          </w:rPr>
+          <w:t>Calculus for Machine Learning a</w:t>
+        </w:r>
+        <w:r>
+          <w:rPr>
+            <w:rStyle w:val="Hyperlink"/>
+            <w:rFonts w:asciiTheme="minorBidi" w:hAnsiTheme="minorBidi"/>
+            <w:color w:val="2F5496" w:themeColor="accent1" w:themeShade="BF"/>
+            <w:sz w:val="20"/>
+            <w:szCs w:val="20"/>
+            <w:u w:val="none"/>
+          </w:rPr>
+          <w:t>n</w:t>
+        </w:r>
+        <w:r>
+          <w:rPr>
+            <w:rStyle w:val="Hyperlink"/>
+            <w:rFonts w:asciiTheme="minorBidi" w:hAnsiTheme="minorBidi"/>
+            <w:color w:val="2F5496" w:themeColor="accent1" w:themeShade="BF"/>
+            <w:sz w:val="20"/>
+            <w:szCs w:val="20"/>
+            <w:u w:val="none"/>
+          </w:rPr>
+          <w:t>d Data Science</w:t>
+        </w:r>
+      </w:hyperlink>
+    </w:p>
+    <w:p>
+      <w:pPr>
+        <w:spacing w:line="240" w:lineRule="auto"/>
+        <w:ind w:left="720" w:firstLine="720"/>
+        <w:rPr>
+          <w:rFonts w:asciiTheme="minorBidi" w:hAnsiTheme="minorBidi"/>
+          <w:color w:val="4C4D4F"/>
+          <w:sz w:val="20"/>
+          <w:szCs w:val="20"/>
+        </w:rPr>
+      </w:pPr>
+      <w:r>
+        <w:rPr>
+          <w:rFonts w:asciiTheme="minorBidi" w:hAnsiTheme="minorBidi"/>
+          <w:color w:val="4C4D4F"/>
+          <w:sz w:val="20"/>
+          <w:szCs w:val="20"/>
+        </w:rPr>
+        <w:t xml:space="preserve">Coursera, </w:t>
+      </w:r>
+      <w:r>
+        <w:rPr>
+          <w:rFonts w:asciiTheme="minorBidi" w:hAnsiTheme="minorBidi"/>
+          <w:color w:val="4C4D4F"/>
+          <w:sz w:val="20"/>
+          <w:szCs w:val="20"/>
+        </w:rPr>
+        <w:t>DeepLearning.AI</w:t>
+      </w:r>
+    </w:p>
+    <w:p>
+      <w:pPr>
+        <w:spacing w:line="240" w:lineRule="auto"/>
+        <w:rPr>
+          <w:rStyle w:val="Hyperlink"/>
+          <w:rFonts w:asciiTheme="minorBidi" w:hAnsiTheme="minorBidi"/>
+          <w:color w:val="4C4D4F"/>
+          <w:sz w:val="20"/>
+          <w:szCs w:val="20"/>
+          <w:u w:val="none"/>
+        </w:rPr>
+      </w:pPr>
+      <w:r>
+        <w:rPr>
+          <w:rFonts w:asciiTheme="minorBidi" w:hAnsiTheme="minorBidi"/>
+          <w:color w:val="4C4D4F"/>
+          <w:sz w:val="20"/>
+          <w:szCs w:val="20"/>
+        </w:rPr>
+        <w:t>Feb</w:t>
+      </w:r>
+      <w:r>
+        <w:rPr>
+          <w:rFonts w:asciiTheme="minorBidi" w:hAnsiTheme="minorBidi"/>
+          <w:color w:val="4C4D4F"/>
+          <w:sz w:val="20"/>
+          <w:szCs w:val="20"/>
+        </w:rPr>
+        <w:t xml:space="preserve"> 202</w:t>
+      </w:r>
+      <w:r>
+        <w:rPr>
+          <w:rFonts w:asciiTheme="minorBidi" w:hAnsiTheme="minorBidi"/>
+          <w:color w:val="4C4D4F"/>
+          <w:sz w:val="20"/>
+          <w:szCs w:val="20"/>
+        </w:rPr>
+        <w:t>3</w:t>
+      </w:r>
+      <w:r>
+        <w:rPr>
+          <w:rFonts w:asciiTheme="minorBidi" w:hAnsiTheme="minorBidi"/>
+          <w:color w:val="4C4D4F"/>
+          <w:sz w:val="20"/>
+          <w:szCs w:val="20"/>
+        </w:rPr>
+        <w:tab/>
+      </w:r>
+      <w:hyperlink r:id="rId20" w:history="1">
+        <w:r>
+          <w:rPr>
+            <w:rStyle w:val="Hyperlink"/>
+            <w:rFonts w:asciiTheme="minorBidi" w:hAnsiTheme="minorBidi"/>
+            <w:color w:val="2F5496" w:themeColor="accent1" w:themeShade="BF"/>
+            <w:sz w:val="20"/>
+            <w:szCs w:val="20"/>
+            <w:u w:val="none"/>
+          </w:rPr>
+          <w:t>Linear Algebra for Machine Learning and Data Science</w:t>
+        </w:r>
+      </w:hyperlink>
+    </w:p>
+    <w:p>
+      <w:pPr>
+        <w:spacing w:line="240" w:lineRule="auto"/>
+        <w:ind w:left="720" w:firstLine="720"/>
+        <w:rPr>
+          <w:rFonts w:asciiTheme="minorBidi" w:hAnsiTheme="minorBidi"/>
+          <w:color w:val="4C4D4F"/>
+          <w:sz w:val="20"/>
+          <w:szCs w:val="20"/>
+        </w:rPr>
+      </w:pPr>
+      <w:r>
+        <w:rPr>
+          <w:rFonts w:asciiTheme="minorBidi" w:hAnsiTheme="minorBidi"/>
+          <w:color w:val="4C4D4F"/>
+          <w:sz w:val="20"/>
+          <w:szCs w:val="20"/>
+        </w:rPr>
+        <w:t xml:space="preserve">Coursera, </w:t>
+      </w:r>
+      <w:r>
+        <w:rPr>
+          <w:rFonts w:asciiTheme="minorBidi" w:hAnsiTheme="minorBidi"/>
+          <w:color w:val="4C4D4F"/>
+          <w:sz w:val="20"/>
+          <w:szCs w:val="20"/>
+        </w:rPr>
+        <w:t>DeepLearning.AI</w:t>
+      </w:r>
+    </w:p>
+    <w:p>
+      <w:pPr>
+        <w:spacing w:line="240" w:lineRule="auto"/>
+        <w:rPr>
+          <w:rStyle w:val="Hyperlink"/>
+          <w:rFonts w:asciiTheme="minorBidi" w:hAnsiTheme="minorBidi"/>
+          <w:color w:val="4C4D4F"/>
+          <w:sz w:val="20"/>
+          <w:szCs w:val="20"/>
+          <w:u w:val="none"/>
+        </w:rPr>
+      </w:pPr>
+      <w:r>
+        <w:rPr>
+          <w:rFonts w:asciiTheme="minorBidi" w:hAnsiTheme="minorBidi"/>
+          <w:color w:val="4C4D4F"/>
+          <w:sz w:val="20"/>
+          <w:szCs w:val="20"/>
+        </w:rPr>
         <w:t>May 2022</w:t>
       </w:r>
       <w:r>
@@ -4292,7 +4489,7 @@
         </w:rPr>
         <w:tab/>
       </w:r>
-      <w:hyperlink r:id="rId19" w:history="1">
+      <w:hyperlink r:id="rId21" w:history="1">
         <w:r>
           <w:rPr>
             <w:rStyle w:val="Hyperlink"/>
@@ -4357,7 +4554,7 @@
         </w:rPr>
         <w:tab/>
       </w:r>
-      <w:hyperlink r:id="rId20" w:history="1">
+      <w:hyperlink r:id="rId22" w:history="1">
         <w:r>
           <w:rPr>
             <w:rStyle w:val="Hyperlink"/>
@@ -4438,7 +4635,7 @@
         </w:rPr>
         <w:tab/>
       </w:r>
-      <w:hyperlink r:id="rId21" w:history="1">
+      <w:hyperlink r:id="rId23" w:history="1">
         <w:r>
           <w:rPr>
             <w:rStyle w:val="Hyperlink"/>
@@ -5061,12 +5258,12 @@
       </w:r>
     </w:p>
     <w:sectPr>
-      <w:headerReference w:type="even" r:id="rId22"/>
-      <w:headerReference w:type="default" r:id="rId23"/>
-      <w:footerReference w:type="even" r:id="rId24"/>
-      <w:footerReference w:type="default" r:id="rId25"/>
-      <w:headerReference w:type="first" r:id="rId26"/>
-      <w:footerReference w:type="first" r:id="rId27"/>
+      <w:headerReference w:type="even" r:id="rId24"/>
+      <w:headerReference w:type="default" r:id="rId25"/>
+      <w:footerReference w:type="even" r:id="rId26"/>
+      <w:footerReference w:type="default" r:id="rId27"/>
+      <w:headerReference w:type="first" r:id="rId28"/>
+      <w:footerReference w:type="first" r:id="rId29"/>
       <w:pgSz w:w="12240" w:h="15840"/>
       <w:pgMar w:top="1440" w:right="1440" w:bottom="1440" w:left="1440" w:header="720" w:footer="720" w:gutter="0"/>
       <w:pgBorders w:offsetFrom="page">
@@ -5083,7 +5280,7 @@
 </file>
 
 <file path=word/endnotes.xml><?xml version="1.0" encoding="utf-8"?>
-<w:endnotes xmlns:wpc="http://schemas.microsoft.com/office/word/2010/wordprocessingCanvas" xmlns:cx="http://schemas.microsoft.com/office/drawing/2014/chartex" xmlns:cx1="http://schemas.microsoft.com/office/drawing/2015/9/8/chartex" xmlns:cx2="http://schemas.microsoft.com/office/drawing/2015/10/21/chartex" xmlns:cx3="http://schemas.microsoft.com/office/drawing/2016/5/9/chartex" xmlns:cx4="http://schemas.microsoft.com/office/drawing/2016/5/10/chartex" xmlns:cx5="http://schemas.microsoft.com/office/drawing/2016/5/11/chartex" xmlns:cx6="http://schemas.microsoft.com/office/drawing/2016/5/12/chartex" xmlns:cx7="http://schemas.microsoft.com/office/drawing/2016/5/13/chartex" xmlns:cx8="http://schemas.microsoft.com/office/drawing/2016/5/14/chartex" xmlns:mc="http://schemas.openxmlformats.org/markup-compatibility/2006" xmlns:aink="http://schemas.microsoft.com/office/drawing/2016/ink" xmlns:am3d="http://schemas.microsoft.com/office/drawing/2017/model3d" xmlns:o="urn:schemas-microsoft-com:office:office" xmlns:oel="http://schemas.microsoft.com/office/2019/extlst" xmlns:r="http://schemas.openxmlformats.org/officeDocument/2006/relationships" xmlns:m="http://schemas.openxmlformats.org/officeDocument/2006/math" xmlns:v="urn:schemas-microsoft-com:vml" xmlns:wp14="http://schemas.microsoft.com/office/word/2010/wordprocessingDrawing" xmlns:wp="http://schemas.openxmlformats.org/drawingml/2006/wordprocessingDrawing" xmlns:w10="urn:schemas-microsoft-com:office:word" xmlns:w="http://schemas.openxmlformats.org/wordprocessingml/2006/main" xmlns:w14="http://schemas.microsoft.com/office/word/2010/wordml" xmlns:w15="http://schemas.microsoft.com/office/word/2012/wordml" xmlns:w16cex="http://schemas.microsoft.com/office/word/2018/wordml/cex" xmlns:w16cid="http://schemas.microsoft.com/office/word/2016/wordml/cid" xmlns:w16="http://schemas.microsoft.com/office/word/2018/wordml" xmlns:w16sdtdh="http://schemas.microsoft.com/office/word/2020/wordml/sdtdatahash" xmlns:w16se="http://schemas.microsoft.com/office/word/2015/wordml/symex" xmlns:wpg="http://schemas.microsoft.com/office/word/2010/wordprocessingGroup" xmlns:wpi="http://schemas.microsoft.com/office/word/2010/wordprocessingInk" xmlns:wne="http://schemas.microsoft.com/office/word/2006/wordml" xmlns:wps="http://schemas.microsoft.com/office/word/2010/wordprocessingShape" mc:Ignorable="w14 w15 w16se w16cid w16 w16cex w16sdtdh wp14">
+<w:endnotes xmlns:wpc="http://schemas.microsoft.com/office/word/2010/wordprocessingCanvas" xmlns:cx="http://schemas.microsoft.com/office/drawing/2014/chartex" xmlns:cx1="http://schemas.microsoft.com/office/drawing/2015/9/8/chartex" xmlns:cx2="http://schemas.microsoft.com/office/drawing/2015/10/21/chartex" xmlns:cx3="http://schemas.microsoft.com/office/drawing/2016/5/9/chartex" xmlns:cx4="http://schemas.microsoft.com/office/drawing/2016/5/10/chartex" xmlns:cx5="http://schemas.microsoft.com/office/drawing/2016/5/11/chartex" xmlns:cx6="http://schemas.microsoft.com/office/drawing/2016/5/12/chartex" xmlns:cx7="http://schemas.microsoft.com/office/drawing/2016/5/13/chartex" xmlns:cx8="http://schemas.microsoft.com/office/drawing/2016/5/14/chartex" xmlns:mc="http://schemas.openxmlformats.org/markup-compatibility/2006" xmlns:aink="http://schemas.microsoft.com/office/drawing/2016/ink" xmlns:am3d="http://schemas.microsoft.com/office/drawing/2017/model3d" xmlns:o="urn:schemas-microsoft-com:office:office" xmlns:oel="http://schemas.microsoft.com/office/2019/extlst" xmlns:r="http://schemas.openxmlformats.org/officeDocument/2006/relationships" xmlns:m="http://schemas.openxmlformats.org/officeDocument/2006/math" xmlns:v="urn:schemas-microsoft-com:vml" xmlns:wp14="http://schemas.microsoft.com/office/word/2010/wordprocessingDrawing" xmlns:wp="http://schemas.openxmlformats.org/drawingml/2006/wordprocessingDrawing" xmlns:w10="urn:schemas-microsoft-com:office:word" xmlns:w="http://schemas.openxmlformats.org/wordprocessingml/2006/main" xmlns:w14="http://schemas.microsoft.com/office/word/2010/wordml" xmlns:w15="http://schemas.microsoft.com/office/word/2012/wordml" xmlns:w16cex="http://schemas.microsoft.com/office/word/2018/wordml/cex" xmlns:w16cid="http://schemas.microsoft.com/office/word/2016/wordml/cid" xmlns:w16="http://schemas.microsoft.com/office/word/2018/wordml" xmlns:w16du="http://schemas.microsoft.com/office/word/2023/wordml/word16du" xmlns:w16sdtdh="http://schemas.microsoft.com/office/word/2020/wordml/sdtdatahash" xmlns:w16se="http://schemas.microsoft.com/office/word/2015/wordml/symex" xmlns:wpg="http://schemas.microsoft.com/office/word/2010/wordprocessingGroup" xmlns:wpi="http://schemas.microsoft.com/office/word/2010/wordprocessingInk" xmlns:wne="http://schemas.microsoft.com/office/word/2006/wordml" xmlns:wps="http://schemas.microsoft.com/office/word/2010/wordprocessingShape" mc:Ignorable="w14 w15 w16se w16cid w16 w16cex w16sdtdh wp14">
   <w:endnote w:type="separator" w:id="-1">
     <w:p>
       <w:pPr>
@@ -5108,7 +5305,7 @@
 </file>
 
 <file path=word/footer1.xml><?xml version="1.0" encoding="utf-8"?>
-<w:ftr xmlns:wpc="http://schemas.microsoft.com/office/word/2010/wordprocessingCanvas" xmlns:cx="http://schemas.microsoft.com/office/drawing/2014/chartex" xmlns:cx1="http://schemas.microsoft.com/office/drawing/2015/9/8/chartex" xmlns:cx2="http://schemas.microsoft.com/office/drawing/2015/10/21/chartex" xmlns:cx3="http://schemas.microsoft.com/office/drawing/2016/5/9/chartex" xmlns:cx4="http://schemas.microsoft.com/office/drawing/2016/5/10/chartex" xmlns:cx5="http://schemas.microsoft.com/office/drawing/2016/5/11/chartex" xmlns:cx6="http://schemas.microsoft.com/office/drawing/2016/5/12/chartex" xmlns:cx7="http://schemas.microsoft.com/office/drawing/2016/5/13/chartex" xmlns:cx8="http://schemas.microsoft.com/office/drawing/2016/5/14/chartex" xmlns:mc="http://schemas.openxmlformats.org/markup-compatibility/2006" xmlns:aink="http://schemas.microsoft.com/office/drawing/2016/ink" xmlns:am3d="http://schemas.microsoft.com/office/drawing/2017/model3d" xmlns:o="urn:schemas-microsoft-com:office:office" xmlns:oel="http://schemas.microsoft.com/office/2019/extlst" xmlns:r="http://schemas.openxmlformats.org/officeDocument/2006/relationships" xmlns:m="http://schemas.openxmlformats.org/officeDocument/2006/math" xmlns:v="urn:schemas-microsoft-com:vml" xmlns:wp14="http://schemas.microsoft.com/office/word/2010/wordprocessingDrawing" xmlns:wp="http://schemas.openxmlformats.org/drawingml/2006/wordprocessingDrawing" xmlns:w10="urn:schemas-microsoft-com:office:word" xmlns:w="http://schemas.openxmlformats.org/wordprocessingml/2006/main" xmlns:w14="http://schemas.microsoft.com/office/word/2010/wordml" xmlns:w15="http://schemas.microsoft.com/office/word/2012/wordml" xmlns:w16cex="http://schemas.microsoft.com/office/word/2018/wordml/cex" xmlns:w16cid="http://schemas.microsoft.com/office/word/2016/wordml/cid" xmlns:w16="http://schemas.microsoft.com/office/word/2018/wordml" xmlns:w16sdtdh="http://schemas.microsoft.com/office/word/2020/wordml/sdtdatahash" xmlns:w16se="http://schemas.microsoft.com/office/word/2015/wordml/symex" xmlns:wpg="http://schemas.microsoft.com/office/word/2010/wordprocessingGroup" xmlns:wpi="http://schemas.microsoft.com/office/word/2010/wordprocessingInk" xmlns:wne="http://schemas.microsoft.com/office/word/2006/wordml" xmlns:wps="http://schemas.microsoft.com/office/word/2010/wordprocessingShape" mc:Ignorable="w14 w15 w16se w16cid w16 w16cex w16sdtdh wp14">
+<w:ftr xmlns:wpc="http://schemas.microsoft.com/office/word/2010/wordprocessingCanvas" xmlns:cx="http://schemas.microsoft.com/office/drawing/2014/chartex" xmlns:cx1="http://schemas.microsoft.com/office/drawing/2015/9/8/chartex" xmlns:cx2="http://schemas.microsoft.com/office/drawing/2015/10/21/chartex" xmlns:cx3="http://schemas.microsoft.com/office/drawing/2016/5/9/chartex" xmlns:cx4="http://schemas.microsoft.com/office/drawing/2016/5/10/chartex" xmlns:cx5="http://schemas.microsoft.com/office/drawing/2016/5/11/chartex" xmlns:cx6="http://schemas.microsoft.com/office/drawing/2016/5/12/chartex" xmlns:cx7="http://schemas.microsoft.com/office/drawing/2016/5/13/chartex" xmlns:cx8="http://schemas.microsoft.com/office/drawing/2016/5/14/chartex" xmlns:mc="http://schemas.openxmlformats.org/markup-compatibility/2006" xmlns:aink="http://schemas.microsoft.com/office/drawing/2016/ink" xmlns:am3d="http://schemas.microsoft.com/office/drawing/2017/model3d" xmlns:o="urn:schemas-microsoft-com:office:office" xmlns:oel="http://schemas.microsoft.com/office/2019/extlst" xmlns:r="http://schemas.openxmlformats.org/officeDocument/2006/relationships" xmlns:m="http://schemas.openxmlformats.org/officeDocument/2006/math" xmlns:v="urn:schemas-microsoft-com:vml" xmlns:wp14="http://schemas.microsoft.com/office/word/2010/wordprocessingDrawing" xmlns:wp="http://schemas.openxmlformats.org/drawingml/2006/wordprocessingDrawing" xmlns:w10="urn:schemas-microsoft-com:office:word" xmlns:w="http://schemas.openxmlformats.org/wordprocessingml/2006/main" xmlns:w14="http://schemas.microsoft.com/office/word/2010/wordml" xmlns:w15="http://schemas.microsoft.com/office/word/2012/wordml" xmlns:w16cex="http://schemas.microsoft.com/office/word/2018/wordml/cex" xmlns:w16cid="http://schemas.microsoft.com/office/word/2016/wordml/cid" xmlns:w16="http://schemas.microsoft.com/office/word/2018/wordml" xmlns:w16du="http://schemas.microsoft.com/office/word/2023/wordml/word16du" xmlns:w16sdtdh="http://schemas.microsoft.com/office/word/2020/wordml/sdtdatahash" xmlns:w16se="http://schemas.microsoft.com/office/word/2015/wordml/symex" xmlns:wpg="http://schemas.microsoft.com/office/word/2010/wordprocessingGroup" xmlns:wpi="http://schemas.microsoft.com/office/word/2010/wordprocessingInk" xmlns:wne="http://schemas.microsoft.com/office/word/2006/wordml" xmlns:wps="http://schemas.microsoft.com/office/word/2010/wordprocessingShape" mc:Ignorable="w14 w15 w16se w16cid w16 w16cex w16sdtdh wp14">
   <w:p>
     <w:pPr>
       <w:pStyle w:val="Footer"/>
@@ -5118,7 +5315,7 @@
 </file>
 
 <file path=word/footer2.xml><?xml version="1.0" encoding="utf-8"?>
-<w:ftr xmlns:wpc="http://schemas.microsoft.com/office/word/2010/wordprocessingCanvas" xmlns:cx="http://schemas.microsoft.com/office/drawing/2014/chartex" xmlns:cx1="http://schemas.microsoft.com/office/drawing/2015/9/8/chartex" xmlns:cx2="http://schemas.microsoft.com/office/drawing/2015/10/21/chartex" xmlns:cx3="http://schemas.microsoft.com/office/drawing/2016/5/9/chartex" xmlns:cx4="http://schemas.microsoft.com/office/drawing/2016/5/10/chartex" xmlns:cx5="http://schemas.microsoft.com/office/drawing/2016/5/11/chartex" xmlns:cx6="http://schemas.microsoft.com/office/drawing/2016/5/12/chartex" xmlns:cx7="http://schemas.microsoft.com/office/drawing/2016/5/13/chartex" xmlns:cx8="http://schemas.microsoft.com/office/drawing/2016/5/14/chartex" xmlns:mc="http://schemas.openxmlformats.org/markup-compatibility/2006" xmlns:aink="http://schemas.microsoft.com/office/drawing/2016/ink" xmlns:am3d="http://schemas.microsoft.com/office/drawing/2017/model3d" xmlns:o="urn:schemas-microsoft-com:office:office" xmlns:oel="http://schemas.microsoft.com/office/2019/extlst" xmlns:r="http://schemas.openxmlformats.org/officeDocument/2006/relationships" xmlns:m="http://schemas.openxmlformats.org/officeDocument/2006/math" xmlns:v="urn:schemas-microsoft-com:vml" xmlns:wp14="http://schemas.microsoft.com/office/word/2010/wordprocessingDrawing" xmlns:wp="http://schemas.openxmlformats.org/drawingml/2006/wordprocessingDrawing" xmlns:w10="urn:schemas-microsoft-com:office:word" xmlns:w="http://schemas.openxmlformats.org/wordprocessingml/2006/main" xmlns:w14="http://schemas.microsoft.com/office/word/2010/wordml" xmlns:w15="http://schemas.microsoft.com/office/word/2012/wordml" xmlns:w16cex="http://schemas.microsoft.com/office/word/2018/wordml/cex" xmlns:w16cid="http://schemas.microsoft.com/office/word/2016/wordml/cid" xmlns:w16="http://schemas.microsoft.com/office/word/2018/wordml" xmlns:w16sdtdh="http://schemas.microsoft.com/office/word/2020/wordml/sdtdatahash" xmlns:w16se="http://schemas.microsoft.com/office/word/2015/wordml/symex" xmlns:wpg="http://schemas.microsoft.com/office/word/2010/wordprocessingGroup" xmlns:wpi="http://schemas.microsoft.com/office/word/2010/wordprocessingInk" xmlns:wne="http://schemas.microsoft.com/office/word/2006/wordml" xmlns:wps="http://schemas.microsoft.com/office/word/2010/wordprocessingShape" mc:Ignorable="w14 w15 w16se w16cid w16 w16cex w16sdtdh wp14">
+<w:ftr xmlns:wpc="http://schemas.microsoft.com/office/word/2010/wordprocessingCanvas" xmlns:cx="http://schemas.microsoft.com/office/drawing/2014/chartex" xmlns:cx1="http://schemas.microsoft.com/office/drawing/2015/9/8/chartex" xmlns:cx2="http://schemas.microsoft.com/office/drawing/2015/10/21/chartex" xmlns:cx3="http://schemas.microsoft.com/office/drawing/2016/5/9/chartex" xmlns:cx4="http://schemas.microsoft.com/office/drawing/2016/5/10/chartex" xmlns:cx5="http://schemas.microsoft.com/office/drawing/2016/5/11/chartex" xmlns:cx6="http://schemas.microsoft.com/office/drawing/2016/5/12/chartex" xmlns:cx7="http://schemas.microsoft.com/office/drawing/2016/5/13/chartex" xmlns:cx8="http://schemas.microsoft.com/office/drawing/2016/5/14/chartex" xmlns:mc="http://schemas.openxmlformats.org/markup-compatibility/2006" xmlns:aink="http://schemas.microsoft.com/office/drawing/2016/ink" xmlns:am3d="http://schemas.microsoft.com/office/drawing/2017/model3d" xmlns:o="urn:schemas-microsoft-com:office:office" xmlns:oel="http://schemas.microsoft.com/office/2019/extlst" xmlns:r="http://schemas.openxmlformats.org/officeDocument/2006/relationships" xmlns:m="http://schemas.openxmlformats.org/officeDocument/2006/math" xmlns:v="urn:schemas-microsoft-com:vml" xmlns:wp14="http://schemas.microsoft.com/office/word/2010/wordprocessingDrawing" xmlns:wp="http://schemas.openxmlformats.org/drawingml/2006/wordprocessingDrawing" xmlns:w10="urn:schemas-microsoft-com:office:word" xmlns:w="http://schemas.openxmlformats.org/wordprocessingml/2006/main" xmlns:w14="http://schemas.microsoft.com/office/word/2010/wordml" xmlns:w15="http://schemas.microsoft.com/office/word/2012/wordml" xmlns:w16cex="http://schemas.microsoft.com/office/word/2018/wordml/cex" xmlns:w16cid="http://schemas.microsoft.com/office/word/2016/wordml/cid" xmlns:w16="http://schemas.microsoft.com/office/word/2018/wordml" xmlns:w16du="http://schemas.microsoft.com/office/word/2023/wordml/word16du" xmlns:w16sdtdh="http://schemas.microsoft.com/office/word/2020/wordml/sdtdatahash" xmlns:w16se="http://schemas.microsoft.com/office/word/2015/wordml/symex" xmlns:wpg="http://schemas.microsoft.com/office/word/2010/wordprocessingGroup" xmlns:wpi="http://schemas.microsoft.com/office/word/2010/wordprocessingInk" xmlns:wne="http://schemas.microsoft.com/office/word/2006/wordml" xmlns:wps="http://schemas.microsoft.com/office/word/2010/wordprocessingShape" mc:Ignorable="w14 w15 w16se w16cid w16 w16cex w16sdtdh wp14">
   <w:sdt>
     <w:sdtPr>
       <w:id w:val="2043244344"/>
@@ -5237,7 +5434,7 @@
 </file>
 
 <file path=word/footer3.xml><?xml version="1.0" encoding="utf-8"?>
-<w:ftr xmlns:wpc="http://schemas.microsoft.com/office/word/2010/wordprocessingCanvas" xmlns:cx="http://schemas.microsoft.com/office/drawing/2014/chartex" xmlns:cx1="http://schemas.microsoft.com/office/drawing/2015/9/8/chartex" xmlns:cx2="http://schemas.microsoft.com/office/drawing/2015/10/21/chartex" xmlns:cx3="http://schemas.microsoft.com/office/drawing/2016/5/9/chartex" xmlns:cx4="http://schemas.microsoft.com/office/drawing/2016/5/10/chartex" xmlns:cx5="http://schemas.microsoft.com/office/drawing/2016/5/11/chartex" xmlns:cx6="http://schemas.microsoft.com/office/drawing/2016/5/12/chartex" xmlns:cx7="http://schemas.microsoft.com/office/drawing/2016/5/13/chartex" xmlns:cx8="http://schemas.microsoft.com/office/drawing/2016/5/14/chartex" xmlns:mc="http://schemas.openxmlformats.org/markup-compatibility/2006" xmlns:aink="http://schemas.microsoft.com/office/drawing/2016/ink" xmlns:am3d="http://schemas.microsoft.com/office/drawing/2017/model3d" xmlns:o="urn:schemas-microsoft-com:office:office" xmlns:oel="http://schemas.microsoft.com/office/2019/extlst" xmlns:r="http://schemas.openxmlformats.org/officeDocument/2006/relationships" xmlns:m="http://schemas.openxmlformats.org/officeDocument/2006/math" xmlns:v="urn:schemas-microsoft-com:vml" xmlns:wp14="http://schemas.microsoft.com/office/word/2010/wordprocessingDrawing" xmlns:wp="http://schemas.openxmlformats.org/drawingml/2006/wordprocessingDrawing" xmlns:w10="urn:schemas-microsoft-com:office:word" xmlns:w="http://schemas.openxmlformats.org/wordprocessingml/2006/main" xmlns:w14="http://schemas.microsoft.com/office/word/2010/wordml" xmlns:w15="http://schemas.microsoft.com/office/word/2012/wordml" xmlns:w16cex="http://schemas.microsoft.com/office/word/2018/wordml/cex" xmlns:w16cid="http://schemas.microsoft.com/office/word/2016/wordml/cid" xmlns:w16="http://schemas.microsoft.com/office/word/2018/wordml" xmlns:w16sdtdh="http://schemas.microsoft.com/office/word/2020/wordml/sdtdatahash" xmlns:w16se="http://schemas.microsoft.com/office/word/2015/wordml/symex" xmlns:wpg="http://schemas.microsoft.com/office/word/2010/wordprocessingGroup" xmlns:wpi="http://schemas.microsoft.com/office/word/2010/wordprocessingInk" xmlns:wne="http://schemas.microsoft.com/office/word/2006/wordml" xmlns:wps="http://schemas.microsoft.com/office/word/2010/wordprocessingShape" mc:Ignorable="w14 w15 w16se w16cid w16 w16cex w16sdtdh wp14">
+<w:ftr xmlns:wpc="http://schemas.microsoft.com/office/word/2010/wordprocessingCanvas" xmlns:cx="http://schemas.microsoft.com/office/drawing/2014/chartex" xmlns:cx1="http://schemas.microsoft.com/office/drawing/2015/9/8/chartex" xmlns:cx2="http://schemas.microsoft.com/office/drawing/2015/10/21/chartex" xmlns:cx3="http://schemas.microsoft.com/office/drawing/2016/5/9/chartex" xmlns:cx4="http://schemas.microsoft.com/office/drawing/2016/5/10/chartex" xmlns:cx5="http://schemas.microsoft.com/office/drawing/2016/5/11/chartex" xmlns:cx6="http://schemas.microsoft.com/office/drawing/2016/5/12/chartex" xmlns:cx7="http://schemas.microsoft.com/office/drawing/2016/5/13/chartex" xmlns:cx8="http://schemas.microsoft.com/office/drawing/2016/5/14/chartex" xmlns:mc="http://schemas.openxmlformats.org/markup-compatibility/2006" xmlns:aink="http://schemas.microsoft.com/office/drawing/2016/ink" xmlns:am3d="http://schemas.microsoft.com/office/drawing/2017/model3d" xmlns:o="urn:schemas-microsoft-com:office:office" xmlns:oel="http://schemas.microsoft.com/office/2019/extlst" xmlns:r="http://schemas.openxmlformats.org/officeDocument/2006/relationships" xmlns:m="http://schemas.openxmlformats.org/officeDocument/2006/math" xmlns:v="urn:schemas-microsoft-com:vml" xmlns:wp14="http://schemas.microsoft.com/office/word/2010/wordprocessingDrawing" xmlns:wp="http://schemas.openxmlformats.org/drawingml/2006/wordprocessingDrawing" xmlns:w10="urn:schemas-microsoft-com:office:word" xmlns:w="http://schemas.openxmlformats.org/wordprocessingml/2006/main" xmlns:w14="http://schemas.microsoft.com/office/word/2010/wordml" xmlns:w15="http://schemas.microsoft.com/office/word/2012/wordml" xmlns:w16cex="http://schemas.microsoft.com/office/word/2018/wordml/cex" xmlns:w16cid="http://schemas.microsoft.com/office/word/2016/wordml/cid" xmlns:w16="http://schemas.microsoft.com/office/word/2018/wordml" xmlns:w16du="http://schemas.microsoft.com/office/word/2023/wordml/word16du" xmlns:w16sdtdh="http://schemas.microsoft.com/office/word/2020/wordml/sdtdatahash" xmlns:w16se="http://schemas.microsoft.com/office/word/2015/wordml/symex" xmlns:wpg="http://schemas.microsoft.com/office/word/2010/wordprocessingGroup" xmlns:wpi="http://schemas.microsoft.com/office/word/2010/wordprocessingInk" xmlns:wne="http://schemas.microsoft.com/office/word/2006/wordml" xmlns:wps="http://schemas.microsoft.com/office/word/2010/wordprocessingShape" mc:Ignorable="w14 w15 w16se w16cid w16 w16cex w16sdtdh wp14">
   <w:p>
     <w:pPr>
       <w:pStyle w:val="Footer"/>
@@ -5247,7 +5444,7 @@
 </file>
 
 <file path=word/footnotes.xml><?xml version="1.0" encoding="utf-8"?>
-<w:footnotes xmlns:wpc="http://schemas.microsoft.com/office/word/2010/wordprocessingCanvas" xmlns:cx="http://schemas.microsoft.com/office/drawing/2014/chartex" xmlns:cx1="http://schemas.microsoft.com/office/drawing/2015/9/8/chartex" xmlns:cx2="http://schemas.microsoft.com/office/drawing/2015/10/21/chartex" xmlns:cx3="http://schemas.microsoft.com/office/drawing/2016/5/9/chartex" xmlns:cx4="http://schemas.microsoft.com/office/drawing/2016/5/10/chartex" xmlns:cx5="http://schemas.microsoft.com/office/drawing/2016/5/11/chartex" xmlns:cx6="http://schemas.microsoft.com/office/drawing/2016/5/12/chartex" xmlns:cx7="http://schemas.microsoft.com/office/drawing/2016/5/13/chartex" xmlns:cx8="http://schemas.microsoft.com/office/drawing/2016/5/14/chartex" xmlns:mc="http://schemas.openxmlformats.org/markup-compatibility/2006" xmlns:aink="http://schemas.microsoft.com/office/drawing/2016/ink" xmlns:am3d="http://schemas.microsoft.com/office/drawing/2017/model3d" xmlns:o="urn:schemas-microsoft-com:office:office" xmlns:oel="http://schemas.microsoft.com/office/2019/extlst" xmlns:r="http://schemas.openxmlformats.org/officeDocument/2006/relationships" xmlns:m="http://schemas.openxmlformats.org/officeDocument/2006/math" xmlns:v="urn:schemas-microsoft-com:vml" xmlns:wp14="http://schemas.microsoft.com/office/word/2010/wordprocessingDrawing" xmlns:wp="http://schemas.openxmlformats.org/drawingml/2006/wordprocessingDrawing" xmlns:w10="urn:schemas-microsoft-com:office:word" xmlns:w="http://schemas.openxmlformats.org/wordprocessingml/2006/main" xmlns:w14="http://schemas.microsoft.com/office/word/2010/wordml" xmlns:w15="http://schemas.microsoft.com/office/word/2012/wordml" xmlns:w16cex="http://schemas.microsoft.com/office/word/2018/wordml/cex" xmlns:w16cid="http://schemas.microsoft.com/office/word/2016/wordml/cid" xmlns:w16="http://schemas.microsoft.com/office/word/2018/wordml" xmlns:w16sdtdh="http://schemas.microsoft.com/office/word/2020/wordml/sdtdatahash" xmlns:w16se="http://schemas.microsoft.com/office/word/2015/wordml/symex" xmlns:wpg="http://schemas.microsoft.com/office/word/2010/wordprocessingGroup" xmlns:wpi="http://schemas.microsoft.com/office/word/2010/wordprocessingInk" xmlns:wne="http://schemas.microsoft.com/office/word/2006/wordml" xmlns:wps="http://schemas.microsoft.com/office/word/2010/wordprocessingShape" mc:Ignorable="w14 w15 w16se w16cid w16 w16cex w16sdtdh wp14">
+<w:footnotes xmlns:wpc="http://schemas.microsoft.com/office/word/2010/wordprocessingCanvas" xmlns:cx="http://schemas.microsoft.com/office/drawing/2014/chartex" xmlns:cx1="http://schemas.microsoft.com/office/drawing/2015/9/8/chartex" xmlns:cx2="http://schemas.microsoft.com/office/drawing/2015/10/21/chartex" xmlns:cx3="http://schemas.microsoft.com/office/drawing/2016/5/9/chartex" xmlns:cx4="http://schemas.microsoft.com/office/drawing/2016/5/10/chartex" xmlns:cx5="http://schemas.microsoft.com/office/drawing/2016/5/11/chartex" xmlns:cx6="http://schemas.microsoft.com/office/drawing/2016/5/12/chartex" xmlns:cx7="http://schemas.microsoft.com/office/drawing/2016/5/13/chartex" xmlns:cx8="http://schemas.microsoft.com/office/drawing/2016/5/14/chartex" xmlns:mc="http://schemas.openxmlformats.org/markup-compatibility/2006" xmlns:aink="http://schemas.microsoft.com/office/drawing/2016/ink" xmlns:am3d="http://schemas.microsoft.com/office/drawing/2017/model3d" xmlns:o="urn:schemas-microsoft-com:office:office" xmlns:oel="http://schemas.microsoft.com/office/2019/extlst" xmlns:r="http://schemas.openxmlformats.org/officeDocument/2006/relationships" xmlns:m="http://schemas.openxmlformats.org/officeDocument/2006/math" xmlns:v="urn:schemas-microsoft-com:vml" xmlns:wp14="http://schemas.microsoft.com/office/word/2010/wordprocessingDrawing" xmlns:wp="http://schemas.openxmlformats.org/drawingml/2006/wordprocessingDrawing" xmlns:w10="urn:schemas-microsoft-com:office:word" xmlns:w="http://schemas.openxmlformats.org/wordprocessingml/2006/main" xmlns:w14="http://schemas.microsoft.com/office/word/2010/wordml" xmlns:w15="http://schemas.microsoft.com/office/word/2012/wordml" xmlns:w16cex="http://schemas.microsoft.com/office/word/2018/wordml/cex" xmlns:w16cid="http://schemas.microsoft.com/office/word/2016/wordml/cid" xmlns:w16="http://schemas.microsoft.com/office/word/2018/wordml" xmlns:w16du="http://schemas.microsoft.com/office/word/2023/wordml/word16du" xmlns:w16sdtdh="http://schemas.microsoft.com/office/word/2020/wordml/sdtdatahash" xmlns:w16se="http://schemas.microsoft.com/office/word/2015/wordml/symex" xmlns:wpg="http://schemas.microsoft.com/office/word/2010/wordprocessingGroup" xmlns:wpi="http://schemas.microsoft.com/office/word/2010/wordprocessingInk" xmlns:wne="http://schemas.microsoft.com/office/word/2006/wordml" xmlns:wps="http://schemas.microsoft.com/office/word/2010/wordprocessingShape" mc:Ignorable="w14 w15 w16se w16cid w16 w16cex w16sdtdh wp14">
   <w:footnote w:type="separator" w:id="-1">
     <w:p>
       <w:pPr>
@@ -5272,7 +5469,7 @@
 </file>
 
 <file path=word/header1.xml><?xml version="1.0" encoding="utf-8"?>
-<w:hdr xmlns:wpc="http://schemas.microsoft.com/office/word/2010/wordprocessingCanvas" xmlns:cx="http://schemas.microsoft.com/office/drawing/2014/chartex" xmlns:cx1="http://schemas.microsoft.com/office/drawing/2015/9/8/chartex" xmlns:cx2="http://schemas.microsoft.com/office/drawing/2015/10/21/chartex" xmlns:cx3="http://schemas.microsoft.com/office/drawing/2016/5/9/chartex" xmlns:cx4="http://schemas.microsoft.com/office/drawing/2016/5/10/chartex" xmlns:cx5="http://schemas.microsoft.com/office/drawing/2016/5/11/chartex" xmlns:cx6="http://schemas.microsoft.com/office/drawing/2016/5/12/chartex" xmlns:cx7="http://schemas.microsoft.com/office/drawing/2016/5/13/chartex" xmlns:cx8="http://schemas.microsoft.com/office/drawing/2016/5/14/chartex" xmlns:mc="http://schemas.openxmlformats.org/markup-compatibility/2006" xmlns:aink="http://schemas.microsoft.com/office/drawing/2016/ink" xmlns:am3d="http://schemas.microsoft.com/office/drawing/2017/model3d" xmlns:o="urn:schemas-microsoft-com:office:office" xmlns:oel="http://schemas.microsoft.com/office/2019/extlst" xmlns:r="http://schemas.openxmlformats.org/officeDocument/2006/relationships" xmlns:m="http://schemas.openxmlformats.org/officeDocument/2006/math" xmlns:v="urn:schemas-microsoft-com:vml" xmlns:wp14="http://schemas.microsoft.com/office/word/2010/wordprocessingDrawing" xmlns:wp="http://schemas.openxmlformats.org/drawingml/2006/wordprocessingDrawing" xmlns:w10="urn:schemas-microsoft-com:office:word" xmlns:w="http://schemas.openxmlformats.org/wordprocessingml/2006/main" xmlns:w14="http://schemas.microsoft.com/office/word/2010/wordml" xmlns:w15="http://schemas.microsoft.com/office/word/2012/wordml" xmlns:w16cex="http://schemas.microsoft.com/office/word/2018/wordml/cex" xmlns:w16cid="http://schemas.microsoft.com/office/word/2016/wordml/cid" xmlns:w16="http://schemas.microsoft.com/office/word/2018/wordml" xmlns:w16sdtdh="http://schemas.microsoft.com/office/word/2020/wordml/sdtdatahash" xmlns:w16se="http://schemas.microsoft.com/office/word/2015/wordml/symex" xmlns:wpg="http://schemas.microsoft.com/office/word/2010/wordprocessingGroup" xmlns:wpi="http://schemas.microsoft.com/office/word/2010/wordprocessingInk" xmlns:wne="http://schemas.microsoft.com/office/word/2006/wordml" xmlns:wps="http://schemas.microsoft.com/office/word/2010/wordprocessingShape" mc:Ignorable="w14 w15 w16se w16cid w16 w16cex w16sdtdh wp14">
+<w:hdr xmlns:wpc="http://schemas.microsoft.com/office/word/2010/wordprocessingCanvas" xmlns:cx="http://schemas.microsoft.com/office/drawing/2014/chartex" xmlns:cx1="http://schemas.microsoft.com/office/drawing/2015/9/8/chartex" xmlns:cx2="http://schemas.microsoft.com/office/drawing/2015/10/21/chartex" xmlns:cx3="http://schemas.microsoft.com/office/drawing/2016/5/9/chartex" xmlns:cx4="http://schemas.microsoft.com/office/drawing/2016/5/10/chartex" xmlns:cx5="http://schemas.microsoft.com/office/drawing/2016/5/11/chartex" xmlns:cx6="http://schemas.microsoft.com/office/drawing/2016/5/12/chartex" xmlns:cx7="http://schemas.microsoft.com/office/drawing/2016/5/13/chartex" xmlns:cx8="http://schemas.microsoft.com/office/drawing/2016/5/14/chartex" xmlns:mc="http://schemas.openxmlformats.org/markup-compatibility/2006" xmlns:aink="http://schemas.microsoft.com/office/drawing/2016/ink" xmlns:am3d="http://schemas.microsoft.com/office/drawing/2017/model3d" xmlns:o="urn:schemas-microsoft-com:office:office" xmlns:oel="http://schemas.microsoft.com/office/2019/extlst" xmlns:r="http://schemas.openxmlformats.org/officeDocument/2006/relationships" xmlns:m="http://schemas.openxmlformats.org/officeDocument/2006/math" xmlns:v="urn:schemas-microsoft-com:vml" xmlns:wp14="http://schemas.microsoft.com/office/word/2010/wordprocessingDrawing" xmlns:wp="http://schemas.openxmlformats.org/drawingml/2006/wordprocessingDrawing" xmlns:w10="urn:schemas-microsoft-com:office:word" xmlns:w="http://schemas.openxmlformats.org/wordprocessingml/2006/main" xmlns:w14="http://schemas.microsoft.com/office/word/2010/wordml" xmlns:w15="http://schemas.microsoft.com/office/word/2012/wordml" xmlns:w16cex="http://schemas.microsoft.com/office/word/2018/wordml/cex" xmlns:w16cid="http://schemas.microsoft.com/office/word/2016/wordml/cid" xmlns:w16="http://schemas.microsoft.com/office/word/2018/wordml" xmlns:w16du="http://schemas.microsoft.com/office/word/2023/wordml/word16du" xmlns:w16sdtdh="http://schemas.microsoft.com/office/word/2020/wordml/sdtdatahash" xmlns:w16se="http://schemas.microsoft.com/office/word/2015/wordml/symex" xmlns:wpg="http://schemas.microsoft.com/office/word/2010/wordprocessingGroup" xmlns:wpi="http://schemas.microsoft.com/office/word/2010/wordprocessingInk" xmlns:wne="http://schemas.microsoft.com/office/word/2006/wordml" xmlns:wps="http://schemas.microsoft.com/office/word/2010/wordprocessingShape" mc:Ignorable="w14 w15 w16se w16cid w16 w16cex w16sdtdh wp14">
   <w:p>
     <w:pPr>
       <w:pStyle w:val="Header"/>
@@ -5282,7 +5479,7 @@
 </file>
 
 <file path=word/header2.xml><?xml version="1.0" encoding="utf-8"?>
-<w:hdr xmlns:wpc="http://schemas.microsoft.com/office/word/2010/wordprocessingCanvas" xmlns:cx="http://schemas.microsoft.com/office/drawing/2014/chartex" xmlns:cx1="http://schemas.microsoft.com/office/drawing/2015/9/8/chartex" xmlns:cx2="http://schemas.microsoft.com/office/drawing/2015/10/21/chartex" xmlns:cx3="http://schemas.microsoft.com/office/drawing/2016/5/9/chartex" xmlns:cx4="http://schemas.microsoft.com/office/drawing/2016/5/10/chartex" xmlns:cx5="http://schemas.microsoft.com/office/drawing/2016/5/11/chartex" xmlns:cx6="http://schemas.microsoft.com/office/drawing/2016/5/12/chartex" xmlns:cx7="http://schemas.microsoft.com/office/drawing/2016/5/13/chartex" xmlns:cx8="http://schemas.microsoft.com/office/drawing/2016/5/14/chartex" xmlns:mc="http://schemas.openxmlformats.org/markup-compatibility/2006" xmlns:aink="http://schemas.microsoft.com/office/drawing/2016/ink" xmlns:am3d="http://schemas.microsoft.com/office/drawing/2017/model3d" xmlns:o="urn:schemas-microsoft-com:office:office" xmlns:oel="http://schemas.microsoft.com/office/2019/extlst" xmlns:r="http://schemas.openxmlformats.org/officeDocument/2006/relationships" xmlns:m="http://schemas.openxmlformats.org/officeDocument/2006/math" xmlns:v="urn:schemas-microsoft-com:vml" xmlns:wp14="http://schemas.microsoft.com/office/word/2010/wordprocessingDrawing" xmlns:wp="http://schemas.openxmlformats.org/drawingml/2006/wordprocessingDrawing" xmlns:w10="urn:schemas-microsoft-com:office:word" xmlns:w="http://schemas.openxmlformats.org/wordprocessingml/2006/main" xmlns:w14="http://schemas.microsoft.com/office/word/2010/wordml" xmlns:w15="http://schemas.microsoft.com/office/word/2012/wordml" xmlns:w16cex="http://schemas.microsoft.com/office/word/2018/wordml/cex" xmlns:w16cid="http://schemas.microsoft.com/office/word/2016/wordml/cid" xmlns:w16="http://schemas.microsoft.com/office/word/2018/wordml" xmlns:w16sdtdh="http://schemas.microsoft.com/office/word/2020/wordml/sdtdatahash" xmlns:w16se="http://schemas.microsoft.com/office/word/2015/wordml/symex" xmlns:wpg="http://schemas.microsoft.com/office/word/2010/wordprocessingGroup" xmlns:wpi="http://schemas.microsoft.com/office/word/2010/wordprocessingInk" xmlns:wne="http://schemas.microsoft.com/office/word/2006/wordml" xmlns:wps="http://schemas.microsoft.com/office/word/2010/wordprocessingShape" mc:Ignorable="w14 w15 w16se w16cid w16 w16cex w16sdtdh wp14">
+<w:hdr xmlns:wpc="http://schemas.microsoft.com/office/word/2010/wordprocessingCanvas" xmlns:cx="http://schemas.microsoft.com/office/drawing/2014/chartex" xmlns:cx1="http://schemas.microsoft.com/office/drawing/2015/9/8/chartex" xmlns:cx2="http://schemas.microsoft.com/office/drawing/2015/10/21/chartex" xmlns:cx3="http://schemas.microsoft.com/office/drawing/2016/5/9/chartex" xmlns:cx4="http://schemas.microsoft.com/office/drawing/2016/5/10/chartex" xmlns:cx5="http://schemas.microsoft.com/office/drawing/2016/5/11/chartex" xmlns:cx6="http://schemas.microsoft.com/office/drawing/2016/5/12/chartex" xmlns:cx7="http://schemas.microsoft.com/office/drawing/2016/5/13/chartex" xmlns:cx8="http://schemas.microsoft.com/office/drawing/2016/5/14/chartex" xmlns:mc="http://schemas.openxmlformats.org/markup-compatibility/2006" xmlns:aink="http://schemas.microsoft.com/office/drawing/2016/ink" xmlns:am3d="http://schemas.microsoft.com/office/drawing/2017/model3d" xmlns:o="urn:schemas-microsoft-com:office:office" xmlns:oel="http://schemas.microsoft.com/office/2019/extlst" xmlns:r="http://schemas.openxmlformats.org/officeDocument/2006/relationships" xmlns:m="http://schemas.openxmlformats.org/officeDocument/2006/math" xmlns:v="urn:schemas-microsoft-com:vml" xmlns:wp14="http://schemas.microsoft.com/office/word/2010/wordprocessingDrawing" xmlns:wp="http://schemas.openxmlformats.org/drawingml/2006/wordprocessingDrawing" xmlns:w10="urn:schemas-microsoft-com:office:word" xmlns:w="http://schemas.openxmlformats.org/wordprocessingml/2006/main" xmlns:w14="http://schemas.microsoft.com/office/word/2010/wordml" xmlns:w15="http://schemas.microsoft.com/office/word/2012/wordml" xmlns:w16cex="http://schemas.microsoft.com/office/word/2018/wordml/cex" xmlns:w16cid="http://schemas.microsoft.com/office/word/2016/wordml/cid" xmlns:w16="http://schemas.microsoft.com/office/word/2018/wordml" xmlns:w16du="http://schemas.microsoft.com/office/word/2023/wordml/word16du" xmlns:w16sdtdh="http://schemas.microsoft.com/office/word/2020/wordml/sdtdatahash" xmlns:w16se="http://schemas.microsoft.com/office/word/2015/wordml/symex" xmlns:wpg="http://schemas.microsoft.com/office/word/2010/wordprocessingGroup" xmlns:wpi="http://schemas.microsoft.com/office/word/2010/wordprocessingInk" xmlns:wne="http://schemas.microsoft.com/office/word/2006/wordml" xmlns:wps="http://schemas.microsoft.com/office/word/2010/wordprocessingShape" mc:Ignorable="w14 w15 w16se w16cid w16 w16cex w16sdtdh wp14">
   <w:p>
     <w:pPr>
       <w:pStyle w:val="Header"/>
@@ -5292,7 +5489,7 @@
 </file>
 
 <file path=word/header3.xml><?xml version="1.0" encoding="utf-8"?>
-<w:hdr xmlns:wpc="http://schemas.microsoft.com/office/word/2010/wordprocessingCanvas" xmlns:cx="http://schemas.microsoft.com/office/drawing/2014/chartex" xmlns:cx1="http://schemas.microsoft.com/office/drawing/2015/9/8/chartex" xmlns:cx2="http://schemas.microsoft.com/office/drawing/2015/10/21/chartex" xmlns:cx3="http://schemas.microsoft.com/office/drawing/2016/5/9/chartex" xmlns:cx4="http://schemas.microsoft.com/office/drawing/2016/5/10/chartex" xmlns:cx5="http://schemas.microsoft.com/office/drawing/2016/5/11/chartex" xmlns:cx6="http://schemas.microsoft.com/office/drawing/2016/5/12/chartex" xmlns:cx7="http://schemas.microsoft.com/office/drawing/2016/5/13/chartex" xmlns:cx8="http://schemas.microsoft.com/office/drawing/2016/5/14/chartex" xmlns:mc="http://schemas.openxmlformats.org/markup-compatibility/2006" xmlns:aink="http://schemas.microsoft.com/office/drawing/2016/ink" xmlns:am3d="http://schemas.microsoft.com/office/drawing/2017/model3d" xmlns:o="urn:schemas-microsoft-com:office:office" xmlns:oel="http://schemas.microsoft.com/office/2019/extlst" xmlns:r="http://schemas.openxmlformats.org/officeDocument/2006/relationships" xmlns:m="http://schemas.openxmlformats.org/officeDocument/2006/math" xmlns:v="urn:schemas-microsoft-com:vml" xmlns:wp14="http://schemas.microsoft.com/office/word/2010/wordprocessingDrawing" xmlns:wp="http://schemas.openxmlformats.org/drawingml/2006/wordprocessingDrawing" xmlns:w10="urn:schemas-microsoft-com:office:word" xmlns:w="http://schemas.openxmlformats.org/wordprocessingml/2006/main" xmlns:w14="http://schemas.microsoft.com/office/word/2010/wordml" xmlns:w15="http://schemas.microsoft.com/office/word/2012/wordml" xmlns:w16cex="http://schemas.microsoft.com/office/word/2018/wordml/cex" xmlns:w16cid="http://schemas.microsoft.com/office/word/2016/wordml/cid" xmlns:w16="http://schemas.microsoft.com/office/word/2018/wordml" xmlns:w16sdtdh="http://schemas.microsoft.com/office/word/2020/wordml/sdtdatahash" xmlns:w16se="http://schemas.microsoft.com/office/word/2015/wordml/symex" xmlns:wpg="http://schemas.microsoft.com/office/word/2010/wordprocessingGroup" xmlns:wpi="http://schemas.microsoft.com/office/word/2010/wordprocessingInk" xmlns:wne="http://schemas.microsoft.com/office/word/2006/wordml" xmlns:wps="http://schemas.microsoft.com/office/word/2010/wordprocessingShape" mc:Ignorable="w14 w15 w16se w16cid w16 w16cex w16sdtdh wp14">
+<w:hdr xmlns:wpc="http://schemas.microsoft.com/office/word/2010/wordprocessingCanvas" xmlns:cx="http://schemas.microsoft.com/office/drawing/2014/chartex" xmlns:cx1="http://schemas.microsoft.com/office/drawing/2015/9/8/chartex" xmlns:cx2="http://schemas.microsoft.com/office/drawing/2015/10/21/chartex" xmlns:cx3="http://schemas.microsoft.com/office/drawing/2016/5/9/chartex" xmlns:cx4="http://schemas.microsoft.com/office/drawing/2016/5/10/chartex" xmlns:cx5="http://schemas.microsoft.com/office/drawing/2016/5/11/chartex" xmlns:cx6="http://schemas.microsoft.com/office/drawing/2016/5/12/chartex" xmlns:cx7="http://schemas.microsoft.com/office/drawing/2016/5/13/chartex" xmlns:cx8="http://schemas.microsoft.com/office/drawing/2016/5/14/chartex" xmlns:mc="http://schemas.openxmlformats.org/markup-compatibility/2006" xmlns:aink="http://schemas.microsoft.com/office/drawing/2016/ink" xmlns:am3d="http://schemas.microsoft.com/office/drawing/2017/model3d" xmlns:o="urn:schemas-microsoft-com:office:office" xmlns:oel="http://schemas.microsoft.com/office/2019/extlst" xmlns:r="http://schemas.openxmlformats.org/officeDocument/2006/relationships" xmlns:m="http://schemas.openxmlformats.org/officeDocument/2006/math" xmlns:v="urn:schemas-microsoft-com:vml" xmlns:wp14="http://schemas.microsoft.com/office/word/2010/wordprocessingDrawing" xmlns:wp="http://schemas.openxmlformats.org/drawingml/2006/wordprocessingDrawing" xmlns:w10="urn:schemas-microsoft-com:office:word" xmlns:w="http://schemas.openxmlformats.org/wordprocessingml/2006/main" xmlns:w14="http://schemas.microsoft.com/office/word/2010/wordml" xmlns:w15="http://schemas.microsoft.com/office/word/2012/wordml" xmlns:w16cex="http://schemas.microsoft.com/office/word/2018/wordml/cex" xmlns:w16cid="http://schemas.microsoft.com/office/word/2016/wordml/cid" xmlns:w16="http://schemas.microsoft.com/office/word/2018/wordml" xmlns:w16du="http://schemas.microsoft.com/office/word/2023/wordml/word16du" xmlns:w16sdtdh="http://schemas.microsoft.com/office/word/2020/wordml/sdtdatahash" xmlns:w16se="http://schemas.microsoft.com/office/word/2015/wordml/symex" xmlns:wpg="http://schemas.microsoft.com/office/word/2010/wordprocessingGroup" xmlns:wpi="http://schemas.microsoft.com/office/word/2010/wordprocessingInk" xmlns:wne="http://schemas.microsoft.com/office/word/2006/wordml" xmlns:wps="http://schemas.microsoft.com/office/word/2010/wordprocessingShape" mc:Ignorable="w14 w15 w16se w16cid w16 w16cex w16sdtdh wp14">
   <w:p>
     <w:pPr>
       <w:pStyle w:val="Header"/>
@@ -5302,7 +5499,7 @@
 </file>
 
 <file path=word/numbering.xml><?xml version="1.0" encoding="utf-8"?>
-<w:numbering xmlns:wpc="http://schemas.microsoft.com/office/word/2010/wordprocessingCanvas" xmlns:cx="http://schemas.microsoft.com/office/drawing/2014/chartex" xmlns:cx1="http://schemas.microsoft.com/office/drawing/2015/9/8/chartex" xmlns:cx2="http://schemas.microsoft.com/office/drawing/2015/10/21/chartex" xmlns:cx3="http://schemas.microsoft.com/office/drawing/2016/5/9/chartex" xmlns:cx4="http://schemas.microsoft.com/office/drawing/2016/5/10/chartex" xmlns:cx5="http://schemas.microsoft.com/office/drawing/2016/5/11/chartex" xmlns:cx6="http://schemas.microsoft.com/office/drawing/2016/5/12/chartex" xmlns:cx7="http://schemas.microsoft.com/office/drawing/2016/5/13/chartex" xmlns:cx8="http://schemas.microsoft.com/office/drawing/2016/5/14/chartex" xmlns:mc="http://schemas.openxmlformats.org/markup-compatibility/2006" xmlns:aink="http://schemas.microsoft.com/office/drawing/2016/ink" xmlns:am3d="http://schemas.microsoft.com/office/drawing/2017/model3d" xmlns:o="urn:schemas-microsoft-com:office:office" xmlns:oel="http://schemas.microsoft.com/office/2019/extlst" xmlns:r="http://schemas.openxmlformats.org/officeDocument/2006/relationships" xmlns:m="http://schemas.openxmlformats.org/officeDocument/2006/math" xmlns:v="urn:schemas-microsoft-com:vml" xmlns:wp14="http://schemas.microsoft.com/office/word/2010/wordprocessingDrawing" xmlns:wp="http://schemas.openxmlformats.org/drawingml/2006/wordprocessingDrawing" xmlns:w10="urn:schemas-microsoft-com:office:word" xmlns:w="http://schemas.openxmlformats.org/wordprocessingml/2006/main" xmlns:w14="http://schemas.microsoft.com/office/word/2010/wordml" xmlns:w15="http://schemas.microsoft.com/office/word/2012/wordml" xmlns:w16cex="http://schemas.microsoft.com/office/word/2018/wordml/cex" xmlns:w16cid="http://schemas.microsoft.com/office/word/2016/wordml/cid" xmlns:w16="http://schemas.microsoft.com/office/word/2018/wordml" xmlns:w16sdtdh="http://schemas.microsoft.com/office/word/2020/wordml/sdtdatahash" xmlns:w16se="http://schemas.microsoft.com/office/word/2015/wordml/symex" xmlns:wpg="http://schemas.microsoft.com/office/word/2010/wordprocessingGroup" xmlns:wpi="http://schemas.microsoft.com/office/word/2010/wordprocessingInk" xmlns:wne="http://schemas.microsoft.com/office/word/2006/wordml" xmlns:wps="http://schemas.microsoft.com/office/word/2010/wordprocessingShape" mc:Ignorable="w14 w15 w16se w16cid w16 w16cex w16sdtdh wp14">
+<w:numbering xmlns:wpc="http://schemas.microsoft.com/office/word/2010/wordprocessingCanvas" xmlns:cx="http://schemas.microsoft.com/office/drawing/2014/chartex" xmlns:cx1="http://schemas.microsoft.com/office/drawing/2015/9/8/chartex" xmlns:cx2="http://schemas.microsoft.com/office/drawing/2015/10/21/chartex" xmlns:cx3="http://schemas.microsoft.com/office/drawing/2016/5/9/chartex" xmlns:cx4="http://schemas.microsoft.com/office/drawing/2016/5/10/chartex" xmlns:cx5="http://schemas.microsoft.com/office/drawing/2016/5/11/chartex" xmlns:cx6="http://schemas.microsoft.com/office/drawing/2016/5/12/chartex" xmlns:cx7="http://schemas.microsoft.com/office/drawing/2016/5/13/chartex" xmlns:cx8="http://schemas.microsoft.com/office/drawing/2016/5/14/chartex" xmlns:mc="http://schemas.openxmlformats.org/markup-compatibility/2006" xmlns:aink="http://schemas.microsoft.com/office/drawing/2016/ink" xmlns:am3d="http://schemas.microsoft.com/office/drawing/2017/model3d" xmlns:o="urn:schemas-microsoft-com:office:office" xmlns:oel="http://schemas.microsoft.com/office/2019/extlst" xmlns:r="http://schemas.openxmlformats.org/officeDocument/2006/relationships" xmlns:m="http://schemas.openxmlformats.org/officeDocument/2006/math" xmlns:v="urn:schemas-microsoft-com:vml" xmlns:wp14="http://schemas.microsoft.com/office/word/2010/wordprocessingDrawing" xmlns:wp="http://schemas.openxmlformats.org/drawingml/2006/wordprocessingDrawing" xmlns:w10="urn:schemas-microsoft-com:office:word" xmlns:w="http://schemas.openxmlformats.org/wordprocessingml/2006/main" xmlns:w14="http://schemas.microsoft.com/office/word/2010/wordml" xmlns:w15="http://schemas.microsoft.com/office/word/2012/wordml" xmlns:w16cex="http://schemas.microsoft.com/office/word/2018/wordml/cex" xmlns:w16cid="http://schemas.microsoft.com/office/word/2016/wordml/cid" xmlns:w16="http://schemas.microsoft.com/office/word/2018/wordml" xmlns:w16du="http://schemas.microsoft.com/office/word/2023/wordml/word16du" xmlns:w16sdtdh="http://schemas.microsoft.com/office/word/2020/wordml/sdtdatahash" xmlns:w16se="http://schemas.microsoft.com/office/word/2015/wordml/symex" xmlns:wpg="http://schemas.microsoft.com/office/word/2010/wordprocessingGroup" xmlns:wpi="http://schemas.microsoft.com/office/word/2010/wordprocessingInk" xmlns:wne="http://schemas.microsoft.com/office/word/2006/wordml" xmlns:wps="http://schemas.microsoft.com/office/word/2010/wordprocessingShape" mc:Ignorable="w14 w15 w16se w16cid w16 w16cex w16sdtdh wp14">
   <w:abstractNum w:abstractNumId="0" w15:restartNumberingAfterBreak="0">
     <w:nsid w:val="087C3772"/>
     <w:multiLevelType w:val="hybridMultilevel"/>

</xml_diff>

<commit_message>
Update contact me section + Fix other sections
</commit_message>
<xml_diff>
--- a/docs/Omid Reza Heidari-CV.docx
+++ b/docs/Omid Reza Heidari-CV.docx
@@ -6,12 +6,14 @@
       <w:pPr>
         <w:jc w:val="center"/>
         <w:rPr>
+          <w:rStyle w:val="Hyperlink"/>
           <w:rFonts w:asciiTheme="minorBidi" w:hAnsiTheme="minorBidi"/>
           <w:b/>
           <w:bCs/>
           <w:color w:val="4C4D4F"/>
           <w:sz w:val="36"/>
           <w:szCs w:val="36"/>
+          <w:u w:val="none"/>
         </w:rPr>
       </w:pPr>
       <w:r>
@@ -26,121 +28,487 @@
         <w:t>Omid Reza Heidari</w:t>
       </w:r>
     </w:p>
-    <w:p>
-      <w:pPr>
+    <w:tbl>
+      <w:tblPr>
+        <w:tblStyle w:val="TableGrid"/>
+        <w:tblW w:w="8805" w:type="dxa"/>
         <w:jc w:val="center"/>
-        <w:rPr>
-          <w:rFonts w:asciiTheme="minorBidi" w:hAnsiTheme="minorBidi"/>
-          <w:color w:val="4B4C4E"/>
-        </w:rPr>
-      </w:pPr>
-      <w:hyperlink r:id="rId8" w:history="1">
-        <w:r>
-          <w:rPr>
-            <w:rStyle w:val="Hyperlink"/>
-            <w:rFonts w:asciiTheme="minorBidi" w:hAnsiTheme="minorBidi"/>
-            <w:color w:val="2F5496" w:themeColor="accent1" w:themeShade="BF"/>
-            <w:u w:val="none"/>
-          </w:rPr>
-          <w:t>Email: omid.orh@gmail.com</w:t>
-        </w:r>
-      </w:hyperlink>
-      <w:r>
-        <w:rPr>
-          <w:rFonts w:asciiTheme="minorBidi" w:hAnsiTheme="minorBidi"/>
-        </w:rPr>
-        <w:t xml:space="preserve"> </w:t>
-      </w:r>
-      <w:r>
-        <w:rPr>
-          <w:rFonts w:asciiTheme="minorBidi" w:hAnsiTheme="minorBidi"/>
-          <w:color w:val="4C4D4F"/>
-        </w:rPr>
-        <w:t>•</w:t>
-      </w:r>
-      <w:r>
-        <w:rPr>
-          <w:rFonts w:asciiTheme="minorBidi" w:hAnsiTheme="minorBidi"/>
-          <w:color w:val="4B4C4E"/>
-        </w:rPr>
-        <w:t xml:space="preserve"> </w:t>
-      </w:r>
-      <w:hyperlink r:id="rId9" w:history="1">
-        <w:r>
-          <w:rPr>
-            <w:rStyle w:val="Hyperlink"/>
-            <w:rFonts w:asciiTheme="minorBidi" w:hAnsiTheme="minorBidi"/>
-            <w:color w:val="2F5496" w:themeColor="accent1" w:themeShade="BF"/>
-            <w:u w:val="none"/>
-          </w:rPr>
-          <w:t>Skype Account</w:t>
-        </w:r>
-      </w:hyperlink>
-      <w:r>
-        <w:rPr>
-          <w:rFonts w:asciiTheme="minorBidi" w:hAnsiTheme="minorBidi"/>
-          <w:color w:val="4B4C4E"/>
-        </w:rPr>
-        <w:t xml:space="preserve"> </w:t>
-      </w:r>
-      <w:r>
-        <w:rPr>
-          <w:rFonts w:asciiTheme="minorBidi" w:hAnsiTheme="minorBidi"/>
-          <w:color w:val="4C4D4F"/>
-        </w:rPr>
-        <w:t>•</w:t>
-      </w:r>
-      <w:r>
-        <w:rPr>
-          <w:rFonts w:asciiTheme="minorBidi" w:hAnsiTheme="minorBidi"/>
-          <w:color w:val="4B4C4E"/>
-        </w:rPr>
-        <w:t xml:space="preserve"> </w:t>
-      </w:r>
-      <w:hyperlink r:id="rId10" w:history="1">
-        <w:r>
-          <w:rPr>
-            <w:rStyle w:val="Hyperlink"/>
-            <w:rFonts w:asciiTheme="minorBidi" w:hAnsiTheme="minorBidi"/>
-            <w:color w:val="2F5496" w:themeColor="accent1" w:themeShade="BF"/>
-            <w:u w:val="none"/>
-          </w:rPr>
-          <w:t>LinkedIn Account</w:t>
-        </w:r>
-      </w:hyperlink>
-      <w:r>
-        <w:rPr>
-          <w:rFonts w:asciiTheme="minorBidi" w:hAnsiTheme="minorBidi"/>
-          <w:color w:val="4B4C4E"/>
-        </w:rPr>
-        <w:t xml:space="preserve"> </w:t>
-      </w:r>
-      <w:r>
-        <w:rPr>
-          <w:rFonts w:asciiTheme="minorBidi" w:hAnsiTheme="minorBidi"/>
-          <w:color w:val="4C4D4F"/>
-        </w:rPr>
-        <w:t>•</w:t>
-      </w:r>
-      <w:r>
-        <w:rPr>
-          <w:rFonts w:asciiTheme="minorBidi" w:hAnsiTheme="minorBidi"/>
-          <w:color w:val="4B4C4E"/>
-        </w:rPr>
-        <w:t xml:space="preserve"> </w:t>
-      </w:r>
-      <w:hyperlink r:id="rId11" w:history="1">
-        <w:r>
-          <w:rPr>
-            <w:rStyle w:val="Hyperlink"/>
-            <w:rFonts w:asciiTheme="minorBidi" w:hAnsiTheme="minorBidi"/>
-            <w:color w:val="2F5496" w:themeColor="accent1" w:themeShade="BF"/>
-            <w:u w:val="none"/>
-          </w:rPr>
-          <w:t>GitHub Account</w:t>
-        </w:r>
-      </w:hyperlink>
-    </w:p>
+        <w:tblBorders>
+          <w:top w:val="none" w:sz="0" w:space="0" w:color="auto"/>
+          <w:left w:val="none" w:sz="0" w:space="0" w:color="auto"/>
+          <w:bottom w:val="none" w:sz="0" w:space="0" w:color="auto"/>
+          <w:right w:val="none" w:sz="0" w:space="0" w:color="auto"/>
+          <w:insideH w:val="none" w:sz="0" w:space="0" w:color="auto"/>
+          <w:insideV w:val="none" w:sz="0" w:space="0" w:color="auto"/>
+        </w:tblBorders>
+        <w:tblLook w:val="04A0" w:firstRow="1" w:lastRow="0" w:firstColumn="1" w:lastColumn="0" w:noHBand="0" w:noVBand="1"/>
+      </w:tblPr>
+      <w:tblGrid>
+        <w:gridCol w:w="1080"/>
+        <w:gridCol w:w="1296"/>
+        <w:gridCol w:w="1080"/>
+        <w:gridCol w:w="2109"/>
+        <w:gridCol w:w="1080"/>
+        <w:gridCol w:w="1080"/>
+        <w:gridCol w:w="1080"/>
+      </w:tblGrid>
+      <w:tr>
+        <w:trPr>
+          <w:jc w:val="center"/>
+        </w:trPr>
+        <w:tc>
+          <w:tcPr>
+            <w:tcW w:w="1080" w:type="dxa"/>
+            <w:vAlign w:val="center"/>
+          </w:tcPr>
+          <w:p>
+            <w:pPr>
+              <w:jc w:val="center"/>
+              <w:rPr>
+                <w:rStyle w:val="Hyperlink"/>
+                <w:rFonts w:asciiTheme="minorBidi" w:hAnsiTheme="minorBidi"/>
+                <w:color w:val="2F5496" w:themeColor="accent1" w:themeShade="BF"/>
+                <w:u w:val="none"/>
+              </w:rPr>
+            </w:pPr>
+            <w:r>
+              <w:rPr>
+                <w:rFonts w:asciiTheme="minorBidi" w:hAnsiTheme="minorBidi"/>
+                <w:noProof/>
+                <w:color w:val="2F5496" w:themeColor="accent1" w:themeShade="BF"/>
+              </w:rPr>
+              <w:drawing>
+                <wp:inline distT="0" distB="0" distL="0" distR="0" wp14:anchorId="3566DF1D" wp14:editId="647B442E">
+                  <wp:extent cx="548640" cy="548640"/>
+                  <wp:effectExtent l="0" t="0" r="0" b="0"/>
+                  <wp:docPr id="6" name="Picture 6"/>
+                  <wp:cNvGraphicFramePr>
+                    <a:graphicFrameLocks xmlns:a="http://schemas.openxmlformats.org/drawingml/2006/main" noChangeAspect="1"/>
+                  </wp:cNvGraphicFramePr>
+                  <a:graphic xmlns:a="http://schemas.openxmlformats.org/drawingml/2006/main">
+                    <a:graphicData uri="http://schemas.openxmlformats.org/drawingml/2006/picture">
+                      <pic:pic xmlns:pic="http://schemas.openxmlformats.org/drawingml/2006/picture">
+                        <pic:nvPicPr>
+                          <pic:cNvPr id="6" name="Picture 6"/>
+                          <pic:cNvPicPr/>
+                        </pic:nvPicPr>
+                        <pic:blipFill>
+                          <a:blip r:embed="rId8" cstate="print">
+                            <a:extLst>
+                              <a:ext uri="{28A0092B-C50C-407E-A947-70E740481C1C}">
+                                <a14:useLocalDpi xmlns:a14="http://schemas.microsoft.com/office/drawing/2010/main" val="0"/>
+                              </a:ext>
+                            </a:extLst>
+                          </a:blip>
+                          <a:stretch>
+                            <a:fillRect/>
+                          </a:stretch>
+                        </pic:blipFill>
+                        <pic:spPr>
+                          <a:xfrm>
+                            <a:off x="0" y="0"/>
+                            <a:ext cx="548640" cy="548640"/>
+                          </a:xfrm>
+                          <a:prstGeom prst="rect">
+                            <a:avLst/>
+                          </a:prstGeom>
+                        </pic:spPr>
+                      </pic:pic>
+                    </a:graphicData>
+                  </a:graphic>
+                </wp:inline>
+              </w:drawing>
+            </w:r>
+          </w:p>
+        </w:tc>
+        <w:tc>
+          <w:tcPr>
+            <w:tcW w:w="1296" w:type="dxa"/>
+            <w:vAlign w:val="center"/>
+          </w:tcPr>
+          <w:p>
+            <w:pPr>
+              <w:rPr>
+                <w:rStyle w:val="Hyperlink"/>
+                <w:rFonts w:asciiTheme="minorBidi" w:hAnsiTheme="minorBidi"/>
+                <w:color w:val="2F5496" w:themeColor="accent1" w:themeShade="BF"/>
+                <w:u w:val="none"/>
+              </w:rPr>
+            </w:pPr>
+            <w:r>
+              <w:rPr>
+                <w:rStyle w:val="Hyperlink"/>
+                <w:rFonts w:asciiTheme="minorBidi" w:hAnsiTheme="minorBidi"/>
+                <w:color w:val="404040" w:themeColor="text1" w:themeTint="BF"/>
+                <w:sz w:val="20"/>
+                <w:szCs w:val="20"/>
+                <w:u w:val="none"/>
+              </w:rPr>
+              <w:t>Zanjan, Iran</w:t>
+            </w:r>
+          </w:p>
+        </w:tc>
+        <w:tc>
+          <w:tcPr>
+            <w:tcW w:w="1080" w:type="dxa"/>
+            <w:vAlign w:val="center"/>
+          </w:tcPr>
+          <w:p>
+            <w:pPr>
+              <w:jc w:val="center"/>
+              <w:rPr>
+                <w:rStyle w:val="Hyperlink"/>
+                <w:rFonts w:asciiTheme="minorBidi" w:hAnsiTheme="minorBidi"/>
+                <w:color w:val="2F5496" w:themeColor="accent1" w:themeShade="BF"/>
+                <w:u w:val="none"/>
+              </w:rPr>
+            </w:pPr>
+            <w:r>
+              <w:rPr>
+                <w:rFonts w:asciiTheme="minorBidi" w:hAnsiTheme="minorBidi"/>
+                <w:noProof/>
+                <w:color w:val="2F5496" w:themeColor="accent1" w:themeShade="BF"/>
+              </w:rPr>
+              <w:drawing>
+                <wp:inline distT="0" distB="0" distL="0" distR="0" wp14:anchorId="062A9834" wp14:editId="02F185C4">
+                  <wp:extent cx="548640" cy="548640"/>
+                  <wp:effectExtent l="0" t="0" r="0" b="0"/>
+                  <wp:docPr id="5" name="Picture 5">
+                    <a:hlinkClick xmlns:a="http://schemas.openxmlformats.org/drawingml/2006/main" r:id="rId9"/>
+                  </wp:docPr>
+                  <wp:cNvGraphicFramePr>
+                    <a:graphicFrameLocks xmlns:a="http://schemas.openxmlformats.org/drawingml/2006/main" noChangeAspect="1"/>
+                  </wp:cNvGraphicFramePr>
+                  <a:graphic xmlns:a="http://schemas.openxmlformats.org/drawingml/2006/main">
+                    <a:graphicData uri="http://schemas.openxmlformats.org/drawingml/2006/picture">
+                      <pic:pic xmlns:pic="http://schemas.openxmlformats.org/drawingml/2006/picture">
+                        <pic:nvPicPr>
+                          <pic:cNvPr id="5" name="Picture 5">
+                            <a:hlinkClick r:id="rId9"/>
+                          </pic:cNvPr>
+                          <pic:cNvPicPr/>
+                        </pic:nvPicPr>
+                        <pic:blipFill>
+                          <a:blip r:embed="rId10" cstate="print">
+                            <a:extLst>
+                              <a:ext uri="{28A0092B-C50C-407E-A947-70E740481C1C}">
+                                <a14:useLocalDpi xmlns:a14="http://schemas.microsoft.com/office/drawing/2010/main" val="0"/>
+                              </a:ext>
+                            </a:extLst>
+                          </a:blip>
+                          <a:stretch>
+                            <a:fillRect/>
+                          </a:stretch>
+                        </pic:blipFill>
+                        <pic:spPr>
+                          <a:xfrm>
+                            <a:off x="0" y="0"/>
+                            <a:ext cx="548640" cy="548640"/>
+                          </a:xfrm>
+                          <a:prstGeom prst="rect">
+                            <a:avLst/>
+                          </a:prstGeom>
+                        </pic:spPr>
+                      </pic:pic>
+                    </a:graphicData>
+                  </a:graphic>
+                </wp:inline>
+              </w:drawing>
+            </w:r>
+          </w:p>
+        </w:tc>
+        <w:tc>
+          <w:tcPr>
+            <w:tcW w:w="2109" w:type="dxa"/>
+            <w:vAlign w:val="center"/>
+          </w:tcPr>
+          <w:p>
+            <w:pPr>
+              <w:rPr>
+                <w:rFonts w:asciiTheme="minorBidi" w:hAnsiTheme="minorBidi"/>
+                <w:noProof/>
+                <w:color w:val="4B4C4E"/>
+              </w:rPr>
+            </w:pPr>
+            <w:r>
+              <w:rPr>
+                <w:rFonts w:asciiTheme="minorBidi" w:hAnsiTheme="minorBidi"/>
+                <w:noProof/>
+                <w:color w:val="404040" w:themeColor="text1" w:themeTint="BF"/>
+                <w:sz w:val="20"/>
+                <w:szCs w:val="20"/>
+              </w:rPr>
+              <w:t>omid</w:t>
+            </w:r>
+            <w:r>
+              <w:rPr>
+                <w:rFonts w:asciiTheme="minorBidi" w:hAnsiTheme="minorBidi"/>
+                <w:noProof/>
+                <w:color w:val="404040" w:themeColor="text1" w:themeTint="BF"/>
+                <w:sz w:val="20"/>
+                <w:szCs w:val="20"/>
+              </w:rPr>
+              <w:t>.</w:t>
+            </w:r>
+            <w:r>
+              <w:rPr>
+                <w:rFonts w:asciiTheme="minorBidi" w:hAnsiTheme="minorBidi"/>
+                <w:noProof/>
+                <w:color w:val="404040" w:themeColor="text1" w:themeTint="BF"/>
+                <w:sz w:val="20"/>
+                <w:szCs w:val="20"/>
+              </w:rPr>
+              <w:t>orh</w:t>
+            </w:r>
+            <w:r>
+              <w:rPr>
+                <w:rFonts w:asciiTheme="minorBidi" w:hAnsiTheme="minorBidi"/>
+                <w:noProof/>
+                <w:color w:val="404040" w:themeColor="text1" w:themeTint="BF"/>
+                <w:sz w:val="20"/>
+                <w:szCs w:val="20"/>
+              </w:rPr>
+              <w:t>@</w:t>
+            </w:r>
+            <w:r>
+              <w:rPr>
+                <w:rFonts w:asciiTheme="minorBidi" w:hAnsiTheme="minorBidi"/>
+                <w:noProof/>
+                <w:color w:val="404040" w:themeColor="text1" w:themeTint="BF"/>
+                <w:sz w:val="20"/>
+                <w:szCs w:val="20"/>
+              </w:rPr>
+              <w:t>gmail</w:t>
+            </w:r>
+            <w:r>
+              <w:rPr>
+                <w:rFonts w:asciiTheme="minorBidi" w:hAnsiTheme="minorBidi"/>
+                <w:noProof/>
+                <w:color w:val="404040" w:themeColor="text1" w:themeTint="BF"/>
+                <w:sz w:val="20"/>
+                <w:szCs w:val="20"/>
+              </w:rPr>
+              <w:t>.</w:t>
+            </w:r>
+            <w:r>
+              <w:rPr>
+                <w:rFonts w:asciiTheme="minorBidi" w:hAnsiTheme="minorBidi"/>
+                <w:noProof/>
+                <w:color w:val="404040" w:themeColor="text1" w:themeTint="BF"/>
+                <w:sz w:val="20"/>
+                <w:szCs w:val="20"/>
+              </w:rPr>
+              <w:t>com</w:t>
+            </w:r>
+          </w:p>
+        </w:tc>
+        <w:tc>
+          <w:tcPr>
+            <w:tcW w:w="1080" w:type="dxa"/>
+            <w:vAlign w:val="center"/>
+          </w:tcPr>
+          <w:p>
+            <w:pPr>
+              <w:jc w:val="center"/>
+              <w:rPr>
+                <w:rStyle w:val="Hyperlink"/>
+                <w:rFonts w:asciiTheme="minorBidi" w:hAnsiTheme="minorBidi"/>
+                <w:color w:val="2F5496" w:themeColor="accent1" w:themeShade="BF"/>
+                <w:u w:val="none"/>
+              </w:rPr>
+            </w:pPr>
+            <w:r>
+              <w:rPr>
+                <w:rFonts w:asciiTheme="minorBidi" w:hAnsiTheme="minorBidi"/>
+                <w:noProof/>
+                <w:color w:val="2F5496" w:themeColor="accent1" w:themeShade="BF"/>
+              </w:rPr>
+              <w:drawing>
+                <wp:inline distT="0" distB="0" distL="0" distR="0" wp14:anchorId="579C447F" wp14:editId="6D737F8F">
+                  <wp:extent cx="548640" cy="548640"/>
+                  <wp:effectExtent l="0" t="0" r="0" b="3810"/>
+                  <wp:docPr id="7" name="Picture 7">
+                    <a:hlinkClick xmlns:a="http://schemas.openxmlformats.org/drawingml/2006/main" r:id="rId11"/>
+                  </wp:docPr>
+                  <wp:cNvGraphicFramePr>
+                    <a:graphicFrameLocks xmlns:a="http://schemas.openxmlformats.org/drawingml/2006/main" noChangeAspect="1"/>
+                  </wp:cNvGraphicFramePr>
+                  <a:graphic xmlns:a="http://schemas.openxmlformats.org/drawingml/2006/main">
+                    <a:graphicData uri="http://schemas.openxmlformats.org/drawingml/2006/picture">
+                      <pic:pic xmlns:pic="http://schemas.openxmlformats.org/drawingml/2006/picture">
+                        <pic:nvPicPr>
+                          <pic:cNvPr id="7" name="Picture 7">
+                            <a:hlinkClick r:id="rId11"/>
+                          </pic:cNvPr>
+                          <pic:cNvPicPr/>
+                        </pic:nvPicPr>
+                        <pic:blipFill>
+                          <a:blip r:embed="rId12" cstate="print">
+                            <a:extLst>
+                              <a:ext uri="{28A0092B-C50C-407E-A947-70E740481C1C}">
+                                <a14:useLocalDpi xmlns:a14="http://schemas.microsoft.com/office/drawing/2010/main" val="0"/>
+                              </a:ext>
+                            </a:extLst>
+                          </a:blip>
+                          <a:stretch>
+                            <a:fillRect/>
+                          </a:stretch>
+                        </pic:blipFill>
+                        <pic:spPr>
+                          <a:xfrm>
+                            <a:off x="0" y="0"/>
+                            <a:ext cx="548640" cy="548640"/>
+                          </a:xfrm>
+                          <a:prstGeom prst="rect">
+                            <a:avLst/>
+                          </a:prstGeom>
+                        </pic:spPr>
+                      </pic:pic>
+                    </a:graphicData>
+                  </a:graphic>
+                </wp:inline>
+              </w:drawing>
+            </w:r>
+          </w:p>
+        </w:tc>
+        <w:tc>
+          <w:tcPr>
+            <w:tcW w:w="1080" w:type="dxa"/>
+          </w:tcPr>
+          <w:p>
+            <w:pPr>
+              <w:jc w:val="center"/>
+              <w:rPr>
+                <w:rFonts w:asciiTheme="minorBidi" w:hAnsiTheme="minorBidi"/>
+                <w:noProof/>
+                <w:color w:val="4B4C4E"/>
+              </w:rPr>
+            </w:pPr>
+            <w:r>
+              <w:rPr>
+                <w:rFonts w:asciiTheme="minorBidi" w:hAnsiTheme="minorBidi"/>
+                <w:noProof/>
+                <w:color w:val="4B4C4E"/>
+              </w:rPr>
+              <w:drawing>
+                <wp:inline distT="0" distB="0" distL="0" distR="0" wp14:anchorId="562F3B5F" wp14:editId="12F64FFD">
+                  <wp:extent cx="548640" cy="548640"/>
+                  <wp:effectExtent l="0" t="0" r="0" b="3810"/>
+                  <wp:docPr id="8" name="Picture 8">
+                    <a:hlinkClick xmlns:a="http://schemas.openxmlformats.org/drawingml/2006/main" r:id="rId13"/>
+                  </wp:docPr>
+                  <wp:cNvGraphicFramePr>
+                    <a:graphicFrameLocks xmlns:a="http://schemas.openxmlformats.org/drawingml/2006/main" noChangeAspect="1"/>
+                  </wp:cNvGraphicFramePr>
+                  <a:graphic xmlns:a="http://schemas.openxmlformats.org/drawingml/2006/main">
+                    <a:graphicData uri="http://schemas.openxmlformats.org/drawingml/2006/picture">
+                      <pic:pic xmlns:pic="http://schemas.openxmlformats.org/drawingml/2006/picture">
+                        <pic:nvPicPr>
+                          <pic:cNvPr id="8" name="Picture 8">
+                            <a:hlinkClick r:id="rId13"/>
+                          </pic:cNvPr>
+                          <pic:cNvPicPr/>
+                        </pic:nvPicPr>
+                        <pic:blipFill>
+                          <a:blip r:embed="rId14" cstate="print">
+                            <a:extLst>
+                              <a:ext uri="{28A0092B-C50C-407E-A947-70E740481C1C}">
+                                <a14:useLocalDpi xmlns:a14="http://schemas.microsoft.com/office/drawing/2010/main" val="0"/>
+                              </a:ext>
+                            </a:extLst>
+                          </a:blip>
+                          <a:stretch>
+                            <a:fillRect/>
+                          </a:stretch>
+                        </pic:blipFill>
+                        <pic:spPr>
+                          <a:xfrm>
+                            <a:off x="0" y="0"/>
+                            <a:ext cx="548640" cy="548640"/>
+                          </a:xfrm>
+                          <a:prstGeom prst="rect">
+                            <a:avLst/>
+                          </a:prstGeom>
+                        </pic:spPr>
+                      </pic:pic>
+                    </a:graphicData>
+                  </a:graphic>
+                </wp:inline>
+              </w:drawing>
+            </w:r>
+          </w:p>
+        </w:tc>
+        <w:tc>
+          <w:tcPr>
+            <w:tcW w:w="1080" w:type="dxa"/>
+            <w:vAlign w:val="center"/>
+          </w:tcPr>
+          <w:p>
+            <w:pPr>
+              <w:jc w:val="center"/>
+              <w:rPr>
+                <w:rStyle w:val="Hyperlink"/>
+                <w:rFonts w:asciiTheme="minorBidi" w:hAnsiTheme="minorBidi"/>
+                <w:color w:val="2F5496" w:themeColor="accent1" w:themeShade="BF"/>
+                <w:u w:val="none"/>
+              </w:rPr>
+            </w:pPr>
+            <w:r>
+              <w:rPr>
+                <w:rFonts w:asciiTheme="minorBidi" w:hAnsiTheme="minorBidi"/>
+                <w:noProof/>
+                <w:color w:val="2F5496" w:themeColor="accent1" w:themeShade="BF"/>
+              </w:rPr>
+              <w:drawing>
+                <wp:inline distT="0" distB="0" distL="0" distR="0" wp14:anchorId="7F26288C" wp14:editId="30910CFA">
+                  <wp:extent cx="548640" cy="548640"/>
+                  <wp:effectExtent l="0" t="0" r="0" b="3810"/>
+                  <wp:docPr id="9" name="Picture 9">
+                    <a:hlinkClick xmlns:a="http://schemas.openxmlformats.org/drawingml/2006/main" r:id="rId15"/>
+                  </wp:docPr>
+                  <wp:cNvGraphicFramePr>
+                    <a:graphicFrameLocks xmlns:a="http://schemas.openxmlformats.org/drawingml/2006/main" noChangeAspect="1"/>
+                  </wp:cNvGraphicFramePr>
+                  <a:graphic xmlns:a="http://schemas.openxmlformats.org/drawingml/2006/main">
+                    <a:graphicData uri="http://schemas.openxmlformats.org/drawingml/2006/picture">
+                      <pic:pic xmlns:pic="http://schemas.openxmlformats.org/drawingml/2006/picture">
+                        <pic:nvPicPr>
+                          <pic:cNvPr id="9" name="Picture 9">
+                            <a:hlinkClick r:id="rId15"/>
+                          </pic:cNvPr>
+                          <pic:cNvPicPr/>
+                        </pic:nvPicPr>
+                        <pic:blipFill>
+                          <a:blip r:embed="rId16" cstate="print">
+                            <a:extLst>
+                              <a:ext uri="{28A0092B-C50C-407E-A947-70E740481C1C}">
+                                <a14:useLocalDpi xmlns:a14="http://schemas.microsoft.com/office/drawing/2010/main" val="0"/>
+                              </a:ext>
+                            </a:extLst>
+                          </a:blip>
+                          <a:stretch>
+                            <a:fillRect/>
+                          </a:stretch>
+                        </pic:blipFill>
+                        <pic:spPr>
+                          <a:xfrm>
+                            <a:off x="0" y="0"/>
+                            <a:ext cx="548640" cy="548640"/>
+                          </a:xfrm>
+                          <a:prstGeom prst="rect">
+                            <a:avLst/>
+                          </a:prstGeom>
+                        </pic:spPr>
+                      </pic:pic>
+                    </a:graphicData>
+                  </a:graphic>
+                </wp:inline>
+              </w:drawing>
+            </w:r>
+          </w:p>
+        </w:tc>
+      </w:tr>
+    </w:tbl>
     <w:p>
       <w:pPr>
         <w:spacing w:line="276" w:lineRule="auto"/>
@@ -1904,7 +2272,7 @@
         </w:rPr>
         <w:t xml:space="preserve">Teaching Assistant, </w:t>
       </w:r>
-      <w:hyperlink r:id="rId12" w:history="1">
+      <w:hyperlink r:id="rId17" w:history="1">
         <w:r>
           <w:rPr>
             <w:rStyle w:val="Hyperlink"/>
@@ -2125,7 +2493,7 @@
         </w:rPr>
         <w:t xml:space="preserve">Teaching Assistant, </w:t>
       </w:r>
-      <w:hyperlink r:id="rId13" w:history="1">
+      <w:hyperlink r:id="rId18" w:history="1">
         <w:r>
           <w:rPr>
             <w:rStyle w:val="Hyperlink"/>
@@ -2213,6 +2581,7 @@
           <w:sz w:val="20"/>
           <w:szCs w:val="20"/>
         </w:rPr>
+        <w:lastRenderedPageBreak/>
         <w:t xml:space="preserve">Held course discussion sessions for up to </w:t>
       </w:r>
       <w:r>
@@ -2265,7 +2634,6 @@
           <w:sz w:val="20"/>
           <w:szCs w:val="20"/>
         </w:rPr>
-        <w:lastRenderedPageBreak/>
         <w:t>Prepare</w:t>
       </w:r>
       <w:r>
@@ -2330,7 +2698,7 @@
         </w:rPr>
         <w:t xml:space="preserve">Teaching Assistant, </w:t>
       </w:r>
-      <w:hyperlink r:id="rId14" w:history="1">
+      <w:hyperlink r:id="rId19" w:history="1">
         <w:r>
           <w:rPr>
             <w:rStyle w:val="Hyperlink"/>
@@ -2526,7 +2894,7 @@
         </w:rPr>
         <w:t xml:space="preserve">Teaching Assistant, </w:t>
       </w:r>
-      <w:hyperlink r:id="rId15" w:history="1">
+      <w:hyperlink r:id="rId20" w:history="1">
         <w:r>
           <w:rPr>
             <w:rStyle w:val="Hyperlink"/>
@@ -3357,7 +3725,7 @@
         </w:rPr>
         <w:t xml:space="preserve">Title: </w:t>
       </w:r>
-      <w:hyperlink r:id="rId16" w:history="1">
+      <w:hyperlink r:id="rId21" w:history="1">
         <w:r>
           <w:rPr>
             <w:rStyle w:val="Hyperlink"/>
@@ -3590,7 +3958,7 @@
         </w:rPr>
         <w:t xml:space="preserve">: </w:t>
       </w:r>
-      <w:hyperlink r:id="rId17" w:history="1">
+      <w:hyperlink r:id="rId22" w:history="1">
         <w:r>
           <w:rPr>
             <w:rStyle w:val="Hyperlink"/>
@@ -3782,7 +4150,7 @@
         </w:rPr>
         <w:t xml:space="preserve">: </w:t>
       </w:r>
-      <w:hyperlink r:id="rId18" w:history="1">
+      <w:hyperlink r:id="rId23" w:history="1">
         <w:r>
           <w:rPr>
             <w:rStyle w:val="Hyperlink"/>
@@ -4091,7 +4459,17 @@
           <w:sz w:val="20"/>
           <w:szCs w:val="20"/>
         </w:rPr>
-        <w:t>Network Security (20)</w:t>
+        <w:t xml:space="preserve">Network </w:t>
+      </w:r>
+      <w:r>
+        <w:rPr>
+          <w:rFonts w:asciiTheme="minorBidi" w:hAnsiTheme="minorBidi"/>
+          <w:color w:val="4C4D4F"/>
+          <w:sz w:val="20"/>
+          <w:szCs w:val="20"/>
+        </w:rPr>
+        <w:lastRenderedPageBreak/>
+        <w:t>Security (20)</w:t>
       </w:r>
       <w:r>
         <w:rPr>
@@ -4246,7 +4624,6 @@
           <w:szCs w:val="24"/>
           <w:lang w:bidi="fa-IR"/>
         </w:rPr>
-        <w:lastRenderedPageBreak/>
         <w:t>ONLINE</w:t>
       </w:r>
       <w:r>
@@ -4301,7 +4678,7 @@
         </w:rPr>
         <w:tab/>
       </w:r>
-      <w:hyperlink r:id="rId19" w:history="1">
+      <w:hyperlink r:id="rId24" w:history="1">
         <w:r>
           <w:rPr>
             <w:rStyle w:val="Hyperlink"/>
@@ -4311,29 +4688,7 @@
             <w:szCs w:val="20"/>
             <w:u w:val="none"/>
           </w:rPr>
-          <w:t>Calculus for Machine Learning a</w:t>
-        </w:r>
-        <w:r>
-          <w:rPr>
-            <w:rStyle w:val="Hyperlink"/>
-            <w:rFonts w:asciiTheme="minorBidi" w:hAnsiTheme="minorBidi"/>
-            <w:color w:val="2F5496" w:themeColor="accent1" w:themeShade="BF"/>
-            <w:sz w:val="20"/>
-            <w:szCs w:val="20"/>
-            <w:u w:val="none"/>
-          </w:rPr>
-          <w:t>n</w:t>
-        </w:r>
-        <w:r>
-          <w:rPr>
-            <w:rStyle w:val="Hyperlink"/>
-            <w:rFonts w:asciiTheme="minorBidi" w:hAnsiTheme="minorBidi"/>
-            <w:color w:val="2F5496" w:themeColor="accent1" w:themeShade="BF"/>
-            <w:sz w:val="20"/>
-            <w:szCs w:val="20"/>
-            <w:u w:val="none"/>
-          </w:rPr>
-          <w:t>d Data Science</w:t>
+          <w:t>Calculus for Machine Learning and Data Science</w:t>
         </w:r>
       </w:hyperlink>
     </w:p>
@@ -4341,12 +4696,6 @@
       <w:pPr>
         <w:spacing w:line="240" w:lineRule="auto"/>
         <w:ind w:left="720" w:firstLine="720"/>
-        <w:rPr>
-          <w:rFonts w:asciiTheme="minorBidi" w:hAnsiTheme="minorBidi"/>
-          <w:color w:val="4C4D4F"/>
-          <w:sz w:val="20"/>
-          <w:szCs w:val="20"/>
-        </w:rPr>
       </w:pPr>
       <w:r>
         <w:rPr>
@@ -4365,6 +4714,15 @@
           <w:szCs w:val="20"/>
         </w:rPr>
         <w:t>DeepLearning.AI</w:t>
+      </w:r>
+      <w:r>
+        <w:rPr>
+          <w:rFonts w:asciiTheme="minorBidi" w:hAnsiTheme="minorBidi"/>
+          <w:color w:val="4C4D4F"/>
+          <w:sz w:val="20"/>
+          <w:szCs w:val="20"/>
+        </w:rPr>
+        <w:t>, Grade: 94.22/100</w:t>
       </w:r>
     </w:p>
     <w:p>
@@ -4415,7 +4773,7 @@
         </w:rPr>
         <w:tab/>
       </w:r>
-      <w:hyperlink r:id="rId20" w:history="1">
+      <w:hyperlink r:id="rId25" w:history="1">
         <w:r>
           <w:rPr>
             <w:rStyle w:val="Hyperlink"/>
@@ -4458,6 +4816,15 @@
         </w:rPr>
         <w:t>DeepLearning.AI</w:t>
       </w:r>
+      <w:r>
+        <w:rPr>
+          <w:rFonts w:asciiTheme="minorBidi" w:hAnsiTheme="minorBidi"/>
+          <w:color w:val="4C4D4F"/>
+          <w:sz w:val="20"/>
+          <w:szCs w:val="20"/>
+        </w:rPr>
+        <w:t>, Grade: 99.37/100</w:t>
+      </w:r>
     </w:p>
     <w:p>
       <w:pPr>
@@ -4489,7 +4856,7 @@
         </w:rPr>
         <w:tab/>
       </w:r>
-      <w:hyperlink r:id="rId21" w:history="1">
+      <w:hyperlink r:id="rId26" w:history="1">
         <w:r>
           <w:rPr>
             <w:rStyle w:val="Hyperlink"/>
@@ -4554,7 +4921,7 @@
         </w:rPr>
         <w:tab/>
       </w:r>
-      <w:hyperlink r:id="rId22" w:history="1">
+      <w:hyperlink r:id="rId27" w:history="1">
         <w:r>
           <w:rPr>
             <w:rStyle w:val="Hyperlink"/>
@@ -4635,7 +5002,7 @@
         </w:rPr>
         <w:tab/>
       </w:r>
-      <w:hyperlink r:id="rId23" w:history="1">
+      <w:hyperlink r:id="rId28" w:history="1">
         <w:r>
           <w:rPr>
             <w:rStyle w:val="Hyperlink"/>
@@ -5258,12 +5625,12 @@
       </w:r>
     </w:p>
     <w:sectPr>
-      <w:headerReference w:type="even" r:id="rId24"/>
-      <w:headerReference w:type="default" r:id="rId25"/>
-      <w:footerReference w:type="even" r:id="rId26"/>
-      <w:footerReference w:type="default" r:id="rId27"/>
-      <w:headerReference w:type="first" r:id="rId28"/>
-      <w:footerReference w:type="first" r:id="rId29"/>
+      <w:headerReference w:type="even" r:id="rId29"/>
+      <w:headerReference w:type="default" r:id="rId30"/>
+      <w:footerReference w:type="even" r:id="rId31"/>
+      <w:footerReference w:type="default" r:id="rId32"/>
+      <w:headerReference w:type="first" r:id="rId33"/>
+      <w:footerReference w:type="first" r:id="rId34"/>
       <w:pgSz w:w="12240" w:h="15840"/>
       <w:pgMar w:top="1440" w:right="1440" w:bottom="1440" w:left="1440" w:header="720" w:footer="720" w:gutter="0"/>
       <w:pgBorders w:offsetFrom="page">

</xml_diff>

<commit_message>
Fix the color of a section
</commit_message>
<xml_diff>
--- a/docs/Omid Reza Heidari-CV.docx
+++ b/docs/Omid Reza Heidari-CV.docx
@@ -136,12 +136,10 @@
             </w:pPr>
             <w:r>
               <w:rPr>
-                <w:rStyle w:val="Hyperlink"/>
                 <w:rFonts w:asciiTheme="minorBidi" w:hAnsiTheme="minorBidi"/>
-                <w:color w:val="404040" w:themeColor="text1" w:themeTint="BF"/>
+                <w:color w:val="4C4D4F"/>
                 <w:sz w:val="20"/>
                 <w:szCs w:val="20"/>
-                <w:u w:val="none"/>
               </w:rPr>
               <w:t>Zanjan, Iran</w:t>
             </w:r>

</xml_diff>

<commit_message>
Make unique a color set for all sections
</commit_message>
<xml_diff>
--- a/docs/Omid Reza Heidari-CV.docx
+++ b/docs/Omid Reza Heidari-CV.docx
@@ -10,7 +10,7 @@
           <w:rFonts w:asciiTheme="minorBidi" w:hAnsiTheme="minorBidi"/>
           <w:b/>
           <w:bCs/>
-          <w:color w:val="4C4D4F"/>
+          <w:color w:val="auto"/>
           <w:sz w:val="36"/>
           <w:szCs w:val="36"/>
           <w:u w:val="none"/>
@@ -21,7 +21,6 @@
           <w:rFonts w:asciiTheme="minorBidi" w:hAnsiTheme="minorBidi"/>
           <w:b/>
           <w:bCs/>
-          <w:color w:val="4C4D4F"/>
           <w:sz w:val="36"/>
           <w:szCs w:val="36"/>
         </w:rPr>
@@ -137,7 +136,6 @@
             <w:r>
               <w:rPr>
                 <w:rFonts w:asciiTheme="minorBidi" w:hAnsiTheme="minorBidi"/>
-                <w:color w:val="4C4D4F"/>
                 <w:sz w:val="20"/>
                 <w:szCs w:val="20"/>
               </w:rPr>
@@ -229,7 +227,7 @@
                   <w:rStyle w:val="Hyperlink"/>
                   <w:rFonts w:asciiTheme="minorBidi" w:hAnsiTheme="minorBidi"/>
                   <w:noProof/>
-                  <w:color w:val="2F5496" w:themeColor="accent1" w:themeShade="BF"/>
+                  <w:color w:val="1F3864" w:themeColor="accent1" w:themeShade="80"/>
                   <w:sz w:val="20"/>
                   <w:szCs w:val="20"/>
                   <w:u w:val="none"/>
@@ -325,7 +323,7 @@
                   <w:rStyle w:val="Hyperlink"/>
                   <w:rFonts w:asciiTheme="minorBidi" w:hAnsiTheme="minorBidi"/>
                   <w:noProof/>
-                  <w:color w:val="2F5496" w:themeColor="accent1" w:themeShade="BF"/>
+                  <w:color w:val="1F3864" w:themeColor="accent1" w:themeShade="80"/>
                   <w:sz w:val="20"/>
                   <w:szCs w:val="20"/>
                   <w:u w:val="none"/>
@@ -355,7 +353,6 @@
           <w:rFonts w:asciiTheme="minorBidi" w:hAnsiTheme="minorBidi"/>
           <w:b/>
           <w:bCs/>
-          <w:color w:val="4C4D4F"/>
           <w:sz w:val="24"/>
           <w:szCs w:val="24"/>
         </w:rPr>
@@ -365,7 +362,6 @@
           <w:rFonts w:asciiTheme="minorBidi" w:hAnsiTheme="minorBidi"/>
           <w:b/>
           <w:bCs/>
-          <w:color w:val="4C4D4F"/>
           <w:sz w:val="24"/>
           <w:szCs w:val="24"/>
         </w:rPr>
@@ -379,7 +375,6 @@
           <w:rFonts w:asciiTheme="minorBidi" w:hAnsiTheme="minorBidi"/>
           <w:b/>
           <w:bCs/>
-          <w:color w:val="4C4D4F"/>
           <w:sz w:val="20"/>
           <w:szCs w:val="20"/>
         </w:rPr>
@@ -388,7 +383,6 @@
       <w:r>
         <w:rPr>
           <w:rFonts w:asciiTheme="minorBidi" w:hAnsiTheme="minorBidi"/>
-          <w:color w:val="4C4D4F"/>
           <w:sz w:val="20"/>
           <w:szCs w:val="20"/>
         </w:rPr>
@@ -397,7 +391,6 @@
       <w:r>
         <w:rPr>
           <w:rFonts w:asciiTheme="minorBidi" w:hAnsiTheme="minorBidi"/>
-          <w:color w:val="4C4D4F"/>
           <w:sz w:val="20"/>
           <w:szCs w:val="20"/>
         </w:rPr>
@@ -406,7 +399,6 @@
       <w:r>
         <w:rPr>
           <w:rFonts w:asciiTheme="minorBidi" w:hAnsiTheme="minorBidi"/>
-          <w:color w:val="4C4D4F"/>
           <w:sz w:val="20"/>
           <w:szCs w:val="20"/>
         </w:rPr>
@@ -415,7 +407,6 @@
       <w:r>
         <w:rPr>
           <w:rFonts w:asciiTheme="minorBidi" w:hAnsiTheme="minorBidi"/>
-          <w:color w:val="4C4D4F"/>
           <w:sz w:val="20"/>
           <w:szCs w:val="20"/>
         </w:rPr>
@@ -424,7 +415,6 @@
       <w:r>
         <w:rPr>
           <w:rFonts w:asciiTheme="minorBidi" w:hAnsiTheme="minorBidi"/>
-          <w:color w:val="4C4D4F"/>
           <w:sz w:val="20"/>
           <w:szCs w:val="20"/>
         </w:rPr>
@@ -435,7 +425,6 @@
           <w:rFonts w:asciiTheme="minorBidi" w:hAnsiTheme="minorBidi"/>
           <w:b/>
           <w:bCs/>
-          <w:color w:val="4C4D4F"/>
           <w:sz w:val="20"/>
           <w:szCs w:val="20"/>
         </w:rPr>
@@ -446,7 +435,6 @@
           <w:rFonts w:asciiTheme="minorBidi" w:hAnsiTheme="minorBidi"/>
           <w:b/>
           <w:bCs/>
-          <w:color w:val="4C4D4F"/>
           <w:sz w:val="20"/>
           <w:szCs w:val="20"/>
         </w:rPr>
@@ -457,7 +445,6 @@
           <w:rFonts w:asciiTheme="minorBidi" w:hAnsiTheme="minorBidi"/>
           <w:b/>
           <w:bCs/>
-          <w:color w:val="4C4D4F"/>
           <w:sz w:val="20"/>
           <w:szCs w:val="20"/>
         </w:rPr>
@@ -471,15 +458,13 @@
         <w:ind w:left="1440"/>
         <w:rPr>
           <w:rFonts w:asciiTheme="minorBidi" w:hAnsiTheme="minorBidi"/>
-          <w:color w:val="4C4D4F"/>
-          <w:sz w:val="20"/>
-          <w:szCs w:val="20"/>
-        </w:rPr>
-      </w:pPr>
-      <w:r>
-        <w:rPr>
-          <w:rFonts w:asciiTheme="minorBidi" w:hAnsiTheme="minorBidi"/>
-          <w:color w:val="4C4D4F"/>
+          <w:sz w:val="20"/>
+          <w:szCs w:val="20"/>
+        </w:rPr>
+      </w:pPr>
+      <w:r>
+        <w:rPr>
+          <w:rFonts w:asciiTheme="minorBidi" w:hAnsiTheme="minorBidi"/>
           <w:sz w:val="20"/>
           <w:szCs w:val="20"/>
         </w:rPr>
@@ -488,7 +473,6 @@
       <w:r>
         <w:rPr>
           <w:rFonts w:asciiTheme="minorBidi" w:hAnsiTheme="minorBidi"/>
-          <w:color w:val="4C4D4F"/>
           <w:sz w:val="20"/>
           <w:szCs w:val="20"/>
         </w:rPr>
@@ -497,7 +481,6 @@
       <w:r>
         <w:rPr>
           <w:rFonts w:asciiTheme="minorBidi" w:hAnsiTheme="minorBidi"/>
-          <w:color w:val="4C4D4F"/>
           <w:sz w:val="20"/>
           <w:szCs w:val="20"/>
         </w:rPr>
@@ -506,7 +489,6 @@
       <w:r>
         <w:rPr>
           <w:rFonts w:asciiTheme="minorBidi" w:hAnsiTheme="minorBidi"/>
-          <w:color w:val="4C4D4F"/>
           <w:sz w:val="20"/>
           <w:szCs w:val="20"/>
         </w:rPr>
@@ -515,7 +497,6 @@
       <w:r>
         <w:rPr>
           <w:rFonts w:asciiTheme="minorBidi" w:hAnsiTheme="minorBidi"/>
-          <w:color w:val="4C4D4F"/>
           <w:sz w:val="20"/>
           <w:szCs w:val="20"/>
         </w:rPr>
@@ -528,15 +509,13 @@
         <w:ind w:left="720" w:firstLine="720"/>
         <w:rPr>
           <w:rFonts w:asciiTheme="minorBidi" w:hAnsiTheme="minorBidi"/>
-          <w:color w:val="4C4D4F"/>
-          <w:sz w:val="20"/>
-          <w:szCs w:val="20"/>
-        </w:rPr>
-      </w:pPr>
-      <w:r>
-        <w:rPr>
-          <w:rFonts w:asciiTheme="minorBidi" w:hAnsiTheme="minorBidi"/>
-          <w:color w:val="4C4D4F"/>
+          <w:sz w:val="20"/>
+          <w:szCs w:val="20"/>
+        </w:rPr>
+      </w:pPr>
+      <w:r>
+        <w:rPr>
+          <w:rFonts w:asciiTheme="minorBidi" w:hAnsiTheme="minorBidi"/>
           <w:sz w:val="20"/>
           <w:szCs w:val="20"/>
         </w:rPr>
@@ -545,7 +524,6 @@
       <w:r>
         <w:rPr>
           <w:rFonts w:asciiTheme="minorBidi" w:hAnsiTheme="minorBidi"/>
-          <w:color w:val="4C4D4F"/>
           <w:sz w:val="20"/>
           <w:szCs w:val="20"/>
         </w:rPr>
@@ -554,7 +532,6 @@
       <w:r>
         <w:rPr>
           <w:rFonts w:asciiTheme="minorBidi" w:hAnsiTheme="minorBidi"/>
-          <w:color w:val="4C4D4F"/>
           <w:sz w:val="20"/>
           <w:szCs w:val="20"/>
         </w:rPr>
@@ -567,15 +544,13 @@
         <w:ind w:left="720" w:firstLine="720"/>
         <w:rPr>
           <w:rFonts w:asciiTheme="minorBidi" w:hAnsiTheme="minorBidi"/>
-          <w:color w:val="4C4D4F"/>
-          <w:sz w:val="20"/>
-          <w:szCs w:val="20"/>
-        </w:rPr>
-      </w:pPr>
-      <w:r>
-        <w:rPr>
-          <w:rFonts w:asciiTheme="minorBidi" w:hAnsiTheme="minorBidi"/>
-          <w:color w:val="4C4D4F"/>
+          <w:sz w:val="20"/>
+          <w:szCs w:val="20"/>
+        </w:rPr>
+      </w:pPr>
+      <w:r>
+        <w:rPr>
+          <w:rFonts w:asciiTheme="minorBidi" w:hAnsiTheme="minorBidi"/>
           <w:sz w:val="20"/>
           <w:szCs w:val="20"/>
         </w:rPr>
@@ -584,7 +559,6 @@
       <w:r>
         <w:rPr>
           <w:rFonts w:asciiTheme="minorBidi" w:hAnsiTheme="minorBidi"/>
-          <w:color w:val="4C4D4F"/>
           <w:sz w:val="20"/>
           <w:szCs w:val="20"/>
         </w:rPr>
@@ -593,7 +567,6 @@
       <w:r>
         <w:rPr>
           <w:rFonts w:asciiTheme="minorBidi" w:hAnsiTheme="minorBidi"/>
-          <w:color w:val="4C4D4F"/>
           <w:sz w:val="20"/>
           <w:szCs w:val="20"/>
         </w:rPr>
@@ -602,7 +575,6 @@
       <w:r>
         <w:rPr>
           <w:rFonts w:asciiTheme="minorBidi" w:hAnsiTheme="minorBidi"/>
-          <w:color w:val="4C4D4F"/>
           <w:sz w:val="20"/>
           <w:szCs w:val="20"/>
         </w:rPr>
@@ -611,7 +583,6 @@
       <w:r>
         <w:rPr>
           <w:rFonts w:asciiTheme="minorBidi" w:hAnsiTheme="minorBidi"/>
-          <w:color w:val="4C4D4F"/>
           <w:sz w:val="20"/>
           <w:szCs w:val="20"/>
         </w:rPr>
@@ -620,7 +591,6 @@
       <w:r>
         <w:rPr>
           <w:rFonts w:asciiTheme="minorBidi" w:hAnsiTheme="minorBidi"/>
-          <w:color w:val="4C4D4F"/>
           <w:sz w:val="20"/>
           <w:szCs w:val="20"/>
         </w:rPr>
@@ -633,7 +603,6 @@
         <w:ind w:left="720" w:firstLine="720"/>
         <w:rPr>
           <w:rFonts w:asciiTheme="minorBidi" w:hAnsiTheme="minorBidi"/>
-          <w:color w:val="4C4D4F"/>
           <w:sz w:val="20"/>
           <w:szCs w:val="20"/>
           <w:rtl/>
@@ -643,7 +612,6 @@
       <w:r>
         <w:rPr>
           <w:rFonts w:asciiTheme="minorBidi" w:hAnsiTheme="minorBidi"/>
-          <w:color w:val="4C4D4F"/>
           <w:sz w:val="20"/>
           <w:szCs w:val="20"/>
         </w:rPr>
@@ -652,7 +620,6 @@
       <w:r>
         <w:rPr>
           <w:rFonts w:asciiTheme="minorBidi" w:hAnsiTheme="minorBidi"/>
-          <w:color w:val="4C4D4F"/>
           <w:sz w:val="20"/>
           <w:szCs w:val="20"/>
         </w:rPr>
@@ -661,7 +628,6 @@
       <w:r>
         <w:rPr>
           <w:rFonts w:asciiTheme="minorBidi" w:hAnsiTheme="minorBidi"/>
-          <w:color w:val="4C4D4F"/>
           <w:sz w:val="20"/>
           <w:szCs w:val="20"/>
         </w:rPr>
@@ -670,7 +636,6 @@
       <w:r>
         <w:rPr>
           <w:rFonts w:asciiTheme="minorBidi" w:hAnsiTheme="minorBidi"/>
-          <w:color w:val="4C4D4F"/>
           <w:sz w:val="20"/>
           <w:szCs w:val="20"/>
         </w:rPr>
@@ -679,7 +644,6 @@
       <w:r>
         <w:rPr>
           <w:rFonts w:asciiTheme="minorBidi" w:hAnsiTheme="minorBidi"/>
-          <w:color w:val="4C4D4F"/>
           <w:sz w:val="20"/>
           <w:szCs w:val="20"/>
         </w:rPr>
@@ -688,7 +652,6 @@
       <w:r>
         <w:rPr>
           <w:rFonts w:asciiTheme="minorBidi" w:hAnsiTheme="minorBidi"/>
-          <w:color w:val="4C4D4F"/>
           <w:sz w:val="20"/>
           <w:szCs w:val="20"/>
         </w:rPr>
@@ -697,7 +660,6 @@
       <w:r>
         <w:rPr>
           <w:rFonts w:asciiTheme="minorBidi" w:hAnsiTheme="minorBidi"/>
-          <w:color w:val="4C4D4F"/>
           <w:sz w:val="20"/>
           <w:szCs w:val="20"/>
         </w:rPr>
@@ -706,7 +668,6 @@
       <w:r>
         <w:rPr>
           <w:rFonts w:asciiTheme="minorBidi" w:hAnsiTheme="minorBidi"/>
-          <w:color w:val="4C4D4F"/>
           <w:sz w:val="20"/>
           <w:szCs w:val="20"/>
         </w:rPr>
@@ -715,7 +676,6 @@
       <w:r>
         <w:rPr>
           <w:rFonts w:asciiTheme="minorBidi" w:hAnsiTheme="minorBidi"/>
-          <w:color w:val="4C4D4F"/>
           <w:sz w:val="20"/>
           <w:szCs w:val="20"/>
         </w:rPr>
@@ -724,7 +684,6 @@
       <w:r>
         <w:rPr>
           <w:rFonts w:asciiTheme="minorBidi" w:hAnsiTheme="minorBidi"/>
-          <w:color w:val="4C4D4F"/>
           <w:sz w:val="20"/>
           <w:szCs w:val="20"/>
         </w:rPr>
@@ -738,15 +697,13 @@
           <w:rFonts w:asciiTheme="minorBidi" w:hAnsiTheme="minorBidi"/>
           <w:b/>
           <w:bCs/>
-          <w:color w:val="4C4D4F"/>
-          <w:sz w:val="20"/>
-          <w:szCs w:val="20"/>
-        </w:rPr>
-      </w:pPr>
-      <w:r>
-        <w:rPr>
-          <w:rFonts w:asciiTheme="minorBidi" w:hAnsiTheme="minorBidi"/>
-          <w:color w:val="4C4D4F"/>
+          <w:sz w:val="20"/>
+          <w:szCs w:val="20"/>
+        </w:rPr>
+      </w:pPr>
+      <w:r>
+        <w:rPr>
+          <w:rFonts w:asciiTheme="minorBidi" w:hAnsiTheme="minorBidi"/>
           <w:sz w:val="20"/>
           <w:szCs w:val="20"/>
         </w:rPr>
@@ -755,7 +712,6 @@
       <w:r>
         <w:rPr>
           <w:rFonts w:asciiTheme="minorBidi" w:hAnsiTheme="minorBidi"/>
-          <w:color w:val="4C4D4F"/>
           <w:sz w:val="20"/>
           <w:szCs w:val="20"/>
         </w:rPr>
@@ -764,7 +720,6 @@
       <w:r>
         <w:rPr>
           <w:rFonts w:asciiTheme="minorBidi" w:hAnsiTheme="minorBidi"/>
-          <w:color w:val="4C4D4F"/>
           <w:sz w:val="20"/>
           <w:szCs w:val="20"/>
         </w:rPr>
@@ -773,7 +728,6 @@
       <w:r>
         <w:rPr>
           <w:rFonts w:asciiTheme="minorBidi" w:hAnsiTheme="minorBidi"/>
-          <w:color w:val="4C4D4F"/>
           <w:sz w:val="20"/>
           <w:szCs w:val="20"/>
         </w:rPr>
@@ -782,7 +736,6 @@
       <w:r>
         <w:rPr>
           <w:rFonts w:asciiTheme="minorBidi" w:hAnsiTheme="minorBidi"/>
-          <w:color w:val="4C4D4F"/>
           <w:sz w:val="20"/>
           <w:szCs w:val="20"/>
         </w:rPr>
@@ -791,7 +744,6 @@
       <w:r>
         <w:rPr>
           <w:rFonts w:asciiTheme="minorBidi" w:hAnsiTheme="minorBidi"/>
-          <w:color w:val="4C4D4F"/>
           <w:sz w:val="20"/>
           <w:szCs w:val="20"/>
         </w:rPr>
@@ -802,7 +754,6 @@
           <w:rFonts w:asciiTheme="minorBidi" w:hAnsiTheme="minorBidi"/>
           <w:b/>
           <w:bCs/>
-          <w:color w:val="4C4D4F"/>
           <w:sz w:val="20"/>
           <w:szCs w:val="20"/>
         </w:rPr>
@@ -815,15 +766,13 @@
         <w:ind w:left="720" w:firstLine="720"/>
         <w:rPr>
           <w:rFonts w:asciiTheme="minorBidi" w:hAnsiTheme="minorBidi"/>
-          <w:color w:val="4C4D4F"/>
-          <w:sz w:val="20"/>
-          <w:szCs w:val="20"/>
-        </w:rPr>
-      </w:pPr>
-      <w:r>
-        <w:rPr>
-          <w:rFonts w:asciiTheme="minorBidi" w:hAnsiTheme="minorBidi"/>
-          <w:color w:val="4C4D4F"/>
+          <w:sz w:val="20"/>
+          <w:szCs w:val="20"/>
+        </w:rPr>
+      </w:pPr>
+      <w:r>
+        <w:rPr>
+          <w:rFonts w:asciiTheme="minorBidi" w:hAnsiTheme="minorBidi"/>
           <w:sz w:val="20"/>
           <w:szCs w:val="20"/>
         </w:rPr>
@@ -832,7 +781,6 @@
       <w:r>
         <w:rPr>
           <w:rFonts w:asciiTheme="minorBidi" w:hAnsiTheme="minorBidi"/>
-          <w:color w:val="4C4D4F"/>
           <w:sz w:val="20"/>
           <w:szCs w:val="20"/>
         </w:rPr>
@@ -841,7 +789,6 @@
       <w:r>
         <w:rPr>
           <w:rFonts w:asciiTheme="minorBidi" w:hAnsiTheme="minorBidi"/>
-          <w:color w:val="4C4D4F"/>
           <w:sz w:val="20"/>
           <w:szCs w:val="20"/>
         </w:rPr>
@@ -850,7 +797,6 @@
       <w:r>
         <w:rPr>
           <w:rFonts w:asciiTheme="minorBidi" w:hAnsiTheme="minorBidi"/>
-          <w:color w:val="4C4D4F"/>
           <w:sz w:val="20"/>
           <w:szCs w:val="20"/>
         </w:rPr>
@@ -859,7 +805,6 @@
       <w:r>
         <w:rPr>
           <w:rFonts w:asciiTheme="minorBidi" w:hAnsiTheme="minorBidi"/>
-          <w:color w:val="4C4D4F"/>
           <w:sz w:val="20"/>
           <w:szCs w:val="20"/>
         </w:rPr>
@@ -868,7 +813,6 @@
       <w:r>
         <w:rPr>
           <w:rFonts w:asciiTheme="minorBidi" w:hAnsiTheme="minorBidi"/>
-          <w:color w:val="4C4D4F"/>
           <w:sz w:val="20"/>
           <w:szCs w:val="20"/>
         </w:rPr>
@@ -877,7 +821,6 @@
       <w:r>
         <w:rPr>
           <w:rFonts w:asciiTheme="minorBidi" w:hAnsiTheme="minorBidi"/>
-          <w:color w:val="4C4D4F"/>
           <w:sz w:val="20"/>
           <w:szCs w:val="20"/>
         </w:rPr>
@@ -886,7 +829,6 @@
       <w:r>
         <w:rPr>
           <w:rFonts w:asciiTheme="minorBidi" w:hAnsiTheme="minorBidi"/>
-          <w:color w:val="4C4D4F"/>
           <w:sz w:val="20"/>
           <w:szCs w:val="20"/>
         </w:rPr>
@@ -895,7 +837,6 @@
       <w:r>
         <w:rPr>
           <w:rFonts w:asciiTheme="minorBidi" w:hAnsiTheme="minorBidi"/>
-          <w:color w:val="4C4D4F"/>
           <w:sz w:val="20"/>
           <w:szCs w:val="20"/>
         </w:rPr>
@@ -907,7 +848,6 @@
         <w:spacing w:line="240" w:lineRule="auto"/>
         <w:rPr>
           <w:rFonts w:asciiTheme="minorBidi" w:hAnsiTheme="minorBidi"/>
-          <w:color w:val="4C4D4F"/>
           <w:sz w:val="2"/>
           <w:szCs w:val="2"/>
         </w:rPr>
@@ -919,7 +859,6 @@
           <w:rFonts w:asciiTheme="minorBidi" w:hAnsiTheme="minorBidi"/>
           <w:b/>
           <w:bCs/>
-          <w:color w:val="4C4D4F"/>
           <w:sz w:val="24"/>
           <w:szCs w:val="24"/>
         </w:rPr>
@@ -929,7 +868,6 @@
           <w:rFonts w:asciiTheme="minorBidi" w:hAnsiTheme="minorBidi"/>
           <w:b/>
           <w:bCs/>
-          <w:color w:val="4C4D4F"/>
           <w:sz w:val="24"/>
           <w:szCs w:val="24"/>
         </w:rPr>
@@ -940,15 +878,13 @@
       <w:pPr>
         <w:rPr>
           <w:rFonts w:asciiTheme="minorBidi" w:hAnsiTheme="minorBidi"/>
-          <w:color w:val="4C4D4F"/>
-          <w:sz w:val="20"/>
-          <w:szCs w:val="20"/>
-        </w:rPr>
-      </w:pPr>
-      <w:r>
-        <w:rPr>
-          <w:rFonts w:asciiTheme="minorBidi" w:hAnsiTheme="minorBidi"/>
-          <w:color w:val="4C4D4F"/>
+          <w:sz w:val="20"/>
+          <w:szCs w:val="20"/>
+        </w:rPr>
+      </w:pPr>
+      <w:r>
+        <w:rPr>
+          <w:rFonts w:asciiTheme="minorBidi" w:hAnsiTheme="minorBidi"/>
           <w:sz w:val="20"/>
           <w:szCs w:val="20"/>
         </w:rPr>
@@ -958,7 +894,6 @@
         <w:rPr>
           <w:rFonts w:asciiTheme="minorBidi" w:hAnsiTheme="minorBidi"/>
           <w:noProof/>
-          <w:color w:val="4C4D4F"/>
           <w:sz w:val="20"/>
           <w:szCs w:val="20"/>
         </w:rPr>
@@ -969,7 +904,6 @@
           <w:rFonts w:asciiTheme="minorBidi" w:hAnsiTheme="minorBidi"/>
           <w:b/>
           <w:bCs/>
-          <w:color w:val="4C4D4F"/>
           <w:sz w:val="20"/>
           <w:szCs w:val="20"/>
           <w:lang w:bidi="fa-IR"/>
@@ -981,7 +915,6 @@
           <w:rFonts w:asciiTheme="minorBidi" w:hAnsiTheme="minorBidi"/>
           <w:b/>
           <w:bCs/>
-          <w:color w:val="4C4D4F"/>
           <w:sz w:val="20"/>
           <w:szCs w:val="20"/>
         </w:rPr>
@@ -990,7 +923,6 @@
       <w:r>
         <w:rPr>
           <w:rFonts w:asciiTheme="minorBidi" w:hAnsiTheme="minorBidi"/>
-          <w:color w:val="4C4D4F"/>
           <w:sz w:val="20"/>
           <w:szCs w:val="20"/>
         </w:rPr>
@@ -1001,7 +933,6 @@
           <w:rFonts w:asciiTheme="minorBidi" w:hAnsiTheme="minorBidi"/>
           <w:b/>
           <w:bCs/>
-          <w:color w:val="4C4D4F"/>
           <w:sz w:val="20"/>
           <w:szCs w:val="20"/>
         </w:rPr>
@@ -1010,7 +941,6 @@
       <w:r>
         <w:rPr>
           <w:rFonts w:asciiTheme="minorBidi" w:hAnsiTheme="minorBidi"/>
-          <w:color w:val="4C4D4F"/>
           <w:sz w:val="20"/>
           <w:szCs w:val="20"/>
         </w:rPr>
@@ -1020,7 +950,6 @@
         <w:rPr>
           <w:rFonts w:asciiTheme="minorBidi" w:hAnsiTheme="minorBidi"/>
           <w:noProof/>
-          <w:color w:val="4C4D4F"/>
           <w:sz w:val="20"/>
           <w:szCs w:val="20"/>
         </w:rPr>
@@ -1031,7 +960,6 @@
           <w:rFonts w:asciiTheme="minorBidi" w:hAnsiTheme="minorBidi"/>
           <w:b/>
           <w:bCs/>
-          <w:color w:val="4C4D4F"/>
           <w:sz w:val="20"/>
           <w:szCs w:val="20"/>
           <w:lang w:bidi="fa-IR"/>
@@ -1043,7 +971,6 @@
           <w:rFonts w:asciiTheme="minorBidi" w:hAnsiTheme="minorBidi"/>
           <w:b/>
           <w:bCs/>
-          <w:color w:val="4C4D4F"/>
           <w:sz w:val="20"/>
           <w:szCs w:val="20"/>
         </w:rPr>
@@ -1052,7 +979,6 @@
       <w:r>
         <w:rPr>
           <w:rFonts w:asciiTheme="minorBidi" w:hAnsiTheme="minorBidi"/>
-          <w:color w:val="4C4D4F"/>
           <w:sz w:val="20"/>
           <w:szCs w:val="20"/>
         </w:rPr>
@@ -1062,7 +988,6 @@
         <w:rPr>
           <w:rFonts w:asciiTheme="minorBidi" w:hAnsiTheme="minorBidi"/>
           <w:noProof/>
-          <w:color w:val="4C4D4F"/>
           <w:sz w:val="20"/>
           <w:szCs w:val="20"/>
         </w:rPr>
@@ -1073,7 +998,6 @@
           <w:rFonts w:asciiTheme="minorBidi" w:hAnsiTheme="minorBidi"/>
           <w:b/>
           <w:bCs/>
-          <w:color w:val="4C4D4F"/>
           <w:sz w:val="20"/>
           <w:szCs w:val="20"/>
           <w:lang w:bidi="fa-IR"/>
@@ -1085,7 +1009,6 @@
           <w:rFonts w:asciiTheme="minorBidi" w:hAnsiTheme="minorBidi"/>
           <w:b/>
           <w:bCs/>
-          <w:color w:val="4C4D4F"/>
           <w:sz w:val="20"/>
           <w:szCs w:val="20"/>
         </w:rPr>
@@ -1094,7 +1017,6 @@
       <w:r>
         <w:rPr>
           <w:rFonts w:asciiTheme="minorBidi" w:hAnsiTheme="minorBidi"/>
-          <w:color w:val="4C4D4F"/>
           <w:sz w:val="20"/>
           <w:szCs w:val="20"/>
         </w:rPr>
@@ -1105,7 +1027,6 @@
           <w:rFonts w:asciiTheme="minorBidi" w:hAnsiTheme="minorBidi"/>
           <w:b/>
           <w:bCs/>
-          <w:color w:val="4C4D4F"/>
           <w:sz w:val="20"/>
           <w:szCs w:val="20"/>
         </w:rPr>
@@ -1114,7 +1035,6 @@
       <w:r>
         <w:rPr>
           <w:rFonts w:asciiTheme="minorBidi" w:hAnsiTheme="minorBidi"/>
-          <w:color w:val="4C4D4F"/>
           <w:sz w:val="20"/>
           <w:szCs w:val="20"/>
         </w:rPr>
@@ -1124,7 +1044,6 @@
         <w:rPr>
           <w:rFonts w:asciiTheme="minorBidi" w:hAnsiTheme="minorBidi"/>
           <w:noProof/>
-          <w:color w:val="4C4D4F"/>
           <w:sz w:val="20"/>
           <w:szCs w:val="20"/>
         </w:rPr>
@@ -1135,7 +1054,6 @@
           <w:rFonts w:asciiTheme="minorBidi" w:hAnsiTheme="minorBidi"/>
           <w:b/>
           <w:bCs/>
-          <w:color w:val="4C4D4F"/>
           <w:sz w:val="20"/>
           <w:szCs w:val="20"/>
           <w:lang w:bidi="fa-IR"/>
@@ -1147,7 +1065,6 @@
           <w:rFonts w:asciiTheme="minorBidi" w:hAnsiTheme="minorBidi"/>
           <w:b/>
           <w:bCs/>
-          <w:color w:val="4C4D4F"/>
           <w:sz w:val="20"/>
           <w:szCs w:val="20"/>
         </w:rPr>
@@ -1156,7 +1073,6 @@
       <w:r>
         <w:rPr>
           <w:rFonts w:asciiTheme="minorBidi" w:hAnsiTheme="minorBidi"/>
-          <w:color w:val="4C4D4F"/>
           <w:sz w:val="20"/>
           <w:szCs w:val="20"/>
         </w:rPr>
@@ -1167,7 +1083,6 @@
       <w:pPr>
         <w:rPr>
           <w:rFonts w:asciiTheme="minorBidi" w:hAnsiTheme="minorBidi"/>
-          <w:color w:val="4C4D4F"/>
           <w:sz w:val="2"/>
           <w:szCs w:val="2"/>
         </w:rPr>
@@ -1179,7 +1094,6 @@
           <w:rFonts w:asciiTheme="minorBidi" w:hAnsiTheme="minorBidi"/>
           <w:b/>
           <w:bCs/>
-          <w:color w:val="4C4D4F"/>
           <w:sz w:val="24"/>
           <w:szCs w:val="24"/>
         </w:rPr>
@@ -1189,7 +1103,6 @@
           <w:rFonts w:asciiTheme="minorBidi" w:hAnsiTheme="minorBidi"/>
           <w:b/>
           <w:bCs/>
-          <w:color w:val="4C4D4F"/>
           <w:sz w:val="24"/>
           <w:szCs w:val="24"/>
         </w:rPr>
@@ -1200,16 +1113,14 @@
       <w:pPr>
         <w:rPr>
           <w:rFonts w:asciiTheme="minorBidi" w:hAnsiTheme="minorBidi"/>
-          <w:color w:val="4C4D4F"/>
-          <w:sz w:val="20"/>
-          <w:szCs w:val="20"/>
-          <w:lang w:bidi="fa-IR"/>
-        </w:rPr>
-      </w:pPr>
-      <w:r>
-        <w:rPr>
-          <w:rFonts w:asciiTheme="minorBidi" w:hAnsiTheme="minorBidi"/>
-          <w:color w:val="4C4D4F"/>
+          <w:sz w:val="20"/>
+          <w:szCs w:val="20"/>
+          <w:lang w:bidi="fa-IR"/>
+        </w:rPr>
+      </w:pPr>
+      <w:r>
+        <w:rPr>
+          <w:rFonts w:asciiTheme="minorBidi" w:hAnsiTheme="minorBidi"/>
           <w:sz w:val="20"/>
           <w:szCs w:val="20"/>
           <w:lang w:bidi="fa-IR"/>
@@ -1219,7 +1130,6 @@
       <w:r>
         <w:rPr>
           <w:rFonts w:asciiTheme="minorBidi" w:hAnsiTheme="minorBidi"/>
-          <w:color w:val="4C4D4F"/>
           <w:sz w:val="20"/>
           <w:szCs w:val="20"/>
           <w:lang w:bidi="fa-IR"/>
@@ -1229,7 +1139,6 @@
       <w:r>
         <w:rPr>
           <w:rFonts w:asciiTheme="minorBidi" w:hAnsiTheme="minorBidi"/>
-          <w:color w:val="4C4D4F"/>
           <w:sz w:val="20"/>
           <w:szCs w:val="20"/>
           <w:lang w:bidi="fa-IR"/>
@@ -1239,7 +1148,6 @@
       <w:r>
         <w:rPr>
           <w:rFonts w:asciiTheme="minorBidi" w:hAnsiTheme="minorBidi"/>
-          <w:color w:val="4C4D4F"/>
           <w:sz w:val="20"/>
           <w:szCs w:val="20"/>
           <w:lang w:bidi="fa-IR"/>
@@ -1249,7 +1157,6 @@
       <w:r>
         <w:rPr>
           <w:rFonts w:asciiTheme="minorBidi" w:hAnsiTheme="minorBidi"/>
-          <w:color w:val="4C4D4F"/>
           <w:sz w:val="20"/>
           <w:szCs w:val="20"/>
           <w:lang w:bidi="fa-IR"/>
@@ -1259,7 +1166,6 @@
       <w:r>
         <w:rPr>
           <w:rFonts w:asciiTheme="minorBidi" w:hAnsiTheme="minorBidi"/>
-          <w:color w:val="4C4D4F"/>
           <w:sz w:val="20"/>
           <w:szCs w:val="20"/>
           <w:lang w:bidi="fa-IR"/>
@@ -1269,7 +1175,6 @@
       <w:r>
         <w:rPr>
           <w:rFonts w:asciiTheme="minorBidi" w:hAnsiTheme="minorBidi"/>
-          <w:color w:val="4C4D4F"/>
           <w:sz w:val="20"/>
           <w:szCs w:val="20"/>
           <w:lang w:bidi="fa-IR"/>
@@ -1279,7 +1184,6 @@
       <w:r>
         <w:rPr>
           <w:rFonts w:asciiTheme="minorBidi" w:hAnsiTheme="minorBidi"/>
-          <w:color w:val="4C4D4F"/>
           <w:sz w:val="20"/>
           <w:szCs w:val="20"/>
           <w:lang w:bidi="fa-IR"/>
@@ -1291,7 +1195,6 @@
           <w:rFonts w:asciiTheme="minorBidi" w:hAnsiTheme="minorBidi"/>
           <w:b/>
           <w:bCs/>
-          <w:color w:val="4C4D4F"/>
           <w:sz w:val="20"/>
           <w:szCs w:val="20"/>
           <w:lang w:bidi="fa-IR"/>
@@ -1303,29 +1206,15 @@
           <w:rFonts w:asciiTheme="minorBidi" w:hAnsiTheme="minorBidi"/>
           <w:b/>
           <w:bCs/>
-          <w:color w:val="4C4D4F"/>
-          <w:sz w:val="20"/>
-          <w:szCs w:val="20"/>
-          <w:lang w:bidi="fa-IR"/>
-        </w:rPr>
-        <w:t>,</w:t>
-      </w:r>
-      <w:r>
-        <w:rPr>
-          <w:rFonts w:asciiTheme="minorBidi" w:hAnsiTheme="minorBidi"/>
-          <w:b/>
-          <w:bCs/>
-          <w:color w:val="4C4D4F"/>
-          <w:sz w:val="20"/>
-          <w:szCs w:val="20"/>
-          <w:lang w:bidi="fa-IR"/>
-        </w:rPr>
-        <w:t xml:space="preserve"> </w:t>
-      </w:r>
-      <w:r>
-        <w:rPr>
-          <w:rFonts w:asciiTheme="minorBidi" w:hAnsiTheme="minorBidi"/>
-          <w:color w:val="4C4D4F"/>
+          <w:sz w:val="20"/>
+          <w:szCs w:val="20"/>
+          <w:lang w:bidi="fa-IR"/>
+        </w:rPr>
+        <w:t xml:space="preserve">, </w:t>
+      </w:r>
+      <w:r>
+        <w:rPr>
+          <w:rFonts w:asciiTheme="minorBidi" w:hAnsiTheme="minorBidi"/>
           <w:sz w:val="20"/>
           <w:szCs w:val="20"/>
           <w:lang w:bidi="fa-IR"/>
@@ -1343,15 +1232,13 @@
         <w:rPr>
           <w:rStyle w:val="hgkelc"/>
           <w:rFonts w:asciiTheme="minorBidi" w:hAnsiTheme="minorBidi"/>
-          <w:color w:val="4C4D4F"/>
-          <w:sz w:val="20"/>
-          <w:szCs w:val="20"/>
-        </w:rPr>
-      </w:pPr>
-      <w:r>
-        <w:rPr>
-          <w:rFonts w:asciiTheme="minorBidi" w:hAnsiTheme="minorBidi"/>
-          <w:color w:val="4C4D4F"/>
+          <w:sz w:val="20"/>
+          <w:szCs w:val="20"/>
+        </w:rPr>
+      </w:pPr>
+      <w:r>
+        <w:rPr>
+          <w:rFonts w:asciiTheme="minorBidi" w:hAnsiTheme="minorBidi"/>
           <w:sz w:val="20"/>
           <w:szCs w:val="20"/>
         </w:rPr>
@@ -1360,7 +1247,6 @@
       <w:r>
         <w:rPr>
           <w:rFonts w:asciiTheme="minorBidi" w:hAnsiTheme="minorBidi"/>
-          <w:color w:val="4C4D4F"/>
           <w:sz w:val="20"/>
           <w:szCs w:val="20"/>
         </w:rPr>
@@ -1369,7 +1255,6 @@
       <w:r>
         <w:rPr>
           <w:rFonts w:asciiTheme="minorBidi" w:hAnsiTheme="minorBidi"/>
-          <w:color w:val="4C4D4F"/>
           <w:sz w:val="20"/>
           <w:szCs w:val="20"/>
         </w:rPr>
@@ -1378,7 +1263,6 @@
       <w:r>
         <w:rPr>
           <w:rFonts w:asciiTheme="minorBidi" w:hAnsiTheme="minorBidi"/>
-          <w:color w:val="4C4D4F"/>
           <w:sz w:val="20"/>
           <w:szCs w:val="20"/>
         </w:rPr>
@@ -1388,7 +1272,6 @@
         <w:rPr>
           <w:rStyle w:val="hgkelc"/>
           <w:rFonts w:asciiTheme="minorBidi" w:hAnsiTheme="minorBidi"/>
-          <w:color w:val="4C4D4F"/>
           <w:sz w:val="20"/>
           <w:szCs w:val="20"/>
         </w:rPr>
@@ -1397,71 +1280,15 @@
       <w:r>
         <w:rPr>
           <w:rFonts w:asciiTheme="minorBidi" w:hAnsiTheme="minorBidi"/>
-          <w:color w:val="4C4D4F"/>
-          <w:sz w:val="20"/>
-          <w:szCs w:val="20"/>
-        </w:rPr>
-        <w:t xml:space="preserve">Structural </w:t>
-      </w:r>
-      <w:r>
-        <w:rPr>
-          <w:rFonts w:asciiTheme="minorBidi" w:hAnsiTheme="minorBidi"/>
-          <w:color w:val="4C4D4F"/>
-          <w:sz w:val="20"/>
-          <w:szCs w:val="20"/>
-        </w:rPr>
-        <w:t>M</w:t>
-      </w:r>
-      <w:r>
-        <w:rPr>
-          <w:rFonts w:asciiTheme="minorBidi" w:hAnsiTheme="minorBidi"/>
-          <w:color w:val="4C4D4F"/>
-          <w:sz w:val="20"/>
-          <w:szCs w:val="20"/>
-        </w:rPr>
-        <w:t xml:space="preserve">agnetic </w:t>
-      </w:r>
-      <w:r>
-        <w:rPr>
-          <w:rFonts w:asciiTheme="minorBidi" w:hAnsiTheme="minorBidi"/>
-          <w:color w:val="4C4D4F"/>
-          <w:sz w:val="20"/>
-          <w:szCs w:val="20"/>
-        </w:rPr>
-        <w:t>R</w:t>
-      </w:r>
-      <w:r>
-        <w:rPr>
-          <w:rFonts w:asciiTheme="minorBidi" w:hAnsiTheme="minorBidi"/>
-          <w:color w:val="4C4D4F"/>
-          <w:sz w:val="20"/>
-          <w:szCs w:val="20"/>
-        </w:rPr>
-        <w:t xml:space="preserve">esonance </w:t>
-      </w:r>
-      <w:r>
-        <w:rPr>
-          <w:rFonts w:asciiTheme="minorBidi" w:hAnsiTheme="minorBidi"/>
-          <w:color w:val="4C4D4F"/>
-          <w:sz w:val="20"/>
-          <w:szCs w:val="20"/>
-        </w:rPr>
-        <w:t>I</w:t>
-      </w:r>
-      <w:r>
-        <w:rPr>
-          <w:rFonts w:asciiTheme="minorBidi" w:hAnsiTheme="minorBidi"/>
-          <w:color w:val="4C4D4F"/>
-          <w:sz w:val="20"/>
-          <w:szCs w:val="20"/>
-        </w:rPr>
-        <w:t>maging</w:t>
+          <w:sz w:val="20"/>
+          <w:szCs w:val="20"/>
+        </w:rPr>
+        <w:t>Structural Magnetic Resonance Imaging</w:t>
       </w:r>
       <w:r>
         <w:rPr>
           <w:rStyle w:val="hgkelc"/>
           <w:rFonts w:asciiTheme="minorBidi" w:hAnsiTheme="minorBidi"/>
-          <w:color w:val="4C4D4F"/>
           <w:sz w:val="20"/>
           <w:szCs w:val="20"/>
         </w:rPr>
@@ -1471,21 +1298,10 @@
         <w:rPr>
           <w:rStyle w:val="hgkelc"/>
           <w:rFonts w:asciiTheme="minorBidi" w:hAnsiTheme="minorBidi"/>
-          <w:color w:val="4C4D4F"/>
-          <w:sz w:val="20"/>
-          <w:szCs w:val="20"/>
-        </w:rPr>
-        <w:t xml:space="preserve">under the supervision of </w:t>
-      </w:r>
-      <w:r>
-        <w:rPr>
-          <w:rStyle w:val="hgkelc"/>
-          <w:rFonts w:asciiTheme="minorBidi" w:hAnsiTheme="minorBidi"/>
-          <w:color w:val="4C4D4F"/>
-          <w:sz w:val="20"/>
-          <w:szCs w:val="20"/>
-        </w:rPr>
-        <w:t>Dr. Mohsen Dadashi</w:t>
+          <w:sz w:val="20"/>
+          <w:szCs w:val="20"/>
+        </w:rPr>
+        <w:t>under the supervision of Dr. Mohsen Dadashi</w:t>
       </w:r>
     </w:p>
     <w:p>
@@ -1497,7 +1313,6 @@
         </w:numPr>
         <w:rPr>
           <w:rFonts w:asciiTheme="minorBidi" w:hAnsiTheme="minorBidi"/>
-          <w:color w:val="4C4D4F"/>
           <w:sz w:val="20"/>
           <w:szCs w:val="20"/>
         </w:rPr>
@@ -1506,7 +1321,6 @@
         <w:rPr>
           <w:rStyle w:val="hgkelc"/>
           <w:rFonts w:asciiTheme="minorBidi" w:hAnsiTheme="minorBidi"/>
-          <w:color w:val="4C4D4F"/>
           <w:sz w:val="20"/>
           <w:szCs w:val="20"/>
         </w:rPr>
@@ -1516,7 +1330,6 @@
         <w:rPr>
           <w:rStyle w:val="hgkelc"/>
           <w:rFonts w:asciiTheme="minorBidi" w:hAnsiTheme="minorBidi"/>
-          <w:color w:val="4C4D4F"/>
           <w:sz w:val="20"/>
           <w:szCs w:val="20"/>
         </w:rPr>
@@ -1526,7 +1339,6 @@
         <w:rPr>
           <w:rStyle w:val="hgkelc"/>
           <w:rFonts w:asciiTheme="minorBidi" w:hAnsiTheme="minorBidi"/>
-          <w:color w:val="4C4D4F"/>
           <w:sz w:val="20"/>
           <w:szCs w:val="20"/>
         </w:rPr>
@@ -1536,7 +1348,6 @@
         <w:rPr>
           <w:rStyle w:val="hgkelc"/>
           <w:rFonts w:asciiTheme="minorBidi" w:hAnsiTheme="minorBidi"/>
-          <w:color w:val="4C4D4F"/>
           <w:sz w:val="20"/>
           <w:szCs w:val="20"/>
         </w:rPr>
@@ -1546,7 +1357,6 @@
         <w:rPr>
           <w:rStyle w:val="hgkelc"/>
           <w:rFonts w:asciiTheme="minorBidi" w:hAnsiTheme="minorBidi"/>
-          <w:color w:val="4C4D4F"/>
           <w:sz w:val="20"/>
           <w:szCs w:val="20"/>
         </w:rPr>
@@ -1556,7 +1366,6 @@
         <w:rPr>
           <w:rStyle w:val="hgkelc"/>
           <w:rFonts w:asciiTheme="minorBidi" w:hAnsiTheme="minorBidi"/>
-          <w:color w:val="4C4D4F"/>
           <w:sz w:val="20"/>
           <w:szCs w:val="20"/>
         </w:rPr>
@@ -1566,7 +1375,6 @@
         <w:rPr>
           <w:rStyle w:val="hgkelc"/>
           <w:rFonts w:asciiTheme="minorBidi" w:hAnsiTheme="minorBidi"/>
-          <w:color w:val="4C4D4F"/>
           <w:sz w:val="20"/>
           <w:szCs w:val="20"/>
         </w:rPr>
@@ -1576,7 +1384,6 @@
         <w:rPr>
           <w:rStyle w:val="hgkelc"/>
           <w:rFonts w:asciiTheme="minorBidi" w:hAnsiTheme="minorBidi"/>
-          <w:color w:val="4C4D4F"/>
           <w:sz w:val="20"/>
           <w:szCs w:val="20"/>
         </w:rPr>
@@ -1586,7 +1393,6 @@
         <w:rPr>
           <w:rStyle w:val="hgkelc"/>
           <w:rFonts w:asciiTheme="minorBidi" w:hAnsiTheme="minorBidi"/>
-          <w:color w:val="4C4D4F"/>
           <w:sz w:val="20"/>
           <w:szCs w:val="20"/>
         </w:rPr>
@@ -1597,16 +1403,14 @@
       <w:pPr>
         <w:rPr>
           <w:rFonts w:asciiTheme="minorBidi" w:hAnsiTheme="minorBidi"/>
-          <w:color w:val="4C4D4F"/>
-          <w:sz w:val="20"/>
-          <w:szCs w:val="20"/>
-          <w:lang w:bidi="fa-IR"/>
-        </w:rPr>
-      </w:pPr>
-      <w:r>
-        <w:rPr>
-          <w:rFonts w:asciiTheme="minorBidi" w:hAnsiTheme="minorBidi"/>
-          <w:color w:val="4C4D4F"/>
+          <w:sz w:val="20"/>
+          <w:szCs w:val="20"/>
+          <w:lang w:bidi="fa-IR"/>
+        </w:rPr>
+      </w:pPr>
+      <w:r>
+        <w:rPr>
+          <w:rFonts w:asciiTheme="minorBidi" w:hAnsiTheme="minorBidi"/>
           <w:sz w:val="20"/>
           <w:szCs w:val="20"/>
           <w:lang w:bidi="fa-IR"/>
@@ -1616,7 +1420,6 @@
       <w:r>
         <w:rPr>
           <w:rFonts w:asciiTheme="minorBidi" w:hAnsiTheme="minorBidi"/>
-          <w:color w:val="4C4D4F"/>
           <w:sz w:val="20"/>
           <w:szCs w:val="20"/>
           <w:lang w:bidi="fa-IR"/>
@@ -1626,37 +1429,15 @@
       <w:r>
         <w:rPr>
           <w:rFonts w:asciiTheme="minorBidi" w:hAnsiTheme="minorBidi"/>
-          <w:color w:val="4C4D4F"/>
-          <w:sz w:val="20"/>
-          <w:szCs w:val="20"/>
-          <w:lang w:bidi="fa-IR"/>
-        </w:rPr>
-        <w:t xml:space="preserve"> 2022 - </w:t>
-      </w:r>
-      <w:r>
-        <w:rPr>
-          <w:rFonts w:asciiTheme="minorBidi" w:hAnsiTheme="minorBidi"/>
-          <w:color w:val="4C4D4F"/>
-          <w:sz w:val="20"/>
-          <w:szCs w:val="20"/>
-          <w:lang w:bidi="fa-IR"/>
-        </w:rPr>
-        <w:t>Oct</w:t>
-      </w:r>
-      <w:r>
-        <w:rPr>
-          <w:rFonts w:asciiTheme="minorBidi" w:hAnsiTheme="minorBidi"/>
-          <w:color w:val="4C4D4F"/>
-          <w:sz w:val="20"/>
-          <w:szCs w:val="20"/>
-          <w:lang w:bidi="fa-IR"/>
-        </w:rPr>
-        <w:t xml:space="preserve"> 2022</w:t>
-      </w:r>
-      <w:r>
-        <w:rPr>
-          <w:rFonts w:asciiTheme="minorBidi" w:hAnsiTheme="minorBidi"/>
-          <w:color w:val="4C4D4F"/>
+          <w:sz w:val="20"/>
+          <w:szCs w:val="20"/>
+          <w:lang w:bidi="fa-IR"/>
+        </w:rPr>
+        <w:t xml:space="preserve"> 2022 - Oct 2022</w:t>
+      </w:r>
+      <w:r>
+        <w:rPr>
+          <w:rFonts w:asciiTheme="minorBidi" w:hAnsiTheme="minorBidi"/>
           <w:sz w:val="20"/>
           <w:szCs w:val="20"/>
           <w:lang w:bidi="fa-IR"/>
@@ -1668,7 +1449,6 @@
           <w:rFonts w:asciiTheme="minorBidi" w:hAnsiTheme="minorBidi"/>
           <w:b/>
           <w:bCs/>
-          <w:color w:val="4C4D4F"/>
           <w:sz w:val="20"/>
           <w:szCs w:val="20"/>
           <w:lang w:bidi="fa-IR"/>
@@ -1680,7 +1460,6 @@
           <w:rFonts w:asciiTheme="minorBidi" w:hAnsiTheme="minorBidi"/>
           <w:b/>
           <w:bCs/>
-          <w:color w:val="4C4D4F"/>
           <w:sz w:val="20"/>
           <w:szCs w:val="20"/>
           <w:lang w:bidi="fa-IR"/>
@@ -1690,7 +1469,6 @@
       <w:r>
         <w:rPr>
           <w:rFonts w:asciiTheme="minorBidi" w:hAnsiTheme="minorBidi"/>
-          <w:color w:val="4C4D4F"/>
           <w:sz w:val="20"/>
           <w:szCs w:val="20"/>
           <w:lang w:bidi="fa-IR"/>
@@ -1707,114 +1485,67 @@
         </w:numPr>
         <w:rPr>
           <w:rFonts w:asciiTheme="minorBidi" w:hAnsiTheme="minorBidi"/>
-          <w:color w:val="4C4D4F"/>
-          <w:sz w:val="20"/>
-          <w:szCs w:val="20"/>
-        </w:rPr>
-      </w:pPr>
-      <w:r>
-        <w:rPr>
-          <w:rFonts w:asciiTheme="minorBidi" w:hAnsiTheme="minorBidi"/>
-          <w:color w:val="4C4D4F"/>
-          <w:sz w:val="20"/>
-          <w:szCs w:val="20"/>
-        </w:rPr>
-        <w:t>Conducted</w:t>
-      </w:r>
-      <w:r>
-        <w:rPr>
-          <w:rFonts w:asciiTheme="minorBidi" w:hAnsiTheme="minorBidi"/>
-          <w:color w:val="4C4D4F"/>
-          <w:sz w:val="20"/>
-          <w:szCs w:val="20"/>
-        </w:rPr>
-        <w:t xml:space="preserve"> research in the area of </w:t>
+          <w:sz w:val="20"/>
+          <w:szCs w:val="20"/>
+        </w:rPr>
+      </w:pPr>
+      <w:r>
+        <w:rPr>
+          <w:rFonts w:asciiTheme="minorBidi" w:hAnsiTheme="minorBidi"/>
+          <w:sz w:val="20"/>
+          <w:szCs w:val="20"/>
+        </w:rPr>
+        <w:t xml:space="preserve">Conducted research in the area of </w:t>
       </w:r>
       <w:r>
         <w:rPr>
           <w:rStyle w:val="hgkelc"/>
           <w:rFonts w:asciiTheme="minorBidi" w:hAnsiTheme="minorBidi"/>
-          <w:color w:val="4C4D4F"/>
-          <w:sz w:val="20"/>
-          <w:szCs w:val="20"/>
-        </w:rPr>
-        <w:t>Electroencephalogram</w:t>
+          <w:sz w:val="20"/>
+          <w:szCs w:val="20"/>
+        </w:rPr>
+        <w:t xml:space="preserve">Electroencephalogram signals </w:t>
       </w:r>
       <w:r>
         <w:rPr>
           <w:rStyle w:val="hgkelc"/>
           <w:rFonts w:asciiTheme="minorBidi" w:hAnsiTheme="minorBidi"/>
-          <w:color w:val="4C4D4F"/>
-          <w:sz w:val="20"/>
-          <w:szCs w:val="20"/>
-        </w:rPr>
-        <w:t xml:space="preserve"> signals </w:t>
+          <w:sz w:val="20"/>
+          <w:szCs w:val="20"/>
+        </w:rPr>
+        <w:t xml:space="preserve">within a team of two </w:t>
       </w:r>
       <w:r>
         <w:rPr>
           <w:rStyle w:val="hgkelc"/>
           <w:rFonts w:asciiTheme="minorBidi" w:hAnsiTheme="minorBidi"/>
-          <w:color w:val="4C4D4F"/>
-          <w:sz w:val="20"/>
-          <w:szCs w:val="20"/>
-        </w:rPr>
-        <w:t xml:space="preserve">within a team of two </w:t>
+          <w:sz w:val="20"/>
+          <w:szCs w:val="20"/>
+        </w:rPr>
+        <w:t xml:space="preserve">under the supervision of Dr. Michael Nitsche and Dr. Mohsen Dadashi, which led to </w:t>
       </w:r>
       <w:r>
         <w:rPr>
           <w:rStyle w:val="hgkelc"/>
           <w:rFonts w:asciiTheme="minorBidi" w:hAnsiTheme="minorBidi"/>
-          <w:color w:val="4C4D4F"/>
-          <w:sz w:val="20"/>
-          <w:szCs w:val="20"/>
-        </w:rPr>
-        <w:t xml:space="preserve">under the supervision of </w:t>
+          <w:sz w:val="20"/>
+          <w:szCs w:val="20"/>
+        </w:rPr>
+        <w:t>a</w:t>
       </w:r>
       <w:r>
         <w:rPr>
           <w:rStyle w:val="hgkelc"/>
           <w:rFonts w:asciiTheme="minorBidi" w:hAnsiTheme="minorBidi"/>
-          <w:color w:val="4C4D4F"/>
-          <w:sz w:val="20"/>
-          <w:szCs w:val="20"/>
-        </w:rPr>
-        <w:t>Dr. Michael Nitsche and Dr. Mohsen Dadashi</w:t>
+          <w:sz w:val="20"/>
+          <w:szCs w:val="20"/>
+        </w:rPr>
+        <w:t xml:space="preserve"> </w:t>
       </w:r>
       <w:r>
         <w:rPr>
           <w:rStyle w:val="hgkelc"/>
           <w:rFonts w:asciiTheme="minorBidi" w:hAnsiTheme="minorBidi"/>
-          <w:color w:val="4C4D4F"/>
-          <w:sz w:val="20"/>
-          <w:szCs w:val="20"/>
-        </w:rPr>
-        <w:t xml:space="preserve">, which led to </w:t>
-      </w:r>
-      <w:r>
-        <w:rPr>
-          <w:rStyle w:val="hgkelc"/>
-          <w:rFonts w:asciiTheme="minorBidi" w:hAnsiTheme="minorBidi"/>
-          <w:color w:val="4C4D4F"/>
-          <w:sz w:val="20"/>
-          <w:szCs w:val="20"/>
-        </w:rPr>
-        <w:t>a</w:t>
-      </w:r>
-      <w:r>
-        <w:rPr>
-          <w:rStyle w:val="hgkelc"/>
-          <w:rFonts w:asciiTheme="minorBidi" w:hAnsiTheme="minorBidi"/>
-          <w:color w:val="4C4D4F"/>
-          <w:sz w:val="20"/>
-          <w:szCs w:val="20"/>
-        </w:rPr>
-        <w:t xml:space="preserve"> </w:t>
-      </w:r>
-      <w:r>
-        <w:rPr>
-          <w:rStyle w:val="hgkelc"/>
-          <w:rFonts w:asciiTheme="minorBidi" w:hAnsiTheme="minorBidi"/>
-          <w:color w:val="4C4D4F"/>
           <w:sz w:val="20"/>
           <w:szCs w:val="20"/>
         </w:rPr>
@@ -1833,15 +1564,13 @@
           <w:rFonts w:asciiTheme="minorBidi" w:hAnsiTheme="minorBidi"/>
           <w:b/>
           <w:bCs/>
-          <w:color w:val="4C4D4F"/>
-          <w:sz w:val="20"/>
-          <w:szCs w:val="20"/>
-        </w:rPr>
-      </w:pPr>
-      <w:r>
-        <w:rPr>
-          <w:rFonts w:asciiTheme="minorBidi" w:hAnsiTheme="minorBidi"/>
-          <w:color w:val="4C4D4F"/>
+          <w:sz w:val="20"/>
+          <w:szCs w:val="20"/>
+        </w:rPr>
+      </w:pPr>
+      <w:r>
+        <w:rPr>
+          <w:rFonts w:asciiTheme="minorBidi" w:hAnsiTheme="minorBidi"/>
           <w:sz w:val="20"/>
           <w:szCs w:val="20"/>
         </w:rPr>
@@ -1850,7 +1579,6 @@
       <w:r>
         <w:rPr>
           <w:rFonts w:asciiTheme="minorBidi" w:hAnsiTheme="minorBidi"/>
-          <w:color w:val="4C4D4F"/>
           <w:sz w:val="20"/>
           <w:szCs w:val="20"/>
         </w:rPr>
@@ -1859,25 +1587,30 @@
       <w:r>
         <w:rPr>
           <w:rFonts w:asciiTheme="minorBidi" w:hAnsiTheme="minorBidi"/>
-          <w:color w:val="4C4D4F"/>
-          <w:sz w:val="20"/>
-          <w:szCs w:val="20"/>
-        </w:rPr>
-        <w:t xml:space="preserve"> several approaches, such as Welch, </w:t>
-      </w:r>
-      <w:r>
-        <w:rPr>
-          <w:rFonts w:asciiTheme="minorBidi" w:hAnsiTheme="minorBidi"/>
-          <w:color w:val="4C4D4F"/>
-          <w:sz w:val="20"/>
-          <w:szCs w:val="20"/>
-        </w:rPr>
-        <w:t>Convolution</w:t>
-      </w:r>
-      <w:r>
-        <w:rPr>
-          <w:rFonts w:asciiTheme="minorBidi" w:hAnsiTheme="minorBidi"/>
-          <w:color w:val="4C4D4F"/>
+          <w:sz w:val="20"/>
+          <w:szCs w:val="20"/>
+        </w:rPr>
+        <w:t xml:space="preserve"> several approaches, such as Welch, Convolution,</w:t>
+      </w:r>
+      <w:r>
+        <w:rPr>
+          <w:rFonts w:asciiTheme="minorBidi" w:hAnsiTheme="minorBidi"/>
+          <w:sz w:val="20"/>
+          <w:szCs w:val="20"/>
+        </w:rPr>
+        <w:t xml:space="preserve"> and</w:t>
+      </w:r>
+      <w:r>
+        <w:rPr>
+          <w:rFonts w:asciiTheme="minorBidi" w:hAnsiTheme="minorBidi"/>
+          <w:sz w:val="20"/>
+          <w:szCs w:val="20"/>
+        </w:rPr>
+        <w:t xml:space="preserve"> Fourier transform</w:t>
+      </w:r>
+      <w:r>
+        <w:rPr>
+          <w:rFonts w:asciiTheme="minorBidi" w:hAnsiTheme="minorBidi"/>
           <w:sz w:val="20"/>
           <w:szCs w:val="20"/>
         </w:rPr>
@@ -1886,16 +1619,6 @@
       <w:r>
         <w:rPr>
           <w:rFonts w:asciiTheme="minorBidi" w:hAnsiTheme="minorBidi"/>
-          <w:color w:val="4C4D4F"/>
-          <w:sz w:val="20"/>
-          <w:szCs w:val="20"/>
-        </w:rPr>
-        <w:t xml:space="preserve"> and</w:t>
-      </w:r>
-      <w:r>
-        <w:rPr>
-          <w:rFonts w:asciiTheme="minorBidi" w:hAnsiTheme="minorBidi"/>
-          <w:color w:val="4C4D4F"/>
           <w:sz w:val="20"/>
           <w:szCs w:val="20"/>
         </w:rPr>
@@ -1904,34 +1627,6 @@
       <w:r>
         <w:rPr>
           <w:rFonts w:asciiTheme="minorBidi" w:hAnsiTheme="minorBidi"/>
-          <w:color w:val="4C4D4F"/>
-          <w:sz w:val="20"/>
-          <w:szCs w:val="20"/>
-        </w:rPr>
-        <w:t>Fourier transform</w:t>
-      </w:r>
-      <w:r>
-        <w:rPr>
-          <w:rFonts w:asciiTheme="minorBidi" w:hAnsiTheme="minorBidi"/>
-          <w:color w:val="4C4D4F"/>
-          <w:sz w:val="20"/>
-          <w:szCs w:val="20"/>
-        </w:rPr>
-        <w:t>,</w:t>
-      </w:r>
-      <w:r>
-        <w:rPr>
-          <w:rFonts w:asciiTheme="minorBidi" w:hAnsiTheme="minorBidi"/>
-          <w:color w:val="4C4D4F"/>
-          <w:sz w:val="20"/>
-          <w:szCs w:val="20"/>
-        </w:rPr>
-        <w:t xml:space="preserve"> </w:t>
-      </w:r>
-      <w:r>
-        <w:rPr>
-          <w:rFonts w:asciiTheme="minorBidi" w:hAnsiTheme="minorBidi"/>
-          <w:color w:val="4C4D4F"/>
           <w:sz w:val="20"/>
           <w:szCs w:val="20"/>
         </w:rPr>
@@ -1940,7 +1635,6 @@
       <w:r>
         <w:rPr>
           <w:rFonts w:asciiTheme="minorBidi" w:hAnsiTheme="minorBidi"/>
-          <w:color w:val="4C4D4F"/>
           <w:sz w:val="20"/>
           <w:szCs w:val="20"/>
         </w:rPr>
@@ -1949,7 +1643,6 @@
       <w:r>
         <w:rPr>
           <w:rFonts w:asciiTheme="minorBidi" w:hAnsiTheme="minorBidi"/>
-          <w:color w:val="4C4D4F"/>
           <w:sz w:val="20"/>
           <w:szCs w:val="20"/>
         </w:rPr>
@@ -1958,7 +1651,6 @@
       <w:r>
         <w:rPr>
           <w:rFonts w:asciiTheme="minorBidi" w:hAnsiTheme="minorBidi"/>
-          <w:color w:val="4C4D4F"/>
           <w:sz w:val="20"/>
           <w:szCs w:val="20"/>
         </w:rPr>
@@ -1969,7 +1661,6 @@
       <w:pPr>
         <w:rPr>
           <w:rFonts w:asciiTheme="minorBidi" w:hAnsiTheme="minorBidi"/>
-          <w:color w:val="4C4D4F"/>
           <w:sz w:val="2"/>
           <w:szCs w:val="2"/>
         </w:rPr>
@@ -1982,7 +1673,6 @@
           <w:rFonts w:asciiTheme="minorBidi" w:hAnsiTheme="minorBidi"/>
           <w:b/>
           <w:bCs/>
-          <w:color w:val="4C4D4F"/>
           <w:sz w:val="24"/>
           <w:szCs w:val="24"/>
         </w:rPr>
@@ -1992,7 +1682,6 @@
           <w:rFonts w:asciiTheme="minorBidi" w:hAnsiTheme="minorBidi"/>
           <w:b/>
           <w:bCs/>
-          <w:color w:val="4C4D4F"/>
           <w:sz w:val="24"/>
           <w:szCs w:val="24"/>
         </w:rPr>
@@ -2004,15 +1693,13 @@
         <w:spacing w:line="276" w:lineRule="auto"/>
         <w:rPr>
           <w:rFonts w:asciiTheme="minorBidi" w:hAnsiTheme="minorBidi"/>
-          <w:color w:val="4C4D4F"/>
-          <w:sz w:val="20"/>
-          <w:szCs w:val="20"/>
-        </w:rPr>
-      </w:pPr>
-      <w:r>
-        <w:rPr>
-          <w:rFonts w:asciiTheme="minorBidi" w:hAnsiTheme="minorBidi"/>
-          <w:color w:val="4C4D4F"/>
+          <w:sz w:val="20"/>
+          <w:szCs w:val="20"/>
+        </w:rPr>
+      </w:pPr>
+      <w:r>
+        <w:rPr>
+          <w:rFonts w:asciiTheme="minorBidi" w:hAnsiTheme="minorBidi"/>
           <w:sz w:val="20"/>
           <w:szCs w:val="20"/>
           <w:lang w:bidi="fa-IR"/>
@@ -2022,7 +1709,6 @@
       <w:r>
         <w:rPr>
           <w:rFonts w:asciiTheme="minorBidi" w:hAnsiTheme="minorBidi"/>
-          <w:color w:val="4C4D4F"/>
           <w:sz w:val="20"/>
           <w:szCs w:val="20"/>
           <w:lang w:bidi="fa-IR"/>
@@ -2032,7 +1718,6 @@
       <w:r>
         <w:rPr>
           <w:rFonts w:asciiTheme="minorBidi" w:hAnsiTheme="minorBidi"/>
-          <w:color w:val="4C4D4F"/>
           <w:sz w:val="20"/>
           <w:szCs w:val="20"/>
           <w:lang w:bidi="fa-IR"/>
@@ -2042,7 +1727,6 @@
       <w:r>
         <w:rPr>
           <w:rFonts w:asciiTheme="minorBidi" w:hAnsiTheme="minorBidi"/>
-          <w:color w:val="4C4D4F"/>
           <w:sz w:val="20"/>
           <w:szCs w:val="20"/>
           <w:lang w:bidi="fa-IR"/>
@@ -2052,7 +1736,6 @@
       <w:r>
         <w:rPr>
           <w:rFonts w:asciiTheme="minorBidi" w:hAnsiTheme="minorBidi"/>
-          <w:color w:val="4C4D4F"/>
           <w:sz w:val="20"/>
           <w:szCs w:val="20"/>
           <w:lang w:bidi="fa-IR"/>
@@ -2062,7 +1745,6 @@
       <w:r>
         <w:rPr>
           <w:rFonts w:asciiTheme="minorBidi" w:hAnsiTheme="minorBidi"/>
-          <w:color w:val="4C4D4F"/>
           <w:sz w:val="20"/>
           <w:szCs w:val="20"/>
           <w:lang w:bidi="fa-IR"/>
@@ -2072,7 +1754,6 @@
       <w:r>
         <w:rPr>
           <w:rFonts w:asciiTheme="minorBidi" w:hAnsiTheme="minorBidi"/>
-          <w:color w:val="4C4D4F"/>
           <w:sz w:val="20"/>
           <w:szCs w:val="20"/>
           <w:lang w:bidi="fa-IR"/>
@@ -2082,7 +1763,6 @@
       <w:r>
         <w:rPr>
           <w:rFonts w:asciiTheme="minorBidi" w:hAnsiTheme="minorBidi"/>
-          <w:color w:val="4C4D4F"/>
           <w:sz w:val="20"/>
           <w:szCs w:val="20"/>
           <w:lang w:bidi="fa-IR"/>
@@ -2094,18 +1774,27 @@
           <w:rFonts w:asciiTheme="minorBidi" w:hAnsiTheme="minorBidi"/>
           <w:b/>
           <w:bCs/>
-          <w:color w:val="4C4D4F"/>
-          <w:sz w:val="20"/>
-          <w:szCs w:val="20"/>
-        </w:rPr>
-        <w:t xml:space="preserve">Teaching Assistant, </w:t>
+          <w:sz w:val="20"/>
+          <w:szCs w:val="20"/>
+        </w:rPr>
+        <w:t>Teaching Assistant,</w:t>
+      </w:r>
+      <w:r>
+        <w:rPr>
+          <w:rFonts w:asciiTheme="minorBidi" w:hAnsiTheme="minorBidi"/>
+          <w:b/>
+          <w:bCs/>
+          <w:sz w:val="20"/>
+          <w:szCs w:val="20"/>
+        </w:rPr>
+        <w:t xml:space="preserve"> </w:t>
       </w:r>
       <w:hyperlink r:id="rId13" w:history="1">
         <w:r>
           <w:rPr>
             <w:rStyle w:val="Hyperlink"/>
             <w:rFonts w:asciiTheme="minorBidi" w:hAnsiTheme="minorBidi"/>
-            <w:color w:val="2F5496" w:themeColor="accent1" w:themeShade="BF"/>
+            <w:color w:val="1F3864" w:themeColor="accent1" w:themeShade="80"/>
             <w:sz w:val="20"/>
             <w:szCs w:val="20"/>
             <w:u w:val="none"/>
@@ -2116,7 +1805,7 @@
           <w:rPr>
             <w:rStyle w:val="Hyperlink"/>
             <w:rFonts w:asciiTheme="minorBidi" w:hAnsiTheme="minorBidi"/>
-            <w:color w:val="2F5496" w:themeColor="accent1" w:themeShade="BF"/>
+            <w:color w:val="1F3864" w:themeColor="accent1" w:themeShade="80"/>
             <w:sz w:val="20"/>
             <w:szCs w:val="20"/>
             <w:u w:val="none"/>
@@ -2127,7 +1816,7 @@
           <w:rPr>
             <w:rStyle w:val="Hyperlink"/>
             <w:rFonts w:asciiTheme="minorBidi" w:hAnsiTheme="minorBidi"/>
-            <w:color w:val="2F5496" w:themeColor="accent1" w:themeShade="BF"/>
+            <w:color w:val="1F3864" w:themeColor="accent1" w:themeShade="80"/>
             <w:sz w:val="20"/>
             <w:szCs w:val="20"/>
             <w:u w:val="none"/>
@@ -2138,7 +1827,6 @@
       <w:r>
         <w:rPr>
           <w:rFonts w:asciiTheme="minorBidi" w:hAnsiTheme="minorBidi"/>
-          <w:color w:val="4C4D4F"/>
           <w:sz w:val="20"/>
           <w:szCs w:val="20"/>
         </w:rPr>
@@ -2147,7 +1835,6 @@
       <w:r>
         <w:rPr>
           <w:rFonts w:asciiTheme="minorBidi" w:hAnsiTheme="minorBidi"/>
-          <w:color w:val="4C4D4F"/>
           <w:sz w:val="20"/>
           <w:szCs w:val="20"/>
         </w:rPr>
@@ -2164,15 +1851,13 @@
         <w:spacing w:line="276" w:lineRule="auto"/>
         <w:rPr>
           <w:rFonts w:asciiTheme="minorBidi" w:hAnsiTheme="minorBidi"/>
-          <w:color w:val="4C4D4F"/>
-          <w:sz w:val="20"/>
-          <w:szCs w:val="20"/>
-        </w:rPr>
-      </w:pPr>
-      <w:r>
-        <w:rPr>
-          <w:rFonts w:asciiTheme="minorBidi" w:hAnsiTheme="minorBidi"/>
-          <w:color w:val="4C4D4F"/>
+          <w:sz w:val="20"/>
+          <w:szCs w:val="20"/>
+        </w:rPr>
+      </w:pPr>
+      <w:r>
+        <w:rPr>
+          <w:rFonts w:asciiTheme="minorBidi" w:hAnsiTheme="minorBidi"/>
           <w:sz w:val="20"/>
           <w:szCs w:val="20"/>
         </w:rPr>
@@ -2181,7 +1866,6 @@
       <w:r>
         <w:rPr>
           <w:rFonts w:asciiTheme="minorBidi" w:hAnsiTheme="minorBidi"/>
-          <w:color w:val="4C4D4F"/>
           <w:sz w:val="20"/>
           <w:szCs w:val="20"/>
         </w:rPr>
@@ -2190,7 +1874,6 @@
       <w:r>
         <w:rPr>
           <w:rFonts w:asciiTheme="minorBidi" w:hAnsiTheme="minorBidi"/>
-          <w:color w:val="4C4D4F"/>
           <w:sz w:val="20"/>
           <w:szCs w:val="20"/>
         </w:rPr>
@@ -2207,15 +1890,13 @@
         <w:spacing w:line="276" w:lineRule="auto"/>
         <w:rPr>
           <w:rFonts w:asciiTheme="minorBidi" w:hAnsiTheme="minorBidi"/>
-          <w:color w:val="4C4D4F"/>
-          <w:sz w:val="20"/>
-          <w:szCs w:val="20"/>
-        </w:rPr>
-      </w:pPr>
-      <w:r>
-        <w:rPr>
-          <w:rFonts w:asciiTheme="minorBidi" w:hAnsiTheme="minorBidi"/>
-          <w:color w:val="4C4D4F"/>
+          <w:sz w:val="20"/>
+          <w:szCs w:val="20"/>
+        </w:rPr>
+      </w:pPr>
+      <w:r>
+        <w:rPr>
+          <w:rFonts w:asciiTheme="minorBidi" w:hAnsiTheme="minorBidi"/>
           <w:sz w:val="20"/>
           <w:szCs w:val="20"/>
         </w:rPr>
@@ -2224,7 +1905,6 @@
       <w:r>
         <w:rPr>
           <w:rFonts w:asciiTheme="minorBidi" w:hAnsiTheme="minorBidi"/>
-          <w:color w:val="4C4D4F"/>
           <w:sz w:val="20"/>
           <w:szCs w:val="20"/>
         </w:rPr>
@@ -2233,7 +1913,6 @@
       <w:r>
         <w:rPr>
           <w:rFonts w:asciiTheme="minorBidi" w:hAnsiTheme="minorBidi"/>
-          <w:color w:val="4C4D4F"/>
           <w:sz w:val="20"/>
           <w:szCs w:val="20"/>
         </w:rPr>
@@ -2245,15 +1924,13 @@
         <w:spacing w:line="276" w:lineRule="auto"/>
         <w:rPr>
           <w:rFonts w:asciiTheme="minorBidi" w:hAnsiTheme="minorBidi"/>
-          <w:color w:val="4C4D4F"/>
-          <w:sz w:val="20"/>
-          <w:szCs w:val="20"/>
-        </w:rPr>
-      </w:pPr>
-      <w:r>
-        <w:rPr>
-          <w:rFonts w:asciiTheme="minorBidi" w:hAnsiTheme="minorBidi"/>
-          <w:color w:val="4C4D4F"/>
+          <w:sz w:val="20"/>
+          <w:szCs w:val="20"/>
+        </w:rPr>
+      </w:pPr>
+      <w:r>
+        <w:rPr>
+          <w:rFonts w:asciiTheme="minorBidi" w:hAnsiTheme="minorBidi"/>
           <w:sz w:val="20"/>
           <w:szCs w:val="20"/>
           <w:lang w:bidi="fa-IR"/>
@@ -2263,7 +1940,6 @@
       <w:r>
         <w:rPr>
           <w:rFonts w:asciiTheme="minorBidi" w:hAnsiTheme="minorBidi"/>
-          <w:color w:val="4C4D4F"/>
           <w:sz w:val="20"/>
           <w:szCs w:val="20"/>
           <w:lang w:bidi="fa-IR"/>
@@ -2273,7 +1949,6 @@
       <w:r>
         <w:rPr>
           <w:rFonts w:asciiTheme="minorBidi" w:hAnsiTheme="minorBidi"/>
-          <w:color w:val="4C4D4F"/>
           <w:sz w:val="20"/>
           <w:szCs w:val="20"/>
           <w:lang w:bidi="fa-IR"/>
@@ -2283,7 +1958,6 @@
       <w:r>
         <w:rPr>
           <w:rFonts w:asciiTheme="minorBidi" w:hAnsiTheme="minorBidi"/>
-          <w:color w:val="4C4D4F"/>
           <w:sz w:val="20"/>
           <w:szCs w:val="20"/>
           <w:lang w:bidi="fa-IR"/>
@@ -2293,7 +1967,6 @@
       <w:r>
         <w:rPr>
           <w:rFonts w:asciiTheme="minorBidi" w:hAnsiTheme="minorBidi"/>
-          <w:color w:val="4C4D4F"/>
           <w:sz w:val="20"/>
           <w:szCs w:val="20"/>
           <w:lang w:bidi="fa-IR"/>
@@ -2303,7 +1976,6 @@
       <w:r>
         <w:rPr>
           <w:rFonts w:asciiTheme="minorBidi" w:hAnsiTheme="minorBidi"/>
-          <w:color w:val="4C4D4F"/>
           <w:sz w:val="20"/>
           <w:szCs w:val="20"/>
           <w:lang w:bidi="fa-IR"/>
@@ -2315,7 +1987,6 @@
           <w:rFonts w:asciiTheme="minorBidi" w:hAnsiTheme="minorBidi"/>
           <w:b/>
           <w:bCs/>
-          <w:color w:val="4C4D4F"/>
           <w:sz w:val="20"/>
           <w:szCs w:val="20"/>
         </w:rPr>
@@ -2326,7 +1997,7 @@
           <w:rPr>
             <w:rStyle w:val="Hyperlink"/>
             <w:rFonts w:asciiTheme="minorBidi" w:hAnsiTheme="minorBidi"/>
-            <w:color w:val="2F5496" w:themeColor="accent1" w:themeShade="BF"/>
+            <w:color w:val="1F3864" w:themeColor="accent1" w:themeShade="80"/>
             <w:sz w:val="20"/>
             <w:szCs w:val="20"/>
             <w:u w:val="none"/>
@@ -2337,7 +2008,6 @@
       <w:r>
         <w:rPr>
           <w:rFonts w:asciiTheme="minorBidi" w:hAnsiTheme="minorBidi"/>
-          <w:color w:val="4C4D4F"/>
           <w:sz w:val="20"/>
           <w:szCs w:val="20"/>
         </w:rPr>
@@ -2354,15 +2024,13 @@
         <w:spacing w:line="276" w:lineRule="auto"/>
         <w:rPr>
           <w:rFonts w:asciiTheme="minorBidi" w:hAnsiTheme="minorBidi"/>
-          <w:color w:val="4C4D4F"/>
-          <w:sz w:val="20"/>
-          <w:szCs w:val="20"/>
-        </w:rPr>
-      </w:pPr>
-      <w:r>
-        <w:rPr>
-          <w:rFonts w:asciiTheme="minorBidi" w:hAnsiTheme="minorBidi"/>
-          <w:color w:val="4C4D4F"/>
+          <w:sz w:val="20"/>
+          <w:szCs w:val="20"/>
+        </w:rPr>
+      </w:pPr>
+      <w:r>
+        <w:rPr>
+          <w:rFonts w:asciiTheme="minorBidi" w:hAnsiTheme="minorBidi"/>
           <w:sz w:val="20"/>
           <w:szCs w:val="20"/>
         </w:rPr>
@@ -2371,7 +2039,6 @@
       <w:r>
         <w:rPr>
           <w:rFonts w:asciiTheme="minorBidi" w:hAnsiTheme="minorBidi"/>
-          <w:color w:val="4C4D4F"/>
           <w:sz w:val="20"/>
           <w:szCs w:val="20"/>
         </w:rPr>
@@ -2380,7 +2047,6 @@
       <w:r>
         <w:rPr>
           <w:rFonts w:asciiTheme="minorBidi" w:hAnsiTheme="minorBidi"/>
-          <w:color w:val="4C4D4F"/>
           <w:sz w:val="20"/>
           <w:szCs w:val="20"/>
         </w:rPr>
@@ -2397,15 +2063,13 @@
         <w:spacing w:line="276" w:lineRule="auto"/>
         <w:rPr>
           <w:rFonts w:asciiTheme="minorBidi" w:hAnsiTheme="minorBidi"/>
-          <w:color w:val="4C4D4F"/>
-          <w:sz w:val="20"/>
-          <w:szCs w:val="20"/>
-        </w:rPr>
-      </w:pPr>
-      <w:r>
-        <w:rPr>
-          <w:rFonts w:asciiTheme="minorBidi" w:hAnsiTheme="minorBidi"/>
-          <w:color w:val="4C4D4F"/>
+          <w:sz w:val="20"/>
+          <w:szCs w:val="20"/>
+        </w:rPr>
+      </w:pPr>
+      <w:r>
+        <w:rPr>
+          <w:rFonts w:asciiTheme="minorBidi" w:hAnsiTheme="minorBidi"/>
           <w:sz w:val="20"/>
           <w:szCs w:val="20"/>
         </w:rPr>
@@ -2415,7 +2079,6 @@
       <w:r>
         <w:rPr>
           <w:rFonts w:asciiTheme="minorBidi" w:hAnsiTheme="minorBidi"/>
-          <w:color w:val="4C4D4F"/>
           <w:sz w:val="20"/>
           <w:szCs w:val="20"/>
         </w:rPr>
@@ -2424,7 +2087,6 @@
       <w:r>
         <w:rPr>
           <w:rFonts w:asciiTheme="minorBidi" w:hAnsiTheme="minorBidi"/>
-          <w:color w:val="4C4D4F"/>
           <w:sz w:val="20"/>
           <w:szCs w:val="20"/>
         </w:rPr>
@@ -2433,7 +2095,6 @@
       <w:r>
         <w:rPr>
           <w:rFonts w:asciiTheme="minorBidi" w:hAnsiTheme="minorBidi"/>
-          <w:color w:val="4C4D4F"/>
           <w:sz w:val="20"/>
           <w:szCs w:val="20"/>
         </w:rPr>
@@ -2450,7 +2111,7 @@
         <w:spacing w:after="160" w:line="276" w:lineRule="auto"/>
         <w:rPr>
           <w:rFonts w:asciiTheme="minorBidi" w:hAnsiTheme="minorBidi" w:cstheme="minorBidi"/>
-          <w:color w:val="4C4D4F"/>
+          <w:color w:val="auto"/>
           <w:sz w:val="20"/>
           <w:szCs w:val="20"/>
         </w:rPr>
@@ -2458,7 +2119,7 @@
       <w:r>
         <w:rPr>
           <w:rFonts w:asciiTheme="minorBidi" w:hAnsiTheme="minorBidi" w:cstheme="minorBidi"/>
-          <w:color w:val="4C4D4F"/>
+          <w:color w:val="auto"/>
           <w:sz w:val="20"/>
           <w:szCs w:val="20"/>
         </w:rPr>
@@ -2467,7 +2128,7 @@
       <w:r>
         <w:rPr>
           <w:rFonts w:asciiTheme="minorBidi" w:hAnsiTheme="minorBidi" w:cstheme="minorBidi"/>
-          <w:color w:val="4C4D4F"/>
+          <w:color w:val="auto"/>
           <w:sz w:val="20"/>
           <w:szCs w:val="20"/>
         </w:rPr>
@@ -2476,7 +2137,7 @@
       <w:r>
         <w:rPr>
           <w:rFonts w:asciiTheme="minorBidi" w:hAnsiTheme="minorBidi" w:cstheme="minorBidi"/>
-          <w:color w:val="4C4D4F"/>
+          <w:color w:val="auto"/>
           <w:sz w:val="20"/>
           <w:szCs w:val="20"/>
         </w:rPr>
@@ -2490,15 +2151,15 @@
         <w:contextualSpacing/>
         <w:rPr>
           <w:rFonts w:asciiTheme="minorBidi" w:hAnsiTheme="minorBidi" w:cstheme="minorBidi"/>
-          <w:color w:val="4C4D4F"/>
-          <w:sz w:val="20"/>
-          <w:szCs w:val="20"/>
-        </w:rPr>
-      </w:pPr>
-      <w:r>
-        <w:rPr>
-          <w:rFonts w:asciiTheme="minorBidi" w:hAnsiTheme="minorBidi"/>
-          <w:color w:val="4C4D4F"/>
+          <w:color w:val="auto"/>
+          <w:sz w:val="20"/>
+          <w:szCs w:val="20"/>
+        </w:rPr>
+      </w:pPr>
+      <w:r>
+        <w:rPr>
+          <w:rFonts w:asciiTheme="minorBidi" w:hAnsiTheme="minorBidi"/>
+          <w:color w:val="auto"/>
           <w:sz w:val="20"/>
           <w:szCs w:val="20"/>
           <w:lang w:bidi="fa-IR"/>
@@ -2508,7 +2169,7 @@
       <w:r>
         <w:rPr>
           <w:rFonts w:asciiTheme="minorBidi" w:hAnsiTheme="minorBidi"/>
-          <w:color w:val="4C4D4F"/>
+          <w:color w:val="auto"/>
           <w:sz w:val="20"/>
           <w:szCs w:val="20"/>
           <w:lang w:bidi="fa-IR"/>
@@ -2520,7 +2181,7 @@
           <w:rFonts w:asciiTheme="minorBidi" w:hAnsiTheme="minorBidi"/>
           <w:b/>
           <w:bCs/>
-          <w:color w:val="4C4D4F"/>
+          <w:color w:val="auto"/>
           <w:sz w:val="20"/>
           <w:szCs w:val="20"/>
         </w:rPr>
@@ -2531,7 +2192,7 @@
           <w:rPr>
             <w:rStyle w:val="Hyperlink"/>
             <w:rFonts w:asciiTheme="minorBidi" w:hAnsiTheme="minorBidi"/>
-            <w:color w:val="2F5496" w:themeColor="accent1" w:themeShade="BF"/>
+            <w:color w:val="1F3864" w:themeColor="accent1" w:themeShade="80"/>
             <w:sz w:val="20"/>
             <w:szCs w:val="20"/>
             <w:u w:val="none"/>
@@ -2542,7 +2203,7 @@
           <w:rPr>
             <w:rStyle w:val="Hyperlink"/>
             <w:rFonts w:asciiTheme="minorBidi" w:hAnsiTheme="minorBidi"/>
-            <w:color w:val="2F5496" w:themeColor="accent1" w:themeShade="BF"/>
+            <w:color w:val="1F3864" w:themeColor="accent1" w:themeShade="80"/>
             <w:sz w:val="20"/>
             <w:szCs w:val="20"/>
             <w:u w:val="none"/>
@@ -2553,7 +2214,7 @@
           <w:rPr>
             <w:rStyle w:val="Hyperlink"/>
             <w:rFonts w:asciiTheme="minorBidi" w:hAnsiTheme="minorBidi"/>
-            <w:color w:val="2F5496" w:themeColor="accent1" w:themeShade="BF"/>
+            <w:color w:val="1F3864" w:themeColor="accent1" w:themeShade="80"/>
             <w:sz w:val="20"/>
             <w:szCs w:val="20"/>
             <w:u w:val="none"/>
@@ -2564,7 +2225,7 @@
       <w:r>
         <w:rPr>
           <w:rFonts w:asciiTheme="minorBidi" w:hAnsiTheme="minorBidi"/>
-          <w:color w:val="4C4D4F"/>
+          <w:color w:val="auto"/>
           <w:sz w:val="20"/>
           <w:szCs w:val="20"/>
         </w:rPr>
@@ -2581,15 +2242,13 @@
         <w:spacing w:line="276" w:lineRule="auto"/>
         <w:rPr>
           <w:rFonts w:asciiTheme="minorBidi" w:hAnsiTheme="minorBidi"/>
-          <w:color w:val="4C4D4F"/>
-          <w:sz w:val="20"/>
-          <w:szCs w:val="20"/>
-        </w:rPr>
-      </w:pPr>
-      <w:r>
-        <w:rPr>
-          <w:rFonts w:asciiTheme="minorBidi" w:hAnsiTheme="minorBidi"/>
-          <w:color w:val="4C4D4F"/>
+          <w:sz w:val="20"/>
+          <w:szCs w:val="20"/>
+        </w:rPr>
+      </w:pPr>
+      <w:r>
+        <w:rPr>
+          <w:rFonts w:asciiTheme="minorBidi" w:hAnsiTheme="minorBidi"/>
           <w:sz w:val="20"/>
           <w:szCs w:val="20"/>
         </w:rPr>
@@ -2598,7 +2257,6 @@
       <w:r>
         <w:rPr>
           <w:rFonts w:asciiTheme="minorBidi" w:hAnsiTheme="minorBidi"/>
-          <w:color w:val="4C4D4F"/>
           <w:sz w:val="20"/>
           <w:szCs w:val="20"/>
         </w:rPr>
@@ -2607,7 +2265,6 @@
       <w:r>
         <w:rPr>
           <w:rFonts w:asciiTheme="minorBidi" w:hAnsiTheme="minorBidi"/>
-          <w:color w:val="4C4D4F"/>
           <w:sz w:val="20"/>
           <w:szCs w:val="20"/>
         </w:rPr>
@@ -2616,7 +2273,6 @@
       <w:r>
         <w:rPr>
           <w:rFonts w:asciiTheme="minorBidi" w:hAnsiTheme="minorBidi"/>
-          <w:color w:val="4C4D4F"/>
           <w:sz w:val="20"/>
           <w:szCs w:val="20"/>
         </w:rPr>
@@ -2625,7 +2281,6 @@
       <w:r>
         <w:rPr>
           <w:rFonts w:asciiTheme="minorBidi" w:hAnsiTheme="minorBidi"/>
-          <w:color w:val="4C4D4F"/>
           <w:sz w:val="20"/>
           <w:szCs w:val="20"/>
         </w:rPr>
@@ -2634,7 +2289,6 @@
       <w:r>
         <w:rPr>
           <w:rFonts w:asciiTheme="minorBidi" w:hAnsiTheme="minorBidi"/>
-          <w:color w:val="4C4D4F"/>
           <w:sz w:val="20"/>
           <w:szCs w:val="20"/>
         </w:rPr>
@@ -2646,15 +2300,13 @@
         <w:spacing w:line="276" w:lineRule="auto"/>
         <w:rPr>
           <w:rFonts w:asciiTheme="minorBidi" w:hAnsiTheme="minorBidi"/>
-          <w:color w:val="4C4D4F"/>
-          <w:sz w:val="20"/>
-          <w:szCs w:val="20"/>
-        </w:rPr>
-      </w:pPr>
-      <w:r>
-        <w:rPr>
-          <w:rFonts w:asciiTheme="minorBidi" w:hAnsiTheme="minorBidi"/>
-          <w:color w:val="4C4D4F"/>
+          <w:sz w:val="20"/>
+          <w:szCs w:val="20"/>
+        </w:rPr>
+      </w:pPr>
+      <w:r>
+        <w:rPr>
+          <w:rFonts w:asciiTheme="minorBidi" w:hAnsiTheme="minorBidi"/>
           <w:sz w:val="20"/>
           <w:szCs w:val="20"/>
           <w:lang w:bidi="fa-IR"/>
@@ -2664,7 +2316,6 @@
       <w:r>
         <w:rPr>
           <w:rFonts w:asciiTheme="minorBidi" w:hAnsiTheme="minorBidi"/>
-          <w:color w:val="4C4D4F"/>
           <w:sz w:val="20"/>
           <w:szCs w:val="20"/>
           <w:lang w:bidi="fa-IR"/>
@@ -2674,7 +2325,6 @@
       <w:r>
         <w:rPr>
           <w:rFonts w:asciiTheme="minorBidi" w:hAnsiTheme="minorBidi"/>
-          <w:color w:val="4C4D4F"/>
           <w:sz w:val="20"/>
           <w:szCs w:val="20"/>
           <w:lang w:bidi="fa-IR"/>
@@ -2684,7 +2334,6 @@
       <w:r>
         <w:rPr>
           <w:rFonts w:asciiTheme="minorBidi" w:hAnsiTheme="minorBidi"/>
-          <w:color w:val="4C4D4F"/>
           <w:sz w:val="20"/>
           <w:szCs w:val="20"/>
           <w:lang w:bidi="fa-IR"/>
@@ -2694,7 +2343,6 @@
       <w:r>
         <w:rPr>
           <w:rFonts w:asciiTheme="minorBidi" w:hAnsiTheme="minorBidi"/>
-          <w:color w:val="4C4D4F"/>
           <w:sz w:val="20"/>
           <w:szCs w:val="20"/>
           <w:lang w:bidi="fa-IR"/>
@@ -2704,7 +2352,6 @@
       <w:r>
         <w:rPr>
           <w:rFonts w:asciiTheme="minorBidi" w:hAnsiTheme="minorBidi"/>
-          <w:color w:val="4C4D4F"/>
           <w:sz w:val="20"/>
           <w:szCs w:val="20"/>
           <w:lang w:bidi="fa-IR"/>
@@ -2716,7 +2363,6 @@
           <w:rFonts w:asciiTheme="minorBidi" w:hAnsiTheme="minorBidi"/>
           <w:b/>
           <w:bCs/>
-          <w:color w:val="4C4D4F"/>
           <w:sz w:val="20"/>
           <w:szCs w:val="20"/>
         </w:rPr>
@@ -2727,7 +2373,7 @@
           <w:rPr>
             <w:rStyle w:val="Hyperlink"/>
             <w:rFonts w:asciiTheme="minorBidi" w:hAnsiTheme="minorBidi"/>
-            <w:color w:val="2F5496" w:themeColor="accent1" w:themeShade="BF"/>
+            <w:color w:val="1F3864" w:themeColor="accent1" w:themeShade="80"/>
             <w:sz w:val="20"/>
             <w:szCs w:val="20"/>
             <w:u w:val="none"/>
@@ -2738,7 +2384,6 @@
       <w:r>
         <w:rPr>
           <w:rFonts w:asciiTheme="minorBidi" w:hAnsiTheme="minorBidi"/>
-          <w:color w:val="4C4D4F"/>
           <w:sz w:val="20"/>
           <w:szCs w:val="20"/>
         </w:rPr>
@@ -2755,15 +2400,13 @@
         <w:spacing w:line="276" w:lineRule="auto"/>
         <w:rPr>
           <w:rFonts w:asciiTheme="minorBidi" w:hAnsiTheme="minorBidi"/>
-          <w:color w:val="4C4D4F"/>
-          <w:sz w:val="20"/>
-          <w:szCs w:val="20"/>
-        </w:rPr>
-      </w:pPr>
-      <w:r>
-        <w:rPr>
-          <w:rFonts w:asciiTheme="minorBidi" w:hAnsiTheme="minorBidi"/>
-          <w:color w:val="4C4D4F"/>
+          <w:sz w:val="20"/>
+          <w:szCs w:val="20"/>
+        </w:rPr>
+      </w:pPr>
+      <w:r>
+        <w:rPr>
+          <w:rFonts w:asciiTheme="minorBidi" w:hAnsiTheme="minorBidi"/>
           <w:sz w:val="20"/>
           <w:szCs w:val="20"/>
         </w:rPr>
@@ -2775,7 +2418,6 @@
         <w:spacing w:line="276" w:lineRule="auto"/>
         <w:rPr>
           <w:rFonts w:asciiTheme="minorBidi" w:hAnsiTheme="minorBidi"/>
-          <w:color w:val="4C4D4F"/>
           <w:sz w:val="2"/>
           <w:szCs w:val="2"/>
         </w:rPr>
@@ -2787,7 +2429,6 @@
           <w:rFonts w:asciiTheme="minorBidi" w:hAnsiTheme="minorBidi"/>
           <w:b/>
           <w:bCs/>
-          <w:color w:val="4B4C4E"/>
           <w:sz w:val="24"/>
           <w:szCs w:val="24"/>
         </w:rPr>
@@ -2797,7 +2438,6 @@
           <w:rFonts w:asciiTheme="minorBidi" w:hAnsiTheme="minorBidi"/>
           <w:b/>
           <w:bCs/>
-          <w:color w:val="4B4C4E"/>
           <w:sz w:val="24"/>
           <w:szCs w:val="24"/>
         </w:rPr>
@@ -2810,35 +2450,21 @@
           <w:rFonts w:asciiTheme="minorBidi" w:hAnsiTheme="minorBidi"/>
           <w:b/>
           <w:bCs/>
-          <w:color w:val="4B4C4E"/>
-          <w:sz w:val="20"/>
-          <w:szCs w:val="20"/>
-          <w:lang w:bidi="fa-IR"/>
-        </w:rPr>
-      </w:pPr>
-      <w:r>
-        <w:rPr>
-          <w:rFonts w:asciiTheme="minorBidi" w:hAnsiTheme="minorBidi"/>
-          <w:b/>
-          <w:bCs/>
-          <w:color w:val="4B4C4E"/>
-          <w:sz w:val="20"/>
-          <w:szCs w:val="20"/>
-          <w:lang w:bidi="fa-IR"/>
-        </w:rPr>
-        <w:t>Submitted w</w:t>
-      </w:r>
-      <w:r>
-        <w:rPr>
-          <w:rFonts w:asciiTheme="minorBidi" w:hAnsiTheme="minorBidi"/>
-          <w:b/>
-          <w:bCs/>
-          <w:color w:val="4B4C4E"/>
-          <w:sz w:val="20"/>
-          <w:szCs w:val="20"/>
-          <w:lang w:bidi="fa-IR"/>
-        </w:rPr>
-        <w:t>orks</w:t>
+          <w:sz w:val="20"/>
+          <w:szCs w:val="20"/>
+          <w:lang w:bidi="fa-IR"/>
+        </w:rPr>
+      </w:pPr>
+      <w:r>
+        <w:rPr>
+          <w:rFonts w:asciiTheme="minorBidi" w:hAnsiTheme="minorBidi"/>
+          <w:b/>
+          <w:bCs/>
+          <w:sz w:val="20"/>
+          <w:szCs w:val="20"/>
+          <w:lang w:bidi="fa-IR"/>
+        </w:rPr>
+        <w:t>Submitted works</w:t>
       </w:r>
     </w:p>
     <w:p>
@@ -2852,46 +2478,44 @@
           <w:rFonts w:asciiTheme="minorBidi" w:hAnsiTheme="minorBidi"/>
           <w:b/>
           <w:bCs/>
-          <w:color w:val="4B4C4E"/>
-          <w:sz w:val="20"/>
-          <w:szCs w:val="20"/>
-          <w:lang w:bidi="fa-IR"/>
-        </w:rPr>
-      </w:pPr>
-      <w:r>
-        <w:rPr>
-          <w:rFonts w:asciiTheme="minorBidi" w:hAnsiTheme="minorBidi"/>
-          <w:color w:val="4B4C4E"/>
-          <w:sz w:val="20"/>
-          <w:szCs w:val="20"/>
-          <w:lang w:bidi="fa-IR"/>
-        </w:rPr>
-        <w:t>OR Heidari</w:t>
-      </w:r>
-      <w:r>
-        <w:rPr>
-          <w:rFonts w:asciiTheme="minorBidi" w:hAnsiTheme="minorBidi"/>
-          <w:color w:val="4B4C4E"/>
-          <w:sz w:val="20"/>
-          <w:szCs w:val="20"/>
-          <w:lang w:bidi="fa-IR"/>
-        </w:rPr>
-        <w:t xml:space="preserve">, M Dadashi, </w:t>
-      </w:r>
-      <w:r>
-        <w:rPr>
-          <w:rFonts w:asciiTheme="minorBidi" w:hAnsiTheme="minorBidi"/>
-          <w:color w:val="4B4C4E"/>
-          <w:sz w:val="20"/>
-          <w:szCs w:val="20"/>
-          <w:lang w:bidi="fa-IR"/>
-        </w:rPr>
-        <w:t>M Maghbooli</w:t>
-      </w:r>
-      <w:r>
-        <w:rPr>
-          <w:rFonts w:asciiTheme="minorBidi" w:hAnsiTheme="minorBidi"/>
-          <w:color w:val="4B4C4E"/>
+          <w:sz w:val="20"/>
+          <w:szCs w:val="20"/>
+          <w:lang w:bidi="fa-IR"/>
+        </w:rPr>
+      </w:pPr>
+      <w:r>
+        <w:rPr>
+          <w:rFonts w:asciiTheme="minorBidi" w:hAnsiTheme="minorBidi"/>
+          <w:sz w:val="20"/>
+          <w:szCs w:val="20"/>
+          <w:lang w:bidi="fa-IR"/>
+        </w:rPr>
+        <w:t>OR Heidari, M Dadashi, M Maghbooli,</w:t>
+      </w:r>
+      <w:r>
+        <w:t xml:space="preserve"> </w:t>
+      </w:r>
+      <w:r>
+        <w:rPr>
+          <w:rFonts w:asciiTheme="minorBidi" w:hAnsiTheme="minorBidi"/>
+          <w:sz w:val="20"/>
+          <w:szCs w:val="20"/>
+          <w:lang w:bidi="fa-IR"/>
+        </w:rPr>
+        <w:t>M Soltani, A Zakerian Zadeh,</w:t>
+      </w:r>
+      <w:r>
+        <w:rPr>
+          <w:rFonts w:asciiTheme="minorBidi" w:hAnsiTheme="minorBidi"/>
+          <w:sz w:val="20"/>
+          <w:szCs w:val="20"/>
+          <w:lang w:bidi="fa-IR"/>
+        </w:rPr>
+        <w:t xml:space="preserve"> M Bayat</w:t>
+      </w:r>
+      <w:r>
+        <w:rPr>
+          <w:rFonts w:asciiTheme="minorBidi" w:hAnsiTheme="minorBidi"/>
           <w:sz w:val="20"/>
           <w:szCs w:val="20"/>
           <w:lang w:bidi="fa-IR"/>
@@ -2899,124 +2523,39 @@
         <w:t>,</w:t>
       </w:r>
       <w:r>
+        <w:rPr>
+          <w:rFonts w:asciiTheme="minorBidi" w:hAnsiTheme="minorBidi"/>
+          <w:sz w:val="20"/>
+          <w:szCs w:val="20"/>
+          <w:lang w:bidi="fa-IR"/>
+        </w:rPr>
         <w:t xml:space="preserve"> </w:t>
       </w:r>
       <w:r>
         <w:rPr>
           <w:rFonts w:asciiTheme="minorBidi" w:hAnsiTheme="minorBidi"/>
-          <w:color w:val="4B4C4E"/>
-          <w:sz w:val="20"/>
-          <w:szCs w:val="20"/>
-          <w:lang w:bidi="fa-IR"/>
-        </w:rPr>
-        <w:t>M Soltani</w:t>
-      </w:r>
-      <w:r>
-        <w:rPr>
-          <w:rFonts w:asciiTheme="minorBidi" w:hAnsiTheme="minorBidi"/>
-          <w:color w:val="4B4C4E"/>
-          <w:sz w:val="20"/>
-          <w:szCs w:val="20"/>
-          <w:lang w:bidi="fa-IR"/>
-        </w:rPr>
-        <w:t xml:space="preserve">, A </w:t>
-      </w:r>
-      <w:r>
-        <w:rPr>
-          <w:rFonts w:asciiTheme="minorBidi" w:hAnsiTheme="minorBidi"/>
-          <w:color w:val="4B4C4E"/>
-          <w:sz w:val="20"/>
-          <w:szCs w:val="20"/>
-          <w:lang w:bidi="fa-IR"/>
-        </w:rPr>
-        <w:t>Zakerian Zadeh</w:t>
-      </w:r>
-      <w:r>
-        <w:rPr>
-          <w:rFonts w:asciiTheme="minorBidi" w:hAnsiTheme="minorBidi"/>
-          <w:color w:val="4B4C4E"/>
-          <w:sz w:val="20"/>
-          <w:szCs w:val="20"/>
-          <w:lang w:bidi="fa-IR"/>
-        </w:rPr>
-        <w:t>,</w:t>
-      </w:r>
-      <w:r>
-        <w:rPr>
-          <w:rFonts w:asciiTheme="minorBidi" w:hAnsiTheme="minorBidi"/>
-          <w:color w:val="4B4C4E"/>
-          <w:sz w:val="20"/>
-          <w:szCs w:val="20"/>
-          <w:lang w:bidi="fa-IR"/>
-        </w:rPr>
-        <w:t xml:space="preserve"> M Bayat</w:t>
-      </w:r>
-      <w:r>
-        <w:rPr>
-          <w:rFonts w:asciiTheme="minorBidi" w:hAnsiTheme="minorBidi"/>
-          <w:color w:val="4B4C4E"/>
-          <w:sz w:val="20"/>
-          <w:szCs w:val="20"/>
-          <w:lang w:bidi="fa-IR"/>
-        </w:rPr>
-        <w:t>,</w:t>
-      </w:r>
-      <w:r>
-        <w:rPr>
-          <w:rFonts w:asciiTheme="minorBidi" w:hAnsiTheme="minorBidi"/>
-          <w:color w:val="4B4C4E"/>
-          <w:sz w:val="20"/>
-          <w:szCs w:val="20"/>
-          <w:lang w:bidi="fa-IR"/>
-        </w:rPr>
-        <w:t xml:space="preserve"> </w:t>
-      </w:r>
-      <w:r>
-        <w:rPr>
-          <w:rFonts w:asciiTheme="minorBidi" w:hAnsiTheme="minorBidi"/>
-          <w:color w:val="4C4D4F"/>
-          <w:sz w:val="20"/>
-          <w:szCs w:val="20"/>
-        </w:rPr>
-        <w:t>“</w:t>
-      </w:r>
-      <w:r>
-        <w:rPr>
-          <w:rFonts w:asciiTheme="minorBidi" w:hAnsiTheme="minorBidi"/>
-          <w:color w:val="4C4D4F"/>
-          <w:sz w:val="20"/>
-          <w:szCs w:val="20"/>
-        </w:rPr>
-        <w:t>Assessment of structural connectivity and brain volumes after tDCS in stroke: a machine-learning method</w:t>
-      </w:r>
-      <w:r>
-        <w:rPr>
-          <w:rFonts w:asciiTheme="minorBidi" w:hAnsiTheme="minorBidi"/>
-          <w:color w:val="4C4D4F"/>
-          <w:sz w:val="20"/>
-          <w:szCs w:val="20"/>
-        </w:rPr>
-        <w:t>”</w:t>
-      </w:r>
-    </w:p>
-    <w:p>
-      <w:pPr>
-        <w:rPr>
-          <w:rFonts w:asciiTheme="minorBidi" w:hAnsiTheme="minorBidi"/>
-          <w:b/>
-          <w:bCs/>
-          <w:color w:val="4B4C4E"/>
-          <w:sz w:val="20"/>
-          <w:szCs w:val="20"/>
-          <w:lang w:bidi="fa-IR"/>
-        </w:rPr>
-      </w:pPr>
-      <w:r>
-        <w:rPr>
-          <w:rFonts w:asciiTheme="minorBidi" w:hAnsiTheme="minorBidi"/>
-          <w:b/>
-          <w:bCs/>
-          <w:color w:val="4B4C4E"/>
+          <w:sz w:val="20"/>
+          <w:szCs w:val="20"/>
+        </w:rPr>
+        <w:t>“Assessment of structural connectivity and brain volumes after tDCS in stroke: a machine-learning method”</w:t>
+      </w:r>
+    </w:p>
+    <w:p>
+      <w:pPr>
+        <w:rPr>
+          <w:rFonts w:asciiTheme="minorBidi" w:hAnsiTheme="minorBidi"/>
+          <w:b/>
+          <w:bCs/>
+          <w:sz w:val="20"/>
+          <w:szCs w:val="20"/>
+          <w:lang w:bidi="fa-IR"/>
+        </w:rPr>
+      </w:pPr>
+      <w:r>
+        <w:rPr>
+          <w:rFonts w:asciiTheme="minorBidi" w:hAnsiTheme="minorBidi"/>
+          <w:b/>
+          <w:bCs/>
           <w:sz w:val="20"/>
           <w:szCs w:val="20"/>
           <w:lang w:bidi="fa-IR"/>
@@ -3035,16 +2574,14 @@
           <w:rFonts w:asciiTheme="minorBidi" w:hAnsiTheme="minorBidi"/>
           <w:b/>
           <w:bCs/>
-          <w:color w:val="4B4C4E"/>
-          <w:sz w:val="20"/>
-          <w:szCs w:val="20"/>
-          <w:lang w:bidi="fa-IR"/>
-        </w:rPr>
-      </w:pPr>
-      <w:r>
-        <w:rPr>
-          <w:rFonts w:asciiTheme="minorBidi" w:hAnsiTheme="minorBidi"/>
-          <w:color w:val="4C4D4F"/>
+          <w:sz w:val="20"/>
+          <w:szCs w:val="20"/>
+          <w:lang w:bidi="fa-IR"/>
+        </w:rPr>
+      </w:pPr>
+      <w:r>
+        <w:rPr>
+          <w:rFonts w:asciiTheme="minorBidi" w:hAnsiTheme="minorBidi"/>
           <w:sz w:val="20"/>
           <w:szCs w:val="20"/>
         </w:rPr>
@@ -3053,7 +2590,6 @@
       <w:r>
         <w:rPr>
           <w:rFonts w:asciiTheme="minorBidi" w:hAnsiTheme="minorBidi"/>
-          <w:color w:val="4C4D4F"/>
           <w:sz w:val="20"/>
           <w:szCs w:val="20"/>
         </w:rPr>
@@ -3062,7 +2598,6 @@
       <w:r>
         <w:rPr>
           <w:rFonts w:asciiTheme="minorBidi" w:hAnsiTheme="minorBidi"/>
-          <w:color w:val="4C4D4F"/>
           <w:sz w:val="20"/>
           <w:szCs w:val="20"/>
         </w:rPr>
@@ -3071,7 +2606,6 @@
       <w:r>
         <w:rPr>
           <w:rFonts w:asciiTheme="minorBidi" w:hAnsiTheme="minorBidi"/>
-          <w:color w:val="4C4D4F"/>
           <w:sz w:val="20"/>
           <w:szCs w:val="20"/>
         </w:rPr>
@@ -3080,7 +2614,6 @@
       <w:r>
         <w:rPr>
           <w:rFonts w:asciiTheme="minorBidi" w:hAnsiTheme="minorBidi"/>
-          <w:color w:val="4C4D4F"/>
           <w:sz w:val="20"/>
           <w:szCs w:val="20"/>
         </w:rPr>
@@ -3089,7 +2622,6 @@
       <w:r>
         <w:rPr>
           <w:rFonts w:asciiTheme="minorBidi" w:hAnsiTheme="minorBidi"/>
-          <w:color w:val="4C4D4F"/>
           <w:sz w:val="20"/>
           <w:szCs w:val="20"/>
         </w:rPr>
@@ -3098,7 +2630,6 @@
       <w:r>
         <w:rPr>
           <w:rFonts w:asciiTheme="minorBidi" w:hAnsiTheme="minorBidi"/>
-          <w:color w:val="4C4D4F"/>
           <w:sz w:val="20"/>
           <w:szCs w:val="20"/>
         </w:rPr>
@@ -3109,7 +2640,6 @@
       <w:pPr>
         <w:rPr>
           <w:rFonts w:asciiTheme="minorBidi" w:hAnsiTheme="minorBidi"/>
-          <w:color w:val="4B4C4E"/>
           <w:sz w:val="2"/>
           <w:szCs w:val="2"/>
           <w:lang w:bidi="fa-IR"/>
@@ -3122,7 +2652,6 @@
           <w:rFonts w:asciiTheme="minorBidi" w:hAnsiTheme="minorBidi"/>
           <w:b/>
           <w:bCs/>
-          <w:color w:val="4C4D4F"/>
           <w:sz w:val="24"/>
           <w:szCs w:val="24"/>
           <w:lang w:bidi="fa-IR"/>
@@ -3133,7 +2662,6 @@
           <w:rFonts w:asciiTheme="minorBidi" w:hAnsiTheme="minorBidi"/>
           <w:b/>
           <w:bCs/>
-          <w:color w:val="4C4D4F"/>
           <w:sz w:val="24"/>
           <w:szCs w:val="24"/>
           <w:lang w:bidi="fa-IR"/>
@@ -3145,16 +2673,14 @@
       <w:pPr>
         <w:rPr>
           <w:rFonts w:asciiTheme="minorBidi" w:hAnsiTheme="minorBidi"/>
-          <w:color w:val="4C4D4F"/>
-          <w:sz w:val="20"/>
-          <w:szCs w:val="20"/>
-          <w:lang w:bidi="fa-IR"/>
-        </w:rPr>
-      </w:pPr>
-      <w:r>
-        <w:rPr>
-          <w:rFonts w:asciiTheme="minorBidi" w:hAnsiTheme="minorBidi"/>
-          <w:color w:val="4C4D4F"/>
+          <w:sz w:val="20"/>
+          <w:szCs w:val="20"/>
+          <w:lang w:bidi="fa-IR"/>
+        </w:rPr>
+      </w:pPr>
+      <w:r>
+        <w:rPr>
+          <w:rFonts w:asciiTheme="minorBidi" w:hAnsiTheme="minorBidi"/>
           <w:sz w:val="20"/>
           <w:szCs w:val="20"/>
           <w:lang w:bidi="fa-IR"/>
@@ -3164,7 +2690,6 @@
       <w:r>
         <w:rPr>
           <w:rFonts w:asciiTheme="minorBidi" w:hAnsiTheme="minorBidi"/>
-          <w:color w:val="4C4D4F"/>
           <w:sz w:val="20"/>
           <w:szCs w:val="20"/>
           <w:lang w:bidi="fa-IR"/>
@@ -3174,7 +2699,6 @@
       <w:r>
         <w:rPr>
           <w:rFonts w:asciiTheme="minorBidi" w:hAnsiTheme="minorBidi"/>
-          <w:color w:val="4C4D4F"/>
           <w:sz w:val="20"/>
           <w:szCs w:val="20"/>
           <w:lang w:bidi="fa-IR"/>
@@ -3184,7 +2708,6 @@
       <w:r>
         <w:rPr>
           <w:rFonts w:asciiTheme="minorBidi" w:hAnsiTheme="minorBidi"/>
-          <w:color w:val="4C4D4F"/>
           <w:sz w:val="20"/>
           <w:szCs w:val="20"/>
           <w:lang w:bidi="fa-IR"/>
@@ -3194,7 +2717,6 @@
       <w:r>
         <w:rPr>
           <w:rFonts w:asciiTheme="minorBidi" w:hAnsiTheme="minorBidi"/>
-          <w:color w:val="4C4D4F"/>
           <w:sz w:val="20"/>
           <w:szCs w:val="20"/>
           <w:lang w:bidi="fa-IR"/>
@@ -3204,7 +2726,6 @@
       <w:r>
         <w:rPr>
           <w:rFonts w:asciiTheme="minorBidi" w:hAnsiTheme="minorBidi"/>
-          <w:color w:val="4C4D4F"/>
           <w:sz w:val="20"/>
           <w:szCs w:val="20"/>
           <w:lang w:bidi="fa-IR"/>
@@ -3216,7 +2737,6 @@
           <w:rFonts w:asciiTheme="minorBidi" w:hAnsiTheme="minorBidi"/>
           <w:b/>
           <w:bCs/>
-          <w:color w:val="4C4D4F"/>
           <w:sz w:val="20"/>
           <w:szCs w:val="20"/>
           <w:lang w:bidi="fa-IR"/>
@@ -3226,7 +2746,6 @@
       <w:r>
         <w:rPr>
           <w:rFonts w:asciiTheme="minorBidi" w:hAnsiTheme="minorBidi"/>
-          <w:color w:val="4C4D4F"/>
           <w:sz w:val="20"/>
           <w:szCs w:val="20"/>
           <w:lang w:bidi="fa-IR"/>
@@ -3243,18 +2762,16 @@
         </w:numPr>
         <w:rPr>
           <w:rFonts w:asciiTheme="minorBidi" w:hAnsiTheme="minorBidi"/>
-          <w:color w:val="4C4D4F"/>
-          <w:sz w:val="20"/>
-          <w:szCs w:val="20"/>
-          <w:lang w:bidi="fa-IR"/>
-        </w:rPr>
-      </w:pPr>
-      <w:r>
-        <w:rPr>
-          <w:rFonts w:asciiTheme="minorBidi" w:hAnsiTheme="minorBidi"/>
-          <w:b/>
-          <w:bCs/>
-          <w:color w:val="4C4D4F"/>
+          <w:sz w:val="20"/>
+          <w:szCs w:val="20"/>
+          <w:lang w:bidi="fa-IR"/>
+        </w:rPr>
+      </w:pPr>
+      <w:r>
+        <w:rPr>
+          <w:rFonts w:asciiTheme="minorBidi" w:hAnsiTheme="minorBidi"/>
+          <w:b/>
+          <w:bCs/>
           <w:sz w:val="20"/>
           <w:szCs w:val="20"/>
           <w:lang w:bidi="fa-IR"/>
@@ -3266,7 +2783,6 @@
           <w:rFonts w:asciiTheme="minorBidi" w:hAnsiTheme="minorBidi"/>
           <w:b/>
           <w:bCs/>
-          <w:color w:val="4C4D4F"/>
           <w:sz w:val="20"/>
           <w:szCs w:val="20"/>
           <w:lang w:bidi="fa-IR"/>
@@ -3278,7 +2794,6 @@
           <w:rFonts w:asciiTheme="minorBidi" w:hAnsiTheme="minorBidi"/>
           <w:b/>
           <w:bCs/>
-          <w:color w:val="4C4D4F"/>
           <w:sz w:val="20"/>
           <w:szCs w:val="20"/>
           <w:lang w:bidi="fa-IR"/>
@@ -3288,7 +2803,6 @@
       <w:r>
         <w:rPr>
           <w:rFonts w:asciiTheme="minorBidi" w:hAnsiTheme="minorBidi"/>
-          <w:color w:val="4C4D4F"/>
           <w:sz w:val="20"/>
           <w:szCs w:val="20"/>
           <w:lang w:bidi="fa-IR"/>
@@ -3298,7 +2812,6 @@
       <w:r>
         <w:rPr>
           <w:rFonts w:asciiTheme="minorBidi" w:hAnsiTheme="minorBidi"/>
-          <w:color w:val="4C4D4F"/>
           <w:sz w:val="20"/>
           <w:szCs w:val="20"/>
           <w:lang w:bidi="fa-IR"/>
@@ -3308,7 +2821,6 @@
       <w:r>
         <w:rPr>
           <w:rFonts w:asciiTheme="minorBidi" w:hAnsiTheme="minorBidi"/>
-          <w:color w:val="4C4D4F"/>
           <w:sz w:val="20"/>
           <w:szCs w:val="20"/>
           <w:lang w:bidi="fa-IR"/>
@@ -3318,7 +2830,6 @@
       <w:r>
         <w:rPr>
           <w:rFonts w:asciiTheme="minorBidi" w:hAnsiTheme="minorBidi"/>
-          <w:color w:val="4C4D4F"/>
           <w:sz w:val="20"/>
           <w:szCs w:val="20"/>
           <w:lang w:bidi="fa-IR"/>
@@ -3328,7 +2839,6 @@
       <w:r>
         <w:rPr>
           <w:rFonts w:asciiTheme="minorBidi" w:hAnsiTheme="minorBidi"/>
-          <w:color w:val="4C4D4F"/>
           <w:sz w:val="20"/>
           <w:szCs w:val="20"/>
           <w:lang w:bidi="fa-IR"/>
@@ -3338,7 +2848,6 @@
       <w:r>
         <w:rPr>
           <w:rFonts w:asciiTheme="minorBidi" w:hAnsiTheme="minorBidi"/>
-          <w:color w:val="4C4D4F"/>
           <w:sz w:val="20"/>
           <w:szCs w:val="20"/>
           <w:lang w:bidi="fa-IR"/>
@@ -3348,7 +2857,6 @@
       <w:r>
         <w:rPr>
           <w:rFonts w:asciiTheme="minorBidi" w:hAnsiTheme="minorBidi"/>
-          <w:color w:val="4C4D4F"/>
           <w:sz w:val="20"/>
           <w:szCs w:val="20"/>
           <w:lang w:bidi="fa-IR"/>
@@ -3358,7 +2866,6 @@
       <w:r>
         <w:rPr>
           <w:rFonts w:asciiTheme="minorBidi" w:hAnsiTheme="minorBidi"/>
-          <w:color w:val="4C4D4F"/>
           <w:sz w:val="20"/>
           <w:szCs w:val="20"/>
           <w:lang w:bidi="fa-IR"/>
@@ -3368,7 +2875,6 @@
       <w:r>
         <w:rPr>
           <w:rFonts w:asciiTheme="minorBidi" w:hAnsiTheme="minorBidi"/>
-          <w:color w:val="4C4D4F"/>
           <w:sz w:val="20"/>
           <w:szCs w:val="20"/>
           <w:lang w:bidi="fa-IR"/>
@@ -3378,7 +2884,6 @@
       <w:r>
         <w:rPr>
           <w:rFonts w:asciiTheme="minorBidi" w:hAnsiTheme="minorBidi"/>
-          <w:color w:val="4C4D4F"/>
           <w:sz w:val="20"/>
           <w:szCs w:val="20"/>
           <w:lang w:bidi="fa-IR"/>
@@ -3395,7 +2900,6 @@
         </w:numPr>
         <w:rPr>
           <w:rFonts w:asciiTheme="minorBidi" w:hAnsiTheme="minorBidi"/>
-          <w:color w:val="4C4D4F"/>
           <w:sz w:val="20"/>
           <w:szCs w:val="20"/>
           <w:lang w:bidi="fa-IR"/>
@@ -3407,7 +2911,6 @@
           <w:b/>
           <w:bCs/>
           <w:noProof/>
-          <w:color w:val="4C4D4F"/>
           <w:sz w:val="20"/>
           <w:szCs w:val="20"/>
         </w:rPr>
@@ -3417,7 +2920,6 @@
         <w:rPr>
           <w:rFonts w:asciiTheme="minorBidi" w:hAnsiTheme="minorBidi"/>
           <w:noProof/>
-          <w:color w:val="4C4D4F"/>
           <w:sz w:val="20"/>
           <w:szCs w:val="20"/>
         </w:rPr>
@@ -3446,7 +2948,6 @@
           <w:rFonts w:asciiTheme="minorBidi" w:hAnsiTheme="minorBidi"/>
           <w:b/>
           <w:bCs/>
-          <w:color w:val="4C4D4F"/>
           <w:sz w:val="24"/>
           <w:szCs w:val="24"/>
           <w:lang w:bidi="fa-IR"/>
@@ -3457,7 +2958,6 @@
           <w:rFonts w:asciiTheme="minorBidi" w:hAnsiTheme="minorBidi"/>
           <w:b/>
           <w:bCs/>
-          <w:color w:val="4C4D4F"/>
           <w:sz w:val="24"/>
           <w:szCs w:val="24"/>
           <w:lang w:bidi="fa-IR"/>
@@ -3475,16 +2975,14 @@
           <w:rFonts w:asciiTheme="minorBidi" w:hAnsiTheme="minorBidi"/>
           <w:b/>
           <w:bCs/>
-          <w:color w:val="4C4D4F"/>
-          <w:sz w:val="20"/>
-          <w:szCs w:val="20"/>
-          <w:lang w:bidi="fa-IR"/>
-        </w:rPr>
-      </w:pPr>
-      <w:r>
-        <w:rPr>
-          <w:rFonts w:asciiTheme="minorBidi" w:hAnsiTheme="minorBidi"/>
-          <w:color w:val="4C4D4F"/>
+          <w:sz w:val="20"/>
+          <w:szCs w:val="20"/>
+          <w:lang w:bidi="fa-IR"/>
+        </w:rPr>
+      </w:pPr>
+      <w:r>
+        <w:rPr>
+          <w:rFonts w:asciiTheme="minorBidi" w:hAnsiTheme="minorBidi"/>
           <w:sz w:val="20"/>
           <w:szCs w:val="20"/>
           <w:lang w:bidi="fa-IR"/>
@@ -3494,7 +2992,6 @@
       <w:r>
         <w:rPr>
           <w:rFonts w:asciiTheme="minorBidi" w:hAnsiTheme="minorBidi"/>
-          <w:color w:val="4C4D4F"/>
           <w:sz w:val="20"/>
           <w:szCs w:val="20"/>
           <w:lang w:bidi="fa-IR"/>
@@ -3504,7 +3001,6 @@
       <w:r>
         <w:rPr>
           <w:rFonts w:asciiTheme="minorBidi" w:hAnsiTheme="minorBidi"/>
-          <w:color w:val="4C4D4F"/>
           <w:sz w:val="20"/>
           <w:szCs w:val="20"/>
           <w:lang w:bidi="fa-IR"/>
@@ -3514,7 +3010,6 @@
       <w:r>
         <w:rPr>
           <w:rFonts w:asciiTheme="minorBidi" w:hAnsiTheme="minorBidi"/>
-          <w:color w:val="4C4D4F"/>
           <w:sz w:val="20"/>
           <w:szCs w:val="20"/>
           <w:lang w:bidi="fa-IR"/>
@@ -3524,7 +3019,6 @@
       <w:r>
         <w:rPr>
           <w:rFonts w:asciiTheme="minorBidi" w:hAnsiTheme="minorBidi"/>
-          <w:color w:val="4C4D4F"/>
           <w:sz w:val="20"/>
           <w:szCs w:val="20"/>
           <w:lang w:bidi="fa-IR"/>
@@ -3534,7 +3028,6 @@
       <w:r>
         <w:rPr>
           <w:rFonts w:asciiTheme="minorBidi" w:hAnsiTheme="minorBidi"/>
-          <w:color w:val="4C4D4F"/>
           <w:sz w:val="20"/>
           <w:szCs w:val="20"/>
           <w:lang w:bidi="fa-IR"/>
@@ -3546,7 +3039,6 @@
           <w:rFonts w:asciiTheme="minorBidi" w:hAnsiTheme="minorBidi"/>
           <w:b/>
           <w:bCs/>
-          <w:color w:val="4C4D4F"/>
           <w:sz w:val="20"/>
           <w:szCs w:val="20"/>
           <w:lang w:bidi="fa-IR"/>
@@ -3558,7 +3050,7 @@
           <w:rPr>
             <w:rStyle w:val="Hyperlink"/>
             <w:rFonts w:asciiTheme="minorBidi" w:hAnsiTheme="minorBidi"/>
-            <w:color w:val="2F5496" w:themeColor="accent1" w:themeShade="BF"/>
+            <w:color w:val="1F3864" w:themeColor="accent1" w:themeShade="80"/>
             <w:sz w:val="20"/>
             <w:szCs w:val="20"/>
             <w:u w:val="none"/>
@@ -3572,7 +3064,6 @@
           <w:rFonts w:asciiTheme="minorBidi" w:hAnsiTheme="minorBidi"/>
           <w:b/>
           <w:bCs/>
-          <w:color w:val="4C4D4F"/>
           <w:sz w:val="20"/>
           <w:szCs w:val="20"/>
           <w:lang w:bidi="fa-IR"/>
@@ -3582,7 +3073,6 @@
       <w:r>
         <w:rPr>
           <w:rFonts w:asciiTheme="minorBidi" w:hAnsiTheme="minorBidi"/>
-          <w:color w:val="4C4D4F"/>
           <w:sz w:val="20"/>
           <w:szCs w:val="20"/>
           <w:lang w:bidi="fa-IR"/>
@@ -3599,18 +3089,16 @@
         <w:ind w:left="1996"/>
         <w:rPr>
           <w:rFonts w:asciiTheme="minorBidi" w:hAnsiTheme="minorBidi"/>
-          <w:color w:val="4C4D4F"/>
-          <w:sz w:val="20"/>
-          <w:szCs w:val="20"/>
-          <w:lang w:bidi="fa-IR"/>
-        </w:rPr>
-      </w:pPr>
-      <w:r>
-        <w:rPr>
-          <w:rFonts w:asciiTheme="minorBidi" w:hAnsiTheme="minorBidi"/>
-          <w:b/>
-          <w:bCs/>
-          <w:color w:val="4C4D4F"/>
+          <w:sz w:val="20"/>
+          <w:szCs w:val="20"/>
+          <w:lang w:bidi="fa-IR"/>
+        </w:rPr>
+      </w:pPr>
+      <w:r>
+        <w:rPr>
+          <w:rFonts w:asciiTheme="minorBidi" w:hAnsiTheme="minorBidi"/>
+          <w:b/>
+          <w:bCs/>
           <w:sz w:val="20"/>
           <w:szCs w:val="20"/>
           <w:lang w:bidi="fa-IR"/>
@@ -3622,7 +3110,6 @@
           <w:rFonts w:asciiTheme="minorBidi" w:hAnsiTheme="minorBidi"/>
           <w:b/>
           <w:bCs/>
-          <w:color w:val="4C4D4F"/>
           <w:sz w:val="20"/>
           <w:szCs w:val="20"/>
           <w:lang w:bidi="fa-IR"/>
@@ -3632,7 +3119,6 @@
       <w:r>
         <w:rPr>
           <w:rFonts w:asciiTheme="minorBidi" w:hAnsiTheme="minorBidi"/>
-          <w:color w:val="4C4D4F"/>
           <w:sz w:val="20"/>
           <w:szCs w:val="20"/>
           <w:lang w:bidi="fa-IR"/>
@@ -3642,52 +3128,20 @@
       <w:r>
         <w:rPr>
           <w:rFonts w:asciiTheme="minorBidi" w:hAnsiTheme="minorBidi"/>
-          <w:color w:val="4C4D4F"/>
-          <w:sz w:val="20"/>
-          <w:szCs w:val="20"/>
-          <w:lang w:bidi="fa-IR"/>
-        </w:rPr>
-        <w:t xml:space="preserve">includes </w:t>
-      </w:r>
-      <w:r>
-        <w:rPr>
-          <w:rFonts w:asciiTheme="minorBidi" w:hAnsiTheme="minorBidi"/>
-          <w:color w:val="4C4D4F"/>
-          <w:sz w:val="20"/>
-          <w:szCs w:val="20"/>
-          <w:lang w:bidi="fa-IR"/>
-        </w:rPr>
-        <w:t>a</w:t>
-      </w:r>
-      <w:r>
-        <w:rPr>
-          <w:rFonts w:asciiTheme="minorBidi" w:hAnsiTheme="minorBidi"/>
-          <w:color w:val="4C4D4F"/>
-          <w:sz w:val="20"/>
-          <w:szCs w:val="20"/>
-          <w:lang w:bidi="fa-IR"/>
-        </w:rPr>
-        <w:t xml:space="preserve"> </w:t>
-      </w:r>
-      <w:r>
-        <w:rPr>
-          <w:rFonts w:asciiTheme="minorBidi" w:hAnsiTheme="minorBidi"/>
-          <w:color w:val="4C4D4F"/>
-          <w:sz w:val="20"/>
-          <w:szCs w:val="20"/>
-          <w:lang w:bidi="fa-IR"/>
-        </w:rPr>
-        <w:t>collaborative</w:t>
-      </w:r>
-      <w:r>
-        <w:rPr>
-          <w:rFonts w:asciiTheme="minorBidi" w:hAnsiTheme="minorBidi"/>
-          <w:color w:val="4C4D4F"/>
-          <w:sz w:val="20"/>
-          <w:szCs w:val="20"/>
-          <w:lang w:bidi="fa-IR"/>
-        </w:rPr>
-        <w:t xml:space="preserve"> recommender system.</w:t>
+          <w:sz w:val="20"/>
+          <w:szCs w:val="20"/>
+          <w:lang w:bidi="fa-IR"/>
+        </w:rPr>
+        <w:t>includes a</w:t>
+      </w:r>
+      <w:r>
+        <w:rPr>
+          <w:rFonts w:asciiTheme="minorBidi" w:hAnsiTheme="minorBidi"/>
+          <w:sz w:val="20"/>
+          <w:szCs w:val="20"/>
+          <w:lang w:bidi="fa-IR"/>
+        </w:rPr>
+        <w:t xml:space="preserve"> collaborative recommender system.</w:t>
       </w:r>
     </w:p>
     <w:p>
@@ -3698,16 +3152,14 @@
         <w:spacing w:line="240" w:lineRule="auto"/>
         <w:rPr>
           <w:rFonts w:asciiTheme="minorBidi" w:hAnsiTheme="minorBidi"/>
-          <w:color w:val="4C4D4F"/>
-          <w:sz w:val="20"/>
-          <w:szCs w:val="20"/>
-          <w:lang w:bidi="fa-IR"/>
-        </w:rPr>
-      </w:pPr>
-      <w:r>
-        <w:rPr>
-          <w:rFonts w:asciiTheme="minorBidi" w:hAnsiTheme="minorBidi"/>
-          <w:color w:val="4C4D4F"/>
+          <w:sz w:val="20"/>
+          <w:szCs w:val="20"/>
+          <w:lang w:bidi="fa-IR"/>
+        </w:rPr>
+      </w:pPr>
+      <w:r>
+        <w:rPr>
+          <w:rFonts w:asciiTheme="minorBidi" w:hAnsiTheme="minorBidi"/>
           <w:sz w:val="20"/>
           <w:szCs w:val="20"/>
           <w:lang w:bidi="fa-IR"/>
@@ -3717,7 +3169,6 @@
       <w:r>
         <w:rPr>
           <w:rFonts w:asciiTheme="minorBidi" w:hAnsiTheme="minorBidi"/>
-          <w:color w:val="4C4D4F"/>
           <w:sz w:val="20"/>
           <w:szCs w:val="20"/>
           <w:lang w:bidi="fa-IR"/>
@@ -3727,7 +3178,6 @@
       <w:r>
         <w:rPr>
           <w:rFonts w:asciiTheme="minorBidi" w:hAnsiTheme="minorBidi"/>
-          <w:color w:val="4C4D4F"/>
           <w:sz w:val="20"/>
           <w:szCs w:val="20"/>
           <w:lang w:bidi="fa-IR"/>
@@ -3737,7 +3187,6 @@
       <w:r>
         <w:rPr>
           <w:rFonts w:asciiTheme="minorBidi" w:hAnsiTheme="minorBidi"/>
-          <w:color w:val="4C4D4F"/>
           <w:sz w:val="20"/>
           <w:szCs w:val="20"/>
           <w:lang w:bidi="fa-IR"/>
@@ -3747,7 +3196,6 @@
       <w:r>
         <w:rPr>
           <w:rFonts w:asciiTheme="minorBidi" w:hAnsiTheme="minorBidi"/>
-          <w:color w:val="4C4D4F"/>
           <w:sz w:val="20"/>
           <w:szCs w:val="20"/>
           <w:lang w:bidi="fa-IR"/>
@@ -3757,7 +3205,6 @@
       <w:r>
         <w:rPr>
           <w:rFonts w:asciiTheme="minorBidi" w:hAnsiTheme="minorBidi"/>
-          <w:color w:val="4C4D4F"/>
           <w:sz w:val="20"/>
           <w:szCs w:val="20"/>
           <w:lang w:bidi="fa-IR"/>
@@ -3769,7 +3216,6 @@
           <w:rFonts w:asciiTheme="minorBidi" w:hAnsiTheme="minorBidi"/>
           <w:b/>
           <w:bCs/>
-          <w:color w:val="4C4D4F"/>
           <w:sz w:val="20"/>
           <w:szCs w:val="20"/>
           <w:lang w:bidi="fa-IR"/>
@@ -3779,7 +3225,6 @@
       <w:r>
         <w:rPr>
           <w:rFonts w:asciiTheme="minorBidi" w:hAnsiTheme="minorBidi"/>
-          <w:color w:val="4C4D4F"/>
           <w:sz w:val="20"/>
           <w:szCs w:val="20"/>
           <w:lang w:bidi="fa-IR"/>
@@ -3791,7 +3236,7 @@
           <w:rPr>
             <w:rStyle w:val="Hyperlink"/>
             <w:rFonts w:asciiTheme="minorBidi" w:hAnsiTheme="minorBidi"/>
-            <w:color w:val="2F5496" w:themeColor="accent1" w:themeShade="BF"/>
+            <w:color w:val="1F3864" w:themeColor="accent1" w:themeShade="80"/>
             <w:sz w:val="20"/>
             <w:szCs w:val="20"/>
             <w:u w:val="none"/>
@@ -3805,7 +3250,6 @@
           <w:rFonts w:asciiTheme="minorBidi" w:hAnsiTheme="minorBidi"/>
           <w:b/>
           <w:bCs/>
-          <w:color w:val="4C4D4F"/>
           <w:sz w:val="20"/>
           <w:szCs w:val="20"/>
           <w:lang w:bidi="fa-IR"/>
@@ -3815,7 +3259,6 @@
       <w:r>
         <w:rPr>
           <w:rFonts w:asciiTheme="minorBidi" w:hAnsiTheme="minorBidi"/>
-          <w:color w:val="4C4D4F"/>
           <w:sz w:val="20"/>
           <w:szCs w:val="20"/>
           <w:lang w:bidi="fa-IR"/>
@@ -3831,16 +3274,14 @@
         <w:spacing w:line="240" w:lineRule="auto"/>
         <w:rPr>
           <w:rFonts w:asciiTheme="minorBidi" w:hAnsiTheme="minorBidi"/>
-          <w:color w:val="4C4D4F"/>
-          <w:sz w:val="20"/>
-          <w:szCs w:val="20"/>
-          <w:lang w:bidi="fa-IR"/>
-        </w:rPr>
-      </w:pPr>
-      <w:r>
-        <w:rPr>
-          <w:rFonts w:asciiTheme="minorBidi" w:hAnsiTheme="minorBidi"/>
-          <w:color w:val="4C4D4F"/>
+          <w:sz w:val="20"/>
+          <w:szCs w:val="20"/>
+          <w:lang w:bidi="fa-IR"/>
+        </w:rPr>
+      </w:pPr>
+      <w:r>
+        <w:rPr>
+          <w:rFonts w:asciiTheme="minorBidi" w:hAnsiTheme="minorBidi"/>
           <w:sz w:val="20"/>
           <w:szCs w:val="20"/>
           <w:lang w:bidi="fa-IR"/>
@@ -3852,7 +3293,6 @@
           <w:rFonts w:asciiTheme="minorBidi" w:hAnsiTheme="minorBidi"/>
           <w:b/>
           <w:bCs/>
-          <w:color w:val="4C4D4F"/>
           <w:sz w:val="20"/>
           <w:szCs w:val="20"/>
           <w:lang w:bidi="fa-IR"/>
@@ -3862,7 +3302,6 @@
       <w:r>
         <w:rPr>
           <w:rFonts w:asciiTheme="minorBidi" w:hAnsiTheme="minorBidi"/>
-          <w:color w:val="4C4D4F"/>
           <w:sz w:val="20"/>
           <w:szCs w:val="20"/>
           <w:lang w:bidi="fa-IR"/>
@@ -3872,7 +3311,6 @@
       <w:r>
         <w:rPr>
           <w:rFonts w:asciiTheme="minorBidi" w:hAnsiTheme="minorBidi"/>
-          <w:color w:val="4C4D4F"/>
           <w:sz w:val="20"/>
           <w:szCs w:val="20"/>
           <w:lang w:bidi="fa-IR"/>
@@ -3890,16 +3328,14 @@
           <w:rFonts w:asciiTheme="minorBidi" w:hAnsiTheme="minorBidi"/>
           <w:b/>
           <w:bCs/>
-          <w:color w:val="4C4D4F"/>
-          <w:sz w:val="20"/>
-          <w:szCs w:val="20"/>
-          <w:lang w:bidi="fa-IR"/>
-        </w:rPr>
-      </w:pPr>
-      <w:r>
-        <w:rPr>
-          <w:rFonts w:asciiTheme="minorBidi" w:hAnsiTheme="minorBidi"/>
-          <w:color w:val="4C4D4F"/>
+          <w:sz w:val="20"/>
+          <w:szCs w:val="20"/>
+          <w:lang w:bidi="fa-IR"/>
+        </w:rPr>
+      </w:pPr>
+      <w:r>
+        <w:rPr>
+          <w:rFonts w:asciiTheme="minorBidi" w:hAnsiTheme="minorBidi"/>
           <w:sz w:val="20"/>
           <w:szCs w:val="20"/>
           <w:lang w:bidi="fa-IR"/>
@@ -3909,7 +3345,6 @@
       <w:r>
         <w:rPr>
           <w:rFonts w:asciiTheme="minorBidi" w:hAnsiTheme="minorBidi"/>
-          <w:color w:val="4C4D4F"/>
           <w:sz w:val="20"/>
           <w:szCs w:val="20"/>
           <w:lang w:bidi="fa-IR"/>
@@ -3919,7 +3354,6 @@
       <w:r>
         <w:rPr>
           <w:rFonts w:asciiTheme="minorBidi" w:hAnsiTheme="minorBidi"/>
-          <w:color w:val="4C4D4F"/>
           <w:sz w:val="20"/>
           <w:szCs w:val="20"/>
           <w:lang w:bidi="fa-IR"/>
@@ -3929,7 +3363,6 @@
       <w:r>
         <w:rPr>
           <w:rFonts w:asciiTheme="minorBidi" w:hAnsiTheme="minorBidi"/>
-          <w:color w:val="4C4D4F"/>
           <w:sz w:val="20"/>
           <w:szCs w:val="20"/>
           <w:lang w:bidi="fa-IR"/>
@@ -3939,7 +3372,6 @@
       <w:r>
         <w:rPr>
           <w:rFonts w:asciiTheme="minorBidi" w:hAnsiTheme="minorBidi"/>
-          <w:color w:val="4C4D4F"/>
           <w:sz w:val="20"/>
           <w:szCs w:val="20"/>
           <w:lang w:bidi="fa-IR"/>
@@ -3949,7 +3381,6 @@
       <w:r>
         <w:rPr>
           <w:rFonts w:asciiTheme="minorBidi" w:hAnsiTheme="minorBidi"/>
-          <w:color w:val="4C4D4F"/>
           <w:sz w:val="20"/>
           <w:szCs w:val="20"/>
           <w:lang w:bidi="fa-IR"/>
@@ -3961,7 +3392,6 @@
           <w:rFonts w:asciiTheme="minorBidi" w:hAnsiTheme="minorBidi"/>
           <w:b/>
           <w:bCs/>
-          <w:color w:val="4C4D4F"/>
           <w:sz w:val="20"/>
           <w:szCs w:val="20"/>
           <w:lang w:bidi="fa-IR"/>
@@ -3971,7 +3401,6 @@
       <w:r>
         <w:rPr>
           <w:rFonts w:asciiTheme="minorBidi" w:hAnsiTheme="minorBidi"/>
-          <w:color w:val="4C4D4F"/>
           <w:sz w:val="20"/>
           <w:szCs w:val="20"/>
           <w:lang w:bidi="fa-IR"/>
@@ -3983,7 +3412,7 @@
           <w:rPr>
             <w:rStyle w:val="Hyperlink"/>
             <w:rFonts w:asciiTheme="minorBidi" w:hAnsiTheme="minorBidi"/>
-            <w:color w:val="2F5496" w:themeColor="accent1" w:themeShade="BF"/>
+            <w:color w:val="1F3864" w:themeColor="accent1" w:themeShade="80"/>
             <w:sz w:val="20"/>
             <w:szCs w:val="20"/>
             <w:u w:val="none"/>
@@ -3997,7 +3426,6 @@
           <w:rFonts w:asciiTheme="minorBidi" w:hAnsiTheme="minorBidi"/>
           <w:b/>
           <w:bCs/>
-          <w:color w:val="4C4D4F"/>
           <w:sz w:val="20"/>
           <w:szCs w:val="20"/>
           <w:lang w:bidi="fa-IR"/>
@@ -4007,7 +3435,6 @@
       <w:r>
         <w:rPr>
           <w:rFonts w:asciiTheme="minorBidi" w:hAnsiTheme="minorBidi"/>
-          <w:color w:val="4C4D4F"/>
           <w:sz w:val="20"/>
           <w:szCs w:val="20"/>
           <w:lang w:bidi="fa-IR"/>
@@ -4024,18 +3451,16 @@
         <w:ind w:left="1996"/>
         <w:rPr>
           <w:rFonts w:asciiTheme="minorBidi" w:hAnsiTheme="minorBidi"/>
-          <w:color w:val="4C4D4F"/>
-          <w:sz w:val="20"/>
-          <w:szCs w:val="20"/>
-          <w:lang w:bidi="fa-IR"/>
-        </w:rPr>
-      </w:pPr>
-      <w:r>
-        <w:rPr>
-          <w:rFonts w:asciiTheme="minorBidi" w:hAnsiTheme="minorBidi"/>
-          <w:b/>
-          <w:bCs/>
-          <w:color w:val="4C4D4F"/>
+          <w:sz w:val="20"/>
+          <w:szCs w:val="20"/>
+          <w:lang w:bidi="fa-IR"/>
+        </w:rPr>
+      </w:pPr>
+      <w:r>
+        <w:rPr>
+          <w:rFonts w:asciiTheme="minorBidi" w:hAnsiTheme="minorBidi"/>
+          <w:b/>
+          <w:bCs/>
           <w:sz w:val="20"/>
           <w:szCs w:val="20"/>
           <w:lang w:bidi="fa-IR"/>
@@ -4045,7 +3470,6 @@
       <w:r>
         <w:rPr>
           <w:rFonts w:asciiTheme="minorBidi" w:hAnsiTheme="minorBidi"/>
-          <w:color w:val="4C4D4F"/>
           <w:sz w:val="20"/>
           <w:szCs w:val="20"/>
           <w:lang w:bidi="fa-IR"/>
@@ -4061,7 +3485,6 @@
         <w:spacing w:line="240" w:lineRule="auto"/>
         <w:rPr>
           <w:rFonts w:asciiTheme="minorBidi" w:hAnsiTheme="minorBidi"/>
-          <w:color w:val="4C4D4F"/>
           <w:sz w:val="2"/>
           <w:szCs w:val="2"/>
           <w:lang w:bidi="fa-IR"/>
@@ -4077,7 +3500,6 @@
           <w:rFonts w:asciiTheme="minorBidi" w:hAnsiTheme="minorBidi"/>
           <w:b/>
           <w:bCs/>
-          <w:color w:val="4C4D4F"/>
           <w:sz w:val="24"/>
           <w:szCs w:val="24"/>
           <w:lang w:bidi="fa-IR"/>
@@ -4088,7 +3510,6 @@
           <w:rFonts w:asciiTheme="minorBidi" w:hAnsiTheme="minorBidi"/>
           <w:b/>
           <w:bCs/>
-          <w:color w:val="4C4D4F"/>
           <w:sz w:val="24"/>
           <w:szCs w:val="24"/>
           <w:lang w:bidi="fa-IR"/>
@@ -4104,15 +3525,13 @@
         <w:spacing w:line="276" w:lineRule="auto"/>
         <w:rPr>
           <w:rFonts w:asciiTheme="minorBidi" w:hAnsiTheme="minorBidi"/>
-          <w:color w:val="4C4D4F"/>
-          <w:sz w:val="20"/>
-          <w:szCs w:val="20"/>
-        </w:rPr>
-      </w:pPr>
-      <w:r>
-        <w:rPr>
-          <w:rFonts w:asciiTheme="minorBidi" w:hAnsiTheme="minorBidi"/>
-          <w:color w:val="4C4D4F"/>
+          <w:sz w:val="20"/>
+          <w:szCs w:val="20"/>
+        </w:rPr>
+      </w:pPr>
+      <w:r>
+        <w:rPr>
+          <w:rFonts w:asciiTheme="minorBidi" w:hAnsiTheme="minorBidi"/>
           <w:sz w:val="20"/>
           <w:szCs w:val="20"/>
           <w:lang w:bidi="fa-IR"/>
@@ -4122,7 +3541,6 @@
       <w:r>
         <w:rPr>
           <w:rFonts w:asciiTheme="minorBidi" w:hAnsiTheme="minorBidi"/>
-          <w:color w:val="4C4D4F"/>
           <w:sz w:val="20"/>
           <w:szCs w:val="20"/>
           <w:lang w:bidi="fa-IR"/>
@@ -4134,7 +3552,6 @@
           <w:rFonts w:asciiTheme="minorBidi" w:hAnsiTheme="minorBidi"/>
           <w:b/>
           <w:bCs/>
-          <w:color w:val="4C4D4F"/>
           <w:sz w:val="20"/>
           <w:szCs w:val="20"/>
         </w:rPr>
@@ -4143,7 +3560,6 @@
       <w:r>
         <w:rPr>
           <w:rFonts w:asciiTheme="minorBidi" w:hAnsiTheme="minorBidi"/>
-          <w:color w:val="4C4D4F"/>
           <w:sz w:val="20"/>
           <w:szCs w:val="20"/>
           <w:lang w:bidi="fa-IR"/>
@@ -4155,7 +3571,6 @@
           <w:rFonts w:asciiTheme="minorBidi" w:hAnsiTheme="minorBidi"/>
           <w:b/>
           <w:bCs/>
-          <w:color w:val="4C4D4F"/>
           <w:sz w:val="20"/>
           <w:szCs w:val="20"/>
         </w:rPr>
@@ -4164,7 +3579,6 @@
       <w:r>
         <w:rPr>
           <w:rFonts w:asciiTheme="minorBidi" w:hAnsiTheme="minorBidi"/>
-          <w:color w:val="4C4D4F"/>
           <w:sz w:val="20"/>
           <w:szCs w:val="20"/>
         </w:rPr>
@@ -4175,7 +3589,6 @@
           <w:rFonts w:asciiTheme="minorBidi" w:hAnsiTheme="minorBidi"/>
           <w:b/>
           <w:bCs/>
-          <w:color w:val="4C4D4F"/>
           <w:sz w:val="20"/>
           <w:szCs w:val="20"/>
         </w:rPr>
@@ -4184,7 +3597,6 @@
       <w:r>
         <w:rPr>
           <w:rFonts w:asciiTheme="minorBidi" w:hAnsiTheme="minorBidi"/>
-          <w:color w:val="4C4D4F"/>
           <w:sz w:val="20"/>
           <w:szCs w:val="20"/>
         </w:rPr>
@@ -4193,7 +3605,6 @@
       <w:r>
         <w:rPr>
           <w:rFonts w:asciiTheme="minorBidi" w:hAnsiTheme="minorBidi"/>
-          <w:color w:val="4C4D4F"/>
           <w:sz w:val="20"/>
           <w:szCs w:val="20"/>
         </w:rPr>
@@ -4202,7 +3613,6 @@
       <w:r>
         <w:rPr>
           <w:rFonts w:asciiTheme="minorBidi" w:hAnsiTheme="minorBidi"/>
-          <w:color w:val="4C4D4F"/>
           <w:sz w:val="20"/>
           <w:szCs w:val="20"/>
           <w:lang w:bidi="fa-IR"/>
@@ -4214,7 +3624,6 @@
           <w:rFonts w:asciiTheme="minorBidi" w:hAnsiTheme="minorBidi"/>
           <w:b/>
           <w:bCs/>
-          <w:color w:val="4C4D4F"/>
           <w:sz w:val="20"/>
           <w:szCs w:val="20"/>
         </w:rPr>
@@ -4223,7 +3632,6 @@
       <w:r>
         <w:rPr>
           <w:rFonts w:asciiTheme="minorBidi" w:hAnsiTheme="minorBidi"/>
-          <w:color w:val="4C4D4F"/>
           <w:sz w:val="20"/>
           <w:szCs w:val="20"/>
           <w:lang w:bidi="fa-IR"/>
@@ -4235,7 +3643,6 @@
           <w:rFonts w:asciiTheme="minorBidi" w:hAnsiTheme="minorBidi"/>
           <w:b/>
           <w:bCs/>
-          <w:color w:val="4C4D4F"/>
           <w:sz w:val="20"/>
           <w:szCs w:val="20"/>
         </w:rPr>
@@ -4244,7 +3651,6 @@
       <w:r>
         <w:rPr>
           <w:rFonts w:asciiTheme="minorBidi" w:hAnsiTheme="minorBidi"/>
-          <w:color w:val="4C4D4F"/>
           <w:sz w:val="20"/>
           <w:szCs w:val="20"/>
         </w:rPr>
@@ -4253,7 +3659,6 @@
       <w:r>
         <w:rPr>
           <w:rFonts w:asciiTheme="minorBidi" w:hAnsiTheme="minorBidi"/>
-          <w:color w:val="4C4D4F"/>
           <w:sz w:val="20"/>
           <w:szCs w:val="20"/>
           <w:lang w:bidi="fa-IR"/>
@@ -4265,7 +3670,6 @@
           <w:rFonts w:asciiTheme="minorBidi" w:hAnsiTheme="minorBidi"/>
           <w:b/>
           <w:bCs/>
-          <w:color w:val="4C4D4F"/>
           <w:sz w:val="20"/>
           <w:szCs w:val="20"/>
         </w:rPr>
@@ -4274,7 +3678,6 @@
       <w:r>
         <w:rPr>
           <w:rFonts w:asciiTheme="minorBidi" w:hAnsiTheme="minorBidi"/>
-          <w:color w:val="4C4D4F"/>
           <w:sz w:val="20"/>
           <w:szCs w:val="20"/>
         </w:rPr>
@@ -4283,7 +3686,6 @@
       <w:r>
         <w:rPr>
           <w:rFonts w:asciiTheme="minorBidi" w:hAnsiTheme="minorBidi"/>
-          <w:color w:val="4C4D4F"/>
           <w:sz w:val="20"/>
           <w:szCs w:val="20"/>
         </w:rPr>
@@ -4292,7 +3694,6 @@
       <w:r>
         <w:rPr>
           <w:rFonts w:asciiTheme="minorBidi" w:hAnsiTheme="minorBidi"/>
-          <w:color w:val="4C4D4F"/>
           <w:sz w:val="20"/>
           <w:szCs w:val="20"/>
         </w:rPr>
@@ -4302,7 +3703,6 @@
       <w:r>
         <w:rPr>
           <w:rFonts w:asciiTheme="minorBidi" w:hAnsiTheme="minorBidi"/>
-          <w:color w:val="4C4D4F"/>
           <w:sz w:val="20"/>
           <w:szCs w:val="20"/>
         </w:rPr>
@@ -4313,7 +3713,6 @@
           <w:rFonts w:asciiTheme="minorBidi" w:hAnsiTheme="minorBidi"/>
           <w:b/>
           <w:bCs/>
-          <w:color w:val="4C4D4F"/>
           <w:sz w:val="20"/>
           <w:szCs w:val="20"/>
         </w:rPr>
@@ -4322,7 +3721,6 @@
       <w:r>
         <w:rPr>
           <w:rFonts w:asciiTheme="minorBidi" w:hAnsiTheme="minorBidi"/>
-          <w:color w:val="4C4D4F"/>
           <w:sz w:val="20"/>
           <w:szCs w:val="20"/>
         </w:rPr>
@@ -4331,7 +3729,6 @@
       <w:r>
         <w:rPr>
           <w:rFonts w:asciiTheme="minorBidi" w:hAnsiTheme="minorBidi"/>
-          <w:color w:val="4C4D4F"/>
           <w:sz w:val="20"/>
           <w:szCs w:val="20"/>
         </w:rPr>
@@ -4340,7 +3737,6 @@
       <w:r>
         <w:rPr>
           <w:rFonts w:asciiTheme="minorBidi" w:hAnsiTheme="minorBidi"/>
-          <w:color w:val="4C4D4F"/>
           <w:sz w:val="20"/>
           <w:szCs w:val="20"/>
           <w:lang w:bidi="fa-IR"/>
@@ -4352,7 +3748,6 @@
           <w:rFonts w:asciiTheme="minorBidi" w:hAnsiTheme="minorBidi"/>
           <w:b/>
           <w:bCs/>
-          <w:color w:val="4C4D4F"/>
           <w:sz w:val="20"/>
           <w:szCs w:val="20"/>
         </w:rPr>
@@ -4361,7 +3756,6 @@
       <w:r>
         <w:rPr>
           <w:rFonts w:asciiTheme="minorBidi" w:hAnsiTheme="minorBidi"/>
-          <w:color w:val="4C4D4F"/>
           <w:sz w:val="20"/>
           <w:szCs w:val="20"/>
         </w:rPr>
@@ -4370,7 +3764,6 @@
       <w:r>
         <w:rPr>
           <w:rFonts w:asciiTheme="minorBidi" w:hAnsiTheme="minorBidi"/>
-          <w:color w:val="4C4D4F"/>
           <w:sz w:val="20"/>
           <w:szCs w:val="20"/>
           <w:lang w:bidi="fa-IR"/>
@@ -4382,7 +3775,6 @@
           <w:rFonts w:asciiTheme="minorBidi" w:hAnsiTheme="minorBidi"/>
           <w:b/>
           <w:bCs/>
-          <w:color w:val="4C4D4F"/>
           <w:sz w:val="20"/>
           <w:szCs w:val="20"/>
         </w:rPr>
@@ -4391,7 +3783,6 @@
       <w:r>
         <w:rPr>
           <w:rFonts w:asciiTheme="minorBidi" w:hAnsiTheme="minorBidi"/>
-          <w:color w:val="4C4D4F"/>
           <w:sz w:val="20"/>
           <w:szCs w:val="20"/>
         </w:rPr>
@@ -4400,7 +3791,6 @@
       <w:r>
         <w:rPr>
           <w:rFonts w:asciiTheme="minorBidi" w:hAnsiTheme="minorBidi"/>
-          <w:color w:val="4C4D4F"/>
           <w:sz w:val="20"/>
           <w:szCs w:val="20"/>
           <w:lang w:bidi="fa-IR"/>
@@ -4412,7 +3802,6 @@
           <w:rFonts w:asciiTheme="minorBidi" w:hAnsiTheme="minorBidi"/>
           <w:b/>
           <w:bCs/>
-          <w:color w:val="4C4D4F"/>
           <w:sz w:val="20"/>
           <w:szCs w:val="20"/>
         </w:rPr>
@@ -4421,7 +3810,6 @@
       <w:r>
         <w:rPr>
           <w:rFonts w:asciiTheme="minorBidi" w:hAnsiTheme="minorBidi"/>
-          <w:color w:val="4C4D4F"/>
           <w:sz w:val="20"/>
           <w:szCs w:val="20"/>
         </w:rPr>
@@ -4436,18 +3824,16 @@
         <w:spacing w:line="276" w:lineRule="auto"/>
         <w:rPr>
           <w:rFonts w:asciiTheme="minorBidi" w:hAnsiTheme="minorBidi"/>
-          <w:color w:val="4C4D4F"/>
-          <w:sz w:val="20"/>
-          <w:szCs w:val="20"/>
-          <w:lang w:bidi="fa-IR"/>
-        </w:rPr>
-      </w:pPr>
-      <w:r>
-        <w:rPr>
-          <w:rFonts w:asciiTheme="minorBidi" w:hAnsiTheme="minorBidi"/>
-          <w:b/>
-          <w:bCs/>
-          <w:color w:val="4C4D4F"/>
+          <w:sz w:val="20"/>
+          <w:szCs w:val="20"/>
+          <w:lang w:bidi="fa-IR"/>
+        </w:rPr>
+      </w:pPr>
+      <w:r>
+        <w:rPr>
+          <w:rFonts w:asciiTheme="minorBidi" w:hAnsiTheme="minorBidi"/>
+          <w:b/>
+          <w:bCs/>
           <w:sz w:val="24"/>
           <w:szCs w:val="24"/>
           <w:lang w:bidi="fa-IR"/>
@@ -4459,7 +3845,6 @@
           <w:rFonts w:asciiTheme="minorBidi" w:hAnsiTheme="minorBidi"/>
           <w:b/>
           <w:bCs/>
-          <w:color w:val="4C4D4F"/>
           <w:sz w:val="24"/>
           <w:szCs w:val="24"/>
           <w:lang w:bidi="fa-IR"/>
@@ -4473,7 +3858,7 @@
         <w:rPr>
           <w:rStyle w:val="Hyperlink"/>
           <w:rFonts w:asciiTheme="minorBidi" w:hAnsiTheme="minorBidi"/>
-          <w:color w:val="4C4D4F"/>
+          <w:color w:val="1F3864" w:themeColor="accent1" w:themeShade="80"/>
           <w:sz w:val="20"/>
           <w:szCs w:val="20"/>
           <w:u w:val="none"/>
@@ -4482,7 +3867,6 @@
       <w:r>
         <w:rPr>
           <w:rFonts w:asciiTheme="minorBidi" w:hAnsiTheme="minorBidi"/>
-          <w:color w:val="4C4D4F"/>
           <w:sz w:val="20"/>
           <w:szCs w:val="20"/>
         </w:rPr>
@@ -4491,7 +3875,6 @@
       <w:r>
         <w:rPr>
           <w:rFonts w:asciiTheme="minorBidi" w:hAnsiTheme="minorBidi"/>
-          <w:color w:val="4C4D4F"/>
           <w:sz w:val="20"/>
           <w:szCs w:val="20"/>
         </w:rPr>
@@ -4500,7 +3883,6 @@
       <w:r>
         <w:rPr>
           <w:rFonts w:asciiTheme="minorBidi" w:hAnsiTheme="minorBidi"/>
-          <w:color w:val="4C4D4F"/>
           <w:sz w:val="20"/>
           <w:szCs w:val="20"/>
         </w:rPr>
@@ -4511,7 +3893,7 @@
           <w:rPr>
             <w:rStyle w:val="Hyperlink"/>
             <w:rFonts w:asciiTheme="minorBidi" w:hAnsiTheme="minorBidi"/>
-            <w:color w:val="2F5496" w:themeColor="accent1" w:themeShade="BF"/>
+            <w:color w:val="1F3864" w:themeColor="accent1" w:themeShade="80"/>
             <w:sz w:val="20"/>
             <w:szCs w:val="20"/>
             <w:u w:val="none"/>
@@ -4528,25 +3910,14 @@
       <w:r>
         <w:rPr>
           <w:rFonts w:asciiTheme="minorBidi" w:hAnsiTheme="minorBidi"/>
-          <w:color w:val="4C4D4F"/>
-          <w:sz w:val="20"/>
-          <w:szCs w:val="20"/>
-        </w:rPr>
-        <w:t xml:space="preserve">Coursera, </w:t>
-      </w:r>
-      <w:r>
-        <w:rPr>
-          <w:rFonts w:asciiTheme="minorBidi" w:hAnsiTheme="minorBidi"/>
-          <w:color w:val="4C4D4F"/>
-          <w:sz w:val="20"/>
-          <w:szCs w:val="20"/>
-        </w:rPr>
-        <w:t>DeepLearning.AI</w:t>
-      </w:r>
-      <w:r>
-        <w:rPr>
-          <w:rFonts w:asciiTheme="minorBidi" w:hAnsiTheme="minorBidi"/>
-          <w:color w:val="4C4D4F"/>
+          <w:sz w:val="20"/>
+          <w:szCs w:val="20"/>
+        </w:rPr>
+        <w:t>Coursera, DeepLearning.AI</w:t>
+      </w:r>
+      <w:r>
+        <w:rPr>
+          <w:rFonts w:asciiTheme="minorBidi" w:hAnsiTheme="minorBidi"/>
           <w:sz w:val="20"/>
           <w:szCs w:val="20"/>
         </w:rPr>
@@ -4559,7 +3930,7 @@
         <w:rPr>
           <w:rStyle w:val="Hyperlink"/>
           <w:rFonts w:asciiTheme="minorBidi" w:hAnsiTheme="minorBidi"/>
-          <w:color w:val="4C4D4F"/>
+          <w:color w:val="1F3864" w:themeColor="accent1" w:themeShade="80"/>
           <w:sz w:val="20"/>
           <w:szCs w:val="20"/>
           <w:u w:val="none"/>
@@ -4568,7 +3939,6 @@
       <w:r>
         <w:rPr>
           <w:rFonts w:asciiTheme="minorBidi" w:hAnsiTheme="minorBidi"/>
-          <w:color w:val="4C4D4F"/>
           <w:sz w:val="20"/>
           <w:szCs w:val="20"/>
         </w:rPr>
@@ -4577,7 +3947,6 @@
       <w:r>
         <w:rPr>
           <w:rFonts w:asciiTheme="minorBidi" w:hAnsiTheme="minorBidi"/>
-          <w:color w:val="4C4D4F"/>
           <w:sz w:val="20"/>
           <w:szCs w:val="20"/>
         </w:rPr>
@@ -4586,7 +3955,6 @@
       <w:r>
         <w:rPr>
           <w:rFonts w:asciiTheme="minorBidi" w:hAnsiTheme="minorBidi"/>
-          <w:color w:val="4C4D4F"/>
           <w:sz w:val="20"/>
           <w:szCs w:val="20"/>
         </w:rPr>
@@ -4595,7 +3963,6 @@
       <w:r>
         <w:rPr>
           <w:rFonts w:asciiTheme="minorBidi" w:hAnsiTheme="minorBidi"/>
-          <w:color w:val="4C4D4F"/>
           <w:sz w:val="20"/>
           <w:szCs w:val="20"/>
         </w:rPr>
@@ -4606,7 +3973,7 @@
           <w:rPr>
             <w:rStyle w:val="Hyperlink"/>
             <w:rFonts w:asciiTheme="minorBidi" w:hAnsiTheme="minorBidi"/>
-            <w:color w:val="2F5496" w:themeColor="accent1" w:themeShade="BF"/>
+            <w:color w:val="1F3864" w:themeColor="accent1" w:themeShade="80"/>
             <w:sz w:val="20"/>
             <w:szCs w:val="20"/>
             <w:u w:val="none"/>
@@ -4621,33 +3988,21 @@
         <w:ind w:left="720" w:firstLine="720"/>
         <w:rPr>
           <w:rFonts w:asciiTheme="minorBidi" w:hAnsiTheme="minorBidi"/>
-          <w:color w:val="4C4D4F"/>
-          <w:sz w:val="20"/>
-          <w:szCs w:val="20"/>
-        </w:rPr>
-      </w:pPr>
-      <w:r>
-        <w:rPr>
-          <w:rFonts w:asciiTheme="minorBidi" w:hAnsiTheme="minorBidi"/>
-          <w:color w:val="4C4D4F"/>
-          <w:sz w:val="20"/>
-          <w:szCs w:val="20"/>
-        </w:rPr>
-        <w:t xml:space="preserve">Coursera, </w:t>
-      </w:r>
-      <w:r>
-        <w:rPr>
-          <w:rFonts w:asciiTheme="minorBidi" w:hAnsiTheme="minorBidi"/>
-          <w:color w:val="4C4D4F"/>
-          <w:sz w:val="20"/>
-          <w:szCs w:val="20"/>
-        </w:rPr>
-        <w:t>DeepLearning.AI</w:t>
-      </w:r>
-      <w:r>
-        <w:rPr>
-          <w:rFonts w:asciiTheme="minorBidi" w:hAnsiTheme="minorBidi"/>
-          <w:color w:val="4C4D4F"/>
+          <w:sz w:val="20"/>
+          <w:szCs w:val="20"/>
+        </w:rPr>
+      </w:pPr>
+      <w:r>
+        <w:rPr>
+          <w:rFonts w:asciiTheme="minorBidi" w:hAnsiTheme="minorBidi"/>
+          <w:sz w:val="20"/>
+          <w:szCs w:val="20"/>
+        </w:rPr>
+        <w:t>Coursera, DeepLearning.AI</w:t>
+      </w:r>
+      <w:r>
+        <w:rPr>
+          <w:rFonts w:asciiTheme="minorBidi" w:hAnsiTheme="minorBidi"/>
           <w:sz w:val="20"/>
           <w:szCs w:val="20"/>
         </w:rPr>
@@ -4660,7 +4015,7 @@
         <w:rPr>
           <w:rStyle w:val="Hyperlink"/>
           <w:rFonts w:asciiTheme="minorBidi" w:hAnsiTheme="minorBidi"/>
-          <w:color w:val="4C4D4F"/>
+          <w:color w:val="1F3864" w:themeColor="accent1" w:themeShade="80"/>
           <w:sz w:val="20"/>
           <w:szCs w:val="20"/>
           <w:u w:val="none"/>
@@ -4669,7 +4024,6 @@
       <w:r>
         <w:rPr>
           <w:rFonts w:asciiTheme="minorBidi" w:hAnsiTheme="minorBidi"/>
-          <w:color w:val="4C4D4F"/>
           <w:sz w:val="20"/>
           <w:szCs w:val="20"/>
         </w:rPr>
@@ -4678,7 +4032,6 @@
       <w:r>
         <w:rPr>
           <w:rFonts w:asciiTheme="minorBidi" w:hAnsiTheme="minorBidi"/>
-          <w:color w:val="4C4D4F"/>
           <w:sz w:val="20"/>
           <w:szCs w:val="20"/>
         </w:rPr>
@@ -4689,7 +4042,7 @@
           <w:rPr>
             <w:rStyle w:val="Hyperlink"/>
             <w:rFonts w:asciiTheme="minorBidi" w:hAnsiTheme="minorBidi"/>
-            <w:color w:val="2F5496" w:themeColor="accent1" w:themeShade="BF"/>
+            <w:color w:val="1F3864" w:themeColor="accent1" w:themeShade="80"/>
             <w:sz w:val="20"/>
             <w:szCs w:val="20"/>
             <w:u w:val="none"/>
@@ -4704,15 +4057,13 @@
         <w:ind w:left="720" w:firstLine="720"/>
         <w:rPr>
           <w:rFonts w:asciiTheme="minorBidi" w:hAnsiTheme="minorBidi"/>
-          <w:color w:val="4C4D4F"/>
-          <w:sz w:val="20"/>
-          <w:szCs w:val="20"/>
-        </w:rPr>
-      </w:pPr>
-      <w:r>
-        <w:rPr>
-          <w:rFonts w:asciiTheme="minorBidi" w:hAnsiTheme="minorBidi"/>
-          <w:color w:val="4C4D4F"/>
+          <w:sz w:val="20"/>
+          <w:szCs w:val="20"/>
+        </w:rPr>
+      </w:pPr>
+      <w:r>
+        <w:rPr>
+          <w:rFonts w:asciiTheme="minorBidi" w:hAnsiTheme="minorBidi"/>
           <w:sz w:val="20"/>
           <w:szCs w:val="20"/>
         </w:rPr>
@@ -4726,15 +4077,14 @@
           <w:rFonts w:asciiTheme="minorBidi" w:hAnsiTheme="minorBidi"/>
           <w:b/>
           <w:bCs/>
-          <w:color w:val="4C4D4F"/>
-          <w:sz w:val="20"/>
-          <w:szCs w:val="20"/>
-        </w:rPr>
-      </w:pPr>
-      <w:r>
-        <w:rPr>
-          <w:rFonts w:asciiTheme="minorBidi" w:hAnsiTheme="minorBidi"/>
-          <w:color w:val="4C4D4F"/>
+          <w:color w:val="1F3864" w:themeColor="accent1" w:themeShade="80"/>
+          <w:sz w:val="20"/>
+          <w:szCs w:val="20"/>
+        </w:rPr>
+      </w:pPr>
+      <w:r>
+        <w:rPr>
+          <w:rFonts w:asciiTheme="minorBidi" w:hAnsiTheme="minorBidi"/>
           <w:sz w:val="20"/>
           <w:szCs w:val="20"/>
         </w:rPr>
@@ -4743,7 +4093,6 @@
       <w:r>
         <w:rPr>
           <w:rFonts w:asciiTheme="minorBidi" w:hAnsiTheme="minorBidi"/>
-          <w:color w:val="4C4D4F"/>
           <w:sz w:val="20"/>
           <w:szCs w:val="20"/>
         </w:rPr>
@@ -4754,7 +4103,7 @@
           <w:rPr>
             <w:rStyle w:val="Hyperlink"/>
             <w:rFonts w:asciiTheme="minorBidi" w:hAnsiTheme="minorBidi"/>
-            <w:color w:val="2F5496" w:themeColor="accent1" w:themeShade="BF"/>
+            <w:color w:val="1F3864" w:themeColor="accent1" w:themeShade="80"/>
             <w:sz w:val="20"/>
             <w:szCs w:val="20"/>
             <w:u w:val="none"/>
@@ -4772,21 +4121,29 @@
         <w:spacing w:line="240" w:lineRule="auto"/>
         <w:rPr>
           <w:rFonts w:asciiTheme="minorBidi" w:hAnsiTheme="minorBidi"/>
+          <w:sz w:val="20"/>
+          <w:szCs w:val="20"/>
+          <w:lang w:bidi="fa-IR"/>
+        </w:rPr>
+      </w:pPr>
+      <w:r>
+        <w:rPr>
+          <w:rFonts w:asciiTheme="minorBidi" w:hAnsiTheme="minorBidi"/>
           <w:color w:val="4C4D4F"/>
           <w:sz w:val="20"/>
           <w:szCs w:val="20"/>
           <w:lang w:bidi="fa-IR"/>
         </w:rPr>
-      </w:pPr>
-      <w:r>
-        <w:rPr>
-          <w:rFonts w:asciiTheme="minorBidi" w:hAnsiTheme="minorBidi"/>
-          <w:color w:val="4C4D4F"/>
-          <w:sz w:val="20"/>
-          <w:szCs w:val="20"/>
-          <w:lang w:bidi="fa-IR"/>
-        </w:rPr>
-        <w:t xml:space="preserve">             Maktabkhoone, Grade: 95/100</w:t>
+        <w:t xml:space="preserve">             </w:t>
+      </w:r>
+      <w:r>
+        <w:rPr>
+          <w:rFonts w:asciiTheme="minorBidi" w:hAnsiTheme="minorBidi"/>
+          <w:sz w:val="20"/>
+          <w:szCs w:val="20"/>
+          <w:lang w:bidi="fa-IR"/>
+        </w:rPr>
+        <w:t>Maktabkhoone, Grade: 95/100</w:t>
       </w:r>
     </w:p>
     <w:p>
@@ -4794,15 +4151,14 @@
         <w:spacing w:line="240" w:lineRule="auto"/>
         <w:rPr>
           <w:rFonts w:asciiTheme="minorBidi" w:hAnsiTheme="minorBidi"/>
-          <w:color w:val="4C4D4F"/>
-          <w:sz w:val="20"/>
-          <w:szCs w:val="20"/>
-        </w:rPr>
-      </w:pPr>
-      <w:r>
-        <w:rPr>
-          <w:rFonts w:asciiTheme="minorBidi" w:hAnsiTheme="minorBidi"/>
-          <w:color w:val="4C4D4F"/>
+          <w:color w:val="1F3864" w:themeColor="accent1" w:themeShade="80"/>
+          <w:sz w:val="20"/>
+          <w:szCs w:val="20"/>
+        </w:rPr>
+      </w:pPr>
+      <w:r>
+        <w:rPr>
+          <w:rFonts w:asciiTheme="minorBidi" w:hAnsiTheme="minorBidi"/>
           <w:sz w:val="20"/>
           <w:szCs w:val="20"/>
         </w:rPr>
@@ -4813,7 +4169,6 @@
           <w:rFonts w:asciiTheme="minorBidi" w:hAnsiTheme="minorBidi"/>
           <w:b/>
           <w:bCs/>
-          <w:color w:val="4C4D4F"/>
           <w:sz w:val="20"/>
           <w:szCs w:val="20"/>
         </w:rPr>
@@ -4824,7 +4179,6 @@
           <w:rFonts w:asciiTheme="minorBidi" w:hAnsiTheme="minorBidi"/>
           <w:b/>
           <w:bCs/>
-          <w:color w:val="4C4D4F"/>
           <w:sz w:val="20"/>
           <w:szCs w:val="20"/>
         </w:rPr>
@@ -4835,7 +4189,7 @@
           <w:rPr>
             <w:rStyle w:val="Hyperlink"/>
             <w:rFonts w:asciiTheme="minorBidi" w:hAnsiTheme="minorBidi"/>
-            <w:color w:val="2F5496" w:themeColor="accent1" w:themeShade="BF"/>
+            <w:color w:val="1F3864" w:themeColor="accent1" w:themeShade="80"/>
             <w:sz w:val="20"/>
             <w:szCs w:val="20"/>
             <w:u w:val="none"/>
@@ -4853,16 +4207,14 @@
         <w:ind w:left="1440"/>
         <w:rPr>
           <w:rFonts w:asciiTheme="minorBidi" w:hAnsiTheme="minorBidi"/>
-          <w:color w:val="4C4D4F"/>
-          <w:sz w:val="20"/>
-          <w:szCs w:val="20"/>
-          <w:lang w:bidi="fa-IR"/>
-        </w:rPr>
-      </w:pPr>
-      <w:r>
-        <w:rPr>
-          <w:rFonts w:asciiTheme="minorBidi" w:hAnsiTheme="minorBidi"/>
-          <w:color w:val="4C4D4F"/>
+          <w:sz w:val="20"/>
+          <w:szCs w:val="20"/>
+          <w:lang w:bidi="fa-IR"/>
+        </w:rPr>
+      </w:pPr>
+      <w:r>
+        <w:rPr>
+          <w:rFonts w:asciiTheme="minorBidi" w:hAnsiTheme="minorBidi"/>
           <w:sz w:val="20"/>
           <w:szCs w:val="20"/>
           <w:lang w:bidi="fa-IR"/>
@@ -4872,7 +4224,6 @@
       <w:r>
         <w:rPr>
           <w:rFonts w:asciiTheme="minorBidi" w:hAnsiTheme="minorBidi"/>
-          <w:color w:val="4C4D4F"/>
           <w:sz w:val="20"/>
           <w:szCs w:val="20"/>
           <w:lang w:bidi="fa-IR"/>
@@ -4882,7 +4233,6 @@
       <w:r>
         <w:rPr>
           <w:rFonts w:asciiTheme="minorBidi" w:hAnsiTheme="minorBidi"/>
-          <w:color w:val="4C4D4F"/>
           <w:sz w:val="20"/>
           <w:szCs w:val="20"/>
           <w:lang w:bidi="fa-IR"/>
@@ -4892,7 +4242,6 @@
       <w:r>
         <w:rPr>
           <w:rFonts w:asciiTheme="minorBidi" w:hAnsiTheme="minorBidi"/>
-          <w:color w:val="4C4D4F"/>
           <w:sz w:val="20"/>
           <w:szCs w:val="20"/>
           <w:lang w:bidi="fa-IR"/>
@@ -4902,7 +4251,6 @@
       <w:r>
         <w:rPr>
           <w:rFonts w:asciiTheme="minorBidi" w:hAnsiTheme="minorBidi"/>
-          <w:color w:val="4C4D4F"/>
           <w:sz w:val="20"/>
           <w:szCs w:val="20"/>
           <w:lang w:bidi="fa-IR"/>
@@ -4912,7 +4260,6 @@
       <w:r>
         <w:rPr>
           <w:rFonts w:asciiTheme="minorBidi" w:hAnsiTheme="minorBidi"/>
-          <w:color w:val="4C4D4F"/>
           <w:sz w:val="20"/>
           <w:szCs w:val="20"/>
           <w:lang w:bidi="fa-IR"/>
@@ -4922,7 +4269,6 @@
       <w:r>
         <w:rPr>
           <w:rFonts w:asciiTheme="minorBidi" w:hAnsiTheme="minorBidi"/>
-          <w:color w:val="4C4D4F"/>
           <w:sz w:val="20"/>
           <w:szCs w:val="20"/>
           <w:lang w:bidi="fa-IR"/>
@@ -4952,7 +4298,6 @@
           <w:rFonts w:asciiTheme="minorBidi" w:hAnsiTheme="minorBidi"/>
           <w:b/>
           <w:bCs/>
-          <w:color w:val="4C4D4F"/>
           <w:sz w:val="24"/>
           <w:szCs w:val="24"/>
           <w:lang w:bidi="fa-IR"/>
@@ -4963,7 +4308,6 @@
           <w:rFonts w:asciiTheme="minorBidi" w:hAnsiTheme="minorBidi"/>
           <w:b/>
           <w:bCs/>
-          <w:color w:val="4C4D4F"/>
           <w:sz w:val="24"/>
           <w:szCs w:val="24"/>
           <w:lang w:bidi="fa-IR"/>
@@ -4983,18 +4327,16 @@
         </w:tabs>
         <w:rPr>
           <w:rFonts w:asciiTheme="minorBidi" w:hAnsiTheme="minorBidi"/>
-          <w:color w:val="4C4D4F"/>
-          <w:sz w:val="20"/>
-          <w:szCs w:val="20"/>
-          <w:lang w:bidi="fa-IR"/>
-        </w:rPr>
-      </w:pPr>
-      <w:r>
-        <w:rPr>
-          <w:rFonts w:asciiTheme="minorBidi" w:hAnsiTheme="minorBidi"/>
-          <w:b/>
-          <w:bCs/>
-          <w:color w:val="4C4D4F"/>
+          <w:sz w:val="20"/>
+          <w:szCs w:val="20"/>
+          <w:lang w:bidi="fa-IR"/>
+        </w:rPr>
+      </w:pPr>
+      <w:r>
+        <w:rPr>
+          <w:rFonts w:asciiTheme="minorBidi" w:hAnsiTheme="minorBidi"/>
+          <w:b/>
+          <w:bCs/>
           <w:sz w:val="20"/>
           <w:szCs w:val="20"/>
           <w:lang w:bidi="fa-IR"/>
@@ -5004,7 +4346,6 @@
       <w:r>
         <w:rPr>
           <w:rFonts w:asciiTheme="minorBidi" w:hAnsiTheme="minorBidi"/>
-          <w:color w:val="4C4D4F"/>
           <w:sz w:val="20"/>
           <w:szCs w:val="20"/>
           <w:lang w:bidi="fa-IR"/>
@@ -5014,7 +4355,6 @@
       <w:r>
         <w:rPr>
           <w:rFonts w:asciiTheme="minorBidi" w:hAnsiTheme="minorBidi"/>
-          <w:color w:val="4C4D4F"/>
           <w:sz w:val="20"/>
           <w:szCs w:val="20"/>
           <w:lang w:bidi="fa-IR"/>
@@ -5024,7 +4364,6 @@
       <w:r>
         <w:rPr>
           <w:rFonts w:asciiTheme="minorBidi" w:hAnsiTheme="minorBidi"/>
-          <w:color w:val="4C4D4F"/>
           <w:sz w:val="20"/>
           <w:szCs w:val="20"/>
           <w:lang w:bidi="fa-IR"/>
@@ -5034,7 +4373,6 @@
       <w:r>
         <w:rPr>
           <w:rFonts w:asciiTheme="minorBidi" w:hAnsiTheme="minorBidi"/>
-          <w:color w:val="4C4D4F"/>
           <w:sz w:val="20"/>
           <w:szCs w:val="20"/>
           <w:lang w:bidi="fa-IR"/>
@@ -5044,7 +4382,6 @@
       <w:r>
         <w:rPr>
           <w:rFonts w:asciiTheme="minorBidi" w:hAnsiTheme="minorBidi"/>
-          <w:color w:val="4C4D4F"/>
           <w:sz w:val="20"/>
           <w:szCs w:val="20"/>
           <w:lang w:bidi="fa-IR"/>
@@ -5054,7 +4391,6 @@
       <w:r>
         <w:rPr>
           <w:rFonts w:asciiTheme="minorBidi" w:hAnsiTheme="minorBidi"/>
-          <w:color w:val="4C4D4F"/>
           <w:sz w:val="20"/>
           <w:szCs w:val="20"/>
           <w:lang w:bidi="fa-IR"/>
@@ -5064,7 +4400,6 @@
       <w:r>
         <w:rPr>
           <w:rFonts w:asciiTheme="minorBidi" w:hAnsiTheme="minorBidi"/>
-          <w:color w:val="4C4D4F"/>
           <w:sz w:val="20"/>
           <w:szCs w:val="20"/>
           <w:lang w:bidi="fa-IR"/>
@@ -5084,18 +4419,16 @@
         </w:tabs>
         <w:rPr>
           <w:rFonts w:asciiTheme="minorBidi" w:hAnsiTheme="minorBidi"/>
-          <w:color w:val="4C4D4F"/>
-          <w:sz w:val="20"/>
-          <w:szCs w:val="20"/>
-          <w:lang w:bidi="fa-IR"/>
-        </w:rPr>
-      </w:pPr>
-      <w:r>
-        <w:rPr>
-          <w:rFonts w:asciiTheme="minorBidi" w:hAnsiTheme="minorBidi"/>
-          <w:b/>
-          <w:bCs/>
-          <w:color w:val="4C4D4F"/>
+          <w:sz w:val="20"/>
+          <w:szCs w:val="20"/>
+          <w:lang w:bidi="fa-IR"/>
+        </w:rPr>
+      </w:pPr>
+      <w:r>
+        <w:rPr>
+          <w:rFonts w:asciiTheme="minorBidi" w:hAnsiTheme="minorBidi"/>
+          <w:b/>
+          <w:bCs/>
           <w:sz w:val="20"/>
           <w:szCs w:val="20"/>
           <w:lang w:bidi="fa-IR"/>
@@ -5105,7 +4438,6 @@
       <w:r>
         <w:rPr>
           <w:rFonts w:asciiTheme="minorBidi" w:hAnsiTheme="minorBidi"/>
-          <w:color w:val="4C4D4F"/>
           <w:sz w:val="20"/>
           <w:szCs w:val="20"/>
           <w:lang w:bidi="fa-IR"/>
@@ -5117,7 +4449,6 @@
           <w:rFonts w:asciiTheme="minorBidi" w:hAnsiTheme="minorBidi"/>
           <w:b/>
           <w:bCs/>
-          <w:color w:val="4C4D4F"/>
           <w:sz w:val="20"/>
           <w:szCs w:val="20"/>
           <w:lang w:bidi="fa-IR"/>
@@ -5127,7 +4458,6 @@
       <w:r>
         <w:rPr>
           <w:rFonts w:asciiTheme="minorBidi" w:hAnsiTheme="minorBidi"/>
-          <w:color w:val="4C4D4F"/>
           <w:sz w:val="20"/>
           <w:szCs w:val="20"/>
           <w:lang w:bidi="fa-IR"/>
@@ -5137,7 +4467,6 @@
       <w:r>
         <w:rPr>
           <w:rFonts w:asciiTheme="minorBidi" w:hAnsiTheme="minorBidi"/>
-          <w:color w:val="4C4D4F"/>
           <w:sz w:val="20"/>
           <w:szCs w:val="20"/>
           <w:lang w:bidi="fa-IR"/>
@@ -5149,7 +4478,6 @@
           <w:rFonts w:asciiTheme="minorBidi" w:hAnsiTheme="minorBidi"/>
           <w:b/>
           <w:bCs/>
-          <w:color w:val="4C4D4F"/>
           <w:sz w:val="20"/>
           <w:szCs w:val="20"/>
           <w:lang w:bidi="fa-IR"/>
@@ -5159,7 +4487,6 @@
       <w:r>
         <w:rPr>
           <w:rFonts w:asciiTheme="minorBidi" w:hAnsiTheme="minorBidi"/>
-          <w:color w:val="4C4D4F"/>
           <w:sz w:val="20"/>
           <w:szCs w:val="20"/>
           <w:lang w:bidi="fa-IR"/>
@@ -5169,7 +4496,6 @@
       <w:r>
         <w:rPr>
           <w:rFonts w:asciiTheme="minorBidi" w:hAnsiTheme="minorBidi"/>
-          <w:color w:val="4C4D4F"/>
           <w:sz w:val="20"/>
           <w:szCs w:val="20"/>
           <w:lang w:bidi="fa-IR"/>
@@ -5179,7 +4505,6 @@
       <w:r>
         <w:rPr>
           <w:rFonts w:asciiTheme="minorBidi" w:hAnsiTheme="minorBidi"/>
-          <w:color w:val="4C4D4F"/>
           <w:sz w:val="20"/>
           <w:szCs w:val="20"/>
           <w:lang w:bidi="fa-IR"/>
@@ -5209,7 +4534,6 @@
           <w:rFonts w:asciiTheme="minorBidi" w:hAnsiTheme="minorBidi"/>
           <w:b/>
           <w:bCs/>
-          <w:color w:val="4C4D4F"/>
           <w:sz w:val="20"/>
           <w:szCs w:val="20"/>
           <w:lang w:bidi="fa-IR"/>
@@ -5219,7 +4543,6 @@
       <w:r>
         <w:rPr>
           <w:rFonts w:asciiTheme="minorBidi" w:hAnsiTheme="minorBidi"/>
-          <w:color w:val="4C4D4F"/>
           <w:sz w:val="20"/>
           <w:szCs w:val="20"/>
           <w:lang w:bidi="fa-IR"/>
@@ -5229,7 +4552,6 @@
       <w:r>
         <w:rPr>
           <w:rFonts w:asciiTheme="minorBidi" w:hAnsiTheme="minorBidi"/>
-          <w:color w:val="4C4D4F"/>
           <w:sz w:val="20"/>
           <w:szCs w:val="20"/>
           <w:lang w:bidi="fa-IR"/>
@@ -5239,7 +4561,6 @@
       <w:r>
         <w:rPr>
           <w:rFonts w:asciiTheme="minorBidi" w:hAnsiTheme="minorBidi"/>
-          <w:color w:val="4C4D4F"/>
           <w:sz w:val="20"/>
           <w:szCs w:val="20"/>
           <w:lang w:bidi="fa-IR"/>
@@ -5271,7 +4592,6 @@
           <w:rFonts w:asciiTheme="minorBidi" w:hAnsiTheme="minorBidi"/>
           <w:b/>
           <w:bCs/>
-          <w:color w:val="4C4D4F"/>
           <w:sz w:val="24"/>
           <w:szCs w:val="24"/>
           <w:lang w:bidi="fa-IR"/>
@@ -5282,7 +4602,6 @@
           <w:rFonts w:asciiTheme="minorBidi" w:hAnsiTheme="minorBidi"/>
           <w:b/>
           <w:bCs/>
-          <w:color w:val="4C4D4F"/>
           <w:sz w:val="24"/>
           <w:szCs w:val="24"/>
           <w:lang w:bidi="fa-IR"/>
@@ -5303,18 +4622,16 @@
         <w:spacing w:line="276" w:lineRule="auto"/>
         <w:rPr>
           <w:rFonts w:asciiTheme="minorBidi" w:hAnsiTheme="minorBidi"/>
-          <w:color w:val="4C4D4F"/>
-          <w:sz w:val="20"/>
-          <w:szCs w:val="20"/>
-          <w:lang w:bidi="fa-IR"/>
-        </w:rPr>
-      </w:pPr>
-      <w:r>
-        <w:rPr>
-          <w:rFonts w:asciiTheme="minorBidi" w:hAnsiTheme="minorBidi"/>
-          <w:b/>
-          <w:bCs/>
-          <w:color w:val="4C4D4F"/>
+          <w:sz w:val="20"/>
+          <w:szCs w:val="20"/>
+          <w:lang w:bidi="fa-IR"/>
+        </w:rPr>
+      </w:pPr>
+      <w:r>
+        <w:rPr>
+          <w:rFonts w:asciiTheme="minorBidi" w:hAnsiTheme="minorBidi"/>
+          <w:b/>
+          <w:bCs/>
           <w:sz w:val="20"/>
           <w:szCs w:val="20"/>
           <w:lang w:bidi="fa-IR"/>
@@ -5326,7 +4643,6 @@
           <w:rFonts w:asciiTheme="minorBidi" w:hAnsiTheme="minorBidi"/>
           <w:b/>
           <w:bCs/>
-          <w:color w:val="4C4D4F"/>
           <w:sz w:val="20"/>
           <w:szCs w:val="20"/>
           <w:lang w:bidi="fa-IR"/>
@@ -5336,7 +4652,6 @@
       <w:r>
         <w:rPr>
           <w:rFonts w:asciiTheme="minorBidi" w:hAnsiTheme="minorBidi"/>
-          <w:color w:val="4C4D4F"/>
           <w:sz w:val="20"/>
           <w:szCs w:val="20"/>
           <w:lang w:bidi="fa-IR"/>
@@ -5357,18 +4672,16 @@
         <w:spacing w:line="276" w:lineRule="auto"/>
         <w:rPr>
           <w:rFonts w:asciiTheme="minorBidi" w:hAnsiTheme="minorBidi"/>
-          <w:color w:val="4C4D4F"/>
-          <w:sz w:val="20"/>
-          <w:szCs w:val="20"/>
-          <w:lang w:bidi="fa-IR"/>
-        </w:rPr>
-      </w:pPr>
-      <w:r>
-        <w:rPr>
-          <w:rFonts w:asciiTheme="minorBidi" w:hAnsiTheme="minorBidi"/>
-          <w:b/>
-          <w:bCs/>
-          <w:color w:val="4C4D4F"/>
+          <w:sz w:val="20"/>
+          <w:szCs w:val="20"/>
+          <w:lang w:bidi="fa-IR"/>
+        </w:rPr>
+      </w:pPr>
+      <w:r>
+        <w:rPr>
+          <w:rFonts w:asciiTheme="minorBidi" w:hAnsiTheme="minorBidi"/>
+          <w:b/>
+          <w:bCs/>
           <w:sz w:val="20"/>
           <w:szCs w:val="20"/>
           <w:lang w:bidi="fa-IR"/>
@@ -5380,7 +4693,6 @@
           <w:rFonts w:asciiTheme="minorBidi" w:hAnsiTheme="minorBidi"/>
           <w:b/>
           <w:bCs/>
-          <w:color w:val="4C4D4F"/>
           <w:sz w:val="20"/>
           <w:szCs w:val="20"/>
           <w:lang w:bidi="fa-IR"/>
@@ -5392,7 +4704,6 @@
           <w:rFonts w:asciiTheme="minorBidi" w:hAnsiTheme="minorBidi"/>
           <w:b/>
           <w:bCs/>
-          <w:color w:val="4C4D4F"/>
           <w:sz w:val="20"/>
           <w:szCs w:val="20"/>
           <w:lang w:bidi="fa-IR"/>
@@ -5402,7 +4713,6 @@
       <w:r>
         <w:rPr>
           <w:rFonts w:asciiTheme="minorBidi" w:hAnsiTheme="minorBidi"/>
-          <w:color w:val="4C4D4F"/>
           <w:sz w:val="20"/>
           <w:szCs w:val="20"/>
           <w:lang w:bidi="fa-IR"/>
@@ -5414,7 +4724,6 @@
           <w:rFonts w:asciiTheme="minorBidi" w:hAnsiTheme="minorBidi"/>
           <w:b/>
           <w:bCs/>
-          <w:color w:val="4C4D4F"/>
           <w:sz w:val="20"/>
           <w:szCs w:val="20"/>
           <w:lang w:bidi="fa-IR"/>
@@ -5424,7 +4733,6 @@
       <w:r>
         <w:rPr>
           <w:rFonts w:asciiTheme="minorBidi" w:hAnsiTheme="minorBidi"/>
-          <w:color w:val="4C4D4F"/>
           <w:sz w:val="20"/>
           <w:szCs w:val="20"/>
           <w:lang w:bidi="fa-IR"/>
@@ -5434,7 +4742,6 @@
       <w:r>
         <w:rPr>
           <w:rFonts w:asciiTheme="minorBidi" w:hAnsiTheme="minorBidi"/>
-          <w:color w:val="4C4D4F"/>
           <w:sz w:val="20"/>
           <w:szCs w:val="20"/>
           <w:lang w:bidi="fa-IR"/>
@@ -5444,7 +4751,6 @@
       <w:r>
         <w:rPr>
           <w:rFonts w:asciiTheme="minorBidi" w:hAnsiTheme="minorBidi"/>
-          <w:color w:val="4C4D4F"/>
           <w:sz w:val="20"/>
           <w:szCs w:val="20"/>
           <w:lang w:bidi="fa-IR"/>
@@ -5508,7 +4814,6 @@
       <w:rPr>
         <w:rFonts w:asciiTheme="minorBidi" w:hAnsiTheme="minorBidi"/>
         <w:noProof/>
-        <w:color w:val="4C4D4F"/>
         <w:sz w:val="20"/>
         <w:szCs w:val="20"/>
       </w:rPr>
@@ -5519,7 +4824,6 @@
           <w:pStyle w:val="Footer"/>
           <w:rPr>
             <w:rFonts w:asciiTheme="minorBidi" w:hAnsiTheme="minorBidi"/>
-            <w:color w:val="4C4D4F"/>
             <w:sz w:val="20"/>
             <w:szCs w:val="20"/>
           </w:rPr>
@@ -5527,7 +4831,6 @@
         <w:r>
           <w:rPr>
             <w:rFonts w:asciiTheme="minorBidi" w:hAnsiTheme="minorBidi"/>
-            <w:color w:val="4C4D4F"/>
             <w:sz w:val="20"/>
             <w:szCs w:val="20"/>
           </w:rPr>
@@ -5542,7 +4845,6 @@
         <w:r>
           <w:rPr>
             <w:rFonts w:asciiTheme="minorBidi" w:hAnsiTheme="minorBidi"/>
-            <w:color w:val="4C4D4F"/>
             <w:sz w:val="20"/>
             <w:szCs w:val="20"/>
           </w:rPr>
@@ -5553,7 +4855,6 @@
             <w:rFonts w:asciiTheme="minorBidi" w:hAnsiTheme="minorBidi"/>
             <w:b/>
             <w:bCs/>
-            <w:color w:val="4C4D4F"/>
             <w:sz w:val="20"/>
             <w:szCs w:val="20"/>
           </w:rPr>
@@ -5562,7 +4863,6 @@
         <w:r>
           <w:rPr>
             <w:rFonts w:asciiTheme="minorBidi" w:hAnsiTheme="minorBidi"/>
-            <w:color w:val="4C4D4F"/>
             <w:sz w:val="20"/>
             <w:szCs w:val="20"/>
           </w:rPr>
@@ -5571,7 +4871,6 @@
         <w:r>
           <w:rPr>
             <w:rFonts w:asciiTheme="minorBidi" w:hAnsiTheme="minorBidi"/>
-            <w:color w:val="4C4D4F"/>
             <w:sz w:val="20"/>
             <w:szCs w:val="20"/>
           </w:rPr>
@@ -5580,7 +4879,6 @@
         <w:r>
           <w:rPr>
             <w:rFonts w:asciiTheme="minorBidi" w:hAnsiTheme="minorBidi"/>
-            <w:color w:val="4C4D4F"/>
             <w:sz w:val="20"/>
             <w:szCs w:val="20"/>
           </w:rPr>
@@ -5590,7 +4888,6 @@
           <w:rPr>
             <w:rFonts w:asciiTheme="minorBidi" w:hAnsiTheme="minorBidi"/>
             <w:noProof/>
-            <w:color w:val="4C4D4F"/>
             <w:sz w:val="20"/>
             <w:szCs w:val="20"/>
           </w:rPr>
@@ -5600,7 +4897,6 @@
           <w:rPr>
             <w:rFonts w:asciiTheme="minorBidi" w:hAnsiTheme="minorBidi"/>
             <w:noProof/>
-            <w:color w:val="4C4D4F"/>
             <w:sz w:val="20"/>
             <w:szCs w:val="20"/>
           </w:rPr>
@@ -5610,7 +4906,6 @@
           <w:rPr>
             <w:rFonts w:asciiTheme="minorBidi" w:hAnsiTheme="minorBidi"/>
             <w:noProof/>
-            <w:color w:val="4C4D4F"/>
             <w:sz w:val="20"/>
             <w:szCs w:val="20"/>
           </w:rPr>

</xml_diff>

<commit_message>
Eliminate unrequired sections & merge a section
</commit_message>
<xml_diff>
--- a/docs/Omid Reza Heidari-CV.docx
+++ b/docs/Omid Reza Heidari-CV.docx
@@ -1,6 +1,6 @@
 
 <file path=word/document.xml><?xml version="1.0" encoding="utf-8"?>
-<w:document xmlns:wpc="http://schemas.microsoft.com/office/word/2010/wordprocessingCanvas" xmlns:cx="http://schemas.microsoft.com/office/drawing/2014/chartex" xmlns:cx1="http://schemas.microsoft.com/office/drawing/2015/9/8/chartex" xmlns:cx2="http://schemas.microsoft.com/office/drawing/2015/10/21/chartex" xmlns:cx3="http://schemas.microsoft.com/office/drawing/2016/5/9/chartex" xmlns:cx4="http://schemas.microsoft.com/office/drawing/2016/5/10/chartex" xmlns:cx5="http://schemas.microsoft.com/office/drawing/2016/5/11/chartex" xmlns:cx6="http://schemas.microsoft.com/office/drawing/2016/5/12/chartex" xmlns:cx7="http://schemas.microsoft.com/office/drawing/2016/5/13/chartex" xmlns:cx8="http://schemas.microsoft.com/office/drawing/2016/5/14/chartex" xmlns:mc="http://schemas.openxmlformats.org/markup-compatibility/2006" xmlns:aink="http://schemas.microsoft.com/office/drawing/2016/ink" xmlns:am3d="http://schemas.microsoft.com/office/drawing/2017/model3d" xmlns:o="urn:schemas-microsoft-com:office:office" xmlns:oel="http://schemas.microsoft.com/office/2019/extlst" xmlns:r="http://schemas.openxmlformats.org/officeDocument/2006/relationships" xmlns:m="http://schemas.openxmlformats.org/officeDocument/2006/math" xmlns:v="urn:schemas-microsoft-com:vml" xmlns:wp14="http://schemas.microsoft.com/office/word/2010/wordprocessingDrawing" xmlns:wp="http://schemas.openxmlformats.org/drawingml/2006/wordprocessingDrawing" xmlns:w10="urn:schemas-microsoft-com:office:word" xmlns:w="http://schemas.openxmlformats.org/wordprocessingml/2006/main" xmlns:w14="http://schemas.microsoft.com/office/word/2010/wordml" xmlns:w15="http://schemas.microsoft.com/office/word/2012/wordml" xmlns:w16cex="http://schemas.microsoft.com/office/word/2018/wordml/cex" xmlns:w16cid="http://schemas.microsoft.com/office/word/2016/wordml/cid" xmlns:w16="http://schemas.microsoft.com/office/word/2018/wordml" xmlns:w16du="http://schemas.microsoft.com/office/word/2023/wordml/word16du" xmlns:w16sdtdh="http://schemas.microsoft.com/office/word/2020/wordml/sdtdatahash" xmlns:w16se="http://schemas.microsoft.com/office/word/2015/wordml/symex" xmlns:wpg="http://schemas.microsoft.com/office/word/2010/wordprocessingGroup" xmlns:wpi="http://schemas.microsoft.com/office/word/2010/wordprocessingInk" xmlns:wne="http://schemas.microsoft.com/office/word/2006/wordml" xmlns:wps="http://schemas.microsoft.com/office/word/2010/wordprocessingShape" mc:Ignorable="w14 w15 w16se w16cid w16 w16cex w16sdtdh wp14">
+<w:document xmlns:wpc="http://schemas.microsoft.com/office/word/2010/wordprocessingCanvas" xmlns:cx="http://schemas.microsoft.com/office/drawing/2014/chartex" xmlns:cx1="http://schemas.microsoft.com/office/drawing/2015/9/8/chartex" xmlns:cx2="http://schemas.microsoft.com/office/drawing/2015/10/21/chartex" xmlns:cx3="http://schemas.microsoft.com/office/drawing/2016/5/9/chartex" xmlns:cx4="http://schemas.microsoft.com/office/drawing/2016/5/10/chartex" xmlns:cx5="http://schemas.microsoft.com/office/drawing/2016/5/11/chartex" xmlns:cx6="http://schemas.microsoft.com/office/drawing/2016/5/12/chartex" xmlns:cx7="http://schemas.microsoft.com/office/drawing/2016/5/13/chartex" xmlns:cx8="http://schemas.microsoft.com/office/drawing/2016/5/14/chartex" xmlns:mc="http://schemas.openxmlformats.org/markup-compatibility/2006" xmlns:aink="http://schemas.microsoft.com/office/drawing/2016/ink" xmlns:am3d="http://schemas.microsoft.com/office/drawing/2017/model3d" xmlns:o="urn:schemas-microsoft-com:office:office" xmlns:oel="http://schemas.microsoft.com/office/2019/extlst" xmlns:r="http://schemas.openxmlformats.org/officeDocument/2006/relationships" xmlns:m="http://schemas.openxmlformats.org/officeDocument/2006/math" xmlns:v="urn:schemas-microsoft-com:vml" xmlns:wp14="http://schemas.microsoft.com/office/word/2010/wordprocessingDrawing" xmlns:wp="http://schemas.openxmlformats.org/drawingml/2006/wordprocessingDrawing" xmlns:w10="urn:schemas-microsoft-com:office:word" xmlns:w="http://schemas.openxmlformats.org/wordprocessingml/2006/main" xmlns:w14="http://schemas.microsoft.com/office/word/2010/wordml" xmlns:w15="http://schemas.microsoft.com/office/word/2012/wordml" xmlns:w16cex="http://schemas.microsoft.com/office/word/2018/wordml/cex" xmlns:w16cid="http://schemas.microsoft.com/office/word/2016/wordml/cid" xmlns:w16="http://schemas.microsoft.com/office/word/2018/wordml" xmlns:w16sdtdh="http://schemas.microsoft.com/office/word/2020/wordml/sdtdatahash" xmlns:w16se="http://schemas.microsoft.com/office/word/2015/wordml/symex" xmlns:wpg="http://schemas.microsoft.com/office/word/2010/wordprocessingGroup" xmlns:wpi="http://schemas.microsoft.com/office/word/2010/wordprocessingInk" xmlns:wne="http://schemas.microsoft.com/office/word/2006/wordml" xmlns:wps="http://schemas.microsoft.com/office/word/2010/wordprocessingShape" mc:Ignorable="w14 w15 w16se w16cid w16 w16cex w16sdtdh wp14">
   <w:body>
     <w:p>
       <w:pPr>
@@ -1125,92 +1125,65 @@
           <w:szCs w:val="20"/>
           <w:lang w:bidi="fa-IR"/>
         </w:rPr>
-        <w:t>Nov</w:t>
-      </w:r>
-      <w:r>
-        <w:rPr>
-          <w:rFonts w:asciiTheme="minorBidi" w:hAnsiTheme="minorBidi"/>
-          <w:sz w:val="20"/>
-          <w:szCs w:val="20"/>
-          <w:lang w:bidi="fa-IR"/>
-        </w:rPr>
-        <w:t xml:space="preserve"> 2022</w:t>
-      </w:r>
-      <w:r>
-        <w:rPr>
-          <w:rFonts w:asciiTheme="minorBidi" w:hAnsiTheme="minorBidi"/>
+        <w:t>Ju</w:t>
+      </w:r>
+      <w:r>
+        <w:rPr>
+          <w:rFonts w:asciiTheme="minorBidi" w:hAnsiTheme="minorBidi"/>
+          <w:sz w:val="20"/>
+          <w:szCs w:val="20"/>
+          <w:lang w:bidi="fa-IR"/>
+        </w:rPr>
+        <w:t>l</w:t>
+      </w:r>
+      <w:r>
+        <w:rPr>
+          <w:rFonts w:asciiTheme="minorBidi" w:hAnsiTheme="minorBidi"/>
+          <w:sz w:val="20"/>
+          <w:szCs w:val="20"/>
+          <w:lang w:bidi="fa-IR"/>
+        </w:rPr>
+        <w:t xml:space="preserve"> 2022 - </w:t>
+      </w:r>
+      <w:r>
+        <w:rPr>
+          <w:rFonts w:asciiTheme="minorBidi" w:hAnsiTheme="minorBidi"/>
+          <w:sz w:val="20"/>
+          <w:szCs w:val="20"/>
+          <w:lang w:bidi="fa-IR"/>
+        </w:rPr>
+        <w:t>Jan 2023</w:t>
+      </w:r>
+      <w:r>
+        <w:rPr>
+          <w:rFonts w:asciiTheme="minorBidi" w:hAnsiTheme="minorBidi"/>
+          <w:sz w:val="20"/>
+          <w:szCs w:val="20"/>
+          <w:lang w:bidi="fa-IR"/>
+        </w:rPr>
+        <w:tab/>
+      </w:r>
+      <w:r>
+        <w:rPr>
+          <w:rFonts w:asciiTheme="minorBidi" w:hAnsiTheme="minorBidi"/>
+          <w:b/>
+          <w:bCs/>
+          <w:sz w:val="20"/>
+          <w:szCs w:val="20"/>
+          <w:lang w:bidi="fa-IR"/>
+        </w:rPr>
+        <w:t>Data Research Analyst,</w:t>
+      </w:r>
+      <w:r>
+        <w:rPr>
+          <w:rFonts w:asciiTheme="minorBidi" w:hAnsiTheme="minorBidi"/>
+          <w:b/>
+          <w:bCs/>
           <w:sz w:val="20"/>
           <w:szCs w:val="20"/>
           <w:lang w:bidi="fa-IR"/>
         </w:rPr>
         <w:t xml:space="preserve"> </w:t>
-      </w:r>
-      <w:r>
-        <w:rPr>
-          <w:rFonts w:asciiTheme="minorBidi" w:hAnsiTheme="minorBidi"/>
-          <w:sz w:val="20"/>
-          <w:szCs w:val="20"/>
-          <w:lang w:bidi="fa-IR"/>
-        </w:rPr>
-        <w:t>–</w:t>
-      </w:r>
-      <w:r>
-        <w:rPr>
-          <w:rFonts w:asciiTheme="minorBidi" w:hAnsiTheme="minorBidi"/>
-          <w:sz w:val="20"/>
-          <w:szCs w:val="20"/>
-          <w:lang w:bidi="fa-IR"/>
-        </w:rPr>
-        <w:t xml:space="preserve"> </w:t>
-      </w:r>
-      <w:r>
-        <w:rPr>
-          <w:rFonts w:asciiTheme="minorBidi" w:hAnsiTheme="minorBidi"/>
-          <w:sz w:val="20"/>
-          <w:szCs w:val="20"/>
-          <w:lang w:bidi="fa-IR"/>
-        </w:rPr>
-        <w:t>Jan</w:t>
-      </w:r>
-      <w:r>
-        <w:rPr>
-          <w:rFonts w:asciiTheme="minorBidi" w:hAnsiTheme="minorBidi"/>
-          <w:sz w:val="20"/>
-          <w:szCs w:val="20"/>
-          <w:lang w:bidi="fa-IR"/>
-        </w:rPr>
-        <w:t xml:space="preserve"> 2023</w:t>
-      </w:r>
-      <w:r>
-        <w:rPr>
-          <w:rFonts w:asciiTheme="minorBidi" w:hAnsiTheme="minorBidi"/>
-          <w:sz w:val="20"/>
-          <w:szCs w:val="20"/>
-          <w:lang w:bidi="fa-IR"/>
-        </w:rPr>
-        <w:tab/>
-      </w:r>
-      <w:r>
-        <w:rPr>
-          <w:rFonts w:asciiTheme="minorBidi" w:hAnsiTheme="minorBidi"/>
-          <w:b/>
-          <w:bCs/>
-          <w:sz w:val="20"/>
-          <w:szCs w:val="20"/>
-          <w:lang w:bidi="fa-IR"/>
-        </w:rPr>
-        <w:t>Machine Learning Researcher</w:t>
-      </w:r>
-      <w:r>
-        <w:rPr>
-          <w:rFonts w:asciiTheme="minorBidi" w:hAnsiTheme="minorBidi"/>
-          <w:b/>
-          <w:bCs/>
-          <w:sz w:val="20"/>
-          <w:szCs w:val="20"/>
-          <w:lang w:bidi="fa-IR"/>
-        </w:rPr>
-        <w:t xml:space="preserve">, </w:t>
       </w:r>
       <w:r>
         <w:rPr>
@@ -1242,31 +1215,7 @@
           <w:sz w:val="20"/>
           <w:szCs w:val="20"/>
         </w:rPr>
-        <w:t>Conduct</w:t>
-      </w:r>
-      <w:r>
-        <w:rPr>
-          <w:rFonts w:asciiTheme="minorBidi" w:hAnsiTheme="minorBidi"/>
-          <w:sz w:val="20"/>
-          <w:szCs w:val="20"/>
-        </w:rPr>
-        <w:t>ed</w:t>
-      </w:r>
-      <w:r>
-        <w:rPr>
-          <w:rFonts w:asciiTheme="minorBidi" w:hAnsiTheme="minorBidi"/>
-          <w:sz w:val="20"/>
-          <w:szCs w:val="20"/>
-        </w:rPr>
-        <w:t xml:space="preserve"> research in the area of</w:t>
-      </w:r>
-      <w:r>
-        <w:rPr>
-          <w:rFonts w:asciiTheme="minorBidi" w:hAnsiTheme="minorBidi"/>
-          <w:sz w:val="20"/>
-          <w:szCs w:val="20"/>
-        </w:rPr>
-        <w:t xml:space="preserve"> </w:t>
+        <w:t xml:space="preserve">Conducted research in the area of </w:t>
       </w:r>
       <w:r>
         <w:rPr>
@@ -1275,15 +1224,7 @@
           <w:sz w:val="20"/>
           <w:szCs w:val="20"/>
         </w:rPr>
-        <w:t xml:space="preserve">Machine Learning and </w:t>
-      </w:r>
-      <w:r>
-        <w:rPr>
-          <w:rFonts w:asciiTheme="minorBidi" w:hAnsiTheme="minorBidi"/>
-          <w:sz w:val="20"/>
-          <w:szCs w:val="20"/>
-        </w:rPr>
-        <w:t>Structural Magnetic Resonance Imaging</w:t>
+        <w:t>Machine Learning</w:t>
       </w:r>
       <w:r>
         <w:rPr>
@@ -1292,7 +1233,7 @@
           <w:sz w:val="20"/>
           <w:szCs w:val="20"/>
         </w:rPr>
-        <w:t xml:space="preserve"> </w:t>
+        <w:t xml:space="preserve"> and </w:t>
       </w:r>
       <w:r>
         <w:rPr>
@@ -1301,7 +1242,7 @@
           <w:sz w:val="20"/>
           <w:szCs w:val="20"/>
         </w:rPr>
-        <w:t>under the supervision of Dr. Mohsen Dadashi</w:t>
+        <w:t>Electroencephalogram signals under the supervision of Dr. Michael Nitsche and Dr. Mohsen Dadashi</w:t>
       </w:r>
     </w:p>
     <w:p>
@@ -1324,232 +1265,7 @@
           <w:sz w:val="20"/>
           <w:szCs w:val="20"/>
         </w:rPr>
-        <w:t>Collect</w:t>
-      </w:r>
-      <w:r>
-        <w:rPr>
-          <w:rStyle w:val="hgkelc"/>
-          <w:rFonts w:asciiTheme="minorBidi" w:hAnsiTheme="minorBidi"/>
-          <w:sz w:val="20"/>
-          <w:szCs w:val="20"/>
-        </w:rPr>
-        <w:t>ed</w:t>
-      </w:r>
-      <w:r>
-        <w:rPr>
-          <w:rStyle w:val="hgkelc"/>
-          <w:rFonts w:asciiTheme="minorBidi" w:hAnsiTheme="minorBidi"/>
-          <w:sz w:val="20"/>
-          <w:szCs w:val="20"/>
-        </w:rPr>
-        <w:t xml:space="preserve"> and preprocess</w:t>
-      </w:r>
-      <w:r>
-        <w:rPr>
-          <w:rStyle w:val="hgkelc"/>
-          <w:rFonts w:asciiTheme="minorBidi" w:hAnsiTheme="minorBidi"/>
-          <w:sz w:val="20"/>
-          <w:szCs w:val="20"/>
-        </w:rPr>
-        <w:t xml:space="preserve">ed </w:t>
-      </w:r>
-      <w:r>
-        <w:rPr>
-          <w:rStyle w:val="hgkelc"/>
-          <w:rFonts w:asciiTheme="minorBidi" w:hAnsiTheme="minorBidi"/>
-          <w:sz w:val="20"/>
-          <w:szCs w:val="20"/>
-        </w:rPr>
-        <w:t xml:space="preserve">data to </w:t>
-      </w:r>
-      <w:r>
-        <w:rPr>
-          <w:rStyle w:val="hgkelc"/>
-          <w:rFonts w:asciiTheme="minorBidi" w:hAnsiTheme="minorBidi"/>
-          <w:sz w:val="20"/>
-          <w:szCs w:val="20"/>
-        </w:rPr>
-        <w:t xml:space="preserve">be </w:t>
-      </w:r>
-      <w:r>
-        <w:rPr>
-          <w:rStyle w:val="hgkelc"/>
-          <w:rFonts w:asciiTheme="minorBidi" w:hAnsiTheme="minorBidi"/>
-          <w:sz w:val="20"/>
-          <w:szCs w:val="20"/>
-        </w:rPr>
-        <w:t>evaluate</w:t>
-      </w:r>
-      <w:r>
-        <w:rPr>
-          <w:rStyle w:val="hgkelc"/>
-          <w:rFonts w:asciiTheme="minorBidi" w:hAnsiTheme="minorBidi"/>
-          <w:sz w:val="20"/>
-          <w:szCs w:val="20"/>
-        </w:rPr>
-        <w:t>d</w:t>
-      </w:r>
-      <w:r>
-        <w:rPr>
-          <w:rStyle w:val="hgkelc"/>
-          <w:rFonts w:asciiTheme="minorBidi" w:hAnsiTheme="minorBidi"/>
-          <w:sz w:val="20"/>
-          <w:szCs w:val="20"/>
-        </w:rPr>
-        <w:t xml:space="preserve"> with Machine Learning models</w:t>
-      </w:r>
-    </w:p>
-    <w:p>
-      <w:pPr>
-        <w:rPr>
-          <w:rFonts w:asciiTheme="minorBidi" w:hAnsiTheme="minorBidi"/>
-          <w:sz w:val="20"/>
-          <w:szCs w:val="20"/>
-          <w:lang w:bidi="fa-IR"/>
-        </w:rPr>
-      </w:pPr>
-      <w:r>
-        <w:rPr>
-          <w:rFonts w:asciiTheme="minorBidi" w:hAnsiTheme="minorBidi"/>
-          <w:sz w:val="20"/>
-          <w:szCs w:val="20"/>
-          <w:lang w:bidi="fa-IR"/>
-        </w:rPr>
-        <w:t>Ju</w:t>
-      </w:r>
-      <w:r>
-        <w:rPr>
-          <w:rFonts w:asciiTheme="minorBidi" w:hAnsiTheme="minorBidi"/>
-          <w:sz w:val="20"/>
-          <w:szCs w:val="20"/>
-          <w:lang w:bidi="fa-IR"/>
-        </w:rPr>
-        <w:t>l</w:t>
-      </w:r>
-      <w:r>
-        <w:rPr>
-          <w:rFonts w:asciiTheme="minorBidi" w:hAnsiTheme="minorBidi"/>
-          <w:sz w:val="20"/>
-          <w:szCs w:val="20"/>
-          <w:lang w:bidi="fa-IR"/>
-        </w:rPr>
-        <w:t xml:space="preserve"> 2022 - Oct 2022</w:t>
-      </w:r>
-      <w:r>
-        <w:rPr>
-          <w:rFonts w:asciiTheme="minorBidi" w:hAnsiTheme="minorBidi"/>
-          <w:sz w:val="20"/>
-          <w:szCs w:val="20"/>
-          <w:lang w:bidi="fa-IR"/>
-        </w:rPr>
-        <w:tab/>
-      </w:r>
-      <w:r>
-        <w:rPr>
-          <w:rFonts w:asciiTheme="minorBidi" w:hAnsiTheme="minorBidi"/>
-          <w:b/>
-          <w:bCs/>
-          <w:sz w:val="20"/>
-          <w:szCs w:val="20"/>
-          <w:lang w:bidi="fa-IR"/>
-        </w:rPr>
-        <w:t>Data Research Analyst,</w:t>
-      </w:r>
-      <w:r>
-        <w:rPr>
-          <w:rFonts w:asciiTheme="minorBidi" w:hAnsiTheme="minorBidi"/>
-          <w:b/>
-          <w:bCs/>
-          <w:sz w:val="20"/>
-          <w:szCs w:val="20"/>
-          <w:lang w:bidi="fa-IR"/>
-        </w:rPr>
-        <w:t xml:space="preserve"> </w:t>
-      </w:r>
-      <w:r>
-        <w:rPr>
-          <w:rFonts w:asciiTheme="minorBidi" w:hAnsiTheme="minorBidi"/>
-          <w:sz w:val="20"/>
-          <w:szCs w:val="20"/>
-          <w:lang w:bidi="fa-IR"/>
-        </w:rPr>
-        <w:t>Zanjan University of Medical Science</w:t>
-      </w:r>
-    </w:p>
-    <w:p>
-      <w:pPr>
-        <w:pStyle w:val="ListParagraph"/>
-        <w:numPr>
-          <w:ilvl w:val="0"/>
-          <w:numId w:val="1"/>
-        </w:numPr>
-        <w:rPr>
-          <w:rFonts w:asciiTheme="minorBidi" w:hAnsiTheme="minorBidi"/>
-          <w:sz w:val="20"/>
-          <w:szCs w:val="20"/>
-        </w:rPr>
-      </w:pPr>
-      <w:r>
-        <w:rPr>
-          <w:rFonts w:asciiTheme="minorBidi" w:hAnsiTheme="minorBidi"/>
-          <w:sz w:val="20"/>
-          <w:szCs w:val="20"/>
-        </w:rPr>
-        <w:t xml:space="preserve">Conducted research in the area of </w:t>
-      </w:r>
-      <w:r>
-        <w:rPr>
-          <w:rStyle w:val="hgkelc"/>
-          <w:rFonts w:asciiTheme="minorBidi" w:hAnsiTheme="minorBidi"/>
-          <w:sz w:val="20"/>
-          <w:szCs w:val="20"/>
-        </w:rPr>
-        <w:t xml:space="preserve">Electroencephalogram signals </w:t>
-      </w:r>
-      <w:r>
-        <w:rPr>
-          <w:rStyle w:val="hgkelc"/>
-          <w:rFonts w:asciiTheme="minorBidi" w:hAnsiTheme="minorBidi"/>
-          <w:sz w:val="20"/>
-          <w:szCs w:val="20"/>
-        </w:rPr>
-        <w:t xml:space="preserve">within a team of two </w:t>
-      </w:r>
-      <w:r>
-        <w:rPr>
-          <w:rStyle w:val="hgkelc"/>
-          <w:rFonts w:asciiTheme="minorBidi" w:hAnsiTheme="minorBidi"/>
-          <w:sz w:val="20"/>
-          <w:szCs w:val="20"/>
-        </w:rPr>
-        <w:t xml:space="preserve">under the supervision of Dr. Michael Nitsche and Dr. Mohsen Dadashi, which led to </w:t>
-      </w:r>
-      <w:r>
-        <w:rPr>
-          <w:rStyle w:val="hgkelc"/>
-          <w:rFonts w:asciiTheme="minorBidi" w:hAnsiTheme="minorBidi"/>
-          <w:sz w:val="20"/>
-          <w:szCs w:val="20"/>
-        </w:rPr>
-        <w:t>a</w:t>
-      </w:r>
-      <w:r>
-        <w:rPr>
-          <w:rStyle w:val="hgkelc"/>
-          <w:rFonts w:asciiTheme="minorBidi" w:hAnsiTheme="minorBidi"/>
-          <w:sz w:val="20"/>
-          <w:szCs w:val="20"/>
-        </w:rPr>
-        <w:t xml:space="preserve"> </w:t>
-      </w:r>
-      <w:r>
-        <w:rPr>
-          <w:rStyle w:val="hgkelc"/>
-          <w:rFonts w:asciiTheme="minorBidi" w:hAnsiTheme="minorBidi"/>
-          <w:sz w:val="20"/>
-          <w:szCs w:val="20"/>
-        </w:rPr>
-        <w:t>publication</w:t>
+        <w:t>Collected and preprocessed data to be evaluated with Machine Learning models</w:t>
       </w:r>
     </w:p>
     <w:p>
@@ -2073,7 +1789,6 @@
           <w:sz w:val="20"/>
           <w:szCs w:val="20"/>
         </w:rPr>
-        <w:lastRenderedPageBreak/>
         <w:t xml:space="preserve">Held course discussion sessions for up to </w:t>
       </w:r>
       <w:r>
@@ -2164,6 +1879,7 @@
           <w:szCs w:val="20"/>
           <w:lang w:bidi="fa-IR"/>
         </w:rPr>
+        <w:lastRenderedPageBreak/>
         <w:t>Feb 2022 - Jun 2022</w:t>
       </w:r>
       <w:r>
@@ -2268,7 +1984,15 @@
           <w:sz w:val="20"/>
           <w:szCs w:val="20"/>
         </w:rPr>
-        <w:t>also the final project</w:t>
+        <w:t>along with</w:t>
+      </w:r>
+      <w:r>
+        <w:rPr>
+          <w:rFonts w:asciiTheme="minorBidi" w:hAnsiTheme="minorBidi"/>
+          <w:sz w:val="20"/>
+          <w:szCs w:val="20"/>
+        </w:rPr>
+        <w:t xml:space="preserve"> the final project</w:t>
       </w:r>
       <w:r>
         <w:rPr>
@@ -2411,519 +2135,6 @@
           <w:szCs w:val="20"/>
         </w:rPr>
         <w:t>Graded assignments and exams of 82 students to provide tailored feedback based on course expectations and outcomes</w:t>
-      </w:r>
-    </w:p>
-    <w:p>
-      <w:pPr>
-        <w:spacing w:line="276" w:lineRule="auto"/>
-        <w:rPr>
-          <w:rFonts w:asciiTheme="minorBidi" w:hAnsiTheme="minorBidi"/>
-          <w:sz w:val="2"/>
-          <w:szCs w:val="2"/>
-        </w:rPr>
-      </w:pPr>
-    </w:p>
-    <w:p>
-      <w:pPr>
-        <w:rPr>
-          <w:rFonts w:asciiTheme="minorBidi" w:hAnsiTheme="minorBidi"/>
-          <w:b/>
-          <w:bCs/>
-          <w:sz w:val="24"/>
-          <w:szCs w:val="24"/>
-        </w:rPr>
-      </w:pPr>
-      <w:r>
-        <w:rPr>
-          <w:rFonts w:asciiTheme="minorBidi" w:hAnsiTheme="minorBidi"/>
-          <w:b/>
-          <w:bCs/>
-          <w:sz w:val="24"/>
-          <w:szCs w:val="24"/>
-        </w:rPr>
-        <w:t>PUBLICATIONS</w:t>
-      </w:r>
-    </w:p>
-    <w:p>
-      <w:pPr>
-        <w:rPr>
-          <w:rFonts w:asciiTheme="minorBidi" w:hAnsiTheme="minorBidi"/>
-          <w:b/>
-          <w:bCs/>
-          <w:sz w:val="20"/>
-          <w:szCs w:val="20"/>
-          <w:lang w:bidi="fa-IR"/>
-        </w:rPr>
-      </w:pPr>
-      <w:r>
-        <w:rPr>
-          <w:rFonts w:asciiTheme="minorBidi" w:hAnsiTheme="minorBidi"/>
-          <w:b/>
-          <w:bCs/>
-          <w:sz w:val="20"/>
-          <w:szCs w:val="20"/>
-          <w:lang w:bidi="fa-IR"/>
-        </w:rPr>
-        <w:t>Submitted works</w:t>
-      </w:r>
-    </w:p>
-    <w:p>
-      <w:pPr>
-        <w:pStyle w:val="ListParagraph"/>
-        <w:numPr>
-          <w:ilvl w:val="0"/>
-          <w:numId w:val="13"/>
-        </w:numPr>
-        <w:rPr>
-          <w:rFonts w:asciiTheme="minorBidi" w:hAnsiTheme="minorBidi"/>
-          <w:b/>
-          <w:bCs/>
-          <w:sz w:val="20"/>
-          <w:szCs w:val="20"/>
-          <w:lang w:bidi="fa-IR"/>
-        </w:rPr>
-      </w:pPr>
-      <w:r>
-        <w:rPr>
-          <w:rFonts w:asciiTheme="minorBidi" w:hAnsiTheme="minorBidi"/>
-          <w:sz w:val="20"/>
-          <w:szCs w:val="20"/>
-          <w:lang w:bidi="fa-IR"/>
-        </w:rPr>
-        <w:t>OR Heidari, M Dadashi, M Maghbooli,</w:t>
-      </w:r>
-      <w:r>
-        <w:t xml:space="preserve"> </w:t>
-      </w:r>
-      <w:r>
-        <w:rPr>
-          <w:rFonts w:asciiTheme="minorBidi" w:hAnsiTheme="minorBidi"/>
-          <w:sz w:val="20"/>
-          <w:szCs w:val="20"/>
-          <w:lang w:bidi="fa-IR"/>
-        </w:rPr>
-        <w:t>M Soltani, A Zakerian Zadeh,</w:t>
-      </w:r>
-      <w:r>
-        <w:rPr>
-          <w:rFonts w:asciiTheme="minorBidi" w:hAnsiTheme="minorBidi"/>
-          <w:sz w:val="20"/>
-          <w:szCs w:val="20"/>
-          <w:lang w:bidi="fa-IR"/>
-        </w:rPr>
-        <w:t xml:space="preserve"> M Bayat</w:t>
-      </w:r>
-      <w:r>
-        <w:rPr>
-          <w:rFonts w:asciiTheme="minorBidi" w:hAnsiTheme="minorBidi"/>
-          <w:sz w:val="20"/>
-          <w:szCs w:val="20"/>
-          <w:lang w:bidi="fa-IR"/>
-        </w:rPr>
-        <w:t>,</w:t>
-      </w:r>
-      <w:r>
-        <w:rPr>
-          <w:rFonts w:asciiTheme="minorBidi" w:hAnsiTheme="minorBidi"/>
-          <w:sz w:val="20"/>
-          <w:szCs w:val="20"/>
-          <w:lang w:bidi="fa-IR"/>
-        </w:rPr>
-        <w:t xml:space="preserve"> </w:t>
-      </w:r>
-      <w:r>
-        <w:rPr>
-          <w:rFonts w:asciiTheme="minorBidi" w:hAnsiTheme="minorBidi"/>
-          <w:sz w:val="20"/>
-          <w:szCs w:val="20"/>
-        </w:rPr>
-        <w:t>“Assessment of structural connectivity and brain volumes after tDCS in stroke: a machine-learning method”</w:t>
-      </w:r>
-    </w:p>
-    <w:p>
-      <w:pPr>
-        <w:rPr>
-          <w:rFonts w:asciiTheme="minorBidi" w:hAnsiTheme="minorBidi"/>
-          <w:b/>
-          <w:bCs/>
-          <w:sz w:val="20"/>
-          <w:szCs w:val="20"/>
-          <w:lang w:bidi="fa-IR"/>
-        </w:rPr>
-      </w:pPr>
-      <w:r>
-        <w:rPr>
-          <w:rFonts w:asciiTheme="minorBidi" w:hAnsiTheme="minorBidi"/>
-          <w:b/>
-          <w:bCs/>
-          <w:sz w:val="20"/>
-          <w:szCs w:val="20"/>
-          <w:lang w:bidi="fa-IR"/>
-        </w:rPr>
-        <w:t>Works in preparation</w:t>
-      </w:r>
-    </w:p>
-    <w:p>
-      <w:pPr>
-        <w:pStyle w:val="ListParagraph"/>
-        <w:numPr>
-          <w:ilvl w:val="0"/>
-          <w:numId w:val="13"/>
-        </w:numPr>
-        <w:rPr>
-          <w:rFonts w:asciiTheme="minorBidi" w:hAnsiTheme="minorBidi"/>
-          <w:b/>
-          <w:bCs/>
-          <w:sz w:val="20"/>
-          <w:szCs w:val="20"/>
-          <w:lang w:bidi="fa-IR"/>
-        </w:rPr>
-      </w:pPr>
-      <w:r>
-        <w:rPr>
-          <w:rFonts w:asciiTheme="minorBidi" w:hAnsiTheme="minorBidi"/>
-          <w:sz w:val="20"/>
-          <w:szCs w:val="20"/>
-        </w:rPr>
-        <w:t>OR Heidari, FN Yousefi,</w:t>
-      </w:r>
-      <w:r>
-        <w:rPr>
-          <w:rFonts w:asciiTheme="minorBidi" w:hAnsiTheme="minorBidi"/>
-          <w:sz w:val="20"/>
-          <w:szCs w:val="20"/>
-        </w:rPr>
-        <w:t xml:space="preserve"> MA Nitsche,</w:t>
-      </w:r>
-      <w:r>
-        <w:rPr>
-          <w:rFonts w:asciiTheme="minorBidi" w:hAnsiTheme="minorBidi"/>
-          <w:sz w:val="20"/>
-          <w:szCs w:val="20"/>
-        </w:rPr>
-        <w:t xml:space="preserve"> M Dadashi</w:t>
-      </w:r>
-      <w:r>
-        <w:rPr>
-          <w:rFonts w:asciiTheme="minorBidi" w:hAnsiTheme="minorBidi"/>
-          <w:sz w:val="20"/>
-          <w:szCs w:val="20"/>
-        </w:rPr>
-        <w:t>,</w:t>
-      </w:r>
-      <w:r>
-        <w:rPr>
-          <w:rFonts w:asciiTheme="minorBidi" w:hAnsiTheme="minorBidi"/>
-          <w:sz w:val="20"/>
-          <w:szCs w:val="20"/>
-        </w:rPr>
-        <w:t xml:space="preserve"> “</w:t>
-      </w:r>
-      <w:r>
-        <w:rPr>
-          <w:rFonts w:asciiTheme="minorBidi" w:hAnsiTheme="minorBidi"/>
-          <w:sz w:val="20"/>
-          <w:szCs w:val="20"/>
-        </w:rPr>
-        <w:t>Effectiveness of tDCS over the DLPFC on reducing clinical symptoms, improving working memory, and aberrant EEG functional connectivity in resting-state schizophrenia patients</w:t>
-      </w:r>
-      <w:r>
-        <w:rPr>
-          <w:rFonts w:asciiTheme="minorBidi" w:hAnsiTheme="minorBidi"/>
-          <w:sz w:val="20"/>
-          <w:szCs w:val="20"/>
-        </w:rPr>
-        <w:t>”</w:t>
-      </w:r>
-    </w:p>
-    <w:p>
-      <w:pPr>
-        <w:rPr>
-          <w:rFonts w:asciiTheme="minorBidi" w:hAnsiTheme="minorBidi"/>
-          <w:sz w:val="2"/>
-          <w:szCs w:val="2"/>
-          <w:lang w:bidi="fa-IR"/>
-        </w:rPr>
-      </w:pPr>
-    </w:p>
-    <w:p>
-      <w:pPr>
-        <w:rPr>
-          <w:rFonts w:asciiTheme="minorBidi" w:hAnsiTheme="minorBidi"/>
-          <w:b/>
-          <w:bCs/>
-          <w:sz w:val="24"/>
-          <w:szCs w:val="24"/>
-          <w:lang w:bidi="fa-IR"/>
-        </w:rPr>
-      </w:pPr>
-      <w:r>
-        <w:rPr>
-          <w:rFonts w:asciiTheme="minorBidi" w:hAnsiTheme="minorBidi"/>
-          <w:b/>
-          <w:bCs/>
-          <w:sz w:val="24"/>
-          <w:szCs w:val="24"/>
-          <w:lang w:bidi="fa-IR"/>
-        </w:rPr>
-        <w:t>INTERNSHIP</w:t>
-      </w:r>
-    </w:p>
-    <w:p>
-      <w:pPr>
-        <w:rPr>
-          <w:rFonts w:asciiTheme="minorBidi" w:hAnsiTheme="minorBidi"/>
-          <w:sz w:val="20"/>
-          <w:szCs w:val="20"/>
-          <w:lang w:bidi="fa-IR"/>
-        </w:rPr>
-      </w:pPr>
-      <w:r>
-        <w:rPr>
-          <w:rFonts w:asciiTheme="minorBidi" w:hAnsiTheme="minorBidi"/>
-          <w:sz w:val="20"/>
-          <w:szCs w:val="20"/>
-          <w:lang w:bidi="fa-IR"/>
-        </w:rPr>
-        <w:t>Aug 2021</w:t>
-      </w:r>
-      <w:r>
-        <w:rPr>
-          <w:rFonts w:asciiTheme="minorBidi" w:hAnsiTheme="minorBidi"/>
-          <w:sz w:val="20"/>
-          <w:szCs w:val="20"/>
-          <w:lang w:bidi="fa-IR"/>
-        </w:rPr>
-        <w:t xml:space="preserve"> </w:t>
-      </w:r>
-      <w:r>
-        <w:rPr>
-          <w:rFonts w:asciiTheme="minorBidi" w:hAnsiTheme="minorBidi"/>
-          <w:sz w:val="20"/>
-          <w:szCs w:val="20"/>
-          <w:lang w:bidi="fa-IR"/>
-        </w:rPr>
-        <w:t>-</w:t>
-      </w:r>
-      <w:r>
-        <w:rPr>
-          <w:rFonts w:asciiTheme="minorBidi" w:hAnsiTheme="minorBidi"/>
-          <w:sz w:val="20"/>
-          <w:szCs w:val="20"/>
-          <w:lang w:bidi="fa-IR"/>
-        </w:rPr>
-        <w:t xml:space="preserve"> </w:t>
-      </w:r>
-      <w:r>
-        <w:rPr>
-          <w:rFonts w:asciiTheme="minorBidi" w:hAnsiTheme="minorBidi"/>
-          <w:sz w:val="20"/>
-          <w:szCs w:val="20"/>
-          <w:lang w:bidi="fa-IR"/>
-        </w:rPr>
-        <w:t>Oct 2021</w:t>
-      </w:r>
-      <w:r>
-        <w:rPr>
-          <w:rFonts w:asciiTheme="minorBidi" w:hAnsiTheme="minorBidi"/>
-          <w:sz w:val="20"/>
-          <w:szCs w:val="20"/>
-          <w:lang w:bidi="fa-IR"/>
-        </w:rPr>
-        <w:tab/>
-      </w:r>
-      <w:r>
-        <w:rPr>
-          <w:rFonts w:asciiTheme="minorBidi" w:hAnsiTheme="minorBidi"/>
-          <w:b/>
-          <w:bCs/>
-          <w:sz w:val="20"/>
-          <w:szCs w:val="20"/>
-          <w:lang w:bidi="fa-IR"/>
-        </w:rPr>
-        <w:t xml:space="preserve">Intern, </w:t>
-      </w:r>
-      <w:r>
-        <w:rPr>
-          <w:rFonts w:asciiTheme="minorBidi" w:hAnsiTheme="minorBidi"/>
-          <w:sz w:val="20"/>
-          <w:szCs w:val="20"/>
-          <w:lang w:bidi="fa-IR"/>
-        </w:rPr>
-        <w:t>Sepah Bank</w:t>
-      </w:r>
-    </w:p>
-    <w:p>
-      <w:pPr>
-        <w:pStyle w:val="ListParagraph"/>
-        <w:numPr>
-          <w:ilvl w:val="0"/>
-          <w:numId w:val="5"/>
-        </w:numPr>
-        <w:rPr>
-          <w:rFonts w:asciiTheme="minorBidi" w:hAnsiTheme="minorBidi"/>
-          <w:sz w:val="20"/>
-          <w:szCs w:val="20"/>
-          <w:lang w:bidi="fa-IR"/>
-        </w:rPr>
-      </w:pPr>
-      <w:r>
-        <w:rPr>
-          <w:rFonts w:asciiTheme="minorBidi" w:hAnsiTheme="minorBidi"/>
-          <w:b/>
-          <w:bCs/>
-          <w:sz w:val="20"/>
-          <w:szCs w:val="20"/>
-          <w:lang w:bidi="fa-IR"/>
-        </w:rPr>
-        <w:t xml:space="preserve">Research </w:t>
-      </w:r>
-      <w:r>
-        <w:rPr>
-          <w:rFonts w:asciiTheme="minorBidi" w:hAnsiTheme="minorBidi"/>
-          <w:b/>
-          <w:bCs/>
-          <w:sz w:val="20"/>
-          <w:szCs w:val="20"/>
-          <w:lang w:bidi="fa-IR"/>
-        </w:rPr>
-        <w:t>T</w:t>
-      </w:r>
-      <w:r>
-        <w:rPr>
-          <w:rFonts w:asciiTheme="minorBidi" w:hAnsiTheme="minorBidi"/>
-          <w:b/>
-          <w:bCs/>
-          <w:sz w:val="20"/>
-          <w:szCs w:val="20"/>
-          <w:lang w:bidi="fa-IR"/>
-        </w:rPr>
-        <w:t>itle:</w:t>
-      </w:r>
-      <w:r>
-        <w:rPr>
-          <w:rFonts w:asciiTheme="minorBidi" w:hAnsiTheme="minorBidi"/>
-          <w:sz w:val="20"/>
-          <w:szCs w:val="20"/>
-          <w:lang w:bidi="fa-IR"/>
-        </w:rPr>
-        <w:t xml:space="preserve"> </w:t>
-      </w:r>
-      <w:r>
-        <w:rPr>
-          <w:rFonts w:asciiTheme="minorBidi" w:hAnsiTheme="minorBidi"/>
-          <w:sz w:val="20"/>
-          <w:szCs w:val="20"/>
-          <w:lang w:bidi="fa-IR"/>
-        </w:rPr>
-        <w:t xml:space="preserve">How to </w:t>
-      </w:r>
-      <w:r>
-        <w:rPr>
-          <w:rFonts w:asciiTheme="minorBidi" w:hAnsiTheme="minorBidi"/>
-          <w:sz w:val="20"/>
-          <w:szCs w:val="20"/>
-          <w:lang w:bidi="fa-IR"/>
-        </w:rPr>
-        <w:t>S</w:t>
-      </w:r>
-      <w:r>
-        <w:rPr>
-          <w:rFonts w:asciiTheme="minorBidi" w:hAnsiTheme="minorBidi"/>
-          <w:sz w:val="20"/>
-          <w:szCs w:val="20"/>
-          <w:lang w:bidi="fa-IR"/>
-        </w:rPr>
-        <w:t xml:space="preserve">et </w:t>
-      </w:r>
-      <w:r>
-        <w:rPr>
-          <w:rFonts w:asciiTheme="minorBidi" w:hAnsiTheme="minorBidi"/>
-          <w:sz w:val="20"/>
-          <w:szCs w:val="20"/>
-          <w:lang w:bidi="fa-IR"/>
-        </w:rPr>
-        <w:t>U</w:t>
-      </w:r>
-      <w:r>
-        <w:rPr>
-          <w:rFonts w:asciiTheme="minorBidi" w:hAnsiTheme="minorBidi"/>
-          <w:sz w:val="20"/>
-          <w:szCs w:val="20"/>
-          <w:lang w:bidi="fa-IR"/>
-        </w:rPr>
-        <w:t xml:space="preserve">p a </w:t>
-      </w:r>
-      <w:r>
-        <w:rPr>
-          <w:rFonts w:asciiTheme="minorBidi" w:hAnsiTheme="minorBidi"/>
-          <w:sz w:val="20"/>
-          <w:szCs w:val="20"/>
-          <w:lang w:bidi="fa-IR"/>
-        </w:rPr>
-        <w:t>D</w:t>
-      </w:r>
-      <w:r>
-        <w:rPr>
-          <w:rFonts w:asciiTheme="minorBidi" w:hAnsiTheme="minorBidi"/>
-          <w:sz w:val="20"/>
-          <w:szCs w:val="20"/>
-          <w:lang w:bidi="fa-IR"/>
-        </w:rPr>
-        <w:t xml:space="preserve">ata </w:t>
-      </w:r>
-      <w:r>
-        <w:rPr>
-          <w:rFonts w:asciiTheme="minorBidi" w:hAnsiTheme="minorBidi"/>
-          <w:sz w:val="20"/>
-          <w:szCs w:val="20"/>
-          <w:lang w:bidi="fa-IR"/>
-        </w:rPr>
-        <w:t>C</w:t>
-      </w:r>
-      <w:r>
-        <w:rPr>
-          <w:rFonts w:asciiTheme="minorBidi" w:hAnsiTheme="minorBidi"/>
-          <w:sz w:val="20"/>
-          <w:szCs w:val="20"/>
-          <w:lang w:bidi="fa-IR"/>
-        </w:rPr>
-        <w:t>enter</w:t>
-      </w:r>
-    </w:p>
-    <w:p>
-      <w:pPr>
-        <w:pStyle w:val="ListParagraph"/>
-        <w:numPr>
-          <w:ilvl w:val="0"/>
-          <w:numId w:val="5"/>
-        </w:numPr>
-        <w:rPr>
-          <w:rFonts w:asciiTheme="minorBidi" w:hAnsiTheme="minorBidi"/>
-          <w:sz w:val="20"/>
-          <w:szCs w:val="20"/>
-          <w:lang w:bidi="fa-IR"/>
-        </w:rPr>
-      </w:pPr>
-      <w:r>
-        <w:rPr>
-          <w:rFonts w:asciiTheme="minorBidi" w:hAnsiTheme="minorBidi"/>
-          <w:b/>
-          <w:bCs/>
-          <w:noProof/>
-          <w:sz w:val="20"/>
-          <w:szCs w:val="20"/>
-        </w:rPr>
-        <w:t xml:space="preserve">Description: </w:t>
-      </w:r>
-      <w:r>
-        <w:rPr>
-          <w:rFonts w:asciiTheme="minorBidi" w:hAnsiTheme="minorBidi"/>
-          <w:noProof/>
-          <w:sz w:val="20"/>
-          <w:szCs w:val="20"/>
-        </w:rPr>
-        <w:t>Investigating the process of setting data centers up in organizations</w:t>
       </w:r>
     </w:p>
     <w:p>
@@ -3689,16 +2900,7 @@
           <w:sz w:val="20"/>
           <w:szCs w:val="20"/>
         </w:rPr>
-        <w:t xml:space="preserve">Network </w:t>
-      </w:r>
-      <w:r>
-        <w:rPr>
-          <w:rFonts w:asciiTheme="minorBidi" w:hAnsiTheme="minorBidi"/>
-          <w:sz w:val="20"/>
-          <w:szCs w:val="20"/>
-        </w:rPr>
-        <w:lastRenderedPageBreak/>
-        <w:t>Security (20)</w:t>
+        <w:t>Network Security (20)</w:t>
       </w:r>
       <w:r>
         <w:rPr>
@@ -4433,6 +3635,7 @@
           <w:szCs w:val="20"/>
           <w:lang w:bidi="fa-IR"/>
         </w:rPr>
+        <w:lastRenderedPageBreak/>
         <w:t xml:space="preserve">Frameworks: </w:t>
       </w:r>
       <w:r>
@@ -4776,7 +3979,7 @@
 </file>
 
 <file path=word/endnotes.xml><?xml version="1.0" encoding="utf-8"?>
-<w:endnotes xmlns:wpc="http://schemas.microsoft.com/office/word/2010/wordprocessingCanvas" xmlns:cx="http://schemas.microsoft.com/office/drawing/2014/chartex" xmlns:cx1="http://schemas.microsoft.com/office/drawing/2015/9/8/chartex" xmlns:cx2="http://schemas.microsoft.com/office/drawing/2015/10/21/chartex" xmlns:cx3="http://schemas.microsoft.com/office/drawing/2016/5/9/chartex" xmlns:cx4="http://schemas.microsoft.com/office/drawing/2016/5/10/chartex" xmlns:cx5="http://schemas.microsoft.com/office/drawing/2016/5/11/chartex" xmlns:cx6="http://schemas.microsoft.com/office/drawing/2016/5/12/chartex" xmlns:cx7="http://schemas.microsoft.com/office/drawing/2016/5/13/chartex" xmlns:cx8="http://schemas.microsoft.com/office/drawing/2016/5/14/chartex" xmlns:mc="http://schemas.openxmlformats.org/markup-compatibility/2006" xmlns:aink="http://schemas.microsoft.com/office/drawing/2016/ink" xmlns:am3d="http://schemas.microsoft.com/office/drawing/2017/model3d" xmlns:o="urn:schemas-microsoft-com:office:office" xmlns:oel="http://schemas.microsoft.com/office/2019/extlst" xmlns:r="http://schemas.openxmlformats.org/officeDocument/2006/relationships" xmlns:m="http://schemas.openxmlformats.org/officeDocument/2006/math" xmlns:v="urn:schemas-microsoft-com:vml" xmlns:wp14="http://schemas.microsoft.com/office/word/2010/wordprocessingDrawing" xmlns:wp="http://schemas.openxmlformats.org/drawingml/2006/wordprocessingDrawing" xmlns:w10="urn:schemas-microsoft-com:office:word" xmlns:w="http://schemas.openxmlformats.org/wordprocessingml/2006/main" xmlns:w14="http://schemas.microsoft.com/office/word/2010/wordml" xmlns:w15="http://schemas.microsoft.com/office/word/2012/wordml" xmlns:w16cex="http://schemas.microsoft.com/office/word/2018/wordml/cex" xmlns:w16cid="http://schemas.microsoft.com/office/word/2016/wordml/cid" xmlns:w16="http://schemas.microsoft.com/office/word/2018/wordml" xmlns:w16du="http://schemas.microsoft.com/office/word/2023/wordml/word16du" xmlns:w16sdtdh="http://schemas.microsoft.com/office/word/2020/wordml/sdtdatahash" xmlns:w16se="http://schemas.microsoft.com/office/word/2015/wordml/symex" xmlns:wpg="http://schemas.microsoft.com/office/word/2010/wordprocessingGroup" xmlns:wpi="http://schemas.microsoft.com/office/word/2010/wordprocessingInk" xmlns:wne="http://schemas.microsoft.com/office/word/2006/wordml" xmlns:wps="http://schemas.microsoft.com/office/word/2010/wordprocessingShape" mc:Ignorable="w14 w15 w16se w16cid w16 w16cex w16sdtdh wp14">
+<w:endnotes xmlns:wpc="http://schemas.microsoft.com/office/word/2010/wordprocessingCanvas" xmlns:cx="http://schemas.microsoft.com/office/drawing/2014/chartex" xmlns:cx1="http://schemas.microsoft.com/office/drawing/2015/9/8/chartex" xmlns:cx2="http://schemas.microsoft.com/office/drawing/2015/10/21/chartex" xmlns:cx3="http://schemas.microsoft.com/office/drawing/2016/5/9/chartex" xmlns:cx4="http://schemas.microsoft.com/office/drawing/2016/5/10/chartex" xmlns:cx5="http://schemas.microsoft.com/office/drawing/2016/5/11/chartex" xmlns:cx6="http://schemas.microsoft.com/office/drawing/2016/5/12/chartex" xmlns:cx7="http://schemas.microsoft.com/office/drawing/2016/5/13/chartex" xmlns:cx8="http://schemas.microsoft.com/office/drawing/2016/5/14/chartex" xmlns:mc="http://schemas.openxmlformats.org/markup-compatibility/2006" xmlns:aink="http://schemas.microsoft.com/office/drawing/2016/ink" xmlns:am3d="http://schemas.microsoft.com/office/drawing/2017/model3d" xmlns:o="urn:schemas-microsoft-com:office:office" xmlns:oel="http://schemas.microsoft.com/office/2019/extlst" xmlns:r="http://schemas.openxmlformats.org/officeDocument/2006/relationships" xmlns:m="http://schemas.openxmlformats.org/officeDocument/2006/math" xmlns:v="urn:schemas-microsoft-com:vml" xmlns:wp14="http://schemas.microsoft.com/office/word/2010/wordprocessingDrawing" xmlns:wp="http://schemas.openxmlformats.org/drawingml/2006/wordprocessingDrawing" xmlns:w10="urn:schemas-microsoft-com:office:word" xmlns:w="http://schemas.openxmlformats.org/wordprocessingml/2006/main" xmlns:w14="http://schemas.microsoft.com/office/word/2010/wordml" xmlns:w15="http://schemas.microsoft.com/office/word/2012/wordml" xmlns:w16cex="http://schemas.microsoft.com/office/word/2018/wordml/cex" xmlns:w16cid="http://schemas.microsoft.com/office/word/2016/wordml/cid" xmlns:w16="http://schemas.microsoft.com/office/word/2018/wordml" xmlns:w16sdtdh="http://schemas.microsoft.com/office/word/2020/wordml/sdtdatahash" xmlns:w16se="http://schemas.microsoft.com/office/word/2015/wordml/symex" xmlns:wpg="http://schemas.microsoft.com/office/word/2010/wordprocessingGroup" xmlns:wpi="http://schemas.microsoft.com/office/word/2010/wordprocessingInk" xmlns:wne="http://schemas.microsoft.com/office/word/2006/wordml" xmlns:wps="http://schemas.microsoft.com/office/word/2010/wordprocessingShape" mc:Ignorable="w14 w15 w16se w16cid w16 w16cex w16sdtdh wp14">
   <w:endnote w:type="separator" w:id="-1">
     <w:p>
       <w:pPr>
@@ -4801,7 +4004,7 @@
 </file>
 
 <file path=word/footer1.xml><?xml version="1.0" encoding="utf-8"?>
-<w:ftr xmlns:wpc="http://schemas.microsoft.com/office/word/2010/wordprocessingCanvas" xmlns:cx="http://schemas.microsoft.com/office/drawing/2014/chartex" xmlns:cx1="http://schemas.microsoft.com/office/drawing/2015/9/8/chartex" xmlns:cx2="http://schemas.microsoft.com/office/drawing/2015/10/21/chartex" xmlns:cx3="http://schemas.microsoft.com/office/drawing/2016/5/9/chartex" xmlns:cx4="http://schemas.microsoft.com/office/drawing/2016/5/10/chartex" xmlns:cx5="http://schemas.microsoft.com/office/drawing/2016/5/11/chartex" xmlns:cx6="http://schemas.microsoft.com/office/drawing/2016/5/12/chartex" xmlns:cx7="http://schemas.microsoft.com/office/drawing/2016/5/13/chartex" xmlns:cx8="http://schemas.microsoft.com/office/drawing/2016/5/14/chartex" xmlns:mc="http://schemas.openxmlformats.org/markup-compatibility/2006" xmlns:aink="http://schemas.microsoft.com/office/drawing/2016/ink" xmlns:am3d="http://schemas.microsoft.com/office/drawing/2017/model3d" xmlns:o="urn:schemas-microsoft-com:office:office" xmlns:oel="http://schemas.microsoft.com/office/2019/extlst" xmlns:r="http://schemas.openxmlformats.org/officeDocument/2006/relationships" xmlns:m="http://schemas.openxmlformats.org/officeDocument/2006/math" xmlns:v="urn:schemas-microsoft-com:vml" xmlns:wp14="http://schemas.microsoft.com/office/word/2010/wordprocessingDrawing" xmlns:wp="http://schemas.openxmlformats.org/drawingml/2006/wordprocessingDrawing" xmlns:w10="urn:schemas-microsoft-com:office:word" xmlns:w="http://schemas.openxmlformats.org/wordprocessingml/2006/main" xmlns:w14="http://schemas.microsoft.com/office/word/2010/wordml" xmlns:w15="http://schemas.microsoft.com/office/word/2012/wordml" xmlns:w16cex="http://schemas.microsoft.com/office/word/2018/wordml/cex" xmlns:w16cid="http://schemas.microsoft.com/office/word/2016/wordml/cid" xmlns:w16="http://schemas.microsoft.com/office/word/2018/wordml" xmlns:w16du="http://schemas.microsoft.com/office/word/2023/wordml/word16du" xmlns:w16sdtdh="http://schemas.microsoft.com/office/word/2020/wordml/sdtdatahash" xmlns:w16se="http://schemas.microsoft.com/office/word/2015/wordml/symex" xmlns:wpg="http://schemas.microsoft.com/office/word/2010/wordprocessingGroup" xmlns:wpi="http://schemas.microsoft.com/office/word/2010/wordprocessingInk" xmlns:wne="http://schemas.microsoft.com/office/word/2006/wordml" xmlns:wps="http://schemas.microsoft.com/office/word/2010/wordprocessingShape" mc:Ignorable="w14 w15 w16se w16cid w16 w16cex w16sdtdh wp14">
+<w:ftr xmlns:wpc="http://schemas.microsoft.com/office/word/2010/wordprocessingCanvas" xmlns:cx="http://schemas.microsoft.com/office/drawing/2014/chartex" xmlns:cx1="http://schemas.microsoft.com/office/drawing/2015/9/8/chartex" xmlns:cx2="http://schemas.microsoft.com/office/drawing/2015/10/21/chartex" xmlns:cx3="http://schemas.microsoft.com/office/drawing/2016/5/9/chartex" xmlns:cx4="http://schemas.microsoft.com/office/drawing/2016/5/10/chartex" xmlns:cx5="http://schemas.microsoft.com/office/drawing/2016/5/11/chartex" xmlns:cx6="http://schemas.microsoft.com/office/drawing/2016/5/12/chartex" xmlns:cx7="http://schemas.microsoft.com/office/drawing/2016/5/13/chartex" xmlns:cx8="http://schemas.microsoft.com/office/drawing/2016/5/14/chartex" xmlns:mc="http://schemas.openxmlformats.org/markup-compatibility/2006" xmlns:aink="http://schemas.microsoft.com/office/drawing/2016/ink" xmlns:am3d="http://schemas.microsoft.com/office/drawing/2017/model3d" xmlns:o="urn:schemas-microsoft-com:office:office" xmlns:oel="http://schemas.microsoft.com/office/2019/extlst" xmlns:r="http://schemas.openxmlformats.org/officeDocument/2006/relationships" xmlns:m="http://schemas.openxmlformats.org/officeDocument/2006/math" xmlns:v="urn:schemas-microsoft-com:vml" xmlns:wp14="http://schemas.microsoft.com/office/word/2010/wordprocessingDrawing" xmlns:wp="http://schemas.openxmlformats.org/drawingml/2006/wordprocessingDrawing" xmlns:w10="urn:schemas-microsoft-com:office:word" xmlns:w="http://schemas.openxmlformats.org/wordprocessingml/2006/main" xmlns:w14="http://schemas.microsoft.com/office/word/2010/wordml" xmlns:w15="http://schemas.microsoft.com/office/word/2012/wordml" xmlns:w16cex="http://schemas.microsoft.com/office/word/2018/wordml/cex" xmlns:w16cid="http://schemas.microsoft.com/office/word/2016/wordml/cid" xmlns:w16="http://schemas.microsoft.com/office/word/2018/wordml" xmlns:w16sdtdh="http://schemas.microsoft.com/office/word/2020/wordml/sdtdatahash" xmlns:w16se="http://schemas.microsoft.com/office/word/2015/wordml/symex" xmlns:wpg="http://schemas.microsoft.com/office/word/2010/wordprocessingGroup" xmlns:wpi="http://schemas.microsoft.com/office/word/2010/wordprocessingInk" xmlns:wne="http://schemas.microsoft.com/office/word/2006/wordml" xmlns:wps="http://schemas.microsoft.com/office/word/2010/wordprocessingShape" mc:Ignorable="w14 w15 w16se w16cid w16 w16cex w16sdtdh wp14">
   <w:sdt>
     <w:sdtPr>
       <w:id w:val="2043244344"/>
@@ -4923,7 +4126,7 @@
 </file>
 
 <file path=word/footnotes.xml><?xml version="1.0" encoding="utf-8"?>
-<w:footnotes xmlns:wpc="http://schemas.microsoft.com/office/word/2010/wordprocessingCanvas" xmlns:cx="http://schemas.microsoft.com/office/drawing/2014/chartex" xmlns:cx1="http://schemas.microsoft.com/office/drawing/2015/9/8/chartex" xmlns:cx2="http://schemas.microsoft.com/office/drawing/2015/10/21/chartex" xmlns:cx3="http://schemas.microsoft.com/office/drawing/2016/5/9/chartex" xmlns:cx4="http://schemas.microsoft.com/office/drawing/2016/5/10/chartex" xmlns:cx5="http://schemas.microsoft.com/office/drawing/2016/5/11/chartex" xmlns:cx6="http://schemas.microsoft.com/office/drawing/2016/5/12/chartex" xmlns:cx7="http://schemas.microsoft.com/office/drawing/2016/5/13/chartex" xmlns:cx8="http://schemas.microsoft.com/office/drawing/2016/5/14/chartex" xmlns:mc="http://schemas.openxmlformats.org/markup-compatibility/2006" xmlns:aink="http://schemas.microsoft.com/office/drawing/2016/ink" xmlns:am3d="http://schemas.microsoft.com/office/drawing/2017/model3d" xmlns:o="urn:schemas-microsoft-com:office:office" xmlns:oel="http://schemas.microsoft.com/office/2019/extlst" xmlns:r="http://schemas.openxmlformats.org/officeDocument/2006/relationships" xmlns:m="http://schemas.openxmlformats.org/officeDocument/2006/math" xmlns:v="urn:schemas-microsoft-com:vml" xmlns:wp14="http://schemas.microsoft.com/office/word/2010/wordprocessingDrawing" xmlns:wp="http://schemas.openxmlformats.org/drawingml/2006/wordprocessingDrawing" xmlns:w10="urn:schemas-microsoft-com:office:word" xmlns:w="http://schemas.openxmlformats.org/wordprocessingml/2006/main" xmlns:w14="http://schemas.microsoft.com/office/word/2010/wordml" xmlns:w15="http://schemas.microsoft.com/office/word/2012/wordml" xmlns:w16cex="http://schemas.microsoft.com/office/word/2018/wordml/cex" xmlns:w16cid="http://schemas.microsoft.com/office/word/2016/wordml/cid" xmlns:w16="http://schemas.microsoft.com/office/word/2018/wordml" xmlns:w16du="http://schemas.microsoft.com/office/word/2023/wordml/word16du" xmlns:w16sdtdh="http://schemas.microsoft.com/office/word/2020/wordml/sdtdatahash" xmlns:w16se="http://schemas.microsoft.com/office/word/2015/wordml/symex" xmlns:wpg="http://schemas.microsoft.com/office/word/2010/wordprocessingGroup" xmlns:wpi="http://schemas.microsoft.com/office/word/2010/wordprocessingInk" xmlns:wne="http://schemas.microsoft.com/office/word/2006/wordml" xmlns:wps="http://schemas.microsoft.com/office/word/2010/wordprocessingShape" mc:Ignorable="w14 w15 w16se w16cid w16 w16cex w16sdtdh wp14">
+<w:footnotes xmlns:wpc="http://schemas.microsoft.com/office/word/2010/wordprocessingCanvas" xmlns:cx="http://schemas.microsoft.com/office/drawing/2014/chartex" xmlns:cx1="http://schemas.microsoft.com/office/drawing/2015/9/8/chartex" xmlns:cx2="http://schemas.microsoft.com/office/drawing/2015/10/21/chartex" xmlns:cx3="http://schemas.microsoft.com/office/drawing/2016/5/9/chartex" xmlns:cx4="http://schemas.microsoft.com/office/drawing/2016/5/10/chartex" xmlns:cx5="http://schemas.microsoft.com/office/drawing/2016/5/11/chartex" xmlns:cx6="http://schemas.microsoft.com/office/drawing/2016/5/12/chartex" xmlns:cx7="http://schemas.microsoft.com/office/drawing/2016/5/13/chartex" xmlns:cx8="http://schemas.microsoft.com/office/drawing/2016/5/14/chartex" xmlns:mc="http://schemas.openxmlformats.org/markup-compatibility/2006" xmlns:aink="http://schemas.microsoft.com/office/drawing/2016/ink" xmlns:am3d="http://schemas.microsoft.com/office/drawing/2017/model3d" xmlns:o="urn:schemas-microsoft-com:office:office" xmlns:oel="http://schemas.microsoft.com/office/2019/extlst" xmlns:r="http://schemas.openxmlformats.org/officeDocument/2006/relationships" xmlns:m="http://schemas.openxmlformats.org/officeDocument/2006/math" xmlns:v="urn:schemas-microsoft-com:vml" xmlns:wp14="http://schemas.microsoft.com/office/word/2010/wordprocessingDrawing" xmlns:wp="http://schemas.openxmlformats.org/drawingml/2006/wordprocessingDrawing" xmlns:w10="urn:schemas-microsoft-com:office:word" xmlns:w="http://schemas.openxmlformats.org/wordprocessingml/2006/main" xmlns:w14="http://schemas.microsoft.com/office/word/2010/wordml" xmlns:w15="http://schemas.microsoft.com/office/word/2012/wordml" xmlns:w16cex="http://schemas.microsoft.com/office/word/2018/wordml/cex" xmlns:w16cid="http://schemas.microsoft.com/office/word/2016/wordml/cid" xmlns:w16="http://schemas.microsoft.com/office/word/2018/wordml" xmlns:w16sdtdh="http://schemas.microsoft.com/office/word/2020/wordml/sdtdatahash" xmlns:w16se="http://schemas.microsoft.com/office/word/2015/wordml/symex" xmlns:wpg="http://schemas.microsoft.com/office/word/2010/wordprocessingGroup" xmlns:wpi="http://schemas.microsoft.com/office/word/2010/wordprocessingInk" xmlns:wne="http://schemas.microsoft.com/office/word/2006/wordml" xmlns:wps="http://schemas.microsoft.com/office/word/2010/wordprocessingShape" mc:Ignorable="w14 w15 w16se w16cid w16 w16cex w16sdtdh wp14">
   <w:footnote w:type="separator" w:id="-1">
     <w:p>
       <w:pPr>
@@ -4948,7 +4151,7 @@
 </file>
 
 <file path=word/numbering.xml><?xml version="1.0" encoding="utf-8"?>
-<w:numbering xmlns:wpc="http://schemas.microsoft.com/office/word/2010/wordprocessingCanvas" xmlns:cx="http://schemas.microsoft.com/office/drawing/2014/chartex" xmlns:cx1="http://schemas.microsoft.com/office/drawing/2015/9/8/chartex" xmlns:cx2="http://schemas.microsoft.com/office/drawing/2015/10/21/chartex" xmlns:cx3="http://schemas.microsoft.com/office/drawing/2016/5/9/chartex" xmlns:cx4="http://schemas.microsoft.com/office/drawing/2016/5/10/chartex" xmlns:cx5="http://schemas.microsoft.com/office/drawing/2016/5/11/chartex" xmlns:cx6="http://schemas.microsoft.com/office/drawing/2016/5/12/chartex" xmlns:cx7="http://schemas.microsoft.com/office/drawing/2016/5/13/chartex" xmlns:cx8="http://schemas.microsoft.com/office/drawing/2016/5/14/chartex" xmlns:mc="http://schemas.openxmlformats.org/markup-compatibility/2006" xmlns:aink="http://schemas.microsoft.com/office/drawing/2016/ink" xmlns:am3d="http://schemas.microsoft.com/office/drawing/2017/model3d" xmlns:o="urn:schemas-microsoft-com:office:office" xmlns:oel="http://schemas.microsoft.com/office/2019/extlst" xmlns:r="http://schemas.openxmlformats.org/officeDocument/2006/relationships" xmlns:m="http://schemas.openxmlformats.org/officeDocument/2006/math" xmlns:v="urn:schemas-microsoft-com:vml" xmlns:wp14="http://schemas.microsoft.com/office/word/2010/wordprocessingDrawing" xmlns:wp="http://schemas.openxmlformats.org/drawingml/2006/wordprocessingDrawing" xmlns:w10="urn:schemas-microsoft-com:office:word" xmlns:w="http://schemas.openxmlformats.org/wordprocessingml/2006/main" xmlns:w14="http://schemas.microsoft.com/office/word/2010/wordml" xmlns:w15="http://schemas.microsoft.com/office/word/2012/wordml" xmlns:w16cex="http://schemas.microsoft.com/office/word/2018/wordml/cex" xmlns:w16cid="http://schemas.microsoft.com/office/word/2016/wordml/cid" xmlns:w16="http://schemas.microsoft.com/office/word/2018/wordml" xmlns:w16du="http://schemas.microsoft.com/office/word/2023/wordml/word16du" xmlns:w16sdtdh="http://schemas.microsoft.com/office/word/2020/wordml/sdtdatahash" xmlns:w16se="http://schemas.microsoft.com/office/word/2015/wordml/symex" xmlns:wpg="http://schemas.microsoft.com/office/word/2010/wordprocessingGroup" xmlns:wpi="http://schemas.microsoft.com/office/word/2010/wordprocessingInk" xmlns:wne="http://schemas.microsoft.com/office/word/2006/wordml" xmlns:wps="http://schemas.microsoft.com/office/word/2010/wordprocessingShape" mc:Ignorable="w14 w15 w16se w16cid w16 w16cex w16sdtdh wp14">
+<w:numbering xmlns:wpc="http://schemas.microsoft.com/office/word/2010/wordprocessingCanvas" xmlns:cx="http://schemas.microsoft.com/office/drawing/2014/chartex" xmlns:cx1="http://schemas.microsoft.com/office/drawing/2015/9/8/chartex" xmlns:cx2="http://schemas.microsoft.com/office/drawing/2015/10/21/chartex" xmlns:cx3="http://schemas.microsoft.com/office/drawing/2016/5/9/chartex" xmlns:cx4="http://schemas.microsoft.com/office/drawing/2016/5/10/chartex" xmlns:cx5="http://schemas.microsoft.com/office/drawing/2016/5/11/chartex" xmlns:cx6="http://schemas.microsoft.com/office/drawing/2016/5/12/chartex" xmlns:cx7="http://schemas.microsoft.com/office/drawing/2016/5/13/chartex" xmlns:cx8="http://schemas.microsoft.com/office/drawing/2016/5/14/chartex" xmlns:mc="http://schemas.openxmlformats.org/markup-compatibility/2006" xmlns:aink="http://schemas.microsoft.com/office/drawing/2016/ink" xmlns:am3d="http://schemas.microsoft.com/office/drawing/2017/model3d" xmlns:o="urn:schemas-microsoft-com:office:office" xmlns:oel="http://schemas.microsoft.com/office/2019/extlst" xmlns:r="http://schemas.openxmlformats.org/officeDocument/2006/relationships" xmlns:m="http://schemas.openxmlformats.org/officeDocument/2006/math" xmlns:v="urn:schemas-microsoft-com:vml" xmlns:wp14="http://schemas.microsoft.com/office/word/2010/wordprocessingDrawing" xmlns:wp="http://schemas.openxmlformats.org/drawingml/2006/wordprocessingDrawing" xmlns:w10="urn:schemas-microsoft-com:office:word" xmlns:w="http://schemas.openxmlformats.org/wordprocessingml/2006/main" xmlns:w14="http://schemas.microsoft.com/office/word/2010/wordml" xmlns:w15="http://schemas.microsoft.com/office/word/2012/wordml" xmlns:w16cex="http://schemas.microsoft.com/office/word/2018/wordml/cex" xmlns:w16cid="http://schemas.microsoft.com/office/word/2016/wordml/cid" xmlns:w16="http://schemas.microsoft.com/office/word/2018/wordml" xmlns:w16sdtdh="http://schemas.microsoft.com/office/word/2020/wordml/sdtdatahash" xmlns:w16se="http://schemas.microsoft.com/office/word/2015/wordml/symex" xmlns:wpg="http://schemas.microsoft.com/office/word/2010/wordprocessingGroup" xmlns:wpi="http://schemas.microsoft.com/office/word/2010/wordprocessingInk" xmlns:wne="http://schemas.microsoft.com/office/word/2006/wordml" xmlns:wps="http://schemas.microsoft.com/office/word/2010/wordprocessingShape" mc:Ignorable="w14 w15 w16se w16cid w16 w16cex w16sdtdh wp14">
   <w:abstractNum w:abstractNumId="0" w15:restartNumberingAfterBreak="0">
     <w:nsid w:val="087C3772"/>
     <w:multiLevelType w:val="hybridMultilevel"/>

</xml_diff>

<commit_message>
Add a new certificate
</commit_message>
<xml_diff>
--- a/docs/Omid Reza Heidari-CV.docx
+++ b/docs/Omid Reza Heidari-CV.docx
@@ -3026,6 +3026,19 @@
         <w:spacing w:line="276" w:lineRule="auto"/>
         <w:rPr>
           <w:rFonts w:asciiTheme="minorBidi" w:hAnsiTheme="minorBidi"/>
+          <w:sz w:val="2"/>
+          <w:szCs w:val="2"/>
+        </w:rPr>
+      </w:pPr>
+    </w:p>
+    <w:p>
+      <w:pPr>
+        <w:tabs>
+          <w:tab w:val="left" w:pos="5280"/>
+        </w:tabs>
+        <w:spacing w:line="276" w:lineRule="auto"/>
+        <w:rPr>
+          <w:rFonts w:asciiTheme="minorBidi" w:hAnsiTheme="minorBidi"/>
           <w:sz w:val="20"/>
           <w:szCs w:val="20"/>
           <w:lang w:bidi="fa-IR"/>
@@ -3072,7 +3085,23 @@
           <w:sz w:val="20"/>
           <w:szCs w:val="20"/>
         </w:rPr>
-        <w:t>May 202</w:t>
+        <w:t>Jun</w:t>
+      </w:r>
+      <w:r>
+        <w:rPr>
+          <w:rFonts w:asciiTheme="minorBidi" w:hAnsiTheme="minorBidi"/>
+          <w:sz w:val="20"/>
+          <w:szCs w:val="20"/>
+        </w:rPr>
+        <w:t>e</w:t>
+      </w:r>
+      <w:r>
+        <w:rPr>
+          <w:rFonts w:asciiTheme="minorBidi" w:hAnsiTheme="minorBidi"/>
+          <w:sz w:val="20"/>
+          <w:szCs w:val="20"/>
+        </w:rPr>
+        <w:t xml:space="preserve"> 202</w:t>
       </w:r>
       <w:r>
         <w:rPr>
@@ -3100,7 +3129,7 @@
             <w:szCs w:val="20"/>
             <w:u w:val="none"/>
           </w:rPr>
-          <w:t>Calculus for Machine Learning and Data Science</w:t>
+          <w:t>Mathematics for Machine Learning and Data Science</w:t>
         </w:r>
       </w:hyperlink>
     </w:p>
@@ -3117,14 +3146,6 @@
         </w:rPr>
         <w:t>Coursera, DeepLearning.AI</w:t>
       </w:r>
-      <w:r>
-        <w:rPr>
-          <w:rFonts w:asciiTheme="minorBidi" w:hAnsiTheme="minorBidi"/>
-          <w:sz w:val="20"/>
-          <w:szCs w:val="20"/>
-        </w:rPr>
-        <w:t>, Grade: 94.22/100</w:t>
-      </w:r>
     </w:p>
     <w:p>
       <w:pPr>
@@ -3144,23 +3165,7 @@
           <w:sz w:val="20"/>
           <w:szCs w:val="20"/>
         </w:rPr>
-        <w:t>Feb</w:t>
-      </w:r>
-      <w:r>
-        <w:rPr>
-          <w:rFonts w:asciiTheme="minorBidi" w:hAnsiTheme="minorBidi"/>
-          <w:sz w:val="20"/>
-          <w:szCs w:val="20"/>
-        </w:rPr>
-        <w:t xml:space="preserve"> 202</w:t>
-      </w:r>
-      <w:r>
-        <w:rPr>
-          <w:rFonts w:asciiTheme="minorBidi" w:hAnsiTheme="minorBidi"/>
-          <w:sz w:val="20"/>
-          <w:szCs w:val="20"/>
-        </w:rPr>
-        <w:t>3</w:t>
+        <w:t>May 2022</w:t>
       </w:r>
       <w:r>
         <w:rPr>
@@ -3171,75 +3176,6 @@
         <w:tab/>
       </w:r>
       <w:hyperlink r:id="rId21" w:history="1">
-        <w:r>
-          <w:rPr>
-            <w:rStyle w:val="Hyperlink"/>
-            <w:rFonts w:asciiTheme="minorBidi" w:hAnsiTheme="minorBidi"/>
-            <w:color w:val="1F3864" w:themeColor="accent1" w:themeShade="80"/>
-            <w:sz w:val="20"/>
-            <w:szCs w:val="20"/>
-            <w:u w:val="none"/>
-          </w:rPr>
-          <w:t>Linear Algebra for Machine Learning and Data Science</w:t>
-        </w:r>
-      </w:hyperlink>
-    </w:p>
-    <w:p>
-      <w:pPr>
-        <w:spacing w:line="240" w:lineRule="auto"/>
-        <w:ind w:left="720" w:firstLine="720"/>
-        <w:rPr>
-          <w:rFonts w:asciiTheme="minorBidi" w:hAnsiTheme="minorBidi"/>
-          <w:sz w:val="20"/>
-          <w:szCs w:val="20"/>
-        </w:rPr>
-      </w:pPr>
-      <w:r>
-        <w:rPr>
-          <w:rFonts w:asciiTheme="minorBidi" w:hAnsiTheme="minorBidi"/>
-          <w:sz w:val="20"/>
-          <w:szCs w:val="20"/>
-        </w:rPr>
-        <w:t>Coursera, DeepLearning.AI</w:t>
-      </w:r>
-      <w:r>
-        <w:rPr>
-          <w:rFonts w:asciiTheme="minorBidi" w:hAnsiTheme="minorBidi"/>
-          <w:sz w:val="20"/>
-          <w:szCs w:val="20"/>
-        </w:rPr>
-        <w:t>, Grade: 99.37/100</w:t>
-      </w:r>
-    </w:p>
-    <w:p>
-      <w:pPr>
-        <w:spacing w:line="240" w:lineRule="auto"/>
-        <w:rPr>
-          <w:rStyle w:val="Hyperlink"/>
-          <w:rFonts w:asciiTheme="minorBidi" w:hAnsiTheme="minorBidi"/>
-          <w:color w:val="1F3864" w:themeColor="accent1" w:themeShade="80"/>
-          <w:sz w:val="20"/>
-          <w:szCs w:val="20"/>
-          <w:u w:val="none"/>
-        </w:rPr>
-      </w:pPr>
-      <w:r>
-        <w:rPr>
-          <w:rFonts w:asciiTheme="minorBidi" w:hAnsiTheme="minorBidi"/>
-          <w:sz w:val="20"/>
-          <w:szCs w:val="20"/>
-        </w:rPr>
-        <w:t>May 2022</w:t>
-      </w:r>
-      <w:r>
-        <w:rPr>
-          <w:rFonts w:asciiTheme="minorBidi" w:hAnsiTheme="minorBidi"/>
-          <w:sz w:val="20"/>
-          <w:szCs w:val="20"/>
-        </w:rPr>
-        <w:tab/>
-      </w:r>
-      <w:hyperlink r:id="rId22" w:history="1">
         <w:r>
           <w:rPr>
             <w:rStyle w:val="Hyperlink"/>
@@ -3300,7 +3236,7 @@
         </w:rPr>
         <w:tab/>
       </w:r>
-      <w:hyperlink r:id="rId23" w:history="1">
+      <w:hyperlink r:id="rId22" w:history="1">
         <w:r>
           <w:rPr>
             <w:rStyle w:val="Hyperlink"/>
@@ -3386,7 +3322,7 @@
         </w:rPr>
         <w:tab/>
       </w:r>
-      <w:hyperlink r:id="rId24" w:history="1">
+      <w:hyperlink r:id="rId23" w:history="1">
         <w:r>
           <w:rPr>
             <w:rStyle w:val="Hyperlink"/>
@@ -3635,7 +3571,6 @@
           <w:szCs w:val="20"/>
           <w:lang w:bidi="fa-IR"/>
         </w:rPr>
-        <w:lastRenderedPageBreak/>
         <w:t xml:space="preserve">Frameworks: </w:t>
       </w:r>
       <w:r>
@@ -3962,7 +3897,7 @@
       </w:r>
     </w:p>
     <w:sectPr>
-      <w:footerReference w:type="default" r:id="rId25"/>
+      <w:footerReference w:type="default" r:id="rId24"/>
       <w:pgSz w:w="12240" w:h="15840"/>
       <w:pgMar w:top="1440" w:right="1440" w:bottom="1440" w:left="1440" w:header="720" w:footer="720" w:gutter="0"/>
       <w:pgBorders w:offsetFrom="page">

</xml_diff>

<commit_message>
Update CV and add new education section
</commit_message>
<xml_diff>
--- a/docs/Omid Reza Heidari-CV.docx
+++ b/docs/Omid Reza Heidari-CV.docx
@@ -30,7 +30,7 @@
     <w:tbl>
       <w:tblPr>
         <w:tblStyle w:val="TableGrid"/>
-        <w:tblW w:w="8762" w:type="dxa"/>
+        <w:tblW w:w="9132" w:type="dxa"/>
         <w:jc w:val="center"/>
         <w:tblBorders>
           <w:top w:val="none" w:sz="0" w:space="0" w:color="auto"/>
@@ -43,12 +43,12 @@
         <w:tblLook w:val="04A0" w:firstRow="1" w:lastRow="0" w:firstColumn="1" w:lastColumn="0" w:noHBand="0" w:noVBand="1"/>
       </w:tblPr>
       <w:tblGrid>
-        <w:gridCol w:w="1080"/>
-        <w:gridCol w:w="1296"/>
+        <w:gridCol w:w="1165"/>
+        <w:gridCol w:w="1676"/>
         <w:gridCol w:w="1080"/>
         <w:gridCol w:w="2109"/>
         <w:gridCol w:w="1080"/>
-        <w:gridCol w:w="2117"/>
+        <w:gridCol w:w="2022"/>
       </w:tblGrid>
       <w:tr>
         <w:trPr>
@@ -56,7 +56,7 @@
         </w:trPr>
         <w:tc>
           <w:tcPr>
-            <w:tcW w:w="1080" w:type="dxa"/>
+            <w:tcW w:w="1165" w:type="dxa"/>
             <w:vAlign w:val="center"/>
           </w:tcPr>
           <w:p>
@@ -121,7 +121,7 @@
         </w:tc>
         <w:tc>
           <w:tcPr>
-            <w:tcW w:w="1296" w:type="dxa"/>
+            <w:tcW w:w="1676" w:type="dxa"/>
             <w:vAlign w:val="center"/>
           </w:tcPr>
           <w:p>
@@ -136,10 +136,34 @@
             <w:r>
               <w:rPr>
                 <w:rFonts w:asciiTheme="minorBidi" w:hAnsiTheme="minorBidi"/>
-                <w:sz w:val="20"/>
-                <w:szCs w:val="20"/>
+                <w:sz w:val="18"/>
+                <w:szCs w:val="18"/>
               </w:rPr>
-              <w:t>Zanjan, Iran</w:t>
+              <w:t>Montréal</w:t>
+            </w:r>
+            <w:r>
+              <w:rPr>
+                <w:rFonts w:asciiTheme="minorBidi" w:hAnsiTheme="minorBidi"/>
+                <w:sz w:val="18"/>
+                <w:szCs w:val="18"/>
+              </w:rPr>
+              <w:t>,</w:t>
+            </w:r>
+            <w:r>
+              <w:rPr>
+                <w:rFonts w:asciiTheme="minorBidi" w:hAnsiTheme="minorBidi"/>
+                <w:sz w:val="18"/>
+                <w:szCs w:val="18"/>
+              </w:rPr>
+              <w:t xml:space="preserve"> </w:t>
+            </w:r>
+            <w:r>
+              <w:rPr>
+                <w:rFonts w:asciiTheme="minorBidi" w:hAnsiTheme="minorBidi"/>
+                <w:sz w:val="18"/>
+                <w:szCs w:val="18"/>
+              </w:rPr>
+              <w:t>Canada</w:t>
             </w:r>
           </w:p>
         </w:tc>
@@ -304,7 +328,7 @@
         </w:tc>
         <w:tc>
           <w:tcPr>
-            <w:tcW w:w="2117" w:type="dxa"/>
+            <w:tcW w:w="2022" w:type="dxa"/>
             <w:vAlign w:val="center"/>
           </w:tcPr>
           <w:p>
@@ -370,6 +394,154 @@
     </w:p>
     <w:p>
       <w:pPr>
+        <w:spacing w:line="240" w:lineRule="auto"/>
+        <w:rPr>
+          <w:rFonts w:asciiTheme="minorBidi" w:hAnsiTheme="minorBidi"/>
+          <w:b/>
+          <w:bCs/>
+          <w:sz w:val="20"/>
+          <w:szCs w:val="20"/>
+        </w:rPr>
+      </w:pPr>
+      <w:bookmarkStart w:id="0" w:name="_Hlk92315511"/>
+      <w:r>
+        <w:rPr>
+          <w:rFonts w:asciiTheme="minorBidi" w:hAnsiTheme="minorBidi"/>
+          <w:sz w:val="20"/>
+          <w:szCs w:val="20"/>
+        </w:rPr>
+        <w:t>20</w:t>
+      </w:r>
+      <w:r>
+        <w:rPr>
+          <w:rFonts w:asciiTheme="minorBidi" w:hAnsiTheme="minorBidi"/>
+          <w:sz w:val="20"/>
+          <w:szCs w:val="20"/>
+        </w:rPr>
+        <w:t>23</w:t>
+      </w:r>
+      <w:r>
+        <w:rPr>
+          <w:rFonts w:asciiTheme="minorBidi" w:hAnsiTheme="minorBidi"/>
+          <w:sz w:val="20"/>
+          <w:szCs w:val="20"/>
+        </w:rPr>
+        <w:t xml:space="preserve"> -</w:t>
+      </w:r>
+      <w:r>
+        <w:rPr>
+          <w:rFonts w:asciiTheme="minorBidi" w:hAnsiTheme="minorBidi"/>
+          <w:sz w:val="20"/>
+          <w:szCs w:val="20"/>
+        </w:rPr>
+        <w:t xml:space="preserve"> Present</w:t>
+      </w:r>
+      <w:r>
+        <w:rPr>
+          <w:rFonts w:asciiTheme="minorBidi" w:hAnsiTheme="minorBidi"/>
+          <w:sz w:val="20"/>
+          <w:szCs w:val="20"/>
+        </w:rPr>
+        <w:tab/>
+      </w:r>
+      <w:r>
+        <w:rPr>
+          <w:rFonts w:asciiTheme="minorBidi" w:hAnsiTheme="minorBidi"/>
+          <w:b/>
+          <w:bCs/>
+          <w:sz w:val="20"/>
+          <w:szCs w:val="20"/>
+        </w:rPr>
+        <w:t>Master of Computer Science</w:t>
+      </w:r>
+      <w:r>
+        <w:rPr>
+          <w:rFonts w:asciiTheme="minorBidi" w:hAnsiTheme="minorBidi"/>
+          <w:b/>
+          <w:bCs/>
+          <w:sz w:val="20"/>
+          <w:szCs w:val="20"/>
+        </w:rPr>
+        <w:t xml:space="preserve"> </w:t>
+      </w:r>
+    </w:p>
+    <w:p>
+      <w:pPr>
+        <w:spacing w:line="240" w:lineRule="auto"/>
+        <w:ind w:left="720" w:firstLine="720"/>
+        <w:rPr>
+          <w:rFonts w:asciiTheme="minorBidi" w:hAnsiTheme="minorBidi"/>
+          <w:sz w:val="20"/>
+          <w:szCs w:val="20"/>
+        </w:rPr>
+      </w:pPr>
+      <w:r>
+        <w:rPr>
+          <w:rFonts w:asciiTheme="minorBidi" w:hAnsiTheme="minorBidi"/>
+          <w:sz w:val="20"/>
+          <w:szCs w:val="20"/>
+        </w:rPr>
+        <w:t>Concordia University</w:t>
+      </w:r>
+      <w:r>
+        <w:rPr>
+          <w:rFonts w:asciiTheme="minorBidi" w:hAnsiTheme="minorBidi"/>
+          <w:sz w:val="20"/>
+          <w:szCs w:val="20"/>
+        </w:rPr>
+        <w:t xml:space="preserve">, </w:t>
+      </w:r>
+      <w:r>
+        <w:rPr>
+          <w:rFonts w:asciiTheme="minorBidi" w:hAnsiTheme="minorBidi"/>
+          <w:sz w:val="20"/>
+          <w:szCs w:val="20"/>
+        </w:rPr>
+        <w:t>Montréal</w:t>
+      </w:r>
+      <w:r>
+        <w:rPr>
+          <w:rFonts w:asciiTheme="minorBidi" w:hAnsiTheme="minorBidi"/>
+          <w:sz w:val="20"/>
+          <w:szCs w:val="20"/>
+        </w:rPr>
+        <w:t xml:space="preserve">, </w:t>
+      </w:r>
+      <w:r>
+        <w:rPr>
+          <w:rFonts w:asciiTheme="minorBidi" w:hAnsiTheme="minorBidi"/>
+          <w:sz w:val="20"/>
+          <w:szCs w:val="20"/>
+        </w:rPr>
+        <w:t>Québec</w:t>
+      </w:r>
+      <w:r>
+        <w:rPr>
+          <w:rFonts w:asciiTheme="minorBidi" w:hAnsiTheme="minorBidi"/>
+          <w:sz w:val="20"/>
+          <w:szCs w:val="20"/>
+        </w:rPr>
+        <w:t>,</w:t>
+      </w:r>
+      <w:r>
+        <w:rPr>
+          <w:rFonts w:asciiTheme="minorBidi" w:hAnsiTheme="minorBidi"/>
+          <w:sz w:val="20"/>
+          <w:szCs w:val="20"/>
+        </w:rPr>
+        <w:t xml:space="preserve"> </w:t>
+      </w:r>
+      <w:r>
+        <w:rPr>
+          <w:rFonts w:asciiTheme="minorBidi" w:hAnsiTheme="minorBidi"/>
+          <w:sz w:val="20"/>
+          <w:szCs w:val="20"/>
+        </w:rPr>
+        <w:t>Canada</w:t>
+      </w:r>
+    </w:p>
+    <w:p>
+      <w:pPr>
         <w:spacing w:line="276" w:lineRule="auto"/>
         <w:rPr>
           <w:rFonts w:asciiTheme="minorBidi" w:hAnsiTheme="minorBidi"/>
@@ -379,7 +551,6 @@
           <w:szCs w:val="20"/>
         </w:rPr>
       </w:pPr>
-      <w:bookmarkStart w:id="0" w:name="_Hlk92315511"/>
       <w:r>
         <w:rPr>
           <w:rFonts w:asciiTheme="minorBidi" w:hAnsiTheme="minorBidi"/>
@@ -468,22 +639,6 @@
           <w:sz w:val="20"/>
           <w:szCs w:val="20"/>
         </w:rPr>
-        <w:t>Computer Engineering Department</w:t>
-      </w:r>
-      <w:r>
-        <w:rPr>
-          <w:rFonts w:asciiTheme="minorBidi" w:hAnsiTheme="minorBidi"/>
-          <w:sz w:val="20"/>
-          <w:szCs w:val="20"/>
-        </w:rPr>
-        <w:t xml:space="preserve">, </w:t>
-      </w:r>
-      <w:r>
-        <w:rPr>
-          <w:rFonts w:asciiTheme="minorBidi" w:hAnsiTheme="minorBidi"/>
-          <w:sz w:val="20"/>
-          <w:szCs w:val="20"/>
-        </w:rPr>
         <w:t xml:space="preserve">Islamic </w:t>
       </w:r>
       <w:r>
@@ -500,7 +655,39 @@
           <w:sz w:val="20"/>
           <w:szCs w:val="20"/>
         </w:rPr>
-        <w:t>, Zanjan, Iran</w:t>
+        <w:t>, Zanjan,</w:t>
+      </w:r>
+      <w:r>
+        <w:rPr>
+          <w:rFonts w:asciiTheme="minorBidi" w:hAnsiTheme="minorBidi"/>
+          <w:sz w:val="20"/>
+          <w:szCs w:val="20"/>
+        </w:rPr>
+        <w:t xml:space="preserve"> </w:t>
+      </w:r>
+      <w:r>
+        <w:rPr>
+          <w:rFonts w:asciiTheme="minorBidi" w:hAnsiTheme="minorBidi"/>
+          <w:sz w:val="20"/>
+          <w:szCs w:val="20"/>
+        </w:rPr>
+        <w:t>Zanjan</w:t>
+      </w:r>
+      <w:r>
+        <w:rPr>
+          <w:rFonts w:asciiTheme="minorBidi" w:hAnsiTheme="minorBidi"/>
+          <w:sz w:val="20"/>
+          <w:szCs w:val="20"/>
+        </w:rPr>
+        <w:t>,</w:t>
+      </w:r>
+      <w:r>
+        <w:rPr>
+          <w:rFonts w:asciiTheme="minorBidi" w:hAnsiTheme="minorBidi"/>
+          <w:sz w:val="20"/>
+          <w:szCs w:val="20"/>
+        </w:rPr>
+        <w:t xml:space="preserve"> Iran</w:t>
       </w:r>
     </w:p>
     <w:p>
@@ -546,23 +733,49 @@
           <w:rFonts w:asciiTheme="minorBidi" w:hAnsiTheme="minorBidi"/>
           <w:sz w:val="20"/>
           <w:szCs w:val="20"/>
-        </w:rPr>
-      </w:pPr>
-      <w:r>
-        <w:rPr>
-          <w:rFonts w:asciiTheme="minorBidi" w:hAnsiTheme="minorBidi"/>
-          <w:sz w:val="20"/>
-          <w:szCs w:val="20"/>
-        </w:rPr>
-        <w:t xml:space="preserve">Last Two Years GPA: </w:t>
-      </w:r>
-      <w:r>
-        <w:rPr>
-          <w:rFonts w:asciiTheme="minorBidi" w:hAnsiTheme="minorBidi"/>
-          <w:sz w:val="20"/>
-          <w:szCs w:val="20"/>
-        </w:rPr>
-        <w:t>16.90</w:t>
+          <w:rtl/>
+          <w:lang w:bidi="fa-IR"/>
+        </w:rPr>
+      </w:pPr>
+      <w:r>
+        <w:rPr>
+          <w:rFonts w:asciiTheme="minorBidi" w:hAnsiTheme="minorBidi"/>
+          <w:sz w:val="20"/>
+          <w:szCs w:val="20"/>
+        </w:rPr>
+        <w:t xml:space="preserve">Total </w:t>
+      </w:r>
+      <w:r>
+        <w:rPr>
+          <w:rFonts w:asciiTheme="minorBidi" w:hAnsiTheme="minorBidi"/>
+          <w:sz w:val="20"/>
+          <w:szCs w:val="20"/>
+        </w:rPr>
+        <w:t>GPA:</w:t>
+      </w:r>
+      <w:r>
+        <w:rPr>
+          <w:rFonts w:asciiTheme="minorBidi" w:hAnsiTheme="minorBidi"/>
+          <w:sz w:val="20"/>
+          <w:szCs w:val="20"/>
+        </w:rPr>
+        <w:t xml:space="preserve"> 16.</w:t>
+      </w:r>
+      <w:r>
+        <w:rPr>
+          <w:rFonts w:asciiTheme="minorBidi" w:hAnsiTheme="minorBidi"/>
+          <w:sz w:val="20"/>
+          <w:szCs w:val="20"/>
+        </w:rPr>
+        <w:t>7</w:t>
+      </w:r>
+      <w:r>
+        <w:rPr>
+          <w:rFonts w:asciiTheme="minorBidi" w:hAnsiTheme="minorBidi"/>
+          <w:sz w:val="20"/>
+          <w:szCs w:val="20"/>
+        </w:rPr>
+        <w:t>4</w:t>
       </w:r>
       <w:r>
         <w:rPr>
@@ -578,15 +791,23 @@
           <w:sz w:val="20"/>
           <w:szCs w:val="20"/>
         </w:rPr>
-        <w:t>=3.</w:t>
-      </w:r>
-      <w:r>
-        <w:rPr>
-          <w:rFonts w:asciiTheme="minorBidi" w:hAnsiTheme="minorBidi"/>
-          <w:sz w:val="20"/>
-          <w:szCs w:val="20"/>
-        </w:rPr>
-        <w:t>53</w:t>
+        <w:t>=</w:t>
+      </w:r>
+      <w:r>
+        <w:rPr>
+          <w:rFonts w:asciiTheme="minorBidi" w:hAnsiTheme="minorBidi"/>
+          <w:sz w:val="20"/>
+          <w:szCs w:val="20"/>
+        </w:rPr>
+        <w:t>3.</w:t>
+      </w:r>
+      <w:r>
+        <w:rPr>
+          <w:rFonts w:asciiTheme="minorBidi" w:hAnsiTheme="minorBidi"/>
+          <w:sz w:val="20"/>
+          <w:szCs w:val="20"/>
+        </w:rPr>
+        <w:t>47</w:t>
       </w:r>
       <w:r>
         <w:rPr>
@@ -595,6 +816,76 @@
           <w:szCs w:val="20"/>
         </w:rPr>
         <w:t>/4</w:t>
+      </w:r>
+    </w:p>
+    <w:p>
+      <w:pPr>
+        <w:spacing w:line="240" w:lineRule="auto"/>
+        <w:rPr>
+          <w:rFonts w:asciiTheme="minorBidi" w:hAnsiTheme="minorBidi"/>
+          <w:b/>
+          <w:bCs/>
+          <w:sz w:val="20"/>
+          <w:szCs w:val="20"/>
+        </w:rPr>
+      </w:pPr>
+      <w:r>
+        <w:rPr>
+          <w:rFonts w:asciiTheme="minorBidi" w:hAnsiTheme="minorBidi"/>
+          <w:sz w:val="20"/>
+          <w:szCs w:val="20"/>
+        </w:rPr>
+        <w:t>2017</w:t>
+      </w:r>
+      <w:r>
+        <w:rPr>
+          <w:rFonts w:asciiTheme="minorBidi" w:hAnsiTheme="minorBidi"/>
+          <w:sz w:val="20"/>
+          <w:szCs w:val="20"/>
+        </w:rPr>
+        <w:t xml:space="preserve"> </w:t>
+      </w:r>
+      <w:r>
+        <w:rPr>
+          <w:rFonts w:asciiTheme="minorBidi" w:hAnsiTheme="minorBidi"/>
+          <w:sz w:val="20"/>
+          <w:szCs w:val="20"/>
+        </w:rPr>
+        <w:t>-</w:t>
+      </w:r>
+      <w:r>
+        <w:rPr>
+          <w:rFonts w:asciiTheme="minorBidi" w:hAnsiTheme="minorBidi"/>
+          <w:sz w:val="20"/>
+          <w:szCs w:val="20"/>
+        </w:rPr>
+        <w:t xml:space="preserve"> </w:t>
+      </w:r>
+      <w:r>
+        <w:rPr>
+          <w:rFonts w:asciiTheme="minorBidi" w:hAnsiTheme="minorBidi"/>
+          <w:sz w:val="20"/>
+          <w:szCs w:val="20"/>
+        </w:rPr>
+        <w:t>2019</w:t>
+      </w:r>
+      <w:r>
+        <w:rPr>
+          <w:rFonts w:asciiTheme="minorBidi" w:hAnsiTheme="minorBidi"/>
+          <w:sz w:val="20"/>
+          <w:szCs w:val="20"/>
+        </w:rPr>
+        <w:tab/>
+      </w:r>
+      <w:r>
+        <w:rPr>
+          <w:rFonts w:asciiTheme="minorBidi" w:hAnsiTheme="minorBidi"/>
+          <w:b/>
+          <w:bCs/>
+          <w:sz w:val="20"/>
+          <w:szCs w:val="20"/>
+        </w:rPr>
+        <w:t>Bachelor of Computer Engineering</w:t>
       </w:r>
     </w:p>
     <w:p>
@@ -605,109 +896,31 @@
           <w:rFonts w:asciiTheme="minorBidi" w:hAnsiTheme="minorBidi"/>
           <w:sz w:val="20"/>
           <w:szCs w:val="20"/>
-          <w:rtl/>
-          <w:lang w:bidi="fa-IR"/>
-        </w:rPr>
-      </w:pPr>
-      <w:r>
-        <w:rPr>
-          <w:rFonts w:asciiTheme="minorBidi" w:hAnsiTheme="minorBidi"/>
-          <w:sz w:val="20"/>
-          <w:szCs w:val="20"/>
-        </w:rPr>
-        <w:t xml:space="preserve">Total </w:t>
-      </w:r>
-      <w:r>
-        <w:rPr>
-          <w:rFonts w:asciiTheme="minorBidi" w:hAnsiTheme="minorBidi"/>
-          <w:sz w:val="20"/>
-          <w:szCs w:val="20"/>
-        </w:rPr>
-        <w:t>GPA:</w:t>
-      </w:r>
-      <w:r>
-        <w:rPr>
-          <w:rFonts w:asciiTheme="minorBidi" w:hAnsiTheme="minorBidi"/>
-          <w:sz w:val="20"/>
-          <w:szCs w:val="20"/>
-        </w:rPr>
-        <w:t xml:space="preserve"> 16.</w:t>
-      </w:r>
-      <w:r>
-        <w:rPr>
-          <w:rFonts w:asciiTheme="minorBidi" w:hAnsiTheme="minorBidi"/>
-          <w:sz w:val="20"/>
-          <w:szCs w:val="20"/>
-        </w:rPr>
-        <w:t>7</w:t>
-      </w:r>
-      <w:r>
-        <w:rPr>
-          <w:rFonts w:asciiTheme="minorBidi" w:hAnsiTheme="minorBidi"/>
-          <w:sz w:val="20"/>
-          <w:szCs w:val="20"/>
-        </w:rPr>
-        <w:t>4</w:t>
-      </w:r>
-      <w:r>
-        <w:rPr>
-          <w:rFonts w:asciiTheme="minorBidi" w:hAnsiTheme="minorBidi"/>
-          <w:sz w:val="20"/>
-          <w:szCs w:val="20"/>
-        </w:rPr>
-        <w:t>/20</w:t>
-      </w:r>
-      <w:r>
-        <w:rPr>
-          <w:rFonts w:asciiTheme="minorBidi" w:hAnsiTheme="minorBidi"/>
-          <w:sz w:val="20"/>
-          <w:szCs w:val="20"/>
-        </w:rPr>
-        <w:t>=</w:t>
-      </w:r>
-      <w:r>
-        <w:rPr>
-          <w:rFonts w:asciiTheme="minorBidi" w:hAnsiTheme="minorBidi"/>
-          <w:sz w:val="20"/>
-          <w:szCs w:val="20"/>
-        </w:rPr>
-        <w:t>3.</w:t>
-      </w:r>
-      <w:r>
-        <w:rPr>
-          <w:rFonts w:asciiTheme="minorBidi" w:hAnsiTheme="minorBidi"/>
-          <w:sz w:val="20"/>
-          <w:szCs w:val="20"/>
-        </w:rPr>
-        <w:t>47</w:t>
-      </w:r>
-      <w:r>
-        <w:rPr>
-          <w:rFonts w:asciiTheme="minorBidi" w:hAnsiTheme="minorBidi"/>
-          <w:sz w:val="20"/>
-          <w:szCs w:val="20"/>
-        </w:rPr>
-        <w:t>/4</w:t>
-      </w:r>
-    </w:p>
-    <w:p>
-      <w:pPr>
-        <w:spacing w:line="240" w:lineRule="auto"/>
-        <w:rPr>
-          <w:rFonts w:asciiTheme="minorBidi" w:hAnsiTheme="minorBidi"/>
-          <w:b/>
-          <w:bCs/>
-          <w:sz w:val="20"/>
-          <w:szCs w:val="20"/>
-        </w:rPr>
-      </w:pPr>
-      <w:r>
-        <w:rPr>
-          <w:rFonts w:asciiTheme="minorBidi" w:hAnsiTheme="minorBidi"/>
-          <w:sz w:val="20"/>
-          <w:szCs w:val="20"/>
-        </w:rPr>
-        <w:t>2017</w:t>
+        </w:rPr>
+      </w:pPr>
+      <w:r>
+        <w:rPr>
+          <w:rFonts w:asciiTheme="minorBidi" w:hAnsiTheme="minorBidi"/>
+          <w:sz w:val="20"/>
+          <w:szCs w:val="20"/>
+        </w:rPr>
+        <w:t>University</w:t>
+      </w:r>
+      <w:r>
+        <w:rPr>
+          <w:rFonts w:asciiTheme="minorBidi" w:hAnsiTheme="minorBidi"/>
+          <w:sz w:val="20"/>
+          <w:szCs w:val="20"/>
+        </w:rPr>
+        <w:t xml:space="preserve"> of Zanjan</w:t>
+      </w:r>
+      <w:r>
+        <w:rPr>
+          <w:rFonts w:asciiTheme="minorBidi" w:hAnsiTheme="minorBidi"/>
+          <w:sz w:val="20"/>
+          <w:szCs w:val="20"/>
+        </w:rPr>
+        <w:t>,</w:t>
       </w:r>
       <w:r>
         <w:rPr>
@@ -723,7 +936,7 @@
           <w:sz w:val="20"/>
           <w:szCs w:val="20"/>
         </w:rPr>
-        <w:t>-</w:t>
+        <w:t>Zanjan,</w:t>
       </w:r>
       <w:r>
         <w:rPr>
@@ -739,68 +952,7 @@
           <w:sz w:val="20"/>
           <w:szCs w:val="20"/>
         </w:rPr>
-        <w:t>2019</w:t>
-      </w:r>
-      <w:r>
-        <w:rPr>
-          <w:rFonts w:asciiTheme="minorBidi" w:hAnsiTheme="minorBidi"/>
-          <w:sz w:val="20"/>
-          <w:szCs w:val="20"/>
-        </w:rPr>
-        <w:tab/>
-      </w:r>
-      <w:r>
-        <w:rPr>
-          <w:rFonts w:asciiTheme="minorBidi" w:hAnsiTheme="minorBidi"/>
-          <w:b/>
-          <w:bCs/>
-          <w:sz w:val="20"/>
-          <w:szCs w:val="20"/>
-        </w:rPr>
-        <w:t>Bachelor of Computer Engineering</w:t>
-      </w:r>
-    </w:p>
-    <w:p>
-      <w:pPr>
-        <w:spacing w:line="240" w:lineRule="auto"/>
-        <w:ind w:left="720" w:firstLine="720"/>
-        <w:rPr>
-          <w:rFonts w:asciiTheme="minorBidi" w:hAnsiTheme="minorBidi"/>
-          <w:sz w:val="20"/>
-          <w:szCs w:val="20"/>
-        </w:rPr>
-      </w:pPr>
-      <w:r>
-        <w:rPr>
-          <w:rFonts w:asciiTheme="minorBidi" w:hAnsiTheme="minorBidi"/>
-          <w:sz w:val="20"/>
-          <w:szCs w:val="20"/>
-        </w:rPr>
-        <w:t>Computer Engineering Department,</w:t>
-      </w:r>
-      <w:r>
-        <w:rPr>
-          <w:rFonts w:asciiTheme="minorBidi" w:hAnsiTheme="minorBidi"/>
-          <w:sz w:val="20"/>
-          <w:szCs w:val="20"/>
-        </w:rPr>
-        <w:t xml:space="preserve"> </w:t>
-      </w:r>
-      <w:r>
-        <w:rPr>
-          <w:rFonts w:asciiTheme="minorBidi" w:hAnsiTheme="minorBidi"/>
-          <w:sz w:val="20"/>
-          <w:szCs w:val="20"/>
-        </w:rPr>
-        <w:t>University</w:t>
-      </w:r>
-      <w:r>
-        <w:rPr>
-          <w:rFonts w:asciiTheme="minorBidi" w:hAnsiTheme="minorBidi"/>
-          <w:sz w:val="20"/>
-          <w:szCs w:val="20"/>
-        </w:rPr>
-        <w:t xml:space="preserve"> of Zanjan</w:t>
+        <w:t>Zanjan</w:t>
       </w:r>
       <w:r>
         <w:rPr>
@@ -809,22 +961,6 @@
           <w:szCs w:val="20"/>
         </w:rPr>
         <w:t>,</w:t>
-      </w:r>
-      <w:r>
-        <w:rPr>
-          <w:rFonts w:asciiTheme="minorBidi" w:hAnsiTheme="minorBidi"/>
-          <w:sz w:val="20"/>
-          <w:szCs w:val="20"/>
-        </w:rPr>
-        <w:t xml:space="preserve"> </w:t>
-      </w:r>
-      <w:r>
-        <w:rPr>
-          <w:rFonts w:asciiTheme="minorBidi" w:hAnsiTheme="minorBidi"/>
-          <w:sz w:val="20"/>
-          <w:szCs w:val="20"/>
-        </w:rPr>
-        <w:t>Zanjan,</w:t>
       </w:r>
       <w:r>
         <w:rPr>
@@ -1020,30 +1156,13 @@
           <w:sz w:val="20"/>
           <w:szCs w:val="20"/>
         </w:rPr>
-        <w:t>Signal</w:t>
-      </w:r>
-      <w:r>
-        <w:rPr>
-          <w:rFonts w:asciiTheme="minorBidi" w:hAnsiTheme="minorBidi"/>
-          <w:b/>
-          <w:bCs/>
-          <w:sz w:val="20"/>
-          <w:szCs w:val="20"/>
-        </w:rPr>
-        <w:t xml:space="preserve"> </w:t>
-      </w:r>
-      <w:r>
-        <w:rPr>
-          <w:rFonts w:asciiTheme="minorBidi" w:hAnsiTheme="minorBidi"/>
-          <w:sz w:val="20"/>
-          <w:szCs w:val="20"/>
-        </w:rPr>
-        <w:t>Processing</w:t>
-      </w:r>
-      <w:r>
-        <w:rPr>
-          <w:rFonts w:asciiTheme="minorBidi" w:hAnsiTheme="minorBidi"/>
-          <w:noProof/>
+        <w:t>Computer Vision</w:t>
+      </w:r>
+      <w:r>
+        <w:rPr>
+          <w:rFonts w:asciiTheme="minorBidi" w:hAnsiTheme="minorBidi"/>
+          <w:b/>
+          <w:bCs/>
           <w:sz w:val="20"/>
           <w:szCs w:val="20"/>
         </w:rPr>
@@ -1838,6 +1957,7 @@
           <w:sz w:val="20"/>
           <w:szCs w:val="20"/>
         </w:rPr>
+        <w:lastRenderedPageBreak/>
         <w:t>Prepare</w:t>
       </w:r>
       <w:r>
@@ -1879,7 +1999,6 @@
           <w:szCs w:val="20"/>
           <w:lang w:bidi="fa-IR"/>
         </w:rPr>
-        <w:lastRenderedPageBreak/>
         <w:t>Feb 2022 - Jun 2022</w:t>
       </w:r>
       <w:r>
@@ -3479,6 +3598,7 @@
           <w:szCs w:val="20"/>
           <w:lang w:bidi="fa-IR"/>
         </w:rPr>
+        <w:lastRenderedPageBreak/>
         <w:t>Programming Languages:</w:t>
       </w:r>
       <w:r>
@@ -5971,7 +6091,7 @@
   <w:style w:type="paragraph" w:default="1" w:styleId="Normal">
     <w:name w:val="Normal"/>
     <w:qFormat/>
-    <w:rsid w:val="003A2C26"/>
+    <w:rsid w:val="00032687"/>
   </w:style>
   <w:style w:type="paragraph" w:styleId="Heading1">
     <w:name w:val="heading 1"/>

</xml_diff>